<commit_message>
chore: got questions on SP1
</commit_message>
<xml_diff>
--- a/51SP Sertyficazija PZ/1/SP1_KNT-116m_Onyshchenko_15.docx
+++ b/51SP Sertyficazija PZ/1/SP1_KNT-116m_Onyshchenko_15.docx
@@ -1060,19 +1060,7 @@
         <w:rPr>
           <w:lang w:val="uk-UA"/>
         </w:rPr>
-        <w:t xml:space="preserve">Розмежування зобов’язань наступне: компанія сама виробляє новини — виїжджає на місце подій, знімає матеріал, монтує його, </w:t>
-      </w:r>
-      <w:r>
-        <w:rPr>
-          <w:lang w:val="uk-UA"/>
-        </w:rPr>
-        <w:t>викладає на сайт та у соціальні мережі</w:t>
-      </w:r>
-      <w:r>
-        <w:rPr>
-          <w:lang w:val="uk-UA"/>
-        </w:rPr>
-        <w:t>. А такі роботи як хостинг сайту, юридичні послуги компанія закуповує у третіх осіб.</w:t>
+        <w:t>Розмежування зобов’язань наступне: компанія сама виробляє новини — виїжджає на місце подій, знімає матеріал, монтує його, викладає на сайт та у соціальні мережі. А такі роботи як хостинг сайту, юридичні послуги компанія закуповує у третіх осіб.</w:t>
       </w:r>
     </w:p>
     <w:p>
@@ -1515,8 +1503,8 @@
         </w:tblCellMar>
       </w:tblPr>
       <w:tblGrid>
-        <w:gridCol w:w="370"/>
-        <w:gridCol w:w="1176"/>
+        <w:gridCol w:w="369"/>
+        <w:gridCol w:w="1177"/>
         <w:gridCol w:w="5757"/>
         <w:gridCol w:w="1992"/>
         <w:gridCol w:w="2323"/>
@@ -1527,7 +1515,7 @@
         </w:trPr>
         <w:tc>
           <w:tcPr>
-            <w:tcW w:w="370" w:type="dxa"/>
+            <w:tcW w:w="369" w:type="dxa"/>
             <w:tcBorders>
               <w:top w:val="single" w:sz="4" w:space="0" w:color="000000"/>
               <w:left w:val="single" w:sz="4" w:space="0" w:color="000000"/>
@@ -1537,7 +1525,7 @@
           </w:tcPr>
           <w:p>
             <w:pPr>
-              <w:pStyle w:val="user4"/>
+              <w:pStyle w:val="Style16"/>
               <w:spacing w:lineRule="auto" w:line="240"/>
               <w:ind w:hanging="0" w:left="0"/>
               <w:jc w:val="center"/>
@@ -1563,7 +1551,7 @@
         </w:tc>
         <w:tc>
           <w:tcPr>
-            <w:tcW w:w="1176" w:type="dxa"/>
+            <w:tcW w:w="1177" w:type="dxa"/>
             <w:tcBorders>
               <w:top w:val="single" w:sz="4" w:space="0" w:color="000000"/>
               <w:left w:val="single" w:sz="4" w:space="0" w:color="000000"/>
@@ -1573,7 +1561,7 @@
           </w:tcPr>
           <w:p>
             <w:pPr>
-              <w:pStyle w:val="user4"/>
+              <w:pStyle w:val="Style16"/>
               <w:spacing w:lineRule="auto" w:line="240"/>
               <w:ind w:hanging="0" w:left="0"/>
               <w:jc w:val="center"/>
@@ -1605,7 +1593,7 @@
           </w:tcPr>
           <w:p>
             <w:pPr>
-              <w:pStyle w:val="user4"/>
+              <w:pStyle w:val="Style16"/>
               <w:spacing w:lineRule="auto" w:line="240"/>
               <w:ind w:hanging="0" w:left="0"/>
               <w:jc w:val="center"/>
@@ -1639,7 +1627,7 @@
           </w:tcPr>
           <w:p>
             <w:pPr>
-              <w:pStyle w:val="user4"/>
+              <w:pStyle w:val="Style16"/>
               <w:spacing w:lineRule="auto" w:line="240"/>
               <w:ind w:hanging="0" w:left="0"/>
               <w:jc w:val="center"/>
@@ -1701,7 +1689,7 @@
         <w:trPr/>
         <w:tc>
           <w:tcPr>
-            <w:tcW w:w="370" w:type="dxa"/>
+            <w:tcW w:w="369" w:type="dxa"/>
             <w:tcBorders>
               <w:left w:val="single" w:sz="4" w:space="0" w:color="000000"/>
               <w:bottom w:val="single" w:sz="4" w:space="0" w:color="000000"/>
@@ -1710,7 +1698,7 @@
           </w:tcPr>
           <w:p>
             <w:pPr>
-              <w:pStyle w:val="user4"/>
+              <w:pStyle w:val="Style16"/>
               <w:spacing w:lineRule="auto" w:line="240"/>
               <w:ind w:hanging="0" w:left="0"/>
               <w:rPr>
@@ -1729,7 +1717,7 @@
         </w:tc>
         <w:tc>
           <w:tcPr>
-            <w:tcW w:w="1176" w:type="dxa"/>
+            <w:tcW w:w="1177" w:type="dxa"/>
             <w:tcBorders>
               <w:left w:val="single" w:sz="4" w:space="0" w:color="000000"/>
               <w:bottom w:val="single" w:sz="4" w:space="0" w:color="000000"/>
@@ -1738,7 +1726,7 @@
           </w:tcPr>
           <w:p>
             <w:pPr>
-              <w:pStyle w:val="user4"/>
+              <w:pStyle w:val="Style16"/>
               <w:spacing w:lineRule="auto" w:line="240"/>
               <w:ind w:hanging="0" w:left="0"/>
               <w:rPr>
@@ -1766,7 +1754,7 @@
           </w:tcPr>
           <w:p>
             <w:pPr>
-              <w:pStyle w:val="user4"/>
+              <w:pStyle w:val="Style16"/>
               <w:spacing w:lineRule="auto" w:line="240"/>
               <w:ind w:hanging="0" w:left="0"/>
               <w:rPr>
@@ -1779,7 +1767,7 @@
                 <w:sz w:val="24"/>
                 <w:szCs w:val="24"/>
               </w:rPr>
-              <w:t>Система керування контентом має містити форми для додавання новин до у зручному місці</w:t>
+              <w:t>Система керування контентом має містити форми для додавання новин у зручному місці</w:t>
             </w:r>
           </w:p>
         </w:tc>
@@ -1794,7 +1782,7 @@
           </w:tcPr>
           <w:p>
             <w:pPr>
-              <w:pStyle w:val="user4"/>
+              <w:pStyle w:val="Style16"/>
               <w:spacing w:lineRule="auto" w:line="240"/>
               <w:ind w:hanging="0" w:left="0"/>
               <w:rPr>
@@ -1845,7 +1833,7 @@
         <w:trPr/>
         <w:tc>
           <w:tcPr>
-            <w:tcW w:w="370" w:type="dxa"/>
+            <w:tcW w:w="369" w:type="dxa"/>
             <w:tcBorders>
               <w:left w:val="single" w:sz="4" w:space="0" w:color="000000"/>
               <w:bottom w:val="single" w:sz="4" w:space="0" w:color="000000"/>
@@ -1854,7 +1842,7 @@
           </w:tcPr>
           <w:p>
             <w:pPr>
-              <w:pStyle w:val="user4"/>
+              <w:pStyle w:val="Style16"/>
               <w:spacing w:lineRule="auto" w:line="240"/>
               <w:ind w:hanging="0" w:left="0"/>
               <w:rPr>
@@ -1873,7 +1861,7 @@
         </w:tc>
         <w:tc>
           <w:tcPr>
-            <w:tcW w:w="1176" w:type="dxa"/>
+            <w:tcW w:w="1177" w:type="dxa"/>
             <w:tcBorders>
               <w:left w:val="single" w:sz="4" w:space="0" w:color="000000"/>
               <w:bottom w:val="single" w:sz="4" w:space="0" w:color="000000"/>
@@ -1882,7 +1870,7 @@
           </w:tcPr>
           <w:p>
             <w:pPr>
-              <w:pStyle w:val="user4"/>
+              <w:pStyle w:val="Style16"/>
               <w:spacing w:lineRule="auto" w:line="240"/>
               <w:ind w:hanging="0" w:left="0"/>
               <w:rPr>
@@ -1989,7 +1977,7 @@
         <w:trPr/>
         <w:tc>
           <w:tcPr>
-            <w:tcW w:w="370" w:type="dxa"/>
+            <w:tcW w:w="369" w:type="dxa"/>
             <w:tcBorders>
               <w:left w:val="single" w:sz="4" w:space="0" w:color="000000"/>
               <w:bottom w:val="single" w:sz="4" w:space="0" w:color="000000"/>
@@ -1998,7 +1986,7 @@
           </w:tcPr>
           <w:p>
             <w:pPr>
-              <w:pStyle w:val="user4"/>
+              <w:pStyle w:val="Style16"/>
               <w:spacing w:lineRule="auto" w:line="240"/>
               <w:ind w:hanging="0" w:left="0"/>
               <w:rPr>
@@ -2017,7 +2005,7 @@
         </w:tc>
         <w:tc>
           <w:tcPr>
-            <w:tcW w:w="1176" w:type="dxa"/>
+            <w:tcW w:w="1177" w:type="dxa"/>
             <w:tcBorders>
               <w:left w:val="single" w:sz="4" w:space="0" w:color="000000"/>
               <w:bottom w:val="single" w:sz="4" w:space="0" w:color="000000"/>
@@ -2026,7 +2014,7 @@
           </w:tcPr>
           <w:p>
             <w:pPr>
-              <w:pStyle w:val="user4"/>
+              <w:pStyle w:val="Style16"/>
               <w:spacing w:lineRule="auto" w:line="240"/>
               <w:ind w:hanging="0" w:left="0"/>
               <w:rPr>
@@ -2133,7 +2121,7 @@
         <w:trPr/>
         <w:tc>
           <w:tcPr>
-            <w:tcW w:w="370" w:type="dxa"/>
+            <w:tcW w:w="369" w:type="dxa"/>
             <w:tcBorders>
               <w:left w:val="single" w:sz="4" w:space="0" w:color="000000"/>
               <w:bottom w:val="single" w:sz="4" w:space="0" w:color="000000"/>
@@ -2142,7 +2130,7 @@
           </w:tcPr>
           <w:p>
             <w:pPr>
-              <w:pStyle w:val="user4"/>
+              <w:pStyle w:val="Style16"/>
               <w:spacing w:lineRule="auto" w:line="240"/>
               <w:ind w:hanging="0" w:left="0"/>
               <w:rPr>
@@ -2161,7 +2149,7 @@
         </w:tc>
         <w:tc>
           <w:tcPr>
-            <w:tcW w:w="1176" w:type="dxa"/>
+            <w:tcW w:w="1177" w:type="dxa"/>
             <w:tcBorders>
               <w:left w:val="single" w:sz="4" w:space="0" w:color="000000"/>
               <w:bottom w:val="single" w:sz="4" w:space="0" w:color="000000"/>
@@ -2170,7 +2158,7 @@
           </w:tcPr>
           <w:p>
             <w:pPr>
-              <w:pStyle w:val="user4"/>
+              <w:pStyle w:val="Style16"/>
               <w:spacing w:lineRule="auto" w:line="240"/>
               <w:ind w:hanging="0" w:left="0"/>
               <w:rPr>
@@ -2277,7 +2265,7 @@
         <w:trPr/>
         <w:tc>
           <w:tcPr>
-            <w:tcW w:w="370" w:type="dxa"/>
+            <w:tcW w:w="369" w:type="dxa"/>
             <w:tcBorders>
               <w:left w:val="single" w:sz="4" w:space="0" w:color="000000"/>
               <w:bottom w:val="single" w:sz="4" w:space="0" w:color="000000"/>
@@ -2286,7 +2274,7 @@
           </w:tcPr>
           <w:p>
             <w:pPr>
-              <w:pStyle w:val="user4"/>
+              <w:pStyle w:val="Style16"/>
               <w:spacing w:lineRule="auto" w:line="240"/>
               <w:ind w:hanging="0" w:left="0"/>
               <w:rPr>
@@ -2305,7 +2293,7 @@
         </w:tc>
         <w:tc>
           <w:tcPr>
-            <w:tcW w:w="1176" w:type="dxa"/>
+            <w:tcW w:w="1177" w:type="dxa"/>
             <w:tcBorders>
               <w:left w:val="single" w:sz="4" w:space="0" w:color="000000"/>
               <w:bottom w:val="single" w:sz="4" w:space="0" w:color="000000"/>
@@ -2314,7 +2302,7 @@
           </w:tcPr>
           <w:p>
             <w:pPr>
-              <w:pStyle w:val="user4"/>
+              <w:pStyle w:val="Style16"/>
               <w:spacing w:lineRule="auto" w:line="240"/>
               <w:ind w:hanging="0" w:left="0"/>
               <w:rPr>
@@ -2421,7 +2409,7 @@
         <w:trPr/>
         <w:tc>
           <w:tcPr>
-            <w:tcW w:w="370" w:type="dxa"/>
+            <w:tcW w:w="369" w:type="dxa"/>
             <w:tcBorders>
               <w:left w:val="single" w:sz="4" w:space="0" w:color="000000"/>
               <w:bottom w:val="single" w:sz="4" w:space="0" w:color="000000"/>
@@ -2430,7 +2418,7 @@
           </w:tcPr>
           <w:p>
             <w:pPr>
-              <w:pStyle w:val="user4"/>
+              <w:pStyle w:val="Style16"/>
               <w:spacing w:lineRule="auto" w:line="240"/>
               <w:ind w:hanging="0" w:left="0"/>
               <w:rPr>
@@ -2449,7 +2437,7 @@
         </w:tc>
         <w:tc>
           <w:tcPr>
-            <w:tcW w:w="1176" w:type="dxa"/>
+            <w:tcW w:w="1177" w:type="dxa"/>
             <w:tcBorders>
               <w:left w:val="single" w:sz="4" w:space="0" w:color="000000"/>
               <w:bottom w:val="single" w:sz="4" w:space="0" w:color="000000"/>
@@ -2458,7 +2446,7 @@
           </w:tcPr>
           <w:p>
             <w:pPr>
-              <w:pStyle w:val="user4"/>
+              <w:pStyle w:val="Style16"/>
               <w:spacing w:lineRule="auto" w:line="240"/>
               <w:ind w:hanging="0" w:left="0"/>
               <w:rPr>
@@ -2565,7 +2553,7 @@
         <w:trPr/>
         <w:tc>
           <w:tcPr>
-            <w:tcW w:w="370" w:type="dxa"/>
+            <w:tcW w:w="369" w:type="dxa"/>
             <w:tcBorders>
               <w:left w:val="single" w:sz="4" w:space="0" w:color="000000"/>
               <w:bottom w:val="single" w:sz="4" w:space="0" w:color="000000"/>
@@ -2574,7 +2562,7 @@
           </w:tcPr>
           <w:p>
             <w:pPr>
-              <w:pStyle w:val="user4"/>
+              <w:pStyle w:val="Style16"/>
               <w:spacing w:lineRule="auto" w:line="240"/>
               <w:ind w:hanging="0" w:left="0"/>
               <w:rPr>
@@ -2593,7 +2581,7 @@
         </w:tc>
         <w:tc>
           <w:tcPr>
-            <w:tcW w:w="1176" w:type="dxa"/>
+            <w:tcW w:w="1177" w:type="dxa"/>
             <w:tcBorders>
               <w:left w:val="single" w:sz="4" w:space="0" w:color="000000"/>
               <w:bottom w:val="single" w:sz="4" w:space="0" w:color="000000"/>
@@ -2602,7 +2590,7 @@
           </w:tcPr>
           <w:p>
             <w:pPr>
-              <w:pStyle w:val="user4"/>
+              <w:pStyle w:val="Style16"/>
               <w:spacing w:lineRule="auto" w:line="240"/>
               <w:ind w:hanging="0" w:left="0"/>
               <w:rPr>
@@ -2765,25 +2753,7 @@
         <w:rPr>
           <w:lang w:val="uk-UA"/>
         </w:rPr>
-        <w:t xml:space="preserve">Компанія займається виготовленням та поширенням новин </w:t>
-      </w:r>
-      <w:r>
-        <w:rPr>
-          <w:lang w:val="uk-UA"/>
-        </w:rPr>
-        <w:t>села Комишуваха</w:t>
-      </w:r>
-      <w:r>
-        <w:rPr>
-          <w:lang w:val="uk-UA"/>
-        </w:rPr>
-        <w:t xml:space="preserve"> на своєму веб-сайті </w:t>
-      </w:r>
-      <w:r>
-        <w:rPr>
-          <w:lang w:val="uk-UA"/>
-        </w:rPr>
-        <w:t xml:space="preserve">та сторінках у соціальних мережах, а саме </w:t>
+        <w:t xml:space="preserve">Компанія займається виготовленням та поширенням новин села Комишуваха на своєму веб-сайті та сторінках у соціальних мережах, а саме </w:t>
       </w:r>
       <w:r>
         <w:rPr>
@@ -3168,15 +3138,7 @@
       </w:pPr>
       <w:r>
         <w:rPr/>
-        <w:t xml:space="preserve">Діяльність компанії полягає в пошуку та поширенні новин села </w:t>
-      </w:r>
-      <w:r>
-        <w:rPr/>
-        <w:t>Комишуваха</w:t>
-      </w:r>
-      <w:r>
-        <w:rPr/>
-        <w:t xml:space="preserve">. </w:t>
+        <w:t xml:space="preserve">Діяльність компанії полягає в пошуку та поширенні новин села. </w:t>
       </w:r>
     </w:p>
     <w:p>
@@ -4129,31 +4091,7 @@
         <w:rPr>
           <w:lang w:val="uk-UA"/>
         </w:rPr>
-        <w:t xml:space="preserve">Було створено компанію </w:t>
-      </w:r>
-      <w:r>
-        <w:rPr>
-          <w:lang w:val="uk-UA"/>
-        </w:rPr>
-        <w:t xml:space="preserve">сільських </w:t>
-      </w:r>
-      <w:r>
-        <w:rPr>
-          <w:lang w:val="uk-UA"/>
-        </w:rPr>
-        <w:t xml:space="preserve">новин </w:t>
-      </w:r>
-      <w:r>
-        <w:rPr>
-          <w:lang w:val="uk-UA"/>
-        </w:rPr>
-        <w:t xml:space="preserve">Комишувахи </w:t>
-      </w:r>
-      <w:r>
-        <w:rPr>
-          <w:lang w:val="uk-UA"/>
-        </w:rPr>
-        <w:t>та розвинено документацію для неї.</w:t>
+        <w:t>Було створено компанію сільських новин Комишувахи та розвинено документацію для неї.</w:t>
       </w:r>
     </w:p>
     <w:sectPr>
@@ -5867,27 +5805,27 @@
       <w:lang w:val="en-US" w:eastAsia="uk-UA"/>
     </w:rPr>
   </w:style>
-  <w:style w:type="character" w:styleId="user">
-    <w:name w:val="Символ нумерації (user)"/>
+  <w:style w:type="character" w:styleId="Style12">
+    <w:name w:val="Символ нумерації"/>
     <w:qFormat/>
     <w:rPr/>
   </w:style>
-  <w:style w:type="character" w:styleId="user1">
+  <w:style w:type="character" w:styleId="Style13">
+    <w:name w:val="Маркери"/>
+    <w:qFormat/>
+    <w:rPr>
+      <w:rFonts w:ascii="OpenSymbol" w:hAnsi="OpenSymbol" w:eastAsia="OpenSymbol" w:cs="OpenSymbol"/>
+    </w:rPr>
+  </w:style>
+  <w:style w:type="character" w:styleId="user">
     <w:name w:val="Маркери (user)"/>
     <w:qFormat/>
     <w:rPr>
       <w:rFonts w:ascii="OpenSymbol" w:hAnsi="OpenSymbol" w:eastAsia="OpenSymbol" w:cs="OpenSymbol"/>
     </w:rPr>
   </w:style>
-  <w:style w:type="character" w:styleId="Style12">
-    <w:name w:val="Маркери"/>
-    <w:qFormat/>
-    <w:rPr>
-      <w:rFonts w:ascii="OpenSymbol" w:hAnsi="OpenSymbol" w:eastAsia="OpenSymbol" w:cs="OpenSymbol"/>
-    </w:rPr>
-  </w:style>
-  <w:style w:type="character" w:styleId="Style13">
-    <w:name w:val="Символ нумерації"/>
+  <w:style w:type="character" w:styleId="user1">
+    <w:name w:val="Символ нумерації (user)"/>
     <w:qFormat/>
     <w:rPr/>
   </w:style>
@@ -5901,7 +5839,7 @@
       <w:spacing w:before="240" w:after="120"/>
     </w:pPr>
     <w:rPr>
-      <w:rFonts w:ascii="Liberation Sans" w:hAnsi="Liberation Sans" w:eastAsia="Microsoft YaHei" w:cs="Arial Unicode MS"/>
+      <w:rFonts w:ascii="Liberation Sans" w:hAnsi="Liberation Sans" w:eastAsia="Microsoft YaHei" w:cs="Lucida Sans"/>
       <w:sz w:val="28"/>
       <w:szCs w:val="28"/>
     </w:rPr>
@@ -5946,7 +5884,7 @@
       <w:suppressLineNumbers/>
     </w:pPr>
     <w:rPr>
-      <w:rFonts w:cs="Arial Unicode MS"/>
+      <w:rFonts w:cs="Lucida Sans"/>
     </w:rPr>
   </w:style>
   <w:style w:type="paragraph" w:styleId="user2">
@@ -5959,7 +5897,7 @@
       <w:spacing w:before="240" w:after="120"/>
     </w:pPr>
     <w:rPr>
-      <w:rFonts w:ascii="Liberation Sans" w:hAnsi="Liberation Sans" w:eastAsia="Microsoft YaHei" w:cs="Lucida Sans"/>
+      <w:rFonts w:ascii="Liberation Sans" w:hAnsi="Liberation Sans" w:eastAsia="Microsoft YaHei" w:cs="Arial Unicode MS"/>
       <w:sz w:val="28"/>
       <w:szCs w:val="28"/>
     </w:rPr>
@@ -5972,12 +5910,12 @@
       <w:suppressLineNumbers/>
     </w:pPr>
     <w:rPr>
-      <w:rFonts w:cs="Lucida Sans"/>
+      <w:rFonts w:cs="Arial Unicode MS"/>
     </w:rPr>
   </w:style>
   <w:style w:type="paragraph" w:styleId="IndexHeading">
     <w:name w:val="index heading"/>
-    <w:basedOn w:val="Style14"/>
+    <w:basedOn w:val="user2"/>
     <w:pPr/>
     <w:rPr/>
   </w:style>
@@ -6255,6 +6193,16 @@
     </w:pPr>
     <w:rPr/>
   </w:style>
+  <w:style w:type="paragraph" w:styleId="Style16">
+    <w:name w:val="Вміст таблиці"/>
+    <w:basedOn w:val="Normal"/>
+    <w:qFormat/>
+    <w:pPr>
+      <w:widowControl w:val="false"/>
+      <w:suppressLineNumbers/>
+    </w:pPr>
+    <w:rPr/>
+  </w:style>
   <w:style w:type="paragraph" w:styleId="user4">
     <w:name w:val="Вміст таблиці (user)"/>
     <w:basedOn w:val="Normal"/>
@@ -6265,19 +6213,9 @@
     </w:pPr>
     <w:rPr/>
   </w:style>
-  <w:style w:type="paragraph" w:styleId="Style16">
-    <w:name w:val="Вміст таблиці"/>
-    <w:basedOn w:val="Normal"/>
-    <w:qFormat/>
-    <w:pPr>
-      <w:widowControl w:val="false"/>
-      <w:suppressLineNumbers/>
-    </w:pPr>
-    <w:rPr/>
-  </w:style>
-  <w:style w:type="paragraph" w:styleId="Style17">
-    <w:name w:val="Заголовок таблиці"/>
-    <w:basedOn w:val="Style16"/>
+  <w:style w:type="paragraph" w:styleId="user5">
+    <w:name w:val="Заголовок таблиці (user)"/>
+    <w:basedOn w:val="user4"/>
     <w:qFormat/>
     <w:pPr>
       <w:suppressLineNumbers/>
@@ -6288,8 +6226,8 @@
       <w:bCs/>
     </w:rPr>
   </w:style>
-  <w:style w:type="numbering" w:styleId="Style18" w:default="1">
-    <w:name w:val="Без маркерів"/>
+  <w:style w:type="numbering" w:styleId="user6" w:default="1">
+    <w:name w:val="Без маркерів (user)"/>
     <w:uiPriority w:val="99"/>
     <w:semiHidden/>
     <w:unhideWhenUsed/>

</xml_diff>

<commit_message>
chore: i cant do it
</commit_message>
<xml_diff>
--- a/51SP Sertyficazija PZ/1/SP1_KNT-116m_Onyshchenko_15.docx
+++ b/51SP Sertyficazija PZ/1/SP1_KNT-116m_Onyshchenko_15.docx
@@ -767,6 +767,10 @@
       </w:pPr>
       <w:r>
         <w:rPr/>
+        <w:t xml:space="preserve">1 </w:t>
+      </w:r>
+      <w:r>
+        <w:rPr/>
         <w:t>Характеристика спеціалізації підприємства</w:t>
       </w:r>
     </w:p>
@@ -786,7 +790,15 @@
       </w:pPr>
       <w:r>
         <w:rPr/>
-        <w:t xml:space="preserve">Створена медіа компанія займається новинами села Комишуваха. Компанією керує директор, він займається системою управління якістю. У компанії є ІТ відділ (складається з двох осіб: один відповідальний за фронтенд та публікацію новин, другий за бекенд) цей відділ відповідальний за розробку та підтримку вебсайту компанії та публікації новин на сторінках у соціальних мережах: </w:t>
+        <w:t xml:space="preserve">Створена медіа компанія займається новинами </w:t>
+      </w:r>
+      <w:r>
+        <w:rPr/>
+        <w:t>Запорізької області</w:t>
+      </w:r>
+      <w:r>
+        <w:rPr/>
+        <w:t xml:space="preserve">. Компанією керує директор, він займається системою управління якістю. У компанії є ІТ відділ (складається з двох осіб: один відповідальний за фронтенд та публікацію новин, другий за бекенд) цей відділ відповідальний за розробку та підтримку вебсайту компанії та публікації новин на сторінках у соціальних мережах: </w:t>
       </w:r>
       <w:r>
         <w:rPr>
@@ -1081,6 +1093,10 @@
         <w:pStyle w:val="H2"/>
         <w:rPr/>
       </w:pPr>
+      <w:r>
+        <w:rPr/>
+        <w:t xml:space="preserve">2 </w:t>
+      </w:r>
       <w:r>
         <w:rPr/>
         <w:t>Організаційна структура підприємства з коротким описом обов’язків</w:t>
@@ -1398,6 +1414,10 @@
       </w:pPr>
       <w:r>
         <w:rPr/>
+        <w:t xml:space="preserve">3 </w:t>
+      </w:r>
+      <w:r>
+        <w:rPr/>
         <w:t xml:space="preserve">Цілі в галузі якості </w:t>
       </w:r>
     </w:p>
@@ -1525,7 +1545,7 @@
           </w:tcPr>
           <w:p>
             <w:pPr>
-              <w:pStyle w:val="Style16"/>
+              <w:pStyle w:val="user4"/>
               <w:spacing w:lineRule="auto" w:line="240"/>
               <w:ind w:hanging="0" w:left="0"/>
               <w:jc w:val="center"/>
@@ -1561,7 +1581,7 @@
           </w:tcPr>
           <w:p>
             <w:pPr>
-              <w:pStyle w:val="Style16"/>
+              <w:pStyle w:val="user4"/>
               <w:spacing w:lineRule="auto" w:line="240"/>
               <w:ind w:hanging="0" w:left="0"/>
               <w:jc w:val="center"/>
@@ -1593,7 +1613,7 @@
           </w:tcPr>
           <w:p>
             <w:pPr>
-              <w:pStyle w:val="Style16"/>
+              <w:pStyle w:val="user4"/>
               <w:spacing w:lineRule="auto" w:line="240"/>
               <w:ind w:hanging="0" w:left="0"/>
               <w:jc w:val="center"/>
@@ -1627,7 +1647,7 @@
           </w:tcPr>
           <w:p>
             <w:pPr>
-              <w:pStyle w:val="Style16"/>
+              <w:pStyle w:val="user4"/>
               <w:spacing w:lineRule="auto" w:line="240"/>
               <w:ind w:hanging="0" w:left="0"/>
               <w:jc w:val="center"/>
@@ -1698,7 +1718,7 @@
           </w:tcPr>
           <w:p>
             <w:pPr>
-              <w:pStyle w:val="Style16"/>
+              <w:pStyle w:val="user4"/>
               <w:spacing w:lineRule="auto" w:line="240"/>
               <w:ind w:hanging="0" w:left="0"/>
               <w:rPr>
@@ -1726,7 +1746,7 @@
           </w:tcPr>
           <w:p>
             <w:pPr>
-              <w:pStyle w:val="Style16"/>
+              <w:pStyle w:val="user4"/>
               <w:spacing w:lineRule="auto" w:line="240"/>
               <w:ind w:hanging="0" w:left="0"/>
               <w:rPr>
@@ -1754,7 +1774,7 @@
           </w:tcPr>
           <w:p>
             <w:pPr>
-              <w:pStyle w:val="Style16"/>
+              <w:pStyle w:val="user4"/>
               <w:spacing w:lineRule="auto" w:line="240"/>
               <w:ind w:hanging="0" w:left="0"/>
               <w:rPr>
@@ -1782,7 +1802,7 @@
           </w:tcPr>
           <w:p>
             <w:pPr>
-              <w:pStyle w:val="Style16"/>
+              <w:pStyle w:val="user4"/>
               <w:spacing w:lineRule="auto" w:line="240"/>
               <w:ind w:hanging="0" w:left="0"/>
               <w:rPr>
@@ -1842,7 +1862,7 @@
           </w:tcPr>
           <w:p>
             <w:pPr>
-              <w:pStyle w:val="Style16"/>
+              <w:pStyle w:val="user4"/>
               <w:spacing w:lineRule="auto" w:line="240"/>
               <w:ind w:hanging="0" w:left="0"/>
               <w:rPr>
@@ -1870,7 +1890,7 @@
           </w:tcPr>
           <w:p>
             <w:pPr>
-              <w:pStyle w:val="Style16"/>
+              <w:pStyle w:val="user4"/>
               <w:spacing w:lineRule="auto" w:line="240"/>
               <w:ind w:hanging="0" w:left="0"/>
               <w:rPr>
@@ -1986,7 +2006,7 @@
           </w:tcPr>
           <w:p>
             <w:pPr>
-              <w:pStyle w:val="Style16"/>
+              <w:pStyle w:val="user4"/>
               <w:spacing w:lineRule="auto" w:line="240"/>
               <w:ind w:hanging="0" w:left="0"/>
               <w:rPr>
@@ -2014,7 +2034,7 @@
           </w:tcPr>
           <w:p>
             <w:pPr>
-              <w:pStyle w:val="Style16"/>
+              <w:pStyle w:val="user4"/>
               <w:spacing w:lineRule="auto" w:line="240"/>
               <w:ind w:hanging="0" w:left="0"/>
               <w:rPr>
@@ -2130,7 +2150,7 @@
           </w:tcPr>
           <w:p>
             <w:pPr>
-              <w:pStyle w:val="Style16"/>
+              <w:pStyle w:val="user4"/>
               <w:spacing w:lineRule="auto" w:line="240"/>
               <w:ind w:hanging="0" w:left="0"/>
               <w:rPr>
@@ -2158,7 +2178,7 @@
           </w:tcPr>
           <w:p>
             <w:pPr>
-              <w:pStyle w:val="Style16"/>
+              <w:pStyle w:val="user4"/>
               <w:spacing w:lineRule="auto" w:line="240"/>
               <w:ind w:hanging="0" w:left="0"/>
               <w:rPr>
@@ -2274,7 +2294,7 @@
           </w:tcPr>
           <w:p>
             <w:pPr>
-              <w:pStyle w:val="Style16"/>
+              <w:pStyle w:val="user4"/>
               <w:spacing w:lineRule="auto" w:line="240"/>
               <w:ind w:hanging="0" w:left="0"/>
               <w:rPr>
@@ -2302,7 +2322,7 @@
           </w:tcPr>
           <w:p>
             <w:pPr>
-              <w:pStyle w:val="Style16"/>
+              <w:pStyle w:val="user4"/>
               <w:spacing w:lineRule="auto" w:line="240"/>
               <w:ind w:hanging="0" w:left="0"/>
               <w:rPr>
@@ -2418,7 +2438,7 @@
           </w:tcPr>
           <w:p>
             <w:pPr>
-              <w:pStyle w:val="Style16"/>
+              <w:pStyle w:val="user4"/>
               <w:spacing w:lineRule="auto" w:line="240"/>
               <w:ind w:hanging="0" w:left="0"/>
               <w:rPr>
@@ -2446,7 +2466,7 @@
           </w:tcPr>
           <w:p>
             <w:pPr>
-              <w:pStyle w:val="Style16"/>
+              <w:pStyle w:val="user4"/>
               <w:spacing w:lineRule="auto" w:line="240"/>
               <w:ind w:hanging="0" w:left="0"/>
               <w:rPr>
@@ -2562,7 +2582,7 @@
           </w:tcPr>
           <w:p>
             <w:pPr>
-              <w:pStyle w:val="Style16"/>
+              <w:pStyle w:val="user4"/>
               <w:spacing w:lineRule="auto" w:line="240"/>
               <w:ind w:hanging="0" w:left="0"/>
               <w:rPr>
@@ -2590,7 +2610,7 @@
           </w:tcPr>
           <w:p>
             <w:pPr>
-              <w:pStyle w:val="Style16"/>
+              <w:pStyle w:val="user4"/>
               <w:spacing w:lineRule="auto" w:line="240"/>
               <w:ind w:hanging="0" w:left="0"/>
               <w:rPr>
@@ -2711,6 +2731,10 @@
       </w:pPr>
       <w:r>
         <w:rPr/>
+        <w:t xml:space="preserve">4 </w:t>
+      </w:r>
+      <w:r>
+        <w:rPr/>
         <w:t>Настанова з якості</w:t>
       </w:r>
     </w:p>
@@ -2720,6 +2744,12 @@
         <w:spacing w:before="0" w:after="0"/>
         <w:rPr/>
       </w:pPr>
+      <w:r>
+        <w:rPr>
+          <w:lang w:val="uk-UA"/>
+        </w:rPr>
+        <w:t xml:space="preserve">4.1 </w:t>
+      </w:r>
       <w:r>
         <w:rPr>
           <w:lang w:val="uk-UA"/>
@@ -3117,6 +3147,10 @@
       </w:pPr>
       <w:r>
         <w:rPr/>
+        <w:t xml:space="preserve">4.2 </w:t>
+      </w:r>
+      <w:r>
+        <w:rPr/>
         <w:t>Характеристика діяльності</w:t>
       </w:r>
     </w:p>
@@ -3462,6 +3496,10 @@
       </w:pPr>
       <w:r>
         <w:rPr/>
+        <w:t xml:space="preserve">4.3 </w:t>
+      </w:r>
+      <w:r>
+        <w:rPr/>
         <w:t>Терміни та визначення понять</w:t>
       </w:r>
     </w:p>
@@ -3524,6 +3562,10 @@
         <w:spacing w:before="0" w:after="0"/>
         <w:rPr/>
       </w:pPr>
+      <w:r>
+        <w:rPr/>
+        <w:t xml:space="preserve">4.4 </w:t>
+      </w:r>
       <w:r>
         <w:rPr/>
         <w:t>Система управління якістю</w:t>
@@ -3753,6 +3795,10 @@
       </w:pPr>
       <w:r>
         <w:rPr/>
+        <w:t xml:space="preserve">4.5 </w:t>
+      </w:r>
+      <w:r>
+        <w:rPr/>
         <w:t>Відповідальність керівництва</w:t>
       </w:r>
     </w:p>
@@ -3795,6 +3841,10 @@
       </w:pPr>
       <w:r>
         <w:rPr/>
+        <w:t xml:space="preserve">4.6 </w:t>
+      </w:r>
+      <w:r>
+        <w:rPr/>
         <w:t>Керування ресурсами</w:t>
       </w:r>
     </w:p>
@@ -3854,6 +3904,10 @@
       </w:pPr>
       <w:r>
         <w:rPr/>
+        <w:t xml:space="preserve">4.7 </w:t>
+      </w:r>
+      <w:r>
+        <w:rPr/>
         <w:t>Виготовлення продукції</w:t>
       </w:r>
     </w:p>
@@ -3906,6 +3960,10 @@
         <w:spacing w:before="0" w:after="0"/>
         <w:rPr/>
       </w:pPr>
+      <w:r>
+        <w:rPr/>
+        <w:t xml:space="preserve">4.8 </w:t>
+      </w:r>
       <w:r>
         <w:rPr/>
         <w:t>Вимірювання, аналізування та поліпшування</w:t>
@@ -5805,27 +5863,27 @@
       <w:lang w:val="en-US" w:eastAsia="uk-UA"/>
     </w:rPr>
   </w:style>
-  <w:style w:type="character" w:styleId="Style12">
-    <w:name w:val="Символ нумерації"/>
+  <w:style w:type="character" w:styleId="user">
+    <w:name w:val="Символ нумерації (user)"/>
     <w:qFormat/>
     <w:rPr/>
   </w:style>
-  <w:style w:type="character" w:styleId="Style13">
+  <w:style w:type="character" w:styleId="user1">
+    <w:name w:val="Маркери (user)"/>
+    <w:qFormat/>
+    <w:rPr>
+      <w:rFonts w:ascii="OpenSymbol" w:hAnsi="OpenSymbol" w:eastAsia="OpenSymbol" w:cs="OpenSymbol"/>
+    </w:rPr>
+  </w:style>
+  <w:style w:type="character" w:styleId="Style12">
     <w:name w:val="Маркери"/>
     <w:qFormat/>
     <w:rPr>
       <w:rFonts w:ascii="OpenSymbol" w:hAnsi="OpenSymbol" w:eastAsia="OpenSymbol" w:cs="OpenSymbol"/>
     </w:rPr>
   </w:style>
-  <w:style w:type="character" w:styleId="user">
-    <w:name w:val="Маркери (user)"/>
-    <w:qFormat/>
-    <w:rPr>
-      <w:rFonts w:ascii="OpenSymbol" w:hAnsi="OpenSymbol" w:eastAsia="OpenSymbol" w:cs="OpenSymbol"/>
-    </w:rPr>
-  </w:style>
-  <w:style w:type="character" w:styleId="user1">
-    <w:name w:val="Символ нумерації (user)"/>
+  <w:style w:type="character" w:styleId="Style13">
+    <w:name w:val="Символ нумерації"/>
     <w:qFormat/>
     <w:rPr/>
   </w:style>
@@ -5839,7 +5897,7 @@
       <w:spacing w:before="240" w:after="120"/>
     </w:pPr>
     <w:rPr>
-      <w:rFonts w:ascii="Liberation Sans" w:hAnsi="Liberation Sans" w:eastAsia="Microsoft YaHei" w:cs="Lucida Sans"/>
+      <w:rFonts w:ascii="Liberation Sans" w:hAnsi="Liberation Sans" w:eastAsia="Microsoft YaHei" w:cs="Arial Unicode MS"/>
       <w:sz w:val="28"/>
       <w:szCs w:val="28"/>
     </w:rPr>
@@ -5884,7 +5942,7 @@
       <w:suppressLineNumbers/>
     </w:pPr>
     <w:rPr>
-      <w:rFonts w:cs="Lucida Sans"/>
+      <w:rFonts w:cs="Arial Unicode MS"/>
     </w:rPr>
   </w:style>
   <w:style w:type="paragraph" w:styleId="user2">
@@ -5897,7 +5955,7 @@
       <w:spacing w:before="240" w:after="120"/>
     </w:pPr>
     <w:rPr>
-      <w:rFonts w:ascii="Liberation Sans" w:hAnsi="Liberation Sans" w:eastAsia="Microsoft YaHei" w:cs="Arial Unicode MS"/>
+      <w:rFonts w:ascii="Liberation Sans" w:hAnsi="Liberation Sans" w:eastAsia="Microsoft YaHei" w:cs="Lucida Sans"/>
       <w:sz w:val="28"/>
       <w:szCs w:val="28"/>
     </w:rPr>
@@ -5910,12 +5968,12 @@
       <w:suppressLineNumbers/>
     </w:pPr>
     <w:rPr>
-      <w:rFonts w:cs="Arial Unicode MS"/>
+      <w:rFonts w:cs="Lucida Sans"/>
     </w:rPr>
   </w:style>
   <w:style w:type="paragraph" w:styleId="IndexHeading">
     <w:name w:val="index heading"/>
-    <w:basedOn w:val="user2"/>
+    <w:basedOn w:val="Style14"/>
     <w:pPr/>
     <w:rPr/>
   </w:style>
@@ -6193,6 +6251,16 @@
     </w:pPr>
     <w:rPr/>
   </w:style>
+  <w:style w:type="paragraph" w:styleId="user4">
+    <w:name w:val="Вміст таблиці (user)"/>
+    <w:basedOn w:val="Normal"/>
+    <w:qFormat/>
+    <w:pPr>
+      <w:widowControl w:val="false"/>
+      <w:suppressLineNumbers/>
+    </w:pPr>
+    <w:rPr/>
+  </w:style>
   <w:style w:type="paragraph" w:styleId="Style16">
     <w:name w:val="Вміст таблиці"/>
     <w:basedOn w:val="Normal"/>
@@ -6203,19 +6271,9 @@
     </w:pPr>
     <w:rPr/>
   </w:style>
-  <w:style w:type="paragraph" w:styleId="user4">
-    <w:name w:val="Вміст таблиці (user)"/>
-    <w:basedOn w:val="Normal"/>
-    <w:qFormat/>
-    <w:pPr>
-      <w:widowControl w:val="false"/>
-      <w:suppressLineNumbers/>
-    </w:pPr>
-    <w:rPr/>
-  </w:style>
-  <w:style w:type="paragraph" w:styleId="user5">
-    <w:name w:val="Заголовок таблиці (user)"/>
-    <w:basedOn w:val="user4"/>
+  <w:style w:type="paragraph" w:styleId="Style17">
+    <w:name w:val="Заголовок таблиці"/>
+    <w:basedOn w:val="Style16"/>
     <w:qFormat/>
     <w:pPr>
       <w:suppressLineNumbers/>
@@ -6226,8 +6284,8 @@
       <w:bCs/>
     </w:rPr>
   </w:style>
-  <w:style w:type="numbering" w:styleId="user6" w:default="1">
-    <w:name w:val="Без маркерів (user)"/>
+  <w:style w:type="numbering" w:styleId="Style18" w:default="1">
+    <w:name w:val="Без маркерів"/>
     <w:uiPriority w:val="99"/>
     <w:semiHidden/>
     <w:unhideWhenUsed/>

</xml_diff>

<commit_message>
chore: write the first part of the first part
</commit_message>
<xml_diff>
--- a/51SP Sertyficazija PZ/1/SP1_KNT-116m_Onyshchenko_15.docx
+++ b/51SP Sertyficazija PZ/1/SP1_KNT-116m_Onyshchenko_15.docx
@@ -252,7 +252,15 @@
       </w:pPr>
       <w:r>
         <w:rPr/>
-        <w:t xml:space="preserve">Студент КНТ-122 </w:t>
+        <w:t>Студент КНТ-</w:t>
+      </w:r>
+      <w:r>
+        <w:rPr/>
+        <w:t>116м</w:t>
+      </w:r>
+      <w:r>
+        <w:rPr/>
+        <w:t xml:space="preserve"> </w:t>
         <w:tab/>
         <w:tab/>
         <w:tab/>
@@ -767,38 +775,26 @@
       </w:pPr>
       <w:r>
         <w:rPr/>
-        <w:t xml:space="preserve">1 </w:t>
-      </w:r>
-      <w:r>
-        <w:rPr/>
-        <w:t>Характеристика спеціалізації підприємства</w:t>
-      </w:r>
-    </w:p>
-    <w:p>
-      <w:pPr>
-        <w:pStyle w:val="P1"/>
-        <w:rPr/>
-      </w:pPr>
-      <w:r>
-        <w:rPr/>
-      </w:r>
-    </w:p>
-    <w:p>
-      <w:pPr>
-        <w:pStyle w:val="P1"/>
-        <w:rPr/>
-      </w:pPr>
-      <w:r>
-        <w:rPr/>
-        <w:t xml:space="preserve">Створена медіа компанія займається новинами </w:t>
-      </w:r>
-      <w:r>
-        <w:rPr/>
-        <w:t>Запорізької області</w:t>
-      </w:r>
-      <w:r>
-        <w:rPr/>
-        <w:t xml:space="preserve">. Компанією керує директор, він займається системою управління якістю. У компанії є ІТ відділ (складається з двох осіб: один відповідальний за фронтенд та публікацію новин, другий за бекенд) цей відділ відповідальний за розробку та підтримку вебсайту компанії та публікації новин на сторінках у соціальних мережах: </w:t>
+        <w:t>1 Характеристика спеціалізації підприємства</w:t>
+      </w:r>
+    </w:p>
+    <w:p>
+      <w:pPr>
+        <w:pStyle w:val="P1"/>
+        <w:rPr/>
+      </w:pPr>
+      <w:r>
+        <w:rPr/>
+      </w:r>
+    </w:p>
+    <w:p>
+      <w:pPr>
+        <w:pStyle w:val="P1"/>
+        <w:rPr/>
+      </w:pPr>
+      <w:r>
+        <w:rPr/>
+        <w:t xml:space="preserve">Створена медіа компанія займається новинами Запорізької області. Компанією керує директор, він займається системою управління якістю. У компанії є ІТ відділ (складається з двох осіб: один відповідальний за фронтенд та публікацію новин, другий за бекенд) цей відділ відповідальний за розробку та підтримку вебсайту компанії та публікації новин на сторінках у соціальних мережах: </w:t>
       </w:r>
       <w:r>
         <w:rPr>
@@ -1095,11 +1091,7 @@
       </w:pPr>
       <w:r>
         <w:rPr/>
-        <w:t xml:space="preserve">2 </w:t>
-      </w:r>
-      <w:r>
-        <w:rPr/>
-        <w:t>Організаційна структура підприємства з коротким описом обов’язків</w:t>
+        <w:t>2 Організаційна структура підприємства з коротким описом обов’язків</w:t>
       </w:r>
     </w:p>
     <w:p>
@@ -1414,11 +1406,7 @@
       </w:pPr>
       <w:r>
         <w:rPr/>
-        <w:t xml:space="preserve">3 </w:t>
-      </w:r>
-      <w:r>
-        <w:rPr/>
-        <w:t xml:space="preserve">Цілі в галузі якості </w:t>
+        <w:t xml:space="preserve">3 Цілі в галузі якості </w:t>
       </w:r>
     </w:p>
     <w:p>
@@ -1545,7 +1533,7 @@
           </w:tcPr>
           <w:p>
             <w:pPr>
-              <w:pStyle w:val="user4"/>
+              <w:pStyle w:val="Style16"/>
               <w:spacing w:lineRule="auto" w:line="240"/>
               <w:ind w:hanging="0" w:left="0"/>
               <w:jc w:val="center"/>
@@ -1581,7 +1569,7 @@
           </w:tcPr>
           <w:p>
             <w:pPr>
-              <w:pStyle w:val="user4"/>
+              <w:pStyle w:val="Style16"/>
               <w:spacing w:lineRule="auto" w:line="240"/>
               <w:ind w:hanging="0" w:left="0"/>
               <w:jc w:val="center"/>
@@ -1613,7 +1601,7 @@
           </w:tcPr>
           <w:p>
             <w:pPr>
-              <w:pStyle w:val="user4"/>
+              <w:pStyle w:val="Style16"/>
               <w:spacing w:lineRule="auto" w:line="240"/>
               <w:ind w:hanging="0" w:left="0"/>
               <w:jc w:val="center"/>
@@ -1647,7 +1635,7 @@
           </w:tcPr>
           <w:p>
             <w:pPr>
-              <w:pStyle w:val="user4"/>
+              <w:pStyle w:val="Style16"/>
               <w:spacing w:lineRule="auto" w:line="240"/>
               <w:ind w:hanging="0" w:left="0"/>
               <w:jc w:val="center"/>
@@ -1718,7 +1706,7 @@
           </w:tcPr>
           <w:p>
             <w:pPr>
-              <w:pStyle w:val="user4"/>
+              <w:pStyle w:val="Style16"/>
               <w:spacing w:lineRule="auto" w:line="240"/>
               <w:ind w:hanging="0" w:left="0"/>
               <w:rPr>
@@ -1746,7 +1734,7 @@
           </w:tcPr>
           <w:p>
             <w:pPr>
-              <w:pStyle w:val="user4"/>
+              <w:pStyle w:val="Style16"/>
               <w:spacing w:lineRule="auto" w:line="240"/>
               <w:ind w:hanging="0" w:left="0"/>
               <w:rPr>
@@ -1774,7 +1762,7 @@
           </w:tcPr>
           <w:p>
             <w:pPr>
-              <w:pStyle w:val="user4"/>
+              <w:pStyle w:val="Style16"/>
               <w:spacing w:lineRule="auto" w:line="240"/>
               <w:ind w:hanging="0" w:left="0"/>
               <w:rPr>
@@ -1802,7 +1790,7 @@
           </w:tcPr>
           <w:p>
             <w:pPr>
-              <w:pStyle w:val="user4"/>
+              <w:pStyle w:val="Style16"/>
               <w:spacing w:lineRule="auto" w:line="240"/>
               <w:ind w:hanging="0" w:left="0"/>
               <w:rPr>
@@ -1862,7 +1850,7 @@
           </w:tcPr>
           <w:p>
             <w:pPr>
-              <w:pStyle w:val="user4"/>
+              <w:pStyle w:val="Style16"/>
               <w:spacing w:lineRule="auto" w:line="240"/>
               <w:ind w:hanging="0" w:left="0"/>
               <w:rPr>
@@ -1890,7 +1878,7 @@
           </w:tcPr>
           <w:p>
             <w:pPr>
-              <w:pStyle w:val="user4"/>
+              <w:pStyle w:val="Style16"/>
               <w:spacing w:lineRule="auto" w:line="240"/>
               <w:ind w:hanging="0" w:left="0"/>
               <w:rPr>
@@ -2006,7 +1994,7 @@
           </w:tcPr>
           <w:p>
             <w:pPr>
-              <w:pStyle w:val="user4"/>
+              <w:pStyle w:val="Style16"/>
               <w:spacing w:lineRule="auto" w:line="240"/>
               <w:ind w:hanging="0" w:left="0"/>
               <w:rPr>
@@ -2034,7 +2022,7 @@
           </w:tcPr>
           <w:p>
             <w:pPr>
-              <w:pStyle w:val="user4"/>
+              <w:pStyle w:val="Style16"/>
               <w:spacing w:lineRule="auto" w:line="240"/>
               <w:ind w:hanging="0" w:left="0"/>
               <w:rPr>
@@ -2150,7 +2138,7 @@
           </w:tcPr>
           <w:p>
             <w:pPr>
-              <w:pStyle w:val="user4"/>
+              <w:pStyle w:val="Style16"/>
               <w:spacing w:lineRule="auto" w:line="240"/>
               <w:ind w:hanging="0" w:left="0"/>
               <w:rPr>
@@ -2178,7 +2166,7 @@
           </w:tcPr>
           <w:p>
             <w:pPr>
-              <w:pStyle w:val="user4"/>
+              <w:pStyle w:val="Style16"/>
               <w:spacing w:lineRule="auto" w:line="240"/>
               <w:ind w:hanging="0" w:left="0"/>
               <w:rPr>
@@ -2294,7 +2282,7 @@
           </w:tcPr>
           <w:p>
             <w:pPr>
-              <w:pStyle w:val="user4"/>
+              <w:pStyle w:val="Style16"/>
               <w:spacing w:lineRule="auto" w:line="240"/>
               <w:ind w:hanging="0" w:left="0"/>
               <w:rPr>
@@ -2322,7 +2310,7 @@
           </w:tcPr>
           <w:p>
             <w:pPr>
-              <w:pStyle w:val="user4"/>
+              <w:pStyle w:val="Style16"/>
               <w:spacing w:lineRule="auto" w:line="240"/>
               <w:ind w:hanging="0" w:left="0"/>
               <w:rPr>
@@ -2438,7 +2426,7 @@
           </w:tcPr>
           <w:p>
             <w:pPr>
-              <w:pStyle w:val="user4"/>
+              <w:pStyle w:val="Style16"/>
               <w:spacing w:lineRule="auto" w:line="240"/>
               <w:ind w:hanging="0" w:left="0"/>
               <w:rPr>
@@ -2466,7 +2454,7 @@
           </w:tcPr>
           <w:p>
             <w:pPr>
-              <w:pStyle w:val="user4"/>
+              <w:pStyle w:val="Style16"/>
               <w:spacing w:lineRule="auto" w:line="240"/>
               <w:ind w:hanging="0" w:left="0"/>
               <w:rPr>
@@ -2582,7 +2570,7 @@
           </w:tcPr>
           <w:p>
             <w:pPr>
-              <w:pStyle w:val="user4"/>
+              <w:pStyle w:val="Style16"/>
               <w:spacing w:lineRule="auto" w:line="240"/>
               <w:ind w:hanging="0" w:left="0"/>
               <w:rPr>
@@ -2610,7 +2598,7 @@
           </w:tcPr>
           <w:p>
             <w:pPr>
-              <w:pStyle w:val="user4"/>
+              <w:pStyle w:val="Style16"/>
               <w:spacing w:lineRule="auto" w:line="240"/>
               <w:ind w:hanging="0" w:left="0"/>
               <w:rPr>
@@ -2731,11 +2719,7 @@
       </w:pPr>
       <w:r>
         <w:rPr/>
-        <w:t xml:space="preserve">4 </w:t>
-      </w:r>
-      <w:r>
-        <w:rPr/>
-        <w:t>Настанова з якості</w:t>
+        <w:t>4 Настанова з якості</w:t>
       </w:r>
     </w:p>
     <w:p>
@@ -2748,13 +2732,7 @@
         <w:rPr>
           <w:lang w:val="uk-UA"/>
         </w:rPr>
-        <w:t xml:space="preserve">4.1 </w:t>
-      </w:r>
-      <w:r>
-        <w:rPr>
-          <w:lang w:val="uk-UA"/>
-        </w:rPr>
-        <w:t>С</w:t>
+        <w:t>4.1 С</w:t>
       </w:r>
       <w:r>
         <w:rPr/>
@@ -3147,11 +3125,7 @@
       </w:pPr>
       <w:r>
         <w:rPr/>
-        <w:t xml:space="preserve">4.2 </w:t>
-      </w:r>
-      <w:r>
-        <w:rPr/>
-        <w:t>Характеристика діяльності</w:t>
+        <w:t>4.2 Характеристика діяльності</w:t>
       </w:r>
     </w:p>
     <w:p>
@@ -3496,11 +3470,7 @@
       </w:pPr>
       <w:r>
         <w:rPr/>
-        <w:t xml:space="preserve">4.3 </w:t>
-      </w:r>
-      <w:r>
-        <w:rPr/>
-        <w:t>Терміни та визначення понять</w:t>
+        <w:t>4.3 Терміни та визначення понять</w:t>
       </w:r>
     </w:p>
     <w:p>
@@ -3564,11 +3534,7 @@
       </w:pPr>
       <w:r>
         <w:rPr/>
-        <w:t xml:space="preserve">4.4 </w:t>
-      </w:r>
-      <w:r>
-        <w:rPr/>
-        <w:t>Система управління якістю</w:t>
+        <w:t>4.4 Система управління якістю</w:t>
       </w:r>
     </w:p>
     <w:p>
@@ -3795,11 +3761,7 @@
       </w:pPr>
       <w:r>
         <w:rPr/>
-        <w:t xml:space="preserve">4.5 </w:t>
-      </w:r>
-      <w:r>
-        <w:rPr/>
-        <w:t>Відповідальність керівництва</w:t>
+        <w:t>4.5 Відповідальність керівництва</w:t>
       </w:r>
     </w:p>
     <w:p>
@@ -3841,11 +3803,7 @@
       </w:pPr>
       <w:r>
         <w:rPr/>
-        <w:t xml:space="preserve">4.6 </w:t>
-      </w:r>
-      <w:r>
-        <w:rPr/>
-        <w:t>Керування ресурсами</w:t>
+        <w:t>4.6 Керування ресурсами</w:t>
       </w:r>
     </w:p>
     <w:p>
@@ -3904,11 +3862,7 @@
       </w:pPr>
       <w:r>
         <w:rPr/>
-        <w:t xml:space="preserve">4.7 </w:t>
-      </w:r>
-      <w:r>
-        <w:rPr/>
-        <w:t>Виготовлення продукції</w:t>
+        <w:t>4.7 Виготовлення продукції</w:t>
       </w:r>
     </w:p>
     <w:p>
@@ -3962,11 +3916,7 @@
       </w:pPr>
       <w:r>
         <w:rPr/>
-        <w:t xml:space="preserve">4.8 </w:t>
-      </w:r>
-      <w:r>
-        <w:rPr/>
-        <w:t>Вимірювання, аналізування та поліпшування</w:t>
+        <w:t>4.8 Вимірювання, аналізування та поліпшування</w:t>
       </w:r>
     </w:p>
     <w:p>
@@ -5863,27 +5813,27 @@
       <w:lang w:val="en-US" w:eastAsia="uk-UA"/>
     </w:rPr>
   </w:style>
-  <w:style w:type="character" w:styleId="user">
-    <w:name w:val="Символ нумерації (user)"/>
+  <w:style w:type="character" w:styleId="Style12">
+    <w:name w:val="Символ нумерації"/>
     <w:qFormat/>
     <w:rPr/>
   </w:style>
-  <w:style w:type="character" w:styleId="user1">
+  <w:style w:type="character" w:styleId="Style13">
+    <w:name w:val="Маркери"/>
+    <w:qFormat/>
+    <w:rPr>
+      <w:rFonts w:ascii="OpenSymbol" w:hAnsi="OpenSymbol" w:eastAsia="OpenSymbol" w:cs="OpenSymbol"/>
+    </w:rPr>
+  </w:style>
+  <w:style w:type="character" w:styleId="user">
     <w:name w:val="Маркери (user)"/>
     <w:qFormat/>
     <w:rPr>
       <w:rFonts w:ascii="OpenSymbol" w:hAnsi="OpenSymbol" w:eastAsia="OpenSymbol" w:cs="OpenSymbol"/>
     </w:rPr>
   </w:style>
-  <w:style w:type="character" w:styleId="Style12">
-    <w:name w:val="Маркери"/>
-    <w:qFormat/>
-    <w:rPr>
-      <w:rFonts w:ascii="OpenSymbol" w:hAnsi="OpenSymbol" w:eastAsia="OpenSymbol" w:cs="OpenSymbol"/>
-    </w:rPr>
-  </w:style>
-  <w:style w:type="character" w:styleId="Style13">
-    <w:name w:val="Символ нумерації"/>
+  <w:style w:type="character" w:styleId="user1">
+    <w:name w:val="Символ нумерації (user)"/>
     <w:qFormat/>
     <w:rPr/>
   </w:style>
@@ -5897,7 +5847,7 @@
       <w:spacing w:before="240" w:after="120"/>
     </w:pPr>
     <w:rPr>
-      <w:rFonts w:ascii="Liberation Sans" w:hAnsi="Liberation Sans" w:eastAsia="Microsoft YaHei" w:cs="Arial Unicode MS"/>
+      <w:rFonts w:ascii="Liberation Sans" w:hAnsi="Liberation Sans" w:eastAsia="Microsoft YaHei" w:cs="Lucida Sans"/>
       <w:sz w:val="28"/>
       <w:szCs w:val="28"/>
     </w:rPr>
@@ -5942,7 +5892,7 @@
       <w:suppressLineNumbers/>
     </w:pPr>
     <w:rPr>
-      <w:rFonts w:cs="Arial Unicode MS"/>
+      <w:rFonts w:cs="Lucida Sans"/>
     </w:rPr>
   </w:style>
   <w:style w:type="paragraph" w:styleId="user2">
@@ -5955,7 +5905,7 @@
       <w:spacing w:before="240" w:after="120"/>
     </w:pPr>
     <w:rPr>
-      <w:rFonts w:ascii="Liberation Sans" w:hAnsi="Liberation Sans" w:eastAsia="Microsoft YaHei" w:cs="Lucida Sans"/>
+      <w:rFonts w:ascii="Liberation Sans" w:hAnsi="Liberation Sans" w:eastAsia="Microsoft YaHei" w:cs="Arial Unicode MS"/>
       <w:sz w:val="28"/>
       <w:szCs w:val="28"/>
     </w:rPr>
@@ -5968,12 +5918,12 @@
       <w:suppressLineNumbers/>
     </w:pPr>
     <w:rPr>
-      <w:rFonts w:cs="Lucida Sans"/>
+      <w:rFonts w:cs="Arial Unicode MS"/>
     </w:rPr>
   </w:style>
   <w:style w:type="paragraph" w:styleId="IndexHeading">
     <w:name w:val="index heading"/>
-    <w:basedOn w:val="Style14"/>
+    <w:basedOn w:val="user2"/>
     <w:pPr/>
     <w:rPr/>
   </w:style>
@@ -6251,6 +6201,16 @@
     </w:pPr>
     <w:rPr/>
   </w:style>
+  <w:style w:type="paragraph" w:styleId="Style16">
+    <w:name w:val="Вміст таблиці"/>
+    <w:basedOn w:val="Normal"/>
+    <w:qFormat/>
+    <w:pPr>
+      <w:widowControl w:val="false"/>
+      <w:suppressLineNumbers/>
+    </w:pPr>
+    <w:rPr/>
+  </w:style>
   <w:style w:type="paragraph" w:styleId="user4">
     <w:name w:val="Вміст таблиці (user)"/>
     <w:basedOn w:val="Normal"/>
@@ -6261,19 +6221,9 @@
     </w:pPr>
     <w:rPr/>
   </w:style>
-  <w:style w:type="paragraph" w:styleId="Style16">
-    <w:name w:val="Вміст таблиці"/>
-    <w:basedOn w:val="Normal"/>
-    <w:qFormat/>
-    <w:pPr>
-      <w:widowControl w:val="false"/>
-      <w:suppressLineNumbers/>
-    </w:pPr>
-    <w:rPr/>
-  </w:style>
-  <w:style w:type="paragraph" w:styleId="Style17">
-    <w:name w:val="Заголовок таблиці"/>
-    <w:basedOn w:val="Style16"/>
+  <w:style w:type="paragraph" w:styleId="user5">
+    <w:name w:val="Заголовок таблиці (user)"/>
+    <w:basedOn w:val="user4"/>
     <w:qFormat/>
     <w:pPr>
       <w:suppressLineNumbers/>
@@ -6284,8 +6234,8 @@
       <w:bCs/>
     </w:rPr>
   </w:style>
-  <w:style w:type="numbering" w:styleId="Style18" w:default="1">
-    <w:name w:val="Без маркерів"/>
+  <w:style w:type="numbering" w:styleId="user6" w:default="1">
+    <w:name w:val="Без маркерів (user)"/>
     <w:uiPriority w:val="99"/>
     <w:semiHidden/>
     <w:unhideWhenUsed/>

</xml_diff>

<commit_message>
docs: SP1 tasks done
</commit_message>
<xml_diff>
--- a/51SP Sertyficazija PZ/1/SP1_KNT-116m_Onyshchenko_15.docx
+++ b/51SP Sertyficazija PZ/1/SP1_KNT-116m_Onyshchenko_15.docx
@@ -252,15 +252,7 @@
       </w:pPr>
       <w:r>
         <w:rPr/>
-        <w:t>Студент КНТ-</w:t>
-      </w:r>
-      <w:r>
-        <w:rPr/>
-        <w:t>116м</w:t>
-      </w:r>
-      <w:r>
-        <w:rPr/>
-        <w:t xml:space="preserve"> </w:t>
+        <w:t xml:space="preserve">Студент КНТ-116м </w:t>
         <w:tab/>
         <w:tab/>
         <w:tab/>
@@ -794,7 +786,15 @@
       </w:pPr>
       <w:r>
         <w:rPr/>
-        <w:t xml:space="preserve">Створена медіа компанія займається новинами Запорізької області. Компанією керує директор, він займається системою управління якістю. У компанії є ІТ відділ (складається з двох осіб: один відповідальний за фронтенд та публікацію новин, другий за бекенд) цей відділ відповідальний за розробку та підтримку вебсайту компанії та публікації новин на сторінках у соціальних мережах: </w:t>
+        <w:t xml:space="preserve">Створена медіа компанія займається новинами Запорізької області. Компанією керує директор, він займається системою управління якістю. У компанії є ІТ відділ (складається з двох осіб: один відповідальний за фронтенд та публікацію новин, другий за бекенд), </w:t>
+      </w:r>
+      <w:r>
+        <w:rPr/>
+        <w:t>який</w:t>
+      </w:r>
+      <w:r>
+        <w:rPr/>
+        <w:t xml:space="preserve"> відповідальний за розробку та підтримку вебсайту компанії та публікації новин на сторінках у соціальних мережах: </w:t>
       </w:r>
       <w:r>
         <w:rPr>
@@ -1425,76 +1425,27 @@
       </w:pPr>
       <w:r>
         <w:rPr/>
-        <w:t>Спочатку потрібно визначити ролі користувачів компанії:</w:t>
+        <w:t>Цілі в галузі якості описані у таблиці 1.1.</w:t>
       </w:r>
     </w:p>
     <w:p>
       <w:pPr>
         <w:pStyle w:val="p11"/>
-        <w:widowControl/>
-        <w:numPr>
-          <w:ilvl w:val="0"/>
-          <w:numId w:val="6"/>
-        </w:numPr>
-        <w:suppressAutoHyphens w:val="true"/>
-        <w:bidi w:val="0"/>
-        <w:spacing w:lineRule="auto" w:line="360" w:before="0" w:after="0"/>
-        <w:ind w:firstLine="850" w:left="0" w:right="0"/>
-        <w:jc w:val="left"/>
-        <w:rPr/>
-      </w:pPr>
-      <w:r>
-        <w:rPr/>
-        <w:t>команда — працівники організації з будь-якого відділу;</w:t>
+        <w:rPr/>
+      </w:pPr>
+      <w:r>
+        <w:rPr/>
       </w:r>
     </w:p>
     <w:p>
       <w:pPr>
         <w:pStyle w:val="p11"/>
-        <w:widowControl/>
-        <w:numPr>
-          <w:ilvl w:val="0"/>
-          <w:numId w:val="6"/>
-        </w:numPr>
-        <w:suppressAutoHyphens w:val="true"/>
-        <w:bidi w:val="0"/>
-        <w:spacing w:lineRule="auto" w:line="360" w:before="0" w:after="0"/>
-        <w:ind w:firstLine="850" w:left="0" w:right="0"/>
-        <w:jc w:val="left"/>
-        <w:rPr/>
-      </w:pPr>
-      <w:r>
-        <w:rPr/>
-        <w:t>споживач — людина, яка користується сайтом чи каналами в соціальних мережах.</w:t>
-      </w:r>
-    </w:p>
-    <w:p>
-      <w:pPr>
-        <w:pStyle w:val="p11"/>
-        <w:rPr/>
-      </w:pPr>
-      <w:r>
-        <w:rPr/>
-        <w:t>Цілі в галузі якості описані у таблиці 1.1.</w:t>
-      </w:r>
-    </w:p>
-    <w:p>
-      <w:pPr>
-        <w:pStyle w:val="p11"/>
-        <w:rPr/>
-      </w:pPr>
-      <w:r>
-        <w:rPr/>
-      </w:r>
-    </w:p>
-    <w:p>
-      <w:pPr>
-        <w:pStyle w:val="p11"/>
         <w:rPr/>
       </w:pPr>
       <w:r>
         <w:rPr/>
         <w:t>Таблиця 1.1 — Цілі в галузі якості та відповідні показники ступеня їх досягнення</w:t>
+        <w:tab/>
       </w:r>
     </w:p>
     <w:tbl>
@@ -1511,11 +1462,10 @@
         </w:tblCellMar>
       </w:tblPr>
       <w:tblGrid>
-        <w:gridCol w:w="369"/>
-        <w:gridCol w:w="1177"/>
-        <w:gridCol w:w="5757"/>
+        <w:gridCol w:w="372"/>
+        <w:gridCol w:w="6350"/>
         <w:gridCol w:w="1992"/>
-        <w:gridCol w:w="2323"/>
+        <w:gridCol w:w="2904"/>
       </w:tblGrid>
       <w:tr>
         <w:trPr>
@@ -1523,7 +1473,7 @@
         </w:trPr>
         <w:tc>
           <w:tcPr>
-            <w:tcW w:w="369" w:type="dxa"/>
+            <w:tcW w:w="372" w:type="dxa"/>
             <w:tcBorders>
               <w:top w:val="single" w:sz="4" w:space="0" w:color="000000"/>
               <w:left w:val="single" w:sz="4" w:space="0" w:color="000000"/>
@@ -1533,7 +1483,7 @@
           </w:tcPr>
           <w:p>
             <w:pPr>
-              <w:pStyle w:val="Style16"/>
+              <w:pStyle w:val="user4"/>
               <w:spacing w:lineRule="auto" w:line="240"/>
               <w:ind w:hanging="0" w:left="0"/>
               <w:jc w:val="center"/>
@@ -1559,7 +1509,7 @@
         </w:tc>
         <w:tc>
           <w:tcPr>
-            <w:tcW w:w="1177" w:type="dxa"/>
+            <w:tcW w:w="6350" w:type="dxa"/>
             <w:tcBorders>
               <w:top w:val="single" w:sz="4" w:space="0" w:color="000000"/>
               <w:left w:val="single" w:sz="4" w:space="0" w:color="000000"/>
@@ -1569,39 +1519,7 @@
           </w:tcPr>
           <w:p>
             <w:pPr>
-              <w:pStyle w:val="Style16"/>
-              <w:spacing w:lineRule="auto" w:line="240"/>
-              <w:ind w:hanging="0" w:left="0"/>
-              <w:jc w:val="center"/>
-              <w:rPr>
-                <w:b/>
-                <w:bCs/>
-              </w:rPr>
-            </w:pPr>
-            <w:r>
-              <w:rPr>
-                <w:b/>
-                <w:bCs/>
-                <w:sz w:val="24"/>
-                <w:szCs w:val="24"/>
-              </w:rPr>
-              <w:t>Роль</w:t>
-            </w:r>
-          </w:p>
-        </w:tc>
-        <w:tc>
-          <w:tcPr>
-            <w:tcW w:w="5757" w:type="dxa"/>
-            <w:tcBorders>
-              <w:top w:val="single" w:sz="4" w:space="0" w:color="000000"/>
-              <w:left w:val="single" w:sz="4" w:space="0" w:color="000000"/>
-              <w:bottom w:val="single" w:sz="4" w:space="0" w:color="000000"/>
-            </w:tcBorders>
-            <w:vAlign w:val="center"/>
-          </w:tcPr>
-          <w:p>
-            <w:pPr>
-              <w:pStyle w:val="Style16"/>
+              <w:pStyle w:val="user4"/>
               <w:spacing w:lineRule="auto" w:line="240"/>
               <w:ind w:hanging="0" w:left="0"/>
               <w:jc w:val="center"/>
@@ -1635,7 +1553,7 @@
           </w:tcPr>
           <w:p>
             <w:pPr>
-              <w:pStyle w:val="Style16"/>
+              <w:pStyle w:val="user4"/>
               <w:spacing w:lineRule="auto" w:line="240"/>
               <w:ind w:hanging="0" w:left="0"/>
               <w:jc w:val="center"/>
@@ -1659,7 +1577,7 @@
         </w:tc>
         <w:tc>
           <w:tcPr>
-            <w:tcW w:w="2323" w:type="dxa"/>
+            <w:tcW w:w="2904" w:type="dxa"/>
             <w:tcBorders>
               <w:top w:val="single" w:sz="4" w:space="0" w:color="000000"/>
               <w:left w:val="single" w:sz="4" w:space="0" w:color="000000"/>
@@ -1697,7 +1615,7 @@
         <w:trPr/>
         <w:tc>
           <w:tcPr>
-            <w:tcW w:w="369" w:type="dxa"/>
+            <w:tcW w:w="372" w:type="dxa"/>
             <w:tcBorders>
               <w:left w:val="single" w:sz="4" w:space="0" w:color="000000"/>
               <w:bottom w:val="single" w:sz="4" w:space="0" w:color="000000"/>
@@ -1706,7 +1624,7 @@
           </w:tcPr>
           <w:p>
             <w:pPr>
-              <w:pStyle w:val="Style16"/>
+              <w:pStyle w:val="user4"/>
               <w:spacing w:lineRule="auto" w:line="240"/>
               <w:ind w:hanging="0" w:left="0"/>
               <w:rPr>
@@ -1725,7 +1643,7 @@
         </w:tc>
         <w:tc>
           <w:tcPr>
-            <w:tcW w:w="1177" w:type="dxa"/>
+            <w:tcW w:w="6350" w:type="dxa"/>
             <w:tcBorders>
               <w:left w:val="single" w:sz="4" w:space="0" w:color="000000"/>
               <w:bottom w:val="single" w:sz="4" w:space="0" w:color="000000"/>
@@ -1734,7 +1652,7 @@
           </w:tcPr>
           <w:p>
             <w:pPr>
-              <w:pStyle w:val="Style16"/>
+              <w:pStyle w:val="user4"/>
               <w:spacing w:lineRule="auto" w:line="240"/>
               <w:ind w:hanging="0" w:left="0"/>
               <w:rPr>
@@ -1747,35 +1665,7 @@
                 <w:sz w:val="24"/>
                 <w:szCs w:val="24"/>
               </w:rPr>
-              <w:t>Команда</w:t>
-            </w:r>
-          </w:p>
-        </w:tc>
-        <w:tc>
-          <w:tcPr>
-            <w:tcW w:w="5757" w:type="dxa"/>
-            <w:tcBorders>
-              <w:left w:val="single" w:sz="4" w:space="0" w:color="000000"/>
-              <w:bottom w:val="single" w:sz="4" w:space="0" w:color="000000"/>
-            </w:tcBorders>
-            <w:vAlign w:val="center"/>
-          </w:tcPr>
-          <w:p>
-            <w:pPr>
-              <w:pStyle w:val="Style16"/>
-              <w:spacing w:lineRule="auto" w:line="240"/>
-              <w:ind w:hanging="0" w:left="0"/>
-              <w:rPr>
-                <w:sz w:val="24"/>
-                <w:szCs w:val="24"/>
-              </w:rPr>
-            </w:pPr>
-            <w:r>
-              <w:rPr>
-                <w:sz w:val="24"/>
-                <w:szCs w:val="24"/>
-              </w:rPr>
-              <w:t>Система керування контентом має містити форми для додавання новин у зручному місці</w:t>
+              <w:t>Забезпечити роботу сайту у 99% випадків на добу</w:t>
             </w:r>
           </w:p>
         </w:tc>
@@ -1790,7 +1680,7 @@
           </w:tcPr>
           <w:p>
             <w:pPr>
-              <w:pStyle w:val="Style16"/>
+              <w:pStyle w:val="user4"/>
               <w:spacing w:lineRule="auto" w:line="240"/>
               <w:ind w:hanging="0" w:left="0"/>
               <w:rPr>
@@ -1803,13 +1693,20 @@
                 <w:sz w:val="24"/>
                 <w:szCs w:val="24"/>
               </w:rPr>
-              <w:t>До кінця кварталу</w:t>
+              <w:t xml:space="preserve">До кінця </w:t>
+            </w:r>
+            <w:r>
+              <w:rPr>
+                <w:sz w:val="24"/>
+                <w:szCs w:val="24"/>
+              </w:rPr>
+              <w:t>місяця</w:t>
             </w:r>
           </w:p>
         </w:tc>
         <w:tc>
           <w:tcPr>
-            <w:tcW w:w="2323" w:type="dxa"/>
+            <w:tcW w:w="2904" w:type="dxa"/>
             <w:tcBorders>
               <w:left w:val="single" w:sz="4" w:space="0" w:color="000000"/>
               <w:bottom w:val="single" w:sz="4" w:space="0" w:color="000000"/>
@@ -1832,7 +1729,7 @@
                 <w:sz w:val="24"/>
                 <w:szCs w:val="24"/>
               </w:rPr>
-              <w:t>Система керування контентом містить спеціальну форму для додавання нових статей на сайт</w:t>
+              <w:t>Сайт працює у 99% випадків на добу</w:t>
             </w:r>
           </w:p>
         </w:tc>
@@ -1841,7 +1738,7 @@
         <w:trPr/>
         <w:tc>
           <w:tcPr>
-            <w:tcW w:w="369" w:type="dxa"/>
+            <w:tcW w:w="372" w:type="dxa"/>
             <w:tcBorders>
               <w:left w:val="single" w:sz="4" w:space="0" w:color="000000"/>
               <w:bottom w:val="single" w:sz="4" w:space="0" w:color="000000"/>
@@ -1850,7 +1747,7 @@
           </w:tcPr>
           <w:p>
             <w:pPr>
-              <w:pStyle w:val="Style16"/>
+              <w:pStyle w:val="user4"/>
               <w:spacing w:lineRule="auto" w:line="240"/>
               <w:ind w:hanging="0" w:left="0"/>
               <w:rPr>
@@ -1869,7 +1766,7 @@
         </w:tc>
         <w:tc>
           <w:tcPr>
-            <w:tcW w:w="1177" w:type="dxa"/>
+            <w:tcW w:w="6350" w:type="dxa"/>
             <w:tcBorders>
               <w:left w:val="single" w:sz="4" w:space="0" w:color="000000"/>
               <w:bottom w:val="single" w:sz="4" w:space="0" w:color="000000"/>
@@ -1878,7 +1775,7 @@
           </w:tcPr>
           <w:p>
             <w:pPr>
-              <w:pStyle w:val="Style16"/>
+              <w:pStyle w:val="user4"/>
               <w:spacing w:lineRule="auto" w:line="240"/>
               <w:ind w:hanging="0" w:left="0"/>
               <w:rPr>
@@ -1891,35 +1788,21 @@
                 <w:sz w:val="24"/>
                 <w:szCs w:val="24"/>
               </w:rPr>
-              <w:t>Споживач</w:t>
+              <w:t xml:space="preserve">Забезпечити </w:t>
             </w:r>
-          </w:p>
-        </w:tc>
-        <w:tc>
-          <w:tcPr>
-            <w:tcW w:w="5757" w:type="dxa"/>
-            <w:tcBorders>
-              <w:left w:val="single" w:sz="4" w:space="0" w:color="000000"/>
-              <w:bottom w:val="single" w:sz="4" w:space="0" w:color="000000"/>
-            </w:tcBorders>
-            <w:vAlign w:val="center"/>
-          </w:tcPr>
-          <w:p>
-            <w:pPr>
-              <w:pStyle w:val="p11"/>
-              <w:spacing w:lineRule="auto" w:line="240"/>
-              <w:ind w:hanging="0" w:left="0"/>
-              <w:rPr>
-                <w:sz w:val="24"/>
-                <w:szCs w:val="24"/>
-              </w:rPr>
-            </w:pPr>
             <w:r>
               <w:rPr>
                 <w:sz w:val="24"/>
                 <w:szCs w:val="24"/>
               </w:rPr>
-              <w:t>Новина має бути викладена зрозумілою мовою</w:t>
+              <w:t>наявність</w:t>
+            </w:r>
+            <w:r>
+              <w:rPr>
+                <w:sz w:val="24"/>
+                <w:szCs w:val="24"/>
+              </w:rPr>
+              <w:t xml:space="preserve"> хоча б одної фотографії для кожної новинної статті</w:t>
             </w:r>
           </w:p>
         </w:tc>
@@ -1934,7 +1817,7 @@
           </w:tcPr>
           <w:p>
             <w:pPr>
-              <w:pStyle w:val="p11"/>
+              <w:pStyle w:val="user4"/>
               <w:spacing w:lineRule="auto" w:line="240"/>
               <w:ind w:hanging="0" w:left="0"/>
               <w:rPr>
@@ -1953,7 +1836,7 @@
         </w:tc>
         <w:tc>
           <w:tcPr>
-            <w:tcW w:w="2323" w:type="dxa"/>
+            <w:tcW w:w="2904" w:type="dxa"/>
             <w:tcBorders>
               <w:left w:val="single" w:sz="4" w:space="0" w:color="000000"/>
               <w:bottom w:val="single" w:sz="4" w:space="0" w:color="000000"/>
@@ -1976,7 +1859,7 @@
                 <w:sz w:val="24"/>
                 <w:szCs w:val="24"/>
               </w:rPr>
-              <w:t>Новина займає не більше ніж 3 хвилини на прочитання</w:t>
+              <w:t>Кожна новина містить хоча б оду фотографію</w:t>
             </w:r>
           </w:p>
         </w:tc>
@@ -1985,7 +1868,7 @@
         <w:trPr/>
         <w:tc>
           <w:tcPr>
-            <w:tcW w:w="369" w:type="dxa"/>
+            <w:tcW w:w="372" w:type="dxa"/>
             <w:tcBorders>
               <w:left w:val="single" w:sz="4" w:space="0" w:color="000000"/>
               <w:bottom w:val="single" w:sz="4" w:space="0" w:color="000000"/>
@@ -1994,7 +1877,7 @@
           </w:tcPr>
           <w:p>
             <w:pPr>
-              <w:pStyle w:val="Style16"/>
+              <w:pStyle w:val="user4"/>
               <w:spacing w:lineRule="auto" w:line="240"/>
               <w:ind w:hanging="0" w:left="0"/>
               <w:rPr>
@@ -2013,7 +1896,7 @@
         </w:tc>
         <w:tc>
           <w:tcPr>
-            <w:tcW w:w="1177" w:type="dxa"/>
+            <w:tcW w:w="6350" w:type="dxa"/>
             <w:tcBorders>
               <w:left w:val="single" w:sz="4" w:space="0" w:color="000000"/>
               <w:bottom w:val="single" w:sz="4" w:space="0" w:color="000000"/>
@@ -2022,7 +1905,7 @@
           </w:tcPr>
           <w:p>
             <w:pPr>
-              <w:pStyle w:val="Style16"/>
+              <w:pStyle w:val="user4"/>
               <w:spacing w:lineRule="auto" w:line="240"/>
               <w:ind w:hanging="0" w:left="0"/>
               <w:rPr>
@@ -2035,35 +1918,7 @@
                 <w:sz w:val="24"/>
                 <w:szCs w:val="24"/>
               </w:rPr>
-              <w:t>Споживач</w:t>
-            </w:r>
-          </w:p>
-        </w:tc>
-        <w:tc>
-          <w:tcPr>
-            <w:tcW w:w="5757" w:type="dxa"/>
-            <w:tcBorders>
-              <w:left w:val="single" w:sz="4" w:space="0" w:color="000000"/>
-              <w:bottom w:val="single" w:sz="4" w:space="0" w:color="000000"/>
-            </w:tcBorders>
-            <w:vAlign w:val="center"/>
-          </w:tcPr>
-          <w:p>
-            <w:pPr>
-              <w:pStyle w:val="p11"/>
-              <w:spacing w:lineRule="auto" w:line="240"/>
-              <w:ind w:hanging="0" w:left="0"/>
-              <w:rPr>
-                <w:sz w:val="24"/>
-                <w:szCs w:val="24"/>
-              </w:rPr>
-            </w:pPr>
-            <w:r>
-              <w:rPr>
-                <w:sz w:val="24"/>
-                <w:szCs w:val="24"/>
-              </w:rPr>
-              <w:t>Новина має бути актуальною</w:t>
+              <w:t>Підвищити рівень задоволеності клієнтів веб-сайту</w:t>
             </w:r>
           </w:p>
         </w:tc>
@@ -2078,7 +1933,7 @@
           </w:tcPr>
           <w:p>
             <w:pPr>
-              <w:pStyle w:val="p11"/>
+              <w:pStyle w:val="user4"/>
               <w:spacing w:lineRule="auto" w:line="240"/>
               <w:ind w:hanging="0" w:left="0"/>
               <w:rPr>
@@ -2091,13 +1946,13 @@
                 <w:sz w:val="24"/>
                 <w:szCs w:val="24"/>
               </w:rPr>
-              <w:t>До кінця тижня</w:t>
+              <w:t>До кінця року</w:t>
             </w:r>
           </w:p>
         </w:tc>
         <w:tc>
           <w:tcPr>
-            <w:tcW w:w="2323" w:type="dxa"/>
+            <w:tcW w:w="2904" w:type="dxa"/>
             <w:tcBorders>
               <w:left w:val="single" w:sz="4" w:space="0" w:color="000000"/>
               <w:bottom w:val="single" w:sz="4" w:space="0" w:color="000000"/>
@@ -2120,7 +1975,7 @@
                 <w:sz w:val="24"/>
                 <w:szCs w:val="24"/>
               </w:rPr>
-              <w:t>Новина є актуальною на поточний час</w:t>
+              <w:t>Відгуки користувачів після прочитання статті в середньому є більше 4 балів з 5-и</w:t>
             </w:r>
           </w:p>
         </w:tc>
@@ -2129,7 +1984,7 @@
         <w:trPr/>
         <w:tc>
           <w:tcPr>
-            <w:tcW w:w="369" w:type="dxa"/>
+            <w:tcW w:w="372" w:type="dxa"/>
             <w:tcBorders>
               <w:left w:val="single" w:sz="4" w:space="0" w:color="000000"/>
               <w:bottom w:val="single" w:sz="4" w:space="0" w:color="000000"/>
@@ -2138,7 +1993,7 @@
           </w:tcPr>
           <w:p>
             <w:pPr>
-              <w:pStyle w:val="Style16"/>
+              <w:pStyle w:val="user4"/>
               <w:spacing w:lineRule="auto" w:line="240"/>
               <w:ind w:hanging="0" w:left="0"/>
               <w:rPr>
@@ -2157,7 +2012,7 @@
         </w:tc>
         <w:tc>
           <w:tcPr>
-            <w:tcW w:w="1177" w:type="dxa"/>
+            <w:tcW w:w="6350" w:type="dxa"/>
             <w:tcBorders>
               <w:left w:val="single" w:sz="4" w:space="0" w:color="000000"/>
               <w:bottom w:val="single" w:sz="4" w:space="0" w:color="000000"/>
@@ -2166,7 +2021,7 @@
           </w:tcPr>
           <w:p>
             <w:pPr>
-              <w:pStyle w:val="Style16"/>
+              <w:pStyle w:val="user4"/>
               <w:spacing w:lineRule="auto" w:line="240"/>
               <w:ind w:hanging="0" w:left="0"/>
               <w:rPr>
@@ -2179,35 +2034,7 @@
                 <w:sz w:val="24"/>
                 <w:szCs w:val="24"/>
               </w:rPr>
-              <w:t>Споживач</w:t>
-            </w:r>
-          </w:p>
-        </w:tc>
-        <w:tc>
-          <w:tcPr>
-            <w:tcW w:w="5757" w:type="dxa"/>
-            <w:tcBorders>
-              <w:left w:val="single" w:sz="4" w:space="0" w:color="000000"/>
-              <w:bottom w:val="single" w:sz="4" w:space="0" w:color="000000"/>
-            </w:tcBorders>
-            <w:vAlign w:val="center"/>
-          </w:tcPr>
-          <w:p>
-            <w:pPr>
-              <w:pStyle w:val="p11"/>
-              <w:spacing w:lineRule="auto" w:line="240"/>
-              <w:ind w:hanging="0" w:left="0"/>
-              <w:rPr>
-                <w:sz w:val="24"/>
-                <w:szCs w:val="24"/>
-              </w:rPr>
-            </w:pPr>
-            <w:r>
-              <w:rPr>
-                <w:sz w:val="24"/>
-                <w:szCs w:val="24"/>
-              </w:rPr>
-              <w:t>Новина має охоплювати як мінімум 2 тисячі читачів</w:t>
+              <w:t>Підвищити оперативність публікації новин</w:t>
             </w:r>
           </w:p>
         </w:tc>
@@ -2222,7 +2049,7 @@
           </w:tcPr>
           <w:p>
             <w:pPr>
-              <w:pStyle w:val="p11"/>
+              <w:pStyle w:val="user4"/>
               <w:spacing w:lineRule="auto" w:line="240"/>
               <w:ind w:hanging="0" w:left="0"/>
               <w:rPr>
@@ -2241,7 +2068,7 @@
         </w:tc>
         <w:tc>
           <w:tcPr>
-            <w:tcW w:w="2323" w:type="dxa"/>
+            <w:tcW w:w="2904" w:type="dxa"/>
             <w:tcBorders>
               <w:left w:val="single" w:sz="4" w:space="0" w:color="000000"/>
               <w:bottom w:val="single" w:sz="4" w:space="0" w:color="000000"/>
@@ -2264,7 +2091,7 @@
                 <w:sz w:val="24"/>
                 <w:szCs w:val="24"/>
               </w:rPr>
-              <w:t>Новина охоплює хоча б 1,8 тисяч читачів на місяць</w:t>
+              <w:t>Новина публікується не більше ніж за 3 години після її знахідки</w:t>
             </w:r>
           </w:p>
         </w:tc>
@@ -2273,7 +2100,7 @@
         <w:trPr/>
         <w:tc>
           <w:tcPr>
-            <w:tcW w:w="369" w:type="dxa"/>
+            <w:tcW w:w="372" w:type="dxa"/>
             <w:tcBorders>
               <w:left w:val="single" w:sz="4" w:space="0" w:color="000000"/>
               <w:bottom w:val="single" w:sz="4" w:space="0" w:color="000000"/>
@@ -2282,7 +2109,7 @@
           </w:tcPr>
           <w:p>
             <w:pPr>
-              <w:pStyle w:val="Style16"/>
+              <w:pStyle w:val="user4"/>
               <w:spacing w:lineRule="auto" w:line="240"/>
               <w:ind w:hanging="0" w:left="0"/>
               <w:rPr>
@@ -2301,7 +2128,7 @@
         </w:tc>
         <w:tc>
           <w:tcPr>
-            <w:tcW w:w="1177" w:type="dxa"/>
+            <w:tcW w:w="6350" w:type="dxa"/>
             <w:tcBorders>
               <w:left w:val="single" w:sz="4" w:space="0" w:color="000000"/>
               <w:bottom w:val="single" w:sz="4" w:space="0" w:color="000000"/>
@@ -2310,7 +2137,7 @@
           </w:tcPr>
           <w:p>
             <w:pPr>
-              <w:pStyle w:val="Style16"/>
+              <w:pStyle w:val="user4"/>
               <w:spacing w:lineRule="auto" w:line="240"/>
               <w:ind w:hanging="0" w:left="0"/>
               <w:rPr>
@@ -2323,35 +2150,7 @@
                 <w:sz w:val="24"/>
                 <w:szCs w:val="24"/>
               </w:rPr>
-              <w:t>Команда</w:t>
-            </w:r>
-          </w:p>
-        </w:tc>
-        <w:tc>
-          <w:tcPr>
-            <w:tcW w:w="5757" w:type="dxa"/>
-            <w:tcBorders>
-              <w:left w:val="single" w:sz="4" w:space="0" w:color="000000"/>
-              <w:bottom w:val="single" w:sz="4" w:space="0" w:color="000000"/>
-            </w:tcBorders>
-            <w:vAlign w:val="center"/>
-          </w:tcPr>
-          <w:p>
-            <w:pPr>
-              <w:pStyle w:val="p11"/>
-              <w:spacing w:lineRule="auto" w:line="240"/>
-              <w:ind w:hanging="0" w:left="0"/>
-              <w:rPr>
-                <w:sz w:val="24"/>
-                <w:szCs w:val="24"/>
-              </w:rPr>
-            </w:pPr>
-            <w:r>
-              <w:rPr>
-                <w:sz w:val="24"/>
-                <w:szCs w:val="24"/>
-              </w:rPr>
-              <w:t>Веб-сайт компанії має працювати у 99% часу доби</w:t>
+              <w:t>Підвищити кількість читачів до п’ятої частини мешканців області</w:t>
             </w:r>
           </w:p>
         </w:tc>
@@ -2366,7 +2165,7 @@
           </w:tcPr>
           <w:p>
             <w:pPr>
-              <w:pStyle w:val="p11"/>
+              <w:pStyle w:val="user4"/>
               <w:spacing w:lineRule="auto" w:line="240"/>
               <w:ind w:hanging="0" w:left="0"/>
               <w:rPr>
@@ -2379,13 +2178,13 @@
                 <w:sz w:val="24"/>
                 <w:szCs w:val="24"/>
               </w:rPr>
-              <w:t>До кінця кварталу</w:t>
+              <w:t>До кінця року</w:t>
             </w:r>
           </w:p>
         </w:tc>
         <w:tc>
           <w:tcPr>
-            <w:tcW w:w="2323" w:type="dxa"/>
+            <w:tcW w:w="2904" w:type="dxa"/>
             <w:tcBorders>
               <w:left w:val="single" w:sz="4" w:space="0" w:color="000000"/>
               <w:bottom w:val="single" w:sz="4" w:space="0" w:color="000000"/>
@@ -2408,295 +2207,7 @@
                 <w:sz w:val="24"/>
                 <w:szCs w:val="24"/>
               </w:rPr>
-              <w:t>Веб-сайт працює у 99% випадків за добу</w:t>
-            </w:r>
-          </w:p>
-        </w:tc>
-      </w:tr>
-      <w:tr>
-        <w:trPr/>
-        <w:tc>
-          <w:tcPr>
-            <w:tcW w:w="369" w:type="dxa"/>
-            <w:tcBorders>
-              <w:left w:val="single" w:sz="4" w:space="0" w:color="000000"/>
-              <w:bottom w:val="single" w:sz="4" w:space="0" w:color="000000"/>
-            </w:tcBorders>
-            <w:vAlign w:val="center"/>
-          </w:tcPr>
-          <w:p>
-            <w:pPr>
-              <w:pStyle w:val="Style16"/>
-              <w:spacing w:lineRule="auto" w:line="240"/>
-              <w:ind w:hanging="0" w:left="0"/>
-              <w:rPr>
-                <w:sz w:val="24"/>
-                <w:szCs w:val="24"/>
-              </w:rPr>
-            </w:pPr>
-            <w:r>
-              <w:rPr>
-                <w:sz w:val="24"/>
-                <w:szCs w:val="24"/>
-              </w:rPr>
-              <w:t>6</w:t>
-            </w:r>
-          </w:p>
-        </w:tc>
-        <w:tc>
-          <w:tcPr>
-            <w:tcW w:w="1177" w:type="dxa"/>
-            <w:tcBorders>
-              <w:left w:val="single" w:sz="4" w:space="0" w:color="000000"/>
-              <w:bottom w:val="single" w:sz="4" w:space="0" w:color="000000"/>
-            </w:tcBorders>
-            <w:vAlign w:val="center"/>
-          </w:tcPr>
-          <w:p>
-            <w:pPr>
-              <w:pStyle w:val="Style16"/>
-              <w:spacing w:lineRule="auto" w:line="240"/>
-              <w:ind w:hanging="0" w:left="0"/>
-              <w:rPr>
-                <w:sz w:val="24"/>
-                <w:szCs w:val="24"/>
-              </w:rPr>
-            </w:pPr>
-            <w:r>
-              <w:rPr>
-                <w:sz w:val="24"/>
-                <w:szCs w:val="24"/>
-              </w:rPr>
-              <w:t>Споживач</w:t>
-            </w:r>
-          </w:p>
-        </w:tc>
-        <w:tc>
-          <w:tcPr>
-            <w:tcW w:w="5757" w:type="dxa"/>
-            <w:tcBorders>
-              <w:left w:val="single" w:sz="4" w:space="0" w:color="000000"/>
-              <w:bottom w:val="single" w:sz="4" w:space="0" w:color="000000"/>
-            </w:tcBorders>
-            <w:vAlign w:val="center"/>
-          </w:tcPr>
-          <w:p>
-            <w:pPr>
-              <w:pStyle w:val="p11"/>
-              <w:spacing w:lineRule="auto" w:line="240"/>
-              <w:ind w:hanging="0" w:left="0"/>
-              <w:rPr>
-                <w:sz w:val="24"/>
-                <w:szCs w:val="24"/>
-              </w:rPr>
-            </w:pPr>
-            <w:r>
-              <w:rPr>
-                <w:sz w:val="24"/>
-                <w:szCs w:val="24"/>
-              </w:rPr>
-              <w:t>Новини мають публікуватися оперативно</w:t>
-            </w:r>
-          </w:p>
-        </w:tc>
-        <w:tc>
-          <w:tcPr>
-            <w:tcW w:w="1992" w:type="dxa"/>
-            <w:tcBorders>
-              <w:left w:val="single" w:sz="4" w:space="0" w:color="000000"/>
-              <w:bottom w:val="single" w:sz="4" w:space="0" w:color="000000"/>
-            </w:tcBorders>
-            <w:vAlign w:val="center"/>
-          </w:tcPr>
-          <w:p>
-            <w:pPr>
-              <w:pStyle w:val="p11"/>
-              <w:spacing w:lineRule="auto" w:line="240"/>
-              <w:ind w:hanging="0" w:left="0"/>
-              <w:rPr>
-                <w:sz w:val="24"/>
-                <w:szCs w:val="24"/>
-              </w:rPr>
-            </w:pPr>
-            <w:r>
-              <w:rPr>
-                <w:sz w:val="24"/>
-                <w:szCs w:val="24"/>
-              </w:rPr>
-              <w:t>До кінця тижня</w:t>
-            </w:r>
-          </w:p>
-        </w:tc>
-        <w:tc>
-          <w:tcPr>
-            <w:tcW w:w="2323" w:type="dxa"/>
-            <w:tcBorders>
-              <w:left w:val="single" w:sz="4" w:space="0" w:color="000000"/>
-              <w:bottom w:val="single" w:sz="4" w:space="0" w:color="000000"/>
-              <w:right w:val="single" w:sz="4" w:space="0" w:color="000000"/>
-            </w:tcBorders>
-            <w:vAlign w:val="center"/>
-          </w:tcPr>
-          <w:p>
-            <w:pPr>
-              <w:pStyle w:val="p11"/>
-              <w:spacing w:lineRule="auto" w:line="240"/>
-              <w:ind w:hanging="0" w:left="0"/>
-              <w:rPr>
-                <w:sz w:val="24"/>
-                <w:szCs w:val="24"/>
-              </w:rPr>
-            </w:pPr>
-            <w:r>
-              <w:rPr>
-                <w:sz w:val="24"/>
-                <w:szCs w:val="24"/>
-              </w:rPr>
-              <w:t>Новина опублікована менше ніж за 2 години після її отримання</w:t>
-            </w:r>
-          </w:p>
-        </w:tc>
-      </w:tr>
-      <w:tr>
-        <w:trPr/>
-        <w:tc>
-          <w:tcPr>
-            <w:tcW w:w="369" w:type="dxa"/>
-            <w:tcBorders>
-              <w:left w:val="single" w:sz="4" w:space="0" w:color="000000"/>
-              <w:bottom w:val="single" w:sz="4" w:space="0" w:color="000000"/>
-            </w:tcBorders>
-            <w:vAlign w:val="center"/>
-          </w:tcPr>
-          <w:p>
-            <w:pPr>
-              <w:pStyle w:val="Style16"/>
-              <w:spacing w:lineRule="auto" w:line="240"/>
-              <w:ind w:hanging="0" w:left="0"/>
-              <w:rPr>
-                <w:sz w:val="24"/>
-                <w:szCs w:val="24"/>
-              </w:rPr>
-            </w:pPr>
-            <w:r>
-              <w:rPr>
-                <w:sz w:val="24"/>
-                <w:szCs w:val="24"/>
-              </w:rPr>
-              <w:t>7</w:t>
-            </w:r>
-          </w:p>
-        </w:tc>
-        <w:tc>
-          <w:tcPr>
-            <w:tcW w:w="1177" w:type="dxa"/>
-            <w:tcBorders>
-              <w:left w:val="single" w:sz="4" w:space="0" w:color="000000"/>
-              <w:bottom w:val="single" w:sz="4" w:space="0" w:color="000000"/>
-            </w:tcBorders>
-            <w:vAlign w:val="center"/>
-          </w:tcPr>
-          <w:p>
-            <w:pPr>
-              <w:pStyle w:val="Style16"/>
-              <w:spacing w:lineRule="auto" w:line="240"/>
-              <w:ind w:hanging="0" w:left="0"/>
-              <w:rPr>
-                <w:sz w:val="24"/>
-                <w:szCs w:val="24"/>
-              </w:rPr>
-            </w:pPr>
-            <w:r>
-              <w:rPr>
-                <w:sz w:val="24"/>
-                <w:szCs w:val="24"/>
-              </w:rPr>
-              <w:t>Споживач</w:t>
-            </w:r>
-          </w:p>
-        </w:tc>
-        <w:tc>
-          <w:tcPr>
-            <w:tcW w:w="5757" w:type="dxa"/>
-            <w:tcBorders>
-              <w:left w:val="single" w:sz="4" w:space="0" w:color="000000"/>
-              <w:bottom w:val="single" w:sz="4" w:space="0" w:color="000000"/>
-            </w:tcBorders>
-            <w:vAlign w:val="center"/>
-          </w:tcPr>
-          <w:p>
-            <w:pPr>
-              <w:pStyle w:val="p11"/>
-              <w:spacing w:lineRule="auto" w:line="240"/>
-              <w:ind w:hanging="0" w:left="0"/>
-              <w:rPr>
-                <w:sz w:val="24"/>
-                <w:szCs w:val="24"/>
-              </w:rPr>
-            </w:pPr>
-            <w:r>
-              <w:rPr>
-                <w:sz w:val="24"/>
-                <w:szCs w:val="24"/>
-              </w:rPr>
-              <w:t>Кожна стаття з новиною має містити картинки з місця подій</w:t>
-            </w:r>
-          </w:p>
-        </w:tc>
-        <w:tc>
-          <w:tcPr>
-            <w:tcW w:w="1992" w:type="dxa"/>
-            <w:tcBorders>
-              <w:left w:val="single" w:sz="4" w:space="0" w:color="000000"/>
-              <w:bottom w:val="single" w:sz="4" w:space="0" w:color="000000"/>
-            </w:tcBorders>
-            <w:vAlign w:val="center"/>
-          </w:tcPr>
-          <w:p>
-            <w:pPr>
-              <w:pStyle w:val="p11"/>
-              <w:spacing w:lineRule="auto" w:line="240"/>
-              <w:ind w:hanging="0" w:left="0"/>
-              <w:rPr>
-                <w:sz w:val="24"/>
-                <w:szCs w:val="24"/>
-              </w:rPr>
-            </w:pPr>
-            <w:r>
-              <w:rPr>
-                <w:sz w:val="24"/>
-                <w:szCs w:val="24"/>
-              </w:rPr>
-              <w:t>До кінця тижня</w:t>
-            </w:r>
-          </w:p>
-        </w:tc>
-        <w:tc>
-          <w:tcPr>
-            <w:tcW w:w="2323" w:type="dxa"/>
-            <w:tcBorders>
-              <w:left w:val="single" w:sz="4" w:space="0" w:color="000000"/>
-              <w:bottom w:val="single" w:sz="4" w:space="0" w:color="000000"/>
-              <w:right w:val="single" w:sz="4" w:space="0" w:color="000000"/>
-            </w:tcBorders>
-            <w:vAlign w:val="center"/>
-          </w:tcPr>
-          <w:p>
-            <w:pPr>
-              <w:pStyle w:val="p11"/>
-              <w:spacing w:lineRule="auto" w:line="240"/>
-              <w:ind w:hanging="0" w:left="0"/>
-              <w:rPr>
-                <w:sz w:val="24"/>
-                <w:szCs w:val="24"/>
-              </w:rPr>
-            </w:pPr>
-            <w:r>
-              <w:rPr>
-                <w:sz w:val="24"/>
-                <w:szCs w:val="24"/>
-              </w:rPr>
-              <w:t>Кожна новинна стаття містить хоча б одну картинку</w:t>
+              <w:t>Новини читають в середньому п’ята частина мешканців області</w:t>
             </w:r>
           </w:p>
         </w:tc>
@@ -2704,7 +2215,7 @@
     </w:tbl>
     <w:p>
       <w:pPr>
-        <w:pStyle w:val="p11"/>
+        <w:pStyle w:val="Normal"/>
         <w:rPr/>
       </w:pPr>
       <w:r>
@@ -3491,7 +3002,7 @@
       </w:pPr>
       <w:r>
         <w:rPr/>
-        <w:t>Новина — стислий виклад якоїсь актуальної інформації, яка сталася нещодавно.</w:t>
+        <w:t>Новина — стислий виклад якоїсь актуальної інформації, яка сталася нещодавно</w:t>
       </w:r>
     </w:p>
     <w:p>
@@ -3502,7 +3013,7 @@
       </w:pPr>
       <w:r>
         <w:rPr/>
-        <w:t>Якість — ступінь, до якого сукупність власних характеристик об’єкта задовольняє вимоги.</w:t>
+        <w:t>Якість — ступінь, до якого сукупність власних характеристик об’єкта задовольняє вимоги</w:t>
       </w:r>
     </w:p>
     <w:p>
@@ -3513,7 +3024,44 @@
       </w:pPr>
       <w:r>
         <w:rPr/>
-        <w:t>Медіа — канали та інструменти для зберігання, передавання та подачі інформації чи даних.</w:t>
+        <w:t>Медіа — канали та інструменти для зберігання, передавання та подачі інформації чи даних</w:t>
+      </w:r>
+    </w:p>
+    <w:p>
+      <w:pPr>
+        <w:pStyle w:val="P1"/>
+        <w:spacing w:before="0" w:after="0"/>
+        <w:rPr/>
+      </w:pPr>
+      <w:r>
+        <w:rPr/>
+        <w:t>Актуальн</w:t>
+      </w:r>
+      <w:r>
+        <w:rPr/>
+        <w:t>а новина — така, що надає потрібну інформацію у відповідний момент часу</w:t>
+      </w:r>
+    </w:p>
+    <w:p>
+      <w:pPr>
+        <w:pStyle w:val="P1"/>
+        <w:spacing w:before="0" w:after="0"/>
+        <w:rPr/>
+      </w:pPr>
+      <w:r>
+        <w:rPr/>
+        <w:t>Веб-сайт компанії — набір програмних засобів (включно з системою управління контентом), які дозволяють команді публікувати новини в мережі інтернет, а споживачам переглядати ці новини</w:t>
+      </w:r>
+    </w:p>
+    <w:p>
+      <w:pPr>
+        <w:pStyle w:val="P1"/>
+        <w:spacing w:before="0" w:after="0"/>
+        <w:rPr/>
+      </w:pPr>
+      <w:r>
+        <w:rPr/>
+        <w:t>Система управління контентом — програмні засоби, які дозволяють відносно легко керувати вмістом веб-сайту</w:t>
       </w:r>
     </w:p>
     <w:p>
@@ -4751,143 +4299,6 @@
   <w:abstractNum w:abstractNumId="6">
     <w:lvl w:ilvl="0">
       <w:start w:val="1"/>
-      <w:numFmt w:val="bullet"/>
-      <w:lvlText w:val="-"/>
-      <w:lvlJc w:val="left"/>
-      <w:pPr>
-        <w:tabs>
-          <w:tab w:val="num" w:pos="720"/>
-        </w:tabs>
-        <w:ind w:left="720" w:hanging="360"/>
-      </w:pPr>
-      <w:rPr>
-        <w:rFonts w:ascii="OpenSymbol" w:hAnsi="OpenSymbol" w:cs="OpenSymbol" w:hint="default"/>
-      </w:rPr>
-    </w:lvl>
-    <w:lvl w:ilvl="1">
-      <w:start w:val="1"/>
-      <w:numFmt w:val="bullet"/>
-      <w:lvlText w:val="◦"/>
-      <w:lvlJc w:val="left"/>
-      <w:pPr>
-        <w:tabs>
-          <w:tab w:val="num" w:pos="1080"/>
-        </w:tabs>
-        <w:ind w:left="1080" w:hanging="360"/>
-      </w:pPr>
-      <w:rPr>
-        <w:rFonts w:ascii="OpenSymbol" w:hAnsi="OpenSymbol" w:cs="OpenSymbol" w:hint="default"/>
-      </w:rPr>
-    </w:lvl>
-    <w:lvl w:ilvl="2">
-      <w:start w:val="1"/>
-      <w:numFmt w:val="bullet"/>
-      <w:lvlText w:val="▪"/>
-      <w:lvlJc w:val="left"/>
-      <w:pPr>
-        <w:tabs>
-          <w:tab w:val="num" w:pos="1440"/>
-        </w:tabs>
-        <w:ind w:left="1440" w:hanging="360"/>
-      </w:pPr>
-      <w:rPr>
-        <w:rFonts w:ascii="OpenSymbol" w:hAnsi="OpenSymbol" w:cs="OpenSymbol" w:hint="default"/>
-      </w:rPr>
-    </w:lvl>
-    <w:lvl w:ilvl="3">
-      <w:start w:val="1"/>
-      <w:numFmt w:val="bullet"/>
-      <w:lvlText w:val=""/>
-      <w:lvlJc w:val="left"/>
-      <w:pPr>
-        <w:tabs>
-          <w:tab w:val="num" w:pos="1800"/>
-        </w:tabs>
-        <w:ind w:left="1800" w:hanging="360"/>
-      </w:pPr>
-      <w:rPr>
-        <w:rFonts w:ascii="Symbol" w:hAnsi="Symbol" w:cs="Symbol" w:hint="default"/>
-      </w:rPr>
-    </w:lvl>
-    <w:lvl w:ilvl="4">
-      <w:start w:val="1"/>
-      <w:numFmt w:val="bullet"/>
-      <w:lvlText w:val="◦"/>
-      <w:lvlJc w:val="left"/>
-      <w:pPr>
-        <w:tabs>
-          <w:tab w:val="num" w:pos="2160"/>
-        </w:tabs>
-        <w:ind w:left="2160" w:hanging="360"/>
-      </w:pPr>
-      <w:rPr>
-        <w:rFonts w:ascii="OpenSymbol" w:hAnsi="OpenSymbol" w:cs="OpenSymbol" w:hint="default"/>
-      </w:rPr>
-    </w:lvl>
-    <w:lvl w:ilvl="5">
-      <w:start w:val="1"/>
-      <w:numFmt w:val="bullet"/>
-      <w:lvlText w:val="▪"/>
-      <w:lvlJc w:val="left"/>
-      <w:pPr>
-        <w:tabs>
-          <w:tab w:val="num" w:pos="2520"/>
-        </w:tabs>
-        <w:ind w:left="2520" w:hanging="360"/>
-      </w:pPr>
-      <w:rPr>
-        <w:rFonts w:ascii="OpenSymbol" w:hAnsi="OpenSymbol" w:cs="OpenSymbol" w:hint="default"/>
-      </w:rPr>
-    </w:lvl>
-    <w:lvl w:ilvl="6">
-      <w:start w:val="1"/>
-      <w:numFmt w:val="bullet"/>
-      <w:lvlText w:val=""/>
-      <w:lvlJc w:val="left"/>
-      <w:pPr>
-        <w:tabs>
-          <w:tab w:val="num" w:pos="2880"/>
-        </w:tabs>
-        <w:ind w:left="2880" w:hanging="360"/>
-      </w:pPr>
-      <w:rPr>
-        <w:rFonts w:ascii="Symbol" w:hAnsi="Symbol" w:cs="Symbol" w:hint="default"/>
-      </w:rPr>
-    </w:lvl>
-    <w:lvl w:ilvl="7">
-      <w:start w:val="1"/>
-      <w:numFmt w:val="bullet"/>
-      <w:lvlText w:val="◦"/>
-      <w:lvlJc w:val="left"/>
-      <w:pPr>
-        <w:tabs>
-          <w:tab w:val="num" w:pos="3240"/>
-        </w:tabs>
-        <w:ind w:left="3240" w:hanging="360"/>
-      </w:pPr>
-      <w:rPr>
-        <w:rFonts w:ascii="OpenSymbol" w:hAnsi="OpenSymbol" w:cs="OpenSymbol" w:hint="default"/>
-      </w:rPr>
-    </w:lvl>
-    <w:lvl w:ilvl="8">
-      <w:start w:val="1"/>
-      <w:numFmt w:val="bullet"/>
-      <w:lvlText w:val="▪"/>
-      <w:lvlJc w:val="left"/>
-      <w:pPr>
-        <w:tabs>
-          <w:tab w:val="num" w:pos="3600"/>
-        </w:tabs>
-        <w:ind w:left="3600" w:hanging="360"/>
-      </w:pPr>
-      <w:rPr>
-        <w:rFonts w:ascii="OpenSymbol" w:hAnsi="OpenSymbol" w:cs="OpenSymbol" w:hint="default"/>
-      </w:rPr>
-    </w:lvl>
-  </w:abstractNum>
-  <w:abstractNum w:abstractNumId="7">
-    <w:lvl w:ilvl="0">
-      <w:start w:val="1"/>
       <w:numFmt w:val="none"/>
       <w:suff w:val="nothing"/>
       <w:lvlText w:val=""/>
@@ -5021,9 +4432,6 @@
   </w:num>
   <w:num w:numId="6">
     <w:abstractNumId w:val="6"/>
-  </w:num>
-  <w:num w:numId="7">
-    <w:abstractNumId w:val="7"/>
   </w:num>
 </w:numbering>
 </file>
@@ -5813,27 +5221,27 @@
       <w:lang w:val="en-US" w:eastAsia="uk-UA"/>
     </w:rPr>
   </w:style>
-  <w:style w:type="character" w:styleId="Style12">
-    <w:name w:val="Символ нумерації"/>
+  <w:style w:type="character" w:styleId="user">
+    <w:name w:val="Символ нумерації (user)"/>
     <w:qFormat/>
     <w:rPr/>
   </w:style>
-  <w:style w:type="character" w:styleId="Style13">
+  <w:style w:type="character" w:styleId="user1">
+    <w:name w:val="Маркери (user)"/>
+    <w:qFormat/>
+    <w:rPr>
+      <w:rFonts w:ascii="OpenSymbol" w:hAnsi="OpenSymbol" w:eastAsia="OpenSymbol" w:cs="OpenSymbol"/>
+    </w:rPr>
+  </w:style>
+  <w:style w:type="character" w:styleId="Style12">
     <w:name w:val="Маркери"/>
     <w:qFormat/>
     <w:rPr>
       <w:rFonts w:ascii="OpenSymbol" w:hAnsi="OpenSymbol" w:eastAsia="OpenSymbol" w:cs="OpenSymbol"/>
     </w:rPr>
   </w:style>
-  <w:style w:type="character" w:styleId="user">
-    <w:name w:val="Маркери (user)"/>
-    <w:qFormat/>
-    <w:rPr>
-      <w:rFonts w:ascii="OpenSymbol" w:hAnsi="OpenSymbol" w:eastAsia="OpenSymbol" w:cs="OpenSymbol"/>
-    </w:rPr>
-  </w:style>
-  <w:style w:type="character" w:styleId="user1">
-    <w:name w:val="Символ нумерації (user)"/>
+  <w:style w:type="character" w:styleId="Style13">
+    <w:name w:val="Символ нумерації"/>
     <w:qFormat/>
     <w:rPr/>
   </w:style>
@@ -5847,7 +5255,7 @@
       <w:spacing w:before="240" w:after="120"/>
     </w:pPr>
     <w:rPr>
-      <w:rFonts w:ascii="Liberation Sans" w:hAnsi="Liberation Sans" w:eastAsia="Microsoft YaHei" w:cs="Lucida Sans"/>
+      <w:rFonts w:ascii="Liberation Sans" w:hAnsi="Liberation Sans" w:eastAsia="Microsoft YaHei" w:cs="Arial Unicode MS"/>
       <w:sz w:val="28"/>
       <w:szCs w:val="28"/>
     </w:rPr>
@@ -5892,7 +5300,7 @@
       <w:suppressLineNumbers/>
     </w:pPr>
     <w:rPr>
-      <w:rFonts w:cs="Lucida Sans"/>
+      <w:rFonts w:cs="Arial Unicode MS"/>
     </w:rPr>
   </w:style>
   <w:style w:type="paragraph" w:styleId="user2">
@@ -5905,7 +5313,7 @@
       <w:spacing w:before="240" w:after="120"/>
     </w:pPr>
     <w:rPr>
-      <w:rFonts w:ascii="Liberation Sans" w:hAnsi="Liberation Sans" w:eastAsia="Microsoft YaHei" w:cs="Arial Unicode MS"/>
+      <w:rFonts w:ascii="Liberation Sans" w:hAnsi="Liberation Sans" w:eastAsia="Microsoft YaHei" w:cs="Lucida Sans"/>
       <w:sz w:val="28"/>
       <w:szCs w:val="28"/>
     </w:rPr>
@@ -5918,12 +5326,12 @@
       <w:suppressLineNumbers/>
     </w:pPr>
     <w:rPr>
-      <w:rFonts w:cs="Arial Unicode MS"/>
+      <w:rFonts w:cs="Lucida Sans"/>
     </w:rPr>
   </w:style>
   <w:style w:type="paragraph" w:styleId="IndexHeading">
     <w:name w:val="index heading"/>
-    <w:basedOn w:val="user2"/>
+    <w:basedOn w:val="Style14"/>
     <w:pPr/>
     <w:rPr/>
   </w:style>
@@ -6201,6 +5609,16 @@
     </w:pPr>
     <w:rPr/>
   </w:style>
+  <w:style w:type="paragraph" w:styleId="user4">
+    <w:name w:val="Вміст таблиці (user)"/>
+    <w:basedOn w:val="Normal"/>
+    <w:qFormat/>
+    <w:pPr>
+      <w:widowControl w:val="false"/>
+      <w:suppressLineNumbers/>
+    </w:pPr>
+    <w:rPr/>
+  </w:style>
   <w:style w:type="paragraph" w:styleId="Style16">
     <w:name w:val="Вміст таблиці"/>
     <w:basedOn w:val="Normal"/>
@@ -6211,19 +5629,9 @@
     </w:pPr>
     <w:rPr/>
   </w:style>
-  <w:style w:type="paragraph" w:styleId="user4">
-    <w:name w:val="Вміст таблиці (user)"/>
-    <w:basedOn w:val="Normal"/>
-    <w:qFormat/>
-    <w:pPr>
-      <w:widowControl w:val="false"/>
-      <w:suppressLineNumbers/>
-    </w:pPr>
-    <w:rPr/>
-  </w:style>
-  <w:style w:type="paragraph" w:styleId="user5">
-    <w:name w:val="Заголовок таблиці (user)"/>
-    <w:basedOn w:val="user4"/>
+  <w:style w:type="paragraph" w:styleId="Style17">
+    <w:name w:val="Заголовок таблиці"/>
+    <w:basedOn w:val="Style16"/>
     <w:qFormat/>
     <w:pPr>
       <w:suppressLineNumbers/>
@@ -6234,8 +5642,8 @@
       <w:bCs/>
     </w:rPr>
   </w:style>
-  <w:style w:type="numbering" w:styleId="user6" w:default="1">
-    <w:name w:val="Без маркерів (user)"/>
+  <w:style w:type="numbering" w:styleId="Style18" w:default="1">
+    <w:name w:val="Без маркерів"/>
     <w:uiPriority w:val="99"/>
     <w:semiHidden/>
     <w:unhideWhenUsed/>

</xml_diff>

<commit_message>
revert: MN1 original personal notes
</commit_message>
<xml_diff>
--- a/51SP Sertyficazija PZ/1/SP1_KNT-116m_Onyshchenko_15.docx
+++ b/51SP Sertyficazija PZ/1/SP1_KNT-116m_Onyshchenko_15.docx
@@ -2617,21 +2617,21 @@
     </w:p>
     <w:p>
       <w:pPr>
+        <w:pStyle w:val="P1"/>
+        <w:spacing w:before="0" w:after="0"/>
+        <w:rPr>
+          <w:lang w:val="uk-UA"/>
+        </w:rPr>
+      </w:pPr>
+      <w:r>
+        <w:rPr>
+          <w:lang w:val="uk-UA"/>
+        </w:rPr>
+      </w:r>
+    </w:p>
+    <w:p>
+      <w:pPr>
         <w:pStyle w:val="H3"/>
-        <w:spacing w:before="0" w:after="0"/>
-        <w:rPr/>
-      </w:pPr>
-      <w:r>
-        <w:rPr/>
-      </w:r>
-      <w:r>
-        <w:br w:type="page"/>
-      </w:r>
-    </w:p>
-    <w:p>
-      <w:pPr>
-        <w:pStyle w:val="H3"/>
-        <w:spacing w:before="0" w:after="0"/>
         <w:rPr/>
       </w:pPr>
       <w:r>
@@ -3243,7 +3243,7 @@
         <w:rPr/>
         <w:drawing>
           <wp:inline distT="0" distB="0" distL="0" distR="0">
-            <wp:extent cx="2075815" cy="3636645"/>
+            <wp:extent cx="1840865" cy="3224530"/>
             <wp:effectExtent l="0" t="0" r="0" b="0"/>
             <wp:docPr id="2" name="Зображення2"/>
             <wp:cNvGraphicFramePr>
@@ -3267,7 +3267,7 @@
                   <pic:spPr bwMode="auto">
                     <a:xfrm>
                       <a:off x="0" y="0"/>
-                      <a:ext cx="2075815" cy="3636645"/>
+                      <a:ext cx="1840865" cy="3224530"/>
                     </a:xfrm>
                     <a:prstGeom prst="rect">
                       <a:avLst/>

</xml_diff>

<commit_message>
docs: combine all the PM topics into one
</commit_message>
<xml_diff>
--- a/51SP Sertyficazija PZ/1/SP1_KNT-116m_Onyshchenko_15.docx
+++ b/51SP Sertyficazija PZ/1/SP1_KNT-116m_Onyshchenko_15.docx
@@ -3136,31 +3136,45 @@
     <w:p>
       <w:pPr>
         <w:pStyle w:val="P1"/>
-        <w:spacing w:before="0" w:after="0"/>
-        <w:rPr>
-          <w:lang w:val="uk-UA"/>
-        </w:rPr>
-      </w:pPr>
-      <w:r>
-        <w:rPr>
-          <w:lang w:val="uk-UA"/>
-        </w:rPr>
-        <w:t>1. Редакційний: новини збираються та перевіряються;</w:t>
-      </w:r>
-    </w:p>
-    <w:p>
-      <w:pPr>
-        <w:pStyle w:val="P1"/>
-        <w:spacing w:before="0" w:after="0"/>
-        <w:rPr>
-          <w:lang w:val="uk-UA"/>
-        </w:rPr>
-      </w:pPr>
-      <w:r>
-        <w:rPr>
-          <w:lang w:val="uk-UA"/>
-        </w:rPr>
-        <w:t xml:space="preserve">2. Технологічний: новини публікуються на сайті через </w:t>
+        <w:widowControl/>
+        <w:numPr>
+          <w:ilvl w:val="0"/>
+          <w:numId w:val="6"/>
+        </w:numPr>
+        <w:suppressAutoHyphens w:val="true"/>
+        <w:bidi w:val="0"/>
+        <w:spacing w:lineRule="auto" w:line="360" w:before="0" w:after="0"/>
+        <w:ind w:firstLine="850" w:left="0" w:right="0"/>
+        <w:jc w:val="both"/>
+        <w:rPr/>
+      </w:pPr>
+      <w:r>
+        <w:rPr>
+          <w:lang w:val="uk-UA"/>
+        </w:rPr>
+        <w:t>Редакційний: новини збираються та перевіряються;</w:t>
+      </w:r>
+    </w:p>
+    <w:p>
+      <w:pPr>
+        <w:pStyle w:val="P1"/>
+        <w:widowControl/>
+        <w:numPr>
+          <w:ilvl w:val="0"/>
+          <w:numId w:val="6"/>
+        </w:numPr>
+        <w:suppressAutoHyphens w:val="true"/>
+        <w:bidi w:val="0"/>
+        <w:spacing w:lineRule="auto" w:line="360" w:before="0" w:after="0"/>
+        <w:ind w:firstLine="850" w:left="0" w:right="0"/>
+        <w:jc w:val="both"/>
+        <w:rPr/>
+      </w:pPr>
+      <w:r>
+        <w:rPr>
+          <w:lang w:val="uk-UA"/>
+        </w:rPr>
+        <w:t xml:space="preserve">Технологічний: новини публікуються на сайті через </w:t>
       </w:r>
       <w:r>
         <w:rPr>
@@ -3178,31 +3192,45 @@
     <w:p>
       <w:pPr>
         <w:pStyle w:val="P1"/>
-        <w:spacing w:before="0" w:after="0"/>
-        <w:rPr>
-          <w:lang w:val="uk-UA"/>
-        </w:rPr>
-      </w:pPr>
-      <w:r>
-        <w:rPr>
-          <w:lang w:val="uk-UA"/>
-        </w:rPr>
-        <w:t>3. Комерційний: новини просуваються та публікується реклама;</w:t>
-      </w:r>
-    </w:p>
-    <w:p>
-      <w:pPr>
-        <w:pStyle w:val="P1"/>
-        <w:spacing w:before="0" w:after="0"/>
-        <w:rPr>
-          <w:lang w:val="uk-UA"/>
-        </w:rPr>
-      </w:pPr>
-      <w:r>
-        <w:rPr>
-          <w:lang w:val="uk-UA"/>
-        </w:rPr>
-        <w:t>4. Управлінський: процеси документуються та корегуються.</w:t>
+        <w:widowControl/>
+        <w:numPr>
+          <w:ilvl w:val="0"/>
+          <w:numId w:val="6"/>
+        </w:numPr>
+        <w:suppressAutoHyphens w:val="true"/>
+        <w:bidi w:val="0"/>
+        <w:spacing w:lineRule="auto" w:line="360" w:before="0" w:after="0"/>
+        <w:ind w:firstLine="850" w:left="0" w:right="0"/>
+        <w:jc w:val="both"/>
+        <w:rPr/>
+      </w:pPr>
+      <w:r>
+        <w:rPr>
+          <w:lang w:val="uk-UA"/>
+        </w:rPr>
+        <w:t>Комерційний: новини просуваються та публікується реклама;</w:t>
+      </w:r>
+    </w:p>
+    <w:p>
+      <w:pPr>
+        <w:pStyle w:val="P1"/>
+        <w:widowControl/>
+        <w:numPr>
+          <w:ilvl w:val="0"/>
+          <w:numId w:val="6"/>
+        </w:numPr>
+        <w:suppressAutoHyphens w:val="true"/>
+        <w:bidi w:val="0"/>
+        <w:spacing w:lineRule="auto" w:line="360" w:before="0" w:after="0"/>
+        <w:ind w:firstLine="850" w:left="0" w:right="0"/>
+        <w:jc w:val="both"/>
+        <w:rPr/>
+      </w:pPr>
+      <w:r>
+        <w:rPr>
+          <w:lang w:val="uk-UA"/>
+        </w:rPr>
+        <w:t>Управлінський: процеси документуються та корегуються.</w:t>
       </w:r>
     </w:p>
     <w:p>
@@ -3337,6 +3365,69 @@
       <w:pPr>
         <w:pStyle w:val="P1"/>
         <w:spacing w:before="0" w:after="0"/>
+        <w:rPr>
+          <w:lang w:val="uk-UA"/>
+        </w:rPr>
+      </w:pPr>
+      <w:r>
+        <w:rPr>
+          <w:lang w:val="uk-UA"/>
+        </w:rPr>
+        <w:t>Керівництво компанії, а саме її директор, має виконувати такі дії:</w:t>
+      </w:r>
+    </w:p>
+    <w:p>
+      <w:pPr>
+        <w:pStyle w:val="P1"/>
+        <w:widowControl/>
+        <w:numPr>
+          <w:ilvl w:val="0"/>
+          <w:numId w:val="7"/>
+        </w:numPr>
+        <w:suppressAutoHyphens w:val="true"/>
+        <w:bidi w:val="0"/>
+        <w:spacing w:lineRule="auto" w:line="360" w:before="0" w:after="0"/>
+        <w:ind w:firstLine="850" w:left="0" w:right="0"/>
+        <w:jc w:val="both"/>
+        <w:rPr>
+          <w:lang w:val="uk-UA"/>
+        </w:rPr>
+      </w:pPr>
+      <w:r>
+        <w:rPr>
+          <w:lang w:val="uk-UA"/>
+        </w:rPr>
+        <w:t>постійно вдосконалювати продукцію компанії шляхом виділення ресурсів на нову апаратуру та можливе наймання нових людей до команди;</w:t>
+      </w:r>
+    </w:p>
+    <w:p>
+      <w:pPr>
+        <w:pStyle w:val="P1"/>
+        <w:widowControl/>
+        <w:numPr>
+          <w:ilvl w:val="0"/>
+          <w:numId w:val="7"/>
+        </w:numPr>
+        <w:suppressAutoHyphens w:val="true"/>
+        <w:bidi w:val="0"/>
+        <w:spacing w:lineRule="auto" w:line="360" w:before="0" w:after="0"/>
+        <w:ind w:firstLine="850" w:left="0" w:right="0"/>
+        <w:jc w:val="both"/>
+        <w:rPr>
+          <w:lang w:val="uk-UA"/>
+        </w:rPr>
+      </w:pPr>
+      <w:r>
+        <w:rPr>
+          <w:lang w:val="uk-UA"/>
+        </w:rPr>
+        <w:t>контролювати процеси організації і перевіряти чи відповідають вони політикам у сфері якості;</w:t>
+      </w:r>
+    </w:p>
+    <w:p>
+      <w:pPr>
+        <w:pStyle w:val="P1"/>
+        <w:spacing w:before="0" w:after="0"/>
         <w:rPr/>
       </w:pPr>
       <w:r>
@@ -4297,6 +4388,262 @@
     </w:lvl>
   </w:abstractNum>
   <w:abstractNum w:abstractNumId="6">
+    <w:lvl w:ilvl="0">
+      <w:start w:val="1"/>
+      <w:numFmt w:val="decimal"/>
+      <w:lvlText w:val="%1."/>
+      <w:lvlJc w:val="left"/>
+      <w:pPr>
+        <w:tabs>
+          <w:tab w:val="num" w:pos="720"/>
+        </w:tabs>
+        <w:ind w:left="720" w:hanging="360"/>
+      </w:pPr>
+      <w:rPr/>
+    </w:lvl>
+    <w:lvl w:ilvl="1">
+      <w:start w:val="1"/>
+      <w:numFmt w:val="decimal"/>
+      <w:lvlText w:val="%2."/>
+      <w:lvlJc w:val="left"/>
+      <w:pPr>
+        <w:tabs>
+          <w:tab w:val="num" w:pos="1080"/>
+        </w:tabs>
+        <w:ind w:left="1080" w:hanging="360"/>
+      </w:pPr>
+      <w:rPr/>
+    </w:lvl>
+    <w:lvl w:ilvl="2">
+      <w:start w:val="1"/>
+      <w:numFmt w:val="decimal"/>
+      <w:lvlText w:val="%3."/>
+      <w:lvlJc w:val="left"/>
+      <w:pPr>
+        <w:tabs>
+          <w:tab w:val="num" w:pos="1440"/>
+        </w:tabs>
+        <w:ind w:left="1440" w:hanging="360"/>
+      </w:pPr>
+      <w:rPr/>
+    </w:lvl>
+    <w:lvl w:ilvl="3">
+      <w:start w:val="1"/>
+      <w:numFmt w:val="decimal"/>
+      <w:lvlText w:val="%4."/>
+      <w:lvlJc w:val="left"/>
+      <w:pPr>
+        <w:tabs>
+          <w:tab w:val="num" w:pos="1800"/>
+        </w:tabs>
+        <w:ind w:left="1800" w:hanging="360"/>
+      </w:pPr>
+      <w:rPr/>
+    </w:lvl>
+    <w:lvl w:ilvl="4">
+      <w:start w:val="1"/>
+      <w:numFmt w:val="decimal"/>
+      <w:lvlText w:val="%5."/>
+      <w:lvlJc w:val="left"/>
+      <w:pPr>
+        <w:tabs>
+          <w:tab w:val="num" w:pos="2160"/>
+        </w:tabs>
+        <w:ind w:left="2160" w:hanging="360"/>
+      </w:pPr>
+      <w:rPr/>
+    </w:lvl>
+    <w:lvl w:ilvl="5">
+      <w:start w:val="1"/>
+      <w:numFmt w:val="decimal"/>
+      <w:lvlText w:val="%6."/>
+      <w:lvlJc w:val="left"/>
+      <w:pPr>
+        <w:tabs>
+          <w:tab w:val="num" w:pos="2520"/>
+        </w:tabs>
+        <w:ind w:left="2520" w:hanging="360"/>
+      </w:pPr>
+      <w:rPr/>
+    </w:lvl>
+    <w:lvl w:ilvl="6">
+      <w:start w:val="1"/>
+      <w:numFmt w:val="decimal"/>
+      <w:lvlText w:val="%7."/>
+      <w:lvlJc w:val="left"/>
+      <w:pPr>
+        <w:tabs>
+          <w:tab w:val="num" w:pos="2880"/>
+        </w:tabs>
+        <w:ind w:left="2880" w:hanging="360"/>
+      </w:pPr>
+      <w:rPr/>
+    </w:lvl>
+    <w:lvl w:ilvl="7">
+      <w:start w:val="1"/>
+      <w:numFmt w:val="decimal"/>
+      <w:lvlText w:val="%8."/>
+      <w:lvlJc w:val="left"/>
+      <w:pPr>
+        <w:tabs>
+          <w:tab w:val="num" w:pos="3240"/>
+        </w:tabs>
+        <w:ind w:left="3240" w:hanging="360"/>
+      </w:pPr>
+      <w:rPr/>
+    </w:lvl>
+    <w:lvl w:ilvl="8">
+      <w:start w:val="1"/>
+      <w:numFmt w:val="decimal"/>
+      <w:lvlText w:val="%9."/>
+      <w:lvlJc w:val="left"/>
+      <w:pPr>
+        <w:tabs>
+          <w:tab w:val="num" w:pos="3600"/>
+        </w:tabs>
+        <w:ind w:left="3600" w:hanging="360"/>
+      </w:pPr>
+      <w:rPr/>
+    </w:lvl>
+  </w:abstractNum>
+  <w:abstractNum w:abstractNumId="7">
+    <w:lvl w:ilvl="0">
+      <w:start w:val="1"/>
+      <w:numFmt w:val="bullet"/>
+      <w:lvlText w:val="-"/>
+      <w:lvlJc w:val="left"/>
+      <w:pPr>
+        <w:tabs>
+          <w:tab w:val="num" w:pos="720"/>
+        </w:tabs>
+        <w:ind w:left="720" w:hanging="360"/>
+      </w:pPr>
+      <w:rPr>
+        <w:rFonts w:ascii="OpenSymbol" w:hAnsi="OpenSymbol" w:cs="OpenSymbol" w:hint="default"/>
+      </w:rPr>
+    </w:lvl>
+    <w:lvl w:ilvl="1">
+      <w:start w:val="1"/>
+      <w:numFmt w:val="bullet"/>
+      <w:lvlText w:val="-"/>
+      <w:lvlJc w:val="left"/>
+      <w:pPr>
+        <w:tabs>
+          <w:tab w:val="num" w:pos="1080"/>
+        </w:tabs>
+        <w:ind w:left="1080" w:hanging="360"/>
+      </w:pPr>
+      <w:rPr>
+        <w:rFonts w:ascii="OpenSymbol" w:hAnsi="OpenSymbol" w:cs="OpenSymbol" w:hint="default"/>
+      </w:rPr>
+    </w:lvl>
+    <w:lvl w:ilvl="2">
+      <w:start w:val="1"/>
+      <w:numFmt w:val="bullet"/>
+      <w:lvlText w:val="-"/>
+      <w:lvlJc w:val="left"/>
+      <w:pPr>
+        <w:tabs>
+          <w:tab w:val="num" w:pos="1440"/>
+        </w:tabs>
+        <w:ind w:left="1440" w:hanging="360"/>
+      </w:pPr>
+      <w:rPr>
+        <w:rFonts w:ascii="OpenSymbol" w:hAnsi="OpenSymbol" w:cs="OpenSymbol" w:hint="default"/>
+      </w:rPr>
+    </w:lvl>
+    <w:lvl w:ilvl="3">
+      <w:start w:val="1"/>
+      <w:numFmt w:val="bullet"/>
+      <w:lvlText w:val="-"/>
+      <w:lvlJc w:val="left"/>
+      <w:pPr>
+        <w:tabs>
+          <w:tab w:val="num" w:pos="1800"/>
+        </w:tabs>
+        <w:ind w:left="1800" w:hanging="360"/>
+      </w:pPr>
+      <w:rPr>
+        <w:rFonts w:ascii="OpenSymbol" w:hAnsi="OpenSymbol" w:cs="OpenSymbol" w:hint="default"/>
+      </w:rPr>
+    </w:lvl>
+    <w:lvl w:ilvl="4">
+      <w:start w:val="1"/>
+      <w:numFmt w:val="bullet"/>
+      <w:lvlText w:val="-"/>
+      <w:lvlJc w:val="left"/>
+      <w:pPr>
+        <w:tabs>
+          <w:tab w:val="num" w:pos="2160"/>
+        </w:tabs>
+        <w:ind w:left="2160" w:hanging="360"/>
+      </w:pPr>
+      <w:rPr>
+        <w:rFonts w:ascii="OpenSymbol" w:hAnsi="OpenSymbol" w:cs="OpenSymbol" w:hint="default"/>
+      </w:rPr>
+    </w:lvl>
+    <w:lvl w:ilvl="5">
+      <w:start w:val="1"/>
+      <w:numFmt w:val="bullet"/>
+      <w:lvlText w:val="-"/>
+      <w:lvlJc w:val="left"/>
+      <w:pPr>
+        <w:tabs>
+          <w:tab w:val="num" w:pos="2520"/>
+        </w:tabs>
+        <w:ind w:left="2520" w:hanging="360"/>
+      </w:pPr>
+      <w:rPr>
+        <w:rFonts w:ascii="OpenSymbol" w:hAnsi="OpenSymbol" w:cs="OpenSymbol" w:hint="default"/>
+      </w:rPr>
+    </w:lvl>
+    <w:lvl w:ilvl="6">
+      <w:start w:val="1"/>
+      <w:numFmt w:val="bullet"/>
+      <w:lvlText w:val="-"/>
+      <w:lvlJc w:val="left"/>
+      <w:pPr>
+        <w:tabs>
+          <w:tab w:val="num" w:pos="2880"/>
+        </w:tabs>
+        <w:ind w:left="2880" w:hanging="360"/>
+      </w:pPr>
+      <w:rPr>
+        <w:rFonts w:ascii="OpenSymbol" w:hAnsi="OpenSymbol" w:cs="OpenSymbol" w:hint="default"/>
+      </w:rPr>
+    </w:lvl>
+    <w:lvl w:ilvl="7">
+      <w:start w:val="1"/>
+      <w:numFmt w:val="bullet"/>
+      <w:lvlText w:val="-"/>
+      <w:lvlJc w:val="left"/>
+      <w:pPr>
+        <w:tabs>
+          <w:tab w:val="num" w:pos="3240"/>
+        </w:tabs>
+        <w:ind w:left="3240" w:hanging="360"/>
+      </w:pPr>
+      <w:rPr>
+        <w:rFonts w:ascii="OpenSymbol" w:hAnsi="OpenSymbol" w:cs="OpenSymbol" w:hint="default"/>
+      </w:rPr>
+    </w:lvl>
+    <w:lvl w:ilvl="8">
+      <w:start w:val="1"/>
+      <w:numFmt w:val="bullet"/>
+      <w:lvlText w:val="-"/>
+      <w:lvlJc w:val="left"/>
+      <w:pPr>
+        <w:tabs>
+          <w:tab w:val="num" w:pos="3600"/>
+        </w:tabs>
+        <w:ind w:left="3600" w:hanging="360"/>
+      </w:pPr>
+      <w:rPr>
+        <w:rFonts w:ascii="OpenSymbol" w:hAnsi="OpenSymbol" w:cs="OpenSymbol" w:hint="default"/>
+      </w:rPr>
+    </w:lvl>
+  </w:abstractNum>
+  <w:abstractNum w:abstractNumId="8">
     <w:lvl w:ilvl="0">
       <w:start w:val="1"/>
       <w:numFmt w:val="none"/>
@@ -4432,6 +4779,12 @@
   </w:num>
   <w:num w:numId="6">
     <w:abstractNumId w:val="6"/>
+  </w:num>
+  <w:num w:numId="7">
+    <w:abstractNumId w:val="7"/>
+  </w:num>
+  <w:num w:numId="8">
+    <w:abstractNumId w:val="8"/>
   </w:num>
 </w:numbering>
 </file>

</xml_diff>

<commit_message>
docs: working on resources tab SP1
</commit_message>
<xml_diff>
--- a/51SP Sertyficazija PZ/1/SP1_KNT-116m_Onyshchenko_15.docx
+++ b/51SP Sertyficazija PZ/1/SP1_KNT-116m_Onyshchenko_15.docx
@@ -3354,17 +3354,6 @@
       <w:pPr>
         <w:pStyle w:val="P1"/>
         <w:spacing w:before="0" w:after="0"/>
-        <w:rPr/>
-      </w:pPr>
-      <w:r>
-        <w:rPr/>
-        <w:t>Керівництво має відповідати за делегацію відповідальностей до керівників відділів, а також про планування та імплементацію стандартів якості у компанії.</w:t>
-      </w:r>
-    </w:p>
-    <w:p>
-      <w:pPr>
-        <w:pStyle w:val="P1"/>
-        <w:spacing w:before="0" w:after="0"/>
         <w:rPr>
           <w:lang w:val="uk-UA"/>
         </w:rPr>
@@ -3421,7 +3410,79 @@
         <w:rPr>
           <w:lang w:val="uk-UA"/>
         </w:rPr>
-        <w:t>контролювати процеси організації і перевіряти чи відповідають вони політикам у сфері якості;</w:t>
+        <w:t>сприяти використанню процесного підходу та ризик-орієнтованого мислення;</w:t>
+      </w:r>
+    </w:p>
+    <w:p>
+      <w:pPr>
+        <w:pStyle w:val="P1"/>
+        <w:widowControl/>
+        <w:numPr>
+          <w:ilvl w:val="0"/>
+          <w:numId w:val="7"/>
+        </w:numPr>
+        <w:suppressAutoHyphens w:val="true"/>
+        <w:bidi w:val="0"/>
+        <w:spacing w:lineRule="auto" w:line="360" w:before="0" w:after="0"/>
+        <w:ind w:firstLine="850" w:left="0" w:right="0"/>
+        <w:jc w:val="both"/>
+        <w:rPr>
+          <w:lang w:val="uk-UA"/>
+        </w:rPr>
+      </w:pPr>
+      <w:r>
+        <w:rPr>
+          <w:lang w:val="uk-UA"/>
+        </w:rPr>
+        <w:t>забезпечувати наявність необхідних ресурсів для команди;</w:t>
+      </w:r>
+    </w:p>
+    <w:p>
+      <w:pPr>
+        <w:pStyle w:val="P1"/>
+        <w:widowControl/>
+        <w:numPr>
+          <w:ilvl w:val="0"/>
+          <w:numId w:val="7"/>
+        </w:numPr>
+        <w:suppressAutoHyphens w:val="true"/>
+        <w:bidi w:val="0"/>
+        <w:spacing w:lineRule="auto" w:line="360" w:before="0" w:after="0"/>
+        <w:ind w:firstLine="850" w:left="0" w:right="0"/>
+        <w:jc w:val="both"/>
+        <w:rPr>
+          <w:lang w:val="uk-UA"/>
+        </w:rPr>
+      </w:pPr>
+      <w:r>
+        <w:rPr>
+          <w:lang w:val="uk-UA"/>
+        </w:rPr>
+        <w:t>забезпечувати досягнення СУЯ запланованих результатів;</w:t>
+      </w:r>
+    </w:p>
+    <w:p>
+      <w:pPr>
+        <w:pStyle w:val="P1"/>
+        <w:widowControl/>
+        <w:numPr>
+          <w:ilvl w:val="0"/>
+          <w:numId w:val="7"/>
+        </w:numPr>
+        <w:suppressAutoHyphens w:val="true"/>
+        <w:bidi w:val="0"/>
+        <w:spacing w:lineRule="auto" w:line="360" w:before="0" w:after="0"/>
+        <w:ind w:firstLine="850" w:left="0" w:right="0"/>
+        <w:jc w:val="both"/>
+        <w:rPr>
+          <w:lang w:val="uk-UA"/>
+        </w:rPr>
+      </w:pPr>
+      <w:r>
+        <w:rPr>
+          <w:lang w:val="uk-UA"/>
+        </w:rPr>
+        <w:t>заохочувати персонал робити свій внесок у результативність СУЯ;</w:t>
       </w:r>
     </w:p>
     <w:p>
@@ -3443,6 +3504,1004 @@
       <w:r>
         <w:rPr/>
         <w:t>4.6 Керування ресурсами</w:t>
+      </w:r>
+    </w:p>
+    <w:p>
+      <w:pPr>
+        <w:pStyle w:val="P1"/>
+        <w:spacing w:before="0" w:after="0"/>
+        <w:rPr/>
+      </w:pPr>
+      <w:r>
+        <w:rPr/>
+      </w:r>
+    </w:p>
+    <w:p>
+      <w:pPr>
+        <w:pStyle w:val="P1"/>
+        <w:spacing w:before="0" w:after="0"/>
+        <w:rPr/>
+      </w:pPr>
+      <w:r>
+        <w:rPr/>
+        <w:t>Ресурси, якими володіє компанія наведені у таблиці 4.1.</w:t>
+      </w:r>
+    </w:p>
+    <w:p>
+      <w:pPr>
+        <w:pStyle w:val="P1"/>
+        <w:spacing w:before="0" w:after="0"/>
+        <w:rPr/>
+      </w:pPr>
+      <w:r>
+        <w:rPr/>
+      </w:r>
+    </w:p>
+    <w:p>
+      <w:pPr>
+        <w:pStyle w:val="P1"/>
+        <w:spacing w:before="0" w:after="0"/>
+        <w:rPr/>
+      </w:pPr>
+      <w:r>
+        <w:rPr/>
+        <w:t>Таблиця 4.1 — Ресурси компанії</w:t>
+      </w:r>
+    </w:p>
+    <w:tbl>
+      <w:tblPr>
+        <w:tblW w:w="9026" w:type="dxa"/>
+        <w:jc w:val="left"/>
+        <w:tblInd w:w="55" w:type="dxa"/>
+        <w:tblLayout w:type="fixed"/>
+        <w:tblCellMar>
+          <w:top w:w="55" w:type="dxa"/>
+          <w:left w:w="55" w:type="dxa"/>
+          <w:bottom w:w="55" w:type="dxa"/>
+          <w:right w:w="55" w:type="dxa"/>
+        </w:tblCellMar>
+      </w:tblPr>
+      <w:tblGrid>
+        <w:gridCol w:w="372"/>
+        <w:gridCol w:w="3125"/>
+        <w:gridCol w:w="1189"/>
+        <w:gridCol w:w="1851"/>
+        <w:gridCol w:w="2489"/>
+      </w:tblGrid>
+      <w:tr>
+        <w:trPr/>
+        <w:tc>
+          <w:tcPr>
+            <w:tcW w:w="372" w:type="dxa"/>
+            <w:tcBorders>
+              <w:top w:val="single" w:sz="4" w:space="0" w:color="000000"/>
+              <w:left w:val="single" w:sz="4" w:space="0" w:color="000000"/>
+              <w:bottom w:val="single" w:sz="4" w:space="0" w:color="000000"/>
+            </w:tcBorders>
+          </w:tcPr>
+          <w:p>
+            <w:pPr>
+              <w:pStyle w:val="Style16"/>
+              <w:spacing w:lineRule="auto" w:line="240"/>
+              <w:ind w:hanging="0" w:left="0"/>
+              <w:rPr>
+                <w:b/>
+                <w:bCs/>
+                <w:sz w:val="24"/>
+                <w:szCs w:val="24"/>
+              </w:rPr>
+            </w:pPr>
+            <w:r>
+              <w:rPr>
+                <w:b/>
+                <w:bCs/>
+                <w:sz w:val="24"/>
+                <w:szCs w:val="24"/>
+              </w:rPr>
+              <w:t>№</w:t>
+            </w:r>
+          </w:p>
+        </w:tc>
+        <w:tc>
+          <w:tcPr>
+            <w:tcW w:w="3125" w:type="dxa"/>
+            <w:tcBorders>
+              <w:top w:val="single" w:sz="4" w:space="0" w:color="000000"/>
+              <w:left w:val="single" w:sz="4" w:space="0" w:color="000000"/>
+              <w:bottom w:val="single" w:sz="4" w:space="0" w:color="000000"/>
+            </w:tcBorders>
+          </w:tcPr>
+          <w:p>
+            <w:pPr>
+              <w:pStyle w:val="Style16"/>
+              <w:spacing w:lineRule="auto" w:line="240"/>
+              <w:ind w:hanging="0" w:left="0"/>
+              <w:rPr>
+                <w:b/>
+                <w:bCs/>
+                <w:sz w:val="24"/>
+                <w:szCs w:val="24"/>
+              </w:rPr>
+            </w:pPr>
+            <w:r>
+              <w:rPr>
+                <w:b/>
+                <w:bCs/>
+                <w:sz w:val="24"/>
+                <w:szCs w:val="24"/>
+              </w:rPr>
+              <w:t>Назва</w:t>
+            </w:r>
+          </w:p>
+        </w:tc>
+        <w:tc>
+          <w:tcPr>
+            <w:tcW w:w="1189" w:type="dxa"/>
+            <w:tcBorders>
+              <w:top w:val="single" w:sz="4" w:space="0" w:color="000000"/>
+              <w:left w:val="single" w:sz="4" w:space="0" w:color="000000"/>
+              <w:bottom w:val="single" w:sz="4" w:space="0" w:color="000000"/>
+            </w:tcBorders>
+          </w:tcPr>
+          <w:p>
+            <w:pPr>
+              <w:pStyle w:val="Style16"/>
+              <w:spacing w:lineRule="auto" w:line="240"/>
+              <w:ind w:hanging="0" w:left="0"/>
+              <w:rPr>
+                <w:b/>
+                <w:bCs/>
+                <w:sz w:val="24"/>
+                <w:szCs w:val="24"/>
+              </w:rPr>
+            </w:pPr>
+            <w:r>
+              <w:rPr>
+                <w:b/>
+                <w:bCs/>
+                <w:sz w:val="24"/>
+                <w:szCs w:val="24"/>
+              </w:rPr>
+              <w:t>Кількість</w:t>
+            </w:r>
+          </w:p>
+        </w:tc>
+        <w:tc>
+          <w:tcPr>
+            <w:tcW w:w="1851" w:type="dxa"/>
+            <w:tcBorders>
+              <w:top w:val="single" w:sz="4" w:space="0" w:color="000000"/>
+              <w:left w:val="single" w:sz="4" w:space="0" w:color="000000"/>
+              <w:bottom w:val="single" w:sz="4" w:space="0" w:color="000000"/>
+            </w:tcBorders>
+          </w:tcPr>
+          <w:p>
+            <w:pPr>
+              <w:pStyle w:val="Style16"/>
+              <w:spacing w:lineRule="auto" w:line="240"/>
+              <w:ind w:hanging="0" w:left="0"/>
+              <w:rPr>
+                <w:b/>
+                <w:bCs/>
+                <w:sz w:val="24"/>
+                <w:szCs w:val="24"/>
+              </w:rPr>
+            </w:pPr>
+            <w:r>
+              <w:rPr>
+                <w:b/>
+                <w:bCs/>
+                <w:sz w:val="24"/>
+                <w:szCs w:val="24"/>
+              </w:rPr>
+              <w:t>Відповідальний</w:t>
+            </w:r>
+          </w:p>
+        </w:tc>
+        <w:tc>
+          <w:tcPr>
+            <w:tcW w:w="2489" w:type="dxa"/>
+            <w:tcBorders>
+              <w:top w:val="single" w:sz="4" w:space="0" w:color="000000"/>
+              <w:left w:val="single" w:sz="4" w:space="0" w:color="000000"/>
+              <w:bottom w:val="single" w:sz="4" w:space="0" w:color="000000"/>
+              <w:right w:val="single" w:sz="4" w:space="0" w:color="000000"/>
+            </w:tcBorders>
+          </w:tcPr>
+          <w:p>
+            <w:pPr>
+              <w:pStyle w:val="Style16"/>
+              <w:spacing w:lineRule="auto" w:line="240"/>
+              <w:ind w:hanging="0" w:left="0"/>
+              <w:rPr>
+                <w:b/>
+                <w:bCs/>
+                <w:sz w:val="24"/>
+                <w:szCs w:val="24"/>
+              </w:rPr>
+            </w:pPr>
+            <w:r>
+              <w:rPr>
+                <w:b/>
+                <w:bCs/>
+                <w:sz w:val="24"/>
+                <w:szCs w:val="24"/>
+              </w:rPr>
+              <w:t>Власне чи орендується</w:t>
+            </w:r>
+          </w:p>
+        </w:tc>
+      </w:tr>
+      <w:tr>
+        <w:trPr/>
+        <w:tc>
+          <w:tcPr>
+            <w:tcW w:w="372" w:type="dxa"/>
+            <w:tcBorders>
+              <w:left w:val="single" w:sz="4" w:space="0" w:color="000000"/>
+              <w:bottom w:val="single" w:sz="4" w:space="0" w:color="000000"/>
+            </w:tcBorders>
+          </w:tcPr>
+          <w:p>
+            <w:pPr>
+              <w:pStyle w:val="Style16"/>
+              <w:spacing w:lineRule="auto" w:line="240"/>
+              <w:ind w:hanging="0" w:left="0"/>
+              <w:rPr>
+                <w:sz w:val="24"/>
+                <w:szCs w:val="24"/>
+              </w:rPr>
+            </w:pPr>
+            <w:r>
+              <w:rPr>
+                <w:sz w:val="24"/>
+                <w:szCs w:val="24"/>
+              </w:rPr>
+              <w:t>1</w:t>
+            </w:r>
+          </w:p>
+        </w:tc>
+        <w:tc>
+          <w:tcPr>
+            <w:tcW w:w="3125" w:type="dxa"/>
+            <w:tcBorders>
+              <w:left w:val="single" w:sz="4" w:space="0" w:color="000000"/>
+              <w:bottom w:val="single" w:sz="4" w:space="0" w:color="000000"/>
+            </w:tcBorders>
+          </w:tcPr>
+          <w:p>
+            <w:pPr>
+              <w:pStyle w:val="Style16"/>
+              <w:spacing w:lineRule="auto" w:line="240"/>
+              <w:ind w:hanging="0" w:left="0"/>
+              <w:rPr>
+                <w:sz w:val="24"/>
+                <w:szCs w:val="24"/>
+              </w:rPr>
+            </w:pPr>
+            <w:r>
+              <w:rPr>
+                <w:sz w:val="24"/>
+                <w:szCs w:val="24"/>
+              </w:rPr>
+              <w:t xml:space="preserve">Автомобіль </w:t>
+            </w:r>
+            <w:r>
+              <w:rPr>
+                <w:sz w:val="24"/>
+                <w:szCs w:val="24"/>
+                <w:lang w:val="en-US"/>
+              </w:rPr>
+              <w:t>Skoda Fabia 2008</w:t>
+            </w:r>
+          </w:p>
+        </w:tc>
+        <w:tc>
+          <w:tcPr>
+            <w:tcW w:w="1189" w:type="dxa"/>
+            <w:tcBorders>
+              <w:left w:val="single" w:sz="4" w:space="0" w:color="000000"/>
+              <w:bottom w:val="single" w:sz="4" w:space="0" w:color="000000"/>
+            </w:tcBorders>
+          </w:tcPr>
+          <w:p>
+            <w:pPr>
+              <w:pStyle w:val="Style16"/>
+              <w:spacing w:lineRule="auto" w:line="240"/>
+              <w:ind w:hanging="0" w:left="0"/>
+              <w:rPr>
+                <w:sz w:val="24"/>
+                <w:szCs w:val="24"/>
+              </w:rPr>
+            </w:pPr>
+            <w:r>
+              <w:rPr>
+                <w:sz w:val="24"/>
+                <w:szCs w:val="24"/>
+              </w:rPr>
+              <w:t>1</w:t>
+            </w:r>
+          </w:p>
+        </w:tc>
+        <w:tc>
+          <w:tcPr>
+            <w:tcW w:w="1851" w:type="dxa"/>
+            <w:tcBorders>
+              <w:left w:val="single" w:sz="4" w:space="0" w:color="000000"/>
+              <w:bottom w:val="single" w:sz="4" w:space="0" w:color="000000"/>
+            </w:tcBorders>
+          </w:tcPr>
+          <w:p>
+            <w:pPr>
+              <w:pStyle w:val="Style16"/>
+              <w:spacing w:lineRule="auto" w:line="240"/>
+              <w:ind w:hanging="0" w:left="0"/>
+              <w:rPr>
+                <w:sz w:val="24"/>
+                <w:szCs w:val="24"/>
+              </w:rPr>
+            </w:pPr>
+            <w:r>
+              <w:rPr>
+                <w:sz w:val="24"/>
+                <w:szCs w:val="24"/>
+              </w:rPr>
+              <w:t>Водій</w:t>
+            </w:r>
+          </w:p>
+        </w:tc>
+        <w:tc>
+          <w:tcPr>
+            <w:tcW w:w="2489" w:type="dxa"/>
+            <w:tcBorders>
+              <w:left w:val="single" w:sz="4" w:space="0" w:color="000000"/>
+              <w:bottom w:val="single" w:sz="4" w:space="0" w:color="000000"/>
+              <w:right w:val="single" w:sz="4" w:space="0" w:color="000000"/>
+            </w:tcBorders>
+          </w:tcPr>
+          <w:p>
+            <w:pPr>
+              <w:pStyle w:val="Style16"/>
+              <w:spacing w:lineRule="auto" w:line="240"/>
+              <w:ind w:hanging="0" w:left="0"/>
+              <w:rPr>
+                <w:b w:val="false"/>
+                <w:bCs w:val="false"/>
+                <w:sz w:val="24"/>
+                <w:szCs w:val="24"/>
+              </w:rPr>
+            </w:pPr>
+            <w:r>
+              <w:rPr>
+                <w:b w:val="false"/>
+                <w:bCs w:val="false"/>
+                <w:sz w:val="24"/>
+                <w:szCs w:val="24"/>
+              </w:rPr>
+              <w:t>Власна</w:t>
+            </w:r>
+          </w:p>
+        </w:tc>
+      </w:tr>
+      <w:tr>
+        <w:trPr/>
+        <w:tc>
+          <w:tcPr>
+            <w:tcW w:w="372" w:type="dxa"/>
+            <w:tcBorders>
+              <w:left w:val="single" w:sz="4" w:space="0" w:color="000000"/>
+              <w:bottom w:val="single" w:sz="4" w:space="0" w:color="000000"/>
+            </w:tcBorders>
+          </w:tcPr>
+          <w:p>
+            <w:pPr>
+              <w:pStyle w:val="Style16"/>
+              <w:spacing w:lineRule="auto" w:line="240"/>
+              <w:ind w:hanging="0" w:left="0"/>
+              <w:rPr>
+                <w:sz w:val="24"/>
+                <w:szCs w:val="24"/>
+              </w:rPr>
+            </w:pPr>
+            <w:r>
+              <w:rPr>
+                <w:sz w:val="24"/>
+                <w:szCs w:val="24"/>
+              </w:rPr>
+              <w:t>2</w:t>
+            </w:r>
+          </w:p>
+        </w:tc>
+        <w:tc>
+          <w:tcPr>
+            <w:tcW w:w="3125" w:type="dxa"/>
+            <w:tcBorders>
+              <w:left w:val="single" w:sz="4" w:space="0" w:color="000000"/>
+              <w:bottom w:val="single" w:sz="4" w:space="0" w:color="000000"/>
+            </w:tcBorders>
+          </w:tcPr>
+          <w:p>
+            <w:pPr>
+              <w:pStyle w:val="Style16"/>
+              <w:spacing w:lineRule="auto" w:line="240"/>
+              <w:ind w:hanging="0" w:left="0"/>
+              <w:rPr>
+                <w:sz w:val="24"/>
+                <w:szCs w:val="24"/>
+              </w:rPr>
+            </w:pPr>
+            <w:r>
+              <w:rPr>
+                <w:sz w:val="24"/>
+                <w:szCs w:val="24"/>
+              </w:rPr>
+              <w:t xml:space="preserve">Відеокамера </w:t>
+            </w:r>
+            <w:r>
+              <w:rPr>
+                <w:sz w:val="24"/>
+                <w:szCs w:val="24"/>
+                <w:lang w:val="en-US"/>
+              </w:rPr>
+              <w:t>Sony a7 V</w:t>
+            </w:r>
+          </w:p>
+        </w:tc>
+        <w:tc>
+          <w:tcPr>
+            <w:tcW w:w="1189" w:type="dxa"/>
+            <w:tcBorders>
+              <w:left w:val="single" w:sz="4" w:space="0" w:color="000000"/>
+              <w:bottom w:val="single" w:sz="4" w:space="0" w:color="000000"/>
+            </w:tcBorders>
+          </w:tcPr>
+          <w:p>
+            <w:pPr>
+              <w:pStyle w:val="Style16"/>
+              <w:spacing w:lineRule="auto" w:line="240"/>
+              <w:ind w:hanging="0" w:left="0"/>
+              <w:rPr>
+                <w:sz w:val="24"/>
+                <w:szCs w:val="24"/>
+                <w:lang w:val="en-US"/>
+              </w:rPr>
+            </w:pPr>
+            <w:r>
+              <w:rPr>
+                <w:sz w:val="24"/>
+                <w:szCs w:val="24"/>
+                <w:lang w:val="en-US"/>
+              </w:rPr>
+              <w:t>1</w:t>
+            </w:r>
+          </w:p>
+        </w:tc>
+        <w:tc>
+          <w:tcPr>
+            <w:tcW w:w="1851" w:type="dxa"/>
+            <w:tcBorders>
+              <w:left w:val="single" w:sz="4" w:space="0" w:color="000000"/>
+              <w:bottom w:val="single" w:sz="4" w:space="0" w:color="000000"/>
+            </w:tcBorders>
+          </w:tcPr>
+          <w:p>
+            <w:pPr>
+              <w:pStyle w:val="Style16"/>
+              <w:spacing w:lineRule="auto" w:line="240"/>
+              <w:ind w:hanging="0" w:left="0"/>
+              <w:rPr>
+                <w:sz w:val="24"/>
+                <w:szCs w:val="24"/>
+              </w:rPr>
+            </w:pPr>
+            <w:r>
+              <w:rPr>
+                <w:sz w:val="24"/>
+                <w:szCs w:val="24"/>
+              </w:rPr>
+              <w:t>Оператор</w:t>
+            </w:r>
+          </w:p>
+        </w:tc>
+        <w:tc>
+          <w:tcPr>
+            <w:tcW w:w="2489" w:type="dxa"/>
+            <w:tcBorders>
+              <w:left w:val="single" w:sz="4" w:space="0" w:color="000000"/>
+              <w:bottom w:val="single" w:sz="4" w:space="0" w:color="000000"/>
+              <w:right w:val="single" w:sz="4" w:space="0" w:color="000000"/>
+            </w:tcBorders>
+          </w:tcPr>
+          <w:p>
+            <w:pPr>
+              <w:pStyle w:val="Style16"/>
+              <w:spacing w:lineRule="auto" w:line="240"/>
+              <w:ind w:hanging="0" w:left="0"/>
+              <w:rPr>
+                <w:sz w:val="24"/>
+                <w:szCs w:val="24"/>
+              </w:rPr>
+            </w:pPr>
+            <w:r>
+              <w:rPr>
+                <w:sz w:val="24"/>
+                <w:szCs w:val="24"/>
+              </w:rPr>
+              <w:t>Орендується</w:t>
+            </w:r>
+          </w:p>
+        </w:tc>
+      </w:tr>
+      <w:tr>
+        <w:trPr/>
+        <w:tc>
+          <w:tcPr>
+            <w:tcW w:w="372" w:type="dxa"/>
+            <w:tcBorders>
+              <w:left w:val="single" w:sz="4" w:space="0" w:color="000000"/>
+              <w:bottom w:val="single" w:sz="4" w:space="0" w:color="000000"/>
+            </w:tcBorders>
+          </w:tcPr>
+          <w:p>
+            <w:pPr>
+              <w:pStyle w:val="Style16"/>
+              <w:spacing w:lineRule="auto" w:line="240"/>
+              <w:ind w:hanging="0" w:left="0"/>
+              <w:rPr>
+                <w:sz w:val="24"/>
+                <w:szCs w:val="24"/>
+              </w:rPr>
+            </w:pPr>
+            <w:r>
+              <w:rPr>
+                <w:sz w:val="24"/>
+                <w:szCs w:val="24"/>
+              </w:rPr>
+              <w:t>3</w:t>
+            </w:r>
+          </w:p>
+        </w:tc>
+        <w:tc>
+          <w:tcPr>
+            <w:tcW w:w="3125" w:type="dxa"/>
+            <w:tcBorders>
+              <w:left w:val="single" w:sz="4" w:space="0" w:color="000000"/>
+              <w:bottom w:val="single" w:sz="4" w:space="0" w:color="000000"/>
+            </w:tcBorders>
+          </w:tcPr>
+          <w:p>
+            <w:pPr>
+              <w:pStyle w:val="Style16"/>
+              <w:spacing w:lineRule="auto" w:line="240"/>
+              <w:ind w:hanging="0" w:left="0"/>
+              <w:rPr>
+                <w:sz w:val="24"/>
+                <w:szCs w:val="24"/>
+              </w:rPr>
+            </w:pPr>
+            <w:r>
+              <w:rPr>
+                <w:sz w:val="24"/>
+                <w:szCs w:val="24"/>
+              </w:rPr>
+              <w:t>Мікрофон Sennheiser MD46</w:t>
+            </w:r>
+          </w:p>
+        </w:tc>
+        <w:tc>
+          <w:tcPr>
+            <w:tcW w:w="1189" w:type="dxa"/>
+            <w:tcBorders>
+              <w:left w:val="single" w:sz="4" w:space="0" w:color="000000"/>
+              <w:bottom w:val="single" w:sz="4" w:space="0" w:color="000000"/>
+            </w:tcBorders>
+          </w:tcPr>
+          <w:p>
+            <w:pPr>
+              <w:pStyle w:val="Style16"/>
+              <w:spacing w:lineRule="auto" w:line="240"/>
+              <w:ind w:hanging="0" w:left="0"/>
+              <w:rPr>
+                <w:sz w:val="24"/>
+                <w:szCs w:val="24"/>
+                <w:lang w:val="uk-UA"/>
+              </w:rPr>
+            </w:pPr>
+            <w:r>
+              <w:rPr>
+                <w:sz w:val="24"/>
+                <w:szCs w:val="24"/>
+                <w:lang w:val="uk-UA"/>
+              </w:rPr>
+              <w:t>1</w:t>
+            </w:r>
+          </w:p>
+        </w:tc>
+        <w:tc>
+          <w:tcPr>
+            <w:tcW w:w="1851" w:type="dxa"/>
+            <w:tcBorders>
+              <w:left w:val="single" w:sz="4" w:space="0" w:color="000000"/>
+              <w:bottom w:val="single" w:sz="4" w:space="0" w:color="000000"/>
+            </w:tcBorders>
+          </w:tcPr>
+          <w:p>
+            <w:pPr>
+              <w:pStyle w:val="Style16"/>
+              <w:spacing w:lineRule="auto" w:line="240"/>
+              <w:ind w:hanging="0" w:left="0"/>
+              <w:rPr>
+                <w:sz w:val="24"/>
+                <w:szCs w:val="24"/>
+              </w:rPr>
+            </w:pPr>
+            <w:r>
+              <w:rPr>
+                <w:sz w:val="24"/>
+                <w:szCs w:val="24"/>
+              </w:rPr>
+              <w:t>Репортер</w:t>
+            </w:r>
+          </w:p>
+        </w:tc>
+        <w:tc>
+          <w:tcPr>
+            <w:tcW w:w="2489" w:type="dxa"/>
+            <w:tcBorders>
+              <w:left w:val="single" w:sz="4" w:space="0" w:color="000000"/>
+              <w:bottom w:val="single" w:sz="4" w:space="0" w:color="000000"/>
+              <w:right w:val="single" w:sz="4" w:space="0" w:color="000000"/>
+            </w:tcBorders>
+          </w:tcPr>
+          <w:p>
+            <w:pPr>
+              <w:pStyle w:val="Style16"/>
+              <w:spacing w:lineRule="auto" w:line="240"/>
+              <w:ind w:hanging="0" w:left="0"/>
+              <w:rPr>
+                <w:sz w:val="24"/>
+                <w:szCs w:val="24"/>
+              </w:rPr>
+            </w:pPr>
+            <w:r>
+              <w:rPr>
+                <w:sz w:val="24"/>
+                <w:szCs w:val="24"/>
+              </w:rPr>
+              <w:t>Власний</w:t>
+            </w:r>
+          </w:p>
+        </w:tc>
+      </w:tr>
+      <w:tr>
+        <w:trPr/>
+        <w:tc>
+          <w:tcPr>
+            <w:tcW w:w="372" w:type="dxa"/>
+            <w:tcBorders>
+              <w:left w:val="single" w:sz="4" w:space="0" w:color="000000"/>
+              <w:bottom w:val="single" w:sz="4" w:space="0" w:color="000000"/>
+            </w:tcBorders>
+          </w:tcPr>
+          <w:p>
+            <w:pPr>
+              <w:pStyle w:val="Style16"/>
+              <w:spacing w:lineRule="auto" w:line="240"/>
+              <w:ind w:hanging="0" w:left="0"/>
+              <w:rPr>
+                <w:sz w:val="24"/>
+                <w:szCs w:val="24"/>
+              </w:rPr>
+            </w:pPr>
+            <w:r>
+              <w:rPr>
+                <w:sz w:val="24"/>
+                <w:szCs w:val="24"/>
+              </w:rPr>
+              <w:t>4</w:t>
+            </w:r>
+          </w:p>
+        </w:tc>
+        <w:tc>
+          <w:tcPr>
+            <w:tcW w:w="3125" w:type="dxa"/>
+            <w:tcBorders>
+              <w:left w:val="single" w:sz="4" w:space="0" w:color="000000"/>
+              <w:bottom w:val="single" w:sz="4" w:space="0" w:color="000000"/>
+            </w:tcBorders>
+          </w:tcPr>
+          <w:p>
+            <w:pPr>
+              <w:pStyle w:val="Style16"/>
+              <w:spacing w:lineRule="auto" w:line="240"/>
+              <w:ind w:hanging="0" w:left="0"/>
+              <w:rPr>
+                <w:sz w:val="24"/>
+                <w:szCs w:val="24"/>
+              </w:rPr>
+            </w:pPr>
+            <w:r>
+              <w:rPr>
+                <w:sz w:val="24"/>
+                <w:szCs w:val="24"/>
+              </w:rPr>
+              <w:t xml:space="preserve">Ноутбук </w:t>
+            </w:r>
+            <w:r>
+              <w:rPr>
+                <w:sz w:val="24"/>
+                <w:szCs w:val="24"/>
+                <w:lang w:val="en-US"/>
+              </w:rPr>
+              <w:t>Apple MacBook Air</w:t>
+            </w:r>
+          </w:p>
+        </w:tc>
+        <w:tc>
+          <w:tcPr>
+            <w:tcW w:w="1189" w:type="dxa"/>
+            <w:tcBorders>
+              <w:left w:val="single" w:sz="4" w:space="0" w:color="000000"/>
+              <w:bottom w:val="single" w:sz="4" w:space="0" w:color="000000"/>
+            </w:tcBorders>
+          </w:tcPr>
+          <w:p>
+            <w:pPr>
+              <w:pStyle w:val="Style16"/>
+              <w:spacing w:lineRule="auto" w:line="240"/>
+              <w:ind w:hanging="0" w:left="0"/>
+              <w:rPr>
+                <w:sz w:val="24"/>
+                <w:szCs w:val="24"/>
+                <w:lang w:val="uk-UA"/>
+              </w:rPr>
+            </w:pPr>
+            <w:r>
+              <w:rPr>
+                <w:sz w:val="24"/>
+                <w:szCs w:val="24"/>
+                <w:lang w:val="uk-UA"/>
+              </w:rPr>
+              <w:t>2</w:t>
+            </w:r>
+          </w:p>
+        </w:tc>
+        <w:tc>
+          <w:tcPr>
+            <w:tcW w:w="1851" w:type="dxa"/>
+            <w:tcBorders>
+              <w:left w:val="single" w:sz="4" w:space="0" w:color="000000"/>
+              <w:bottom w:val="single" w:sz="4" w:space="0" w:color="000000"/>
+            </w:tcBorders>
+          </w:tcPr>
+          <w:p>
+            <w:pPr>
+              <w:pStyle w:val="Style16"/>
+              <w:spacing w:lineRule="auto" w:line="240"/>
+              <w:ind w:hanging="0" w:left="0"/>
+              <w:rPr>
+                <w:sz w:val="24"/>
+                <w:szCs w:val="24"/>
+              </w:rPr>
+            </w:pPr>
+            <w:r>
+              <w:rPr>
+                <w:sz w:val="24"/>
+                <w:szCs w:val="24"/>
+              </w:rPr>
+              <w:t>ІТ відділ</w:t>
+            </w:r>
+          </w:p>
+        </w:tc>
+        <w:tc>
+          <w:tcPr>
+            <w:tcW w:w="2489" w:type="dxa"/>
+            <w:tcBorders>
+              <w:left w:val="single" w:sz="4" w:space="0" w:color="000000"/>
+              <w:bottom w:val="single" w:sz="4" w:space="0" w:color="000000"/>
+              <w:right w:val="single" w:sz="4" w:space="0" w:color="000000"/>
+            </w:tcBorders>
+          </w:tcPr>
+          <w:p>
+            <w:pPr>
+              <w:pStyle w:val="Style16"/>
+              <w:spacing w:lineRule="auto" w:line="240"/>
+              <w:ind w:hanging="0" w:left="0"/>
+              <w:rPr>
+                <w:sz w:val="24"/>
+                <w:szCs w:val="24"/>
+              </w:rPr>
+            </w:pPr>
+            <w:r>
+              <w:rPr>
+                <w:sz w:val="24"/>
+                <w:szCs w:val="24"/>
+              </w:rPr>
+              <w:t>Власні</w:t>
+            </w:r>
+          </w:p>
+        </w:tc>
+      </w:tr>
+      <w:tr>
+        <w:trPr/>
+        <w:tc>
+          <w:tcPr>
+            <w:tcW w:w="372" w:type="dxa"/>
+            <w:tcBorders>
+              <w:left w:val="single" w:sz="4" w:space="0" w:color="000000"/>
+              <w:bottom w:val="single" w:sz="4" w:space="0" w:color="000000"/>
+            </w:tcBorders>
+          </w:tcPr>
+          <w:p>
+            <w:pPr>
+              <w:pStyle w:val="Style16"/>
+              <w:spacing w:lineRule="auto" w:line="240"/>
+              <w:ind w:hanging="0" w:left="0"/>
+              <w:rPr>
+                <w:sz w:val="24"/>
+                <w:szCs w:val="24"/>
+              </w:rPr>
+            </w:pPr>
+            <w:r>
+              <w:rPr>
+                <w:sz w:val="24"/>
+                <w:szCs w:val="24"/>
+              </w:rPr>
+              <w:t>5</w:t>
+            </w:r>
+          </w:p>
+        </w:tc>
+        <w:tc>
+          <w:tcPr>
+            <w:tcW w:w="3125" w:type="dxa"/>
+            <w:tcBorders>
+              <w:left w:val="single" w:sz="4" w:space="0" w:color="000000"/>
+              <w:bottom w:val="single" w:sz="4" w:space="0" w:color="000000"/>
+            </w:tcBorders>
+          </w:tcPr>
+          <w:p>
+            <w:pPr>
+              <w:pStyle w:val="Style16"/>
+              <w:spacing w:lineRule="auto" w:line="240"/>
+              <w:ind w:hanging="0" w:left="0"/>
+              <w:rPr>
+                <w:sz w:val="24"/>
+                <w:szCs w:val="24"/>
+              </w:rPr>
+            </w:pPr>
+            <w:r>
+              <w:rPr>
+                <w:sz w:val="24"/>
+                <w:szCs w:val="24"/>
+              </w:rPr>
+              <w:t xml:space="preserve">Монітор </w:t>
+            </w:r>
+            <w:r>
+              <w:rPr>
+                <w:sz w:val="24"/>
+                <w:szCs w:val="24"/>
+                <w:lang w:val="en-US"/>
+              </w:rPr>
+              <w:t>BenQ GW2486TC</w:t>
+            </w:r>
+          </w:p>
+        </w:tc>
+        <w:tc>
+          <w:tcPr>
+            <w:tcW w:w="1189" w:type="dxa"/>
+            <w:tcBorders>
+              <w:left w:val="single" w:sz="4" w:space="0" w:color="000000"/>
+              <w:bottom w:val="single" w:sz="4" w:space="0" w:color="000000"/>
+            </w:tcBorders>
+          </w:tcPr>
+          <w:p>
+            <w:pPr>
+              <w:pStyle w:val="Style16"/>
+              <w:spacing w:lineRule="auto" w:line="240"/>
+              <w:ind w:hanging="0" w:left="0"/>
+              <w:rPr>
+                <w:sz w:val="24"/>
+                <w:szCs w:val="24"/>
+                <w:lang w:val="uk-UA"/>
+              </w:rPr>
+            </w:pPr>
+            <w:r>
+              <w:rPr>
+                <w:sz w:val="24"/>
+                <w:szCs w:val="24"/>
+                <w:lang w:val="uk-UA"/>
+              </w:rPr>
+              <w:t>1</w:t>
+            </w:r>
+          </w:p>
+        </w:tc>
+        <w:tc>
+          <w:tcPr>
+            <w:tcW w:w="1851" w:type="dxa"/>
+            <w:tcBorders>
+              <w:left w:val="single" w:sz="4" w:space="0" w:color="000000"/>
+              <w:bottom w:val="single" w:sz="4" w:space="0" w:color="000000"/>
+            </w:tcBorders>
+          </w:tcPr>
+          <w:p>
+            <w:pPr>
+              <w:pStyle w:val="Style16"/>
+              <w:spacing w:lineRule="auto" w:line="240"/>
+              <w:ind w:hanging="0" w:left="0"/>
+              <w:rPr>
+                <w:sz w:val="24"/>
+                <w:szCs w:val="24"/>
+              </w:rPr>
+            </w:pPr>
+            <w:r>
+              <w:rPr>
+                <w:sz w:val="24"/>
+                <w:szCs w:val="24"/>
+              </w:rPr>
+              <w:t>Особа бекенду</w:t>
+            </w:r>
+          </w:p>
+        </w:tc>
+        <w:tc>
+          <w:tcPr>
+            <w:tcW w:w="2489" w:type="dxa"/>
+            <w:tcBorders>
+              <w:left w:val="single" w:sz="4" w:space="0" w:color="000000"/>
+              <w:bottom w:val="single" w:sz="4" w:space="0" w:color="000000"/>
+              <w:right w:val="single" w:sz="4" w:space="0" w:color="000000"/>
+            </w:tcBorders>
+          </w:tcPr>
+          <w:p>
+            <w:pPr>
+              <w:pStyle w:val="Style16"/>
+              <w:spacing w:lineRule="auto" w:line="240"/>
+              <w:ind w:hanging="0" w:left="0"/>
+              <w:rPr>
+                <w:sz w:val="24"/>
+                <w:szCs w:val="24"/>
+              </w:rPr>
+            </w:pPr>
+            <w:r>
+              <w:rPr>
+                <w:sz w:val="24"/>
+                <w:szCs w:val="24"/>
+              </w:rPr>
+              <w:t>Орендується</w:t>
+            </w:r>
+          </w:p>
+        </w:tc>
+      </w:tr>
+    </w:tbl>
+    <w:p>
+      <w:pPr>
+        <w:pStyle w:val="P1"/>
+        <w:spacing w:before="0" w:after="0"/>
+        <w:rPr/>
+      </w:pPr>
+      <w:r>
+        <w:rPr/>
+      </w:r>
+    </w:p>
+    <w:p>
+      <w:pPr>
+        <w:pStyle w:val="P1"/>
+        <w:spacing w:before="0" w:after="0"/>
+        <w:rPr/>
+      </w:pPr>
+      <w:r>
+        <w:rPr/>
+        <w:t>Ресурси обслуговуються відповідальними особами.</w:t>
+      </w:r>
+    </w:p>
+    <w:p>
+      <w:pPr>
+        <w:pStyle w:val="P1"/>
+        <w:spacing w:before="0" w:after="0"/>
+        <w:rPr/>
+      </w:pPr>
+      <w:r>
+        <w:rPr/>
+        <w:t>Директор компанії організовує закупки ресурсів. Якщо один з ресурсів виходить з ладу, відповідальна особа подає запит на оновлення ресурсу, який розглядається директором. Після цього директор робить замовлення на нові ресурси. Директор також визначає скільки коштів виділяється на той чи інший ресурс.</w:t>
       </w:r>
     </w:p>
     <w:p>

</xml_diff>

<commit_message>
docs: SP1 approximately done
</commit_message>
<xml_diff>
--- a/51SP Sertyficazija PZ/1/SP1_KNT-116m_Onyshchenko_15.docx
+++ b/51SP Sertyficazija PZ/1/SP1_KNT-116m_Onyshchenko_15.docx
@@ -2272,7 +2272,19 @@
         <w:rPr>
           <w:lang w:val="uk-UA"/>
         </w:rPr>
-        <w:t xml:space="preserve">Компанія займається виготовленням та поширенням новин села Комишуваха на своєму веб-сайті та сторінках у соціальних мережах, а саме </w:t>
+        <w:t xml:space="preserve">Компанія займається виготовленням та поширенням новин </w:t>
+      </w:r>
+      <w:r>
+        <w:rPr>
+          <w:lang w:val="uk-UA"/>
+        </w:rPr>
+        <w:t xml:space="preserve">Запорізької області </w:t>
+      </w:r>
+      <w:r>
+        <w:rPr>
+          <w:lang w:val="uk-UA"/>
+        </w:rPr>
+        <w:t xml:space="preserve">на своєму веб-сайті та сторінках у соціальних мережах, а саме </w:t>
       </w:r>
       <w:r>
         <w:rPr>
@@ -2657,7 +2669,15 @@
       </w:pPr>
       <w:r>
         <w:rPr/>
-        <w:t xml:space="preserve">Діяльність компанії полягає в пошуку та поширенні новин села. </w:t>
+        <w:t xml:space="preserve">Діяльність компанії полягає в пошуку та поширенні новин </w:t>
+      </w:r>
+      <w:r>
+        <w:rPr/>
+        <w:t>області</w:t>
+      </w:r>
+      <w:r>
+        <w:rPr/>
+        <w:t xml:space="preserve">. </w:t>
       </w:r>
     </w:p>
     <w:p>
@@ -2688,7 +2708,15 @@
       </w:pPr>
       <w:r>
         <w:rPr/>
-        <w:t>моніторинг: команда збору новин приймає дзвінки від мешканців села, а також переглядає соціальні мережі на наявність новин;</w:t>
+        <w:t xml:space="preserve">моніторинг: команда збору новин приймає дзвінки від мешканців </w:t>
+      </w:r>
+      <w:r>
+        <w:rPr/>
+        <w:t>області</w:t>
+      </w:r>
+      <w:r>
+        <w:rPr/>
+        <w:t>, а також переглядає соціальні мережі на наявність новин;</w:t>
       </w:r>
     </w:p>
     <w:p>
@@ -2960,7 +2988,31 @@
       </w:pPr>
       <w:r>
         <w:rPr/>
-        <w:t>Аудиторія, на яку розраховує компанія, це мешканці села Комишуваха, а саме 5,000 людей з її популяції (що складає 50% її мешканців) через те, що не всі мають доступ до інтернету.</w:t>
+        <w:t xml:space="preserve">Аудиторія, на яку розраховує компанія, це мешканці </w:t>
+      </w:r>
+      <w:r>
+        <w:rPr/>
+        <w:t>Запорізької області</w:t>
+      </w:r>
+      <w:r>
+        <w:rPr/>
+        <w:t xml:space="preserve">, а саме </w:t>
+      </w:r>
+      <w:r>
+        <w:rPr/>
+        <w:t xml:space="preserve">30,000 </w:t>
+      </w:r>
+      <w:r>
+        <w:rPr/>
+        <w:t xml:space="preserve">людей з її популяції (що складає </w:t>
+      </w:r>
+      <w:r>
+        <w:rPr/>
+        <w:t>3</w:t>
+      </w:r>
+      <w:r>
+        <w:rPr/>
+        <w:t>0% її мешканців) через те, що не всі мають доступ до інтернету.</w:t>
       </w:r>
     </w:p>
     <w:p>
@@ -3271,7 +3323,7 @@
         <w:rPr/>
         <w:drawing>
           <wp:inline distT="0" distB="0" distL="0" distR="0">
-            <wp:extent cx="1840865" cy="3224530"/>
+            <wp:extent cx="1661160" cy="2910205"/>
             <wp:effectExtent l="0" t="0" r="0" b="0"/>
             <wp:docPr id="2" name="Зображення2"/>
             <wp:cNvGraphicFramePr>
@@ -3295,7 +3347,7 @@
                   <pic:spPr bwMode="auto">
                     <a:xfrm>
                       <a:off x="0" y="0"/>
-                      <a:ext cx="1840865" cy="3224530"/>
+                      <a:ext cx="1661160" cy="2910205"/>
                     </a:xfrm>
                     <a:prstGeom prst="rect">
                       <a:avLst/>
@@ -4501,7 +4553,7 @@
       </w:pPr>
       <w:r>
         <w:rPr/>
-        <w:t>Директор компанії організовує закупки ресурсів. Якщо один з ресурсів виходить з ладу, відповідальна особа подає запит на оновлення ресурсу, який розглядається директором. Після цього директор робить замовлення на нові ресурси. Директор також визначає скільки коштів виділяється на той чи інший ресурс.</w:t>
+        <w:t xml:space="preserve">Директор компанії організовує закупівлю ресурсів. Якщо один з ресурсів виходить з ладу, відповідальна особа подає запит на оновлення ресурсу, який розглядається директором. Після цього директор робить замовлення на нові ресурси. Директор також визначає скільки коштів виділяється на той чи інший ресурс. </w:t>
       </w:r>
     </w:p>
     <w:p>
@@ -4512,34 +4564,13 @@
       </w:pPr>
       <w:r>
         <w:rPr/>
-      </w:r>
-    </w:p>
-    <w:p>
-      <w:pPr>
-        <w:pStyle w:val="P1"/>
-        <w:spacing w:before="0" w:after="0"/>
-        <w:rPr/>
-      </w:pPr>
-      <w:r>
-        <w:rPr/>
-        <w:t>Ресурси розподіляються по відділах відповідно до потреб. Керівники відділів створюють запити на ресурси (послуги, товари тощо). Директор компанії розглядає та погоджує ці запити. Після погодження закупівля здійснюється.</w:t>
-      </w:r>
-    </w:p>
-    <w:p>
-      <w:pPr>
-        <w:pStyle w:val="P1"/>
-        <w:spacing w:before="0" w:after="0"/>
-        <w:rPr/>
-      </w:pPr>
-      <w:r>
-        <w:rPr/>
-        <w:t>Стосовно керування новинами, через 2-3 дні кожна новина переходить в архів. Нові статті публікуються на сайті та сторінках у соціальних мережах. Для цього застосовується платформа з керування контентом (</w:t>
-      </w:r>
-      <w:r>
-        <w:rPr>
-          <w:lang w:val="en-US"/>
-        </w:rPr>
-        <w:t>Content Management System, CMS).</w:t>
+        <w:t xml:space="preserve">При закупівлі директор дає завдання </w:t>
+      </w:r>
+      <w:r>
+        <w:rPr>
+          <w:lang w:val="uk-UA"/>
+        </w:rPr>
+        <w:t>по вивченню ринку відповідальний за ресурс особі. По закінченню відповідальна особа надає директору результати. Після цього директор проводить тендер на закупівлю відповідного ресурсу. З переможцем тендеру укладається односторонній загальний конкурентний договір про надання послуг, а саме надання необхідного ресурсу.</w:t>
       </w:r>
     </w:p>
     <w:p>
@@ -4567,7 +4598,9 @@
       <w:pPr>
         <w:pStyle w:val="P1"/>
         <w:spacing w:before="0" w:after="0"/>
-        <w:rPr/>
+        <w:rPr>
+          <w:lang w:val="uk-UA"/>
+        </w:rPr>
       </w:pPr>
       <w:r>
         <w:rPr/>
@@ -4577,65 +4610,15 @@
       <w:pPr>
         <w:pStyle w:val="P1"/>
         <w:spacing w:before="0" w:after="0"/>
-        <w:rPr/>
-      </w:pPr>
-      <w:r>
-        <w:rPr/>
-        <w:t xml:space="preserve">Новини збирає відповідний відділ компанії. Він постійно спостерігає за подіями села та додає до </w:t>
-      </w:r>
-      <w:r>
-        <w:rPr>
-          <w:lang w:val="en-US"/>
-        </w:rPr>
-        <w:t xml:space="preserve">CMS </w:t>
-      </w:r>
-      <w:r>
-        <w:rPr>
-          <w:lang w:val="uk-UA"/>
-        </w:rPr>
-        <w:t>нові статті.</w:t>
-      </w:r>
-    </w:p>
-    <w:p>
-      <w:pPr>
-        <w:pStyle w:val="P1"/>
-        <w:spacing w:before="0" w:after="0"/>
-        <w:rPr/>
-      </w:pPr>
-      <w:r>
-        <w:rPr/>
-      </w:r>
-    </w:p>
-    <w:p>
-      <w:pPr>
-        <w:pStyle w:val="H3"/>
-        <w:spacing w:before="0" w:after="0"/>
-        <w:rPr/>
-      </w:pPr>
-      <w:r>
-        <w:rPr/>
-        <w:t>4.8 Вимірювання, аналізування та поліпшування</w:t>
-      </w:r>
-    </w:p>
-    <w:p>
-      <w:pPr>
-        <w:pStyle w:val="P1"/>
-        <w:spacing w:before="0" w:after="0"/>
-        <w:rPr/>
-      </w:pPr>
-      <w:r>
-        <w:rPr/>
-      </w:r>
-    </w:p>
-    <w:p>
-      <w:pPr>
-        <w:pStyle w:val="P1"/>
-        <w:spacing w:before="0" w:after="0"/>
-        <w:rPr/>
-      </w:pPr>
-      <w:r>
-        <w:rPr/>
-        <w:t>Виміри здійснюються з таких категорій:</w:t>
+        <w:rPr>
+          <w:lang w:val="uk-UA"/>
+        </w:rPr>
+      </w:pPr>
+      <w:r>
+        <w:rPr>
+          <w:lang w:val="uk-UA"/>
+        </w:rPr>
+        <w:t>Компанія виготовлює таку продукцію:</w:t>
       </w:r>
     </w:p>
     <w:p>
@@ -4655,7 +4638,7 @@
       </w:pPr>
       <w:r>
         <w:rPr/>
-        <w:t>кількість переглядів;</w:t>
+        <w:t>новинний репортаж у вигляді відео;</w:t>
       </w:r>
     </w:p>
     <w:p>
@@ -4675,7 +4658,7 @@
       </w:pPr>
       <w:r>
         <w:rPr/>
-        <w:t>швидкість відкриття сторінки;</w:t>
+        <w:t>новинну статтю на сайті;</w:t>
       </w:r>
     </w:p>
     <w:p>
@@ -4695,6 +4678,158 @@
       </w:pPr>
       <w:r>
         <w:rPr/>
+        <w:t>посилання на статтю у вигляді посту в кожній з соціальних мереж.</w:t>
+      </w:r>
+    </w:p>
+    <w:p>
+      <w:pPr>
+        <w:pStyle w:val="P1"/>
+        <w:spacing w:before="0" w:after="0"/>
+        <w:rPr/>
+      </w:pPr>
+      <w:r>
+        <w:rPr/>
+        <w:t xml:space="preserve">Новина перестає бути актуальною через 1 день після її публікації. За 3 дні </w:t>
+      </w:r>
+      <w:r>
+        <w:rPr/>
+        <w:t>п</w:t>
+      </w:r>
+      <w:r>
+        <w:rPr/>
+        <w:t>іс</w:t>
+      </w:r>
+      <w:r>
+        <w:rPr/>
+        <w:t>л</w:t>
+      </w:r>
+      <w:r>
+        <w:rPr/>
+        <w:t xml:space="preserve">я публікації новина переходить в архів компанії. </w:t>
+      </w:r>
+    </w:p>
+    <w:p>
+      <w:pPr>
+        <w:pStyle w:val="P1"/>
+        <w:spacing w:before="0" w:after="0"/>
+        <w:rPr/>
+      </w:pPr>
+      <w:r>
+        <w:rPr/>
+        <w:t xml:space="preserve">Як систему контролю версій обрано засіб </w:t>
+      </w:r>
+      <w:r>
+        <w:rPr>
+          <w:lang w:val="en-US"/>
+        </w:rPr>
+        <w:t xml:space="preserve">Git </w:t>
+      </w:r>
+      <w:r>
+        <w:rPr>
+          <w:lang w:val="uk-UA"/>
+        </w:rPr>
+        <w:t xml:space="preserve">та </w:t>
+      </w:r>
+      <w:r>
+        <w:rPr>
+          <w:lang w:val="en-US"/>
+        </w:rPr>
+        <w:t xml:space="preserve">GitHub </w:t>
+      </w:r>
+      <w:r>
+        <w:rPr>
+          <w:lang w:val="uk-UA"/>
+        </w:rPr>
+        <w:t xml:space="preserve">для керування файлами. </w:t>
+      </w:r>
+    </w:p>
+    <w:p>
+      <w:pPr>
+        <w:pStyle w:val="P1"/>
+        <w:spacing w:before="0" w:after="0"/>
+        <w:rPr/>
+      </w:pPr>
+      <w:r>
+        <w:rPr/>
+      </w:r>
+    </w:p>
+    <w:p>
+      <w:pPr>
+        <w:pStyle w:val="H3"/>
+        <w:spacing w:before="0" w:after="0"/>
+        <w:rPr/>
+      </w:pPr>
+      <w:r>
+        <w:rPr/>
+        <w:t>4.8 Вимірювання, аналізування та поліпшування</w:t>
+      </w:r>
+    </w:p>
+    <w:p>
+      <w:pPr>
+        <w:pStyle w:val="P1"/>
+        <w:spacing w:before="0" w:after="0"/>
+        <w:rPr/>
+      </w:pPr>
+      <w:r>
+        <w:rPr/>
+      </w:r>
+    </w:p>
+    <w:p>
+      <w:pPr>
+        <w:pStyle w:val="P1"/>
+        <w:spacing w:before="0" w:after="0"/>
+        <w:rPr/>
+      </w:pPr>
+      <w:r>
+        <w:rPr/>
+        <w:t>Виміри здійснюються з таких категорій:</w:t>
+      </w:r>
+    </w:p>
+    <w:p>
+      <w:pPr>
+        <w:pStyle w:val="P1"/>
+        <w:widowControl/>
+        <w:numPr>
+          <w:ilvl w:val="0"/>
+          <w:numId w:val="1"/>
+        </w:numPr>
+        <w:suppressAutoHyphens w:val="true"/>
+        <w:bidi w:val="0"/>
+        <w:spacing w:lineRule="auto" w:line="360" w:before="0" w:after="0"/>
+        <w:ind w:firstLine="850" w:left="0" w:right="0"/>
+        <w:jc w:val="both"/>
+        <w:rPr/>
+      </w:pPr>
+      <w:r>
+        <w:rPr/>
+        <w:t xml:space="preserve">кількість переглядів </w:t>
+      </w:r>
+      <w:r>
+        <w:rPr/>
+        <w:t>новинної статті</w:t>
+      </w:r>
+      <w:r>
+        <w:rPr/>
+        <w:t>;</w:t>
+      </w:r>
+    </w:p>
+    <w:p>
+      <w:pPr>
+        <w:pStyle w:val="P1"/>
+        <w:widowControl/>
+        <w:numPr>
+          <w:ilvl w:val="0"/>
+          <w:numId w:val="1"/>
+        </w:numPr>
+        <w:suppressAutoHyphens w:val="true"/>
+        <w:bidi w:val="0"/>
+        <w:spacing w:lineRule="auto" w:line="360" w:before="0" w:after="0"/>
+        <w:ind w:firstLine="850" w:left="0" w:right="0"/>
+        <w:jc w:val="both"/>
+        <w:rPr/>
+      </w:pPr>
+      <w:r>
+        <w:rPr/>
         <w:t>час безперервної роботи ресурсу.</w:t>
       </w:r>
     </w:p>
@@ -4709,7 +4844,19 @@
         <w:rPr>
           <w:lang w:val="uk-UA"/>
         </w:rPr>
-        <w:t xml:space="preserve">Кожна новина аналізується на правдивість. Якщо новина не є правдивою її позначають такою та архівують. </w:t>
+        <w:t xml:space="preserve">Кожна новина аналізується на правдивість. Якщо новина не є правдивою, її </w:t>
+      </w:r>
+      <w:r>
+        <w:rPr>
+          <w:lang w:val="uk-UA"/>
+        </w:rPr>
+        <w:t>не публікують на сайті</w:t>
+      </w:r>
+      <w:r>
+        <w:rPr>
+          <w:lang w:val="uk-UA"/>
+        </w:rPr>
+        <w:t xml:space="preserve">. </w:t>
       </w:r>
     </w:p>
     <w:p>

</xml_diff>

<commit_message>
chore: SP practice past
</commit_message>
<xml_diff>
--- a/51SP Sertyficazija PZ/1/SP1_KNT-116m_Onyshchenko_15.docx
+++ b/51SP Sertyficazija PZ/1/SP1_KNT-116m_Onyshchenko_15.docx
@@ -786,15 +786,7 @@
       </w:pPr>
       <w:r>
         <w:rPr/>
-        <w:t xml:space="preserve">Створена медіа компанія займається новинами Запорізької області. Компанією керує директор, він займається системою управління якістю. У компанії є ІТ відділ (складається з двох осіб: один відповідальний за фронтенд та публікацію новин, другий за бекенд), </w:t>
-      </w:r>
-      <w:r>
-        <w:rPr/>
-        <w:t>який</w:t>
-      </w:r>
-      <w:r>
-        <w:rPr/>
-        <w:t xml:space="preserve"> відповідальний за розробку та підтримку вебсайту компанії та публікації новин на сторінках у соціальних мережах: </w:t>
+        <w:t xml:space="preserve">Створена медіа компанія займається новинами Запорізької області. Компанією керує директор, він займається системою управління якістю. У компанії є ІТ відділ (складається з двох осіб: один відповідальний за фронтенд та публікацію новин, другий за бекенд), який відповідальний за розробку та підтримку вебсайту компанії та публікації новин на сторінках у соціальних мережах: </w:t>
       </w:r>
       <w:r>
         <w:rPr>
@@ -1462,10 +1454,10 @@
         </w:tblCellMar>
       </w:tblPr>
       <w:tblGrid>
-        <w:gridCol w:w="372"/>
-        <w:gridCol w:w="6350"/>
-        <w:gridCol w:w="1992"/>
-        <w:gridCol w:w="2904"/>
+        <w:gridCol w:w="371"/>
+        <w:gridCol w:w="6351"/>
+        <w:gridCol w:w="1991"/>
+        <w:gridCol w:w="2905"/>
       </w:tblGrid>
       <w:tr>
         <w:trPr>
@@ -1473,7 +1465,7 @@
         </w:trPr>
         <w:tc>
           <w:tcPr>
-            <w:tcW w:w="372" w:type="dxa"/>
+            <w:tcW w:w="371" w:type="dxa"/>
             <w:tcBorders>
               <w:top w:val="single" w:sz="4" w:space="0" w:color="000000"/>
               <w:left w:val="single" w:sz="4" w:space="0" w:color="000000"/>
@@ -1483,7 +1475,7 @@
           </w:tcPr>
           <w:p>
             <w:pPr>
-              <w:pStyle w:val="user4"/>
+              <w:pStyle w:val="Style16"/>
               <w:spacing w:lineRule="auto" w:line="240"/>
               <w:ind w:hanging="0" w:left="0"/>
               <w:jc w:val="center"/>
@@ -1509,7 +1501,7 @@
         </w:tc>
         <w:tc>
           <w:tcPr>
-            <w:tcW w:w="6350" w:type="dxa"/>
+            <w:tcW w:w="6351" w:type="dxa"/>
             <w:tcBorders>
               <w:top w:val="single" w:sz="4" w:space="0" w:color="000000"/>
               <w:left w:val="single" w:sz="4" w:space="0" w:color="000000"/>
@@ -1519,7 +1511,7 @@
           </w:tcPr>
           <w:p>
             <w:pPr>
-              <w:pStyle w:val="user4"/>
+              <w:pStyle w:val="Style16"/>
               <w:spacing w:lineRule="auto" w:line="240"/>
               <w:ind w:hanging="0" w:left="0"/>
               <w:jc w:val="center"/>
@@ -1543,7 +1535,7 @@
         </w:tc>
         <w:tc>
           <w:tcPr>
-            <w:tcW w:w="1992" w:type="dxa"/>
+            <w:tcW w:w="1991" w:type="dxa"/>
             <w:tcBorders>
               <w:top w:val="single" w:sz="4" w:space="0" w:color="000000"/>
               <w:left w:val="single" w:sz="4" w:space="0" w:color="000000"/>
@@ -1553,7 +1545,7 @@
           </w:tcPr>
           <w:p>
             <w:pPr>
-              <w:pStyle w:val="user4"/>
+              <w:pStyle w:val="Style16"/>
               <w:spacing w:lineRule="auto" w:line="240"/>
               <w:ind w:hanging="0" w:left="0"/>
               <w:jc w:val="center"/>
@@ -1577,7 +1569,7 @@
         </w:tc>
         <w:tc>
           <w:tcPr>
-            <w:tcW w:w="2904" w:type="dxa"/>
+            <w:tcW w:w="2905" w:type="dxa"/>
             <w:tcBorders>
               <w:top w:val="single" w:sz="4" w:space="0" w:color="000000"/>
               <w:left w:val="single" w:sz="4" w:space="0" w:color="000000"/>
@@ -1615,7 +1607,7 @@
         <w:trPr/>
         <w:tc>
           <w:tcPr>
-            <w:tcW w:w="372" w:type="dxa"/>
+            <w:tcW w:w="371" w:type="dxa"/>
             <w:tcBorders>
               <w:left w:val="single" w:sz="4" w:space="0" w:color="000000"/>
               <w:bottom w:val="single" w:sz="4" w:space="0" w:color="000000"/>
@@ -1624,7 +1616,7 @@
           </w:tcPr>
           <w:p>
             <w:pPr>
-              <w:pStyle w:val="user4"/>
+              <w:pStyle w:val="Style16"/>
               <w:spacing w:lineRule="auto" w:line="240"/>
               <w:ind w:hanging="0" w:left="0"/>
               <w:rPr>
@@ -1643,7 +1635,7 @@
         </w:tc>
         <w:tc>
           <w:tcPr>
-            <w:tcW w:w="6350" w:type="dxa"/>
+            <w:tcW w:w="6351" w:type="dxa"/>
             <w:tcBorders>
               <w:left w:val="single" w:sz="4" w:space="0" w:color="000000"/>
               <w:bottom w:val="single" w:sz="4" w:space="0" w:color="000000"/>
@@ -1652,7 +1644,7 @@
           </w:tcPr>
           <w:p>
             <w:pPr>
-              <w:pStyle w:val="user4"/>
+              <w:pStyle w:val="Style16"/>
               <w:spacing w:lineRule="auto" w:line="240"/>
               <w:ind w:hanging="0" w:left="0"/>
               <w:rPr>
@@ -1671,7 +1663,7 @@
         </w:tc>
         <w:tc>
           <w:tcPr>
-            <w:tcW w:w="1992" w:type="dxa"/>
+            <w:tcW w:w="1991" w:type="dxa"/>
             <w:tcBorders>
               <w:left w:val="single" w:sz="4" w:space="0" w:color="000000"/>
               <w:bottom w:val="single" w:sz="4" w:space="0" w:color="000000"/>
@@ -1680,7 +1672,7 @@
           </w:tcPr>
           <w:p>
             <w:pPr>
-              <w:pStyle w:val="user4"/>
+              <w:pStyle w:val="Style16"/>
               <w:spacing w:lineRule="auto" w:line="240"/>
               <w:ind w:hanging="0" w:left="0"/>
               <w:rPr>
@@ -1693,20 +1685,13 @@
                 <w:sz w:val="24"/>
                 <w:szCs w:val="24"/>
               </w:rPr>
-              <w:t xml:space="preserve">До кінця </w:t>
-            </w:r>
-            <w:r>
-              <w:rPr>
-                <w:sz w:val="24"/>
-                <w:szCs w:val="24"/>
-              </w:rPr>
-              <w:t>місяця</w:t>
+              <w:t>До кінця місяця</w:t>
             </w:r>
           </w:p>
         </w:tc>
         <w:tc>
           <w:tcPr>
-            <w:tcW w:w="2904" w:type="dxa"/>
+            <w:tcW w:w="2905" w:type="dxa"/>
             <w:tcBorders>
               <w:left w:val="single" w:sz="4" w:space="0" w:color="000000"/>
               <w:bottom w:val="single" w:sz="4" w:space="0" w:color="000000"/>
@@ -1738,7 +1723,7 @@
         <w:trPr/>
         <w:tc>
           <w:tcPr>
-            <w:tcW w:w="372" w:type="dxa"/>
+            <w:tcW w:w="371" w:type="dxa"/>
             <w:tcBorders>
               <w:left w:val="single" w:sz="4" w:space="0" w:color="000000"/>
               <w:bottom w:val="single" w:sz="4" w:space="0" w:color="000000"/>
@@ -1747,7 +1732,7 @@
           </w:tcPr>
           <w:p>
             <w:pPr>
-              <w:pStyle w:val="user4"/>
+              <w:pStyle w:val="Style16"/>
               <w:spacing w:lineRule="auto" w:line="240"/>
               <w:ind w:hanging="0" w:left="0"/>
               <w:rPr>
@@ -1766,7 +1751,7 @@
         </w:tc>
         <w:tc>
           <w:tcPr>
-            <w:tcW w:w="6350" w:type="dxa"/>
+            <w:tcW w:w="6351" w:type="dxa"/>
             <w:tcBorders>
               <w:left w:val="single" w:sz="4" w:space="0" w:color="000000"/>
               <w:bottom w:val="single" w:sz="4" w:space="0" w:color="000000"/>
@@ -1775,7 +1760,7 @@
           </w:tcPr>
           <w:p>
             <w:pPr>
-              <w:pStyle w:val="user4"/>
+              <w:pStyle w:val="Style16"/>
               <w:spacing w:lineRule="auto" w:line="240"/>
               <w:ind w:hanging="0" w:left="0"/>
               <w:rPr>
@@ -1788,27 +1773,13 @@
                 <w:sz w:val="24"/>
                 <w:szCs w:val="24"/>
               </w:rPr>
-              <w:t xml:space="preserve">Забезпечити </w:t>
-            </w:r>
-            <w:r>
-              <w:rPr>
-                <w:sz w:val="24"/>
-                <w:szCs w:val="24"/>
-              </w:rPr>
-              <w:t>наявність</w:t>
-            </w:r>
-            <w:r>
-              <w:rPr>
-                <w:sz w:val="24"/>
-                <w:szCs w:val="24"/>
-              </w:rPr>
-              <w:t xml:space="preserve"> хоча б одної фотографії для кожної новинної статті</w:t>
+              <w:t>Забезпечити наявність хоча б одної фотографії для кожної новинної статті</w:t>
             </w:r>
           </w:p>
         </w:tc>
         <w:tc>
           <w:tcPr>
-            <w:tcW w:w="1992" w:type="dxa"/>
+            <w:tcW w:w="1991" w:type="dxa"/>
             <w:tcBorders>
               <w:left w:val="single" w:sz="4" w:space="0" w:color="000000"/>
               <w:bottom w:val="single" w:sz="4" w:space="0" w:color="000000"/>
@@ -1817,7 +1788,7 @@
           </w:tcPr>
           <w:p>
             <w:pPr>
-              <w:pStyle w:val="user4"/>
+              <w:pStyle w:val="Style16"/>
               <w:spacing w:lineRule="auto" w:line="240"/>
               <w:ind w:hanging="0" w:left="0"/>
               <w:rPr>
@@ -1836,7 +1807,7 @@
         </w:tc>
         <w:tc>
           <w:tcPr>
-            <w:tcW w:w="2904" w:type="dxa"/>
+            <w:tcW w:w="2905" w:type="dxa"/>
             <w:tcBorders>
               <w:left w:val="single" w:sz="4" w:space="0" w:color="000000"/>
               <w:bottom w:val="single" w:sz="4" w:space="0" w:color="000000"/>
@@ -1868,7 +1839,7 @@
         <w:trPr/>
         <w:tc>
           <w:tcPr>
-            <w:tcW w:w="372" w:type="dxa"/>
+            <w:tcW w:w="371" w:type="dxa"/>
             <w:tcBorders>
               <w:left w:val="single" w:sz="4" w:space="0" w:color="000000"/>
               <w:bottom w:val="single" w:sz="4" w:space="0" w:color="000000"/>
@@ -1877,7 +1848,7 @@
           </w:tcPr>
           <w:p>
             <w:pPr>
-              <w:pStyle w:val="user4"/>
+              <w:pStyle w:val="Style16"/>
               <w:spacing w:lineRule="auto" w:line="240"/>
               <w:ind w:hanging="0" w:left="0"/>
               <w:rPr>
@@ -1896,7 +1867,7 @@
         </w:tc>
         <w:tc>
           <w:tcPr>
-            <w:tcW w:w="6350" w:type="dxa"/>
+            <w:tcW w:w="6351" w:type="dxa"/>
             <w:tcBorders>
               <w:left w:val="single" w:sz="4" w:space="0" w:color="000000"/>
               <w:bottom w:val="single" w:sz="4" w:space="0" w:color="000000"/>
@@ -1905,7 +1876,7 @@
           </w:tcPr>
           <w:p>
             <w:pPr>
-              <w:pStyle w:val="user4"/>
+              <w:pStyle w:val="Style16"/>
               <w:spacing w:lineRule="auto" w:line="240"/>
               <w:ind w:hanging="0" w:left="0"/>
               <w:rPr>
@@ -1924,7 +1895,7 @@
         </w:tc>
         <w:tc>
           <w:tcPr>
-            <w:tcW w:w="1992" w:type="dxa"/>
+            <w:tcW w:w="1991" w:type="dxa"/>
             <w:tcBorders>
               <w:left w:val="single" w:sz="4" w:space="0" w:color="000000"/>
               <w:bottom w:val="single" w:sz="4" w:space="0" w:color="000000"/>
@@ -1933,7 +1904,7 @@
           </w:tcPr>
           <w:p>
             <w:pPr>
-              <w:pStyle w:val="user4"/>
+              <w:pStyle w:val="Style16"/>
               <w:spacing w:lineRule="auto" w:line="240"/>
               <w:ind w:hanging="0" w:left="0"/>
               <w:rPr>
@@ -1952,7 +1923,7 @@
         </w:tc>
         <w:tc>
           <w:tcPr>
-            <w:tcW w:w="2904" w:type="dxa"/>
+            <w:tcW w:w="2905" w:type="dxa"/>
             <w:tcBorders>
               <w:left w:val="single" w:sz="4" w:space="0" w:color="000000"/>
               <w:bottom w:val="single" w:sz="4" w:space="0" w:color="000000"/>
@@ -1984,7 +1955,7 @@
         <w:trPr/>
         <w:tc>
           <w:tcPr>
-            <w:tcW w:w="372" w:type="dxa"/>
+            <w:tcW w:w="371" w:type="dxa"/>
             <w:tcBorders>
               <w:left w:val="single" w:sz="4" w:space="0" w:color="000000"/>
               <w:bottom w:val="single" w:sz="4" w:space="0" w:color="000000"/>
@@ -1993,7 +1964,7 @@
           </w:tcPr>
           <w:p>
             <w:pPr>
-              <w:pStyle w:val="user4"/>
+              <w:pStyle w:val="Style16"/>
               <w:spacing w:lineRule="auto" w:line="240"/>
               <w:ind w:hanging="0" w:left="0"/>
               <w:rPr>
@@ -2012,7 +1983,7 @@
         </w:tc>
         <w:tc>
           <w:tcPr>
-            <w:tcW w:w="6350" w:type="dxa"/>
+            <w:tcW w:w="6351" w:type="dxa"/>
             <w:tcBorders>
               <w:left w:val="single" w:sz="4" w:space="0" w:color="000000"/>
               <w:bottom w:val="single" w:sz="4" w:space="0" w:color="000000"/>
@@ -2021,7 +1992,7 @@
           </w:tcPr>
           <w:p>
             <w:pPr>
-              <w:pStyle w:val="user4"/>
+              <w:pStyle w:val="Style16"/>
               <w:spacing w:lineRule="auto" w:line="240"/>
               <w:ind w:hanging="0" w:left="0"/>
               <w:rPr>
@@ -2040,7 +2011,7 @@
         </w:tc>
         <w:tc>
           <w:tcPr>
-            <w:tcW w:w="1992" w:type="dxa"/>
+            <w:tcW w:w="1991" w:type="dxa"/>
             <w:tcBorders>
               <w:left w:val="single" w:sz="4" w:space="0" w:color="000000"/>
               <w:bottom w:val="single" w:sz="4" w:space="0" w:color="000000"/>
@@ -2049,7 +2020,7 @@
           </w:tcPr>
           <w:p>
             <w:pPr>
-              <w:pStyle w:val="user4"/>
+              <w:pStyle w:val="Style16"/>
               <w:spacing w:lineRule="auto" w:line="240"/>
               <w:ind w:hanging="0" w:left="0"/>
               <w:rPr>
@@ -2068,7 +2039,7 @@
         </w:tc>
         <w:tc>
           <w:tcPr>
-            <w:tcW w:w="2904" w:type="dxa"/>
+            <w:tcW w:w="2905" w:type="dxa"/>
             <w:tcBorders>
               <w:left w:val="single" w:sz="4" w:space="0" w:color="000000"/>
               <w:bottom w:val="single" w:sz="4" w:space="0" w:color="000000"/>
@@ -2100,7 +2071,7 @@
         <w:trPr/>
         <w:tc>
           <w:tcPr>
-            <w:tcW w:w="372" w:type="dxa"/>
+            <w:tcW w:w="371" w:type="dxa"/>
             <w:tcBorders>
               <w:left w:val="single" w:sz="4" w:space="0" w:color="000000"/>
               <w:bottom w:val="single" w:sz="4" w:space="0" w:color="000000"/>
@@ -2109,7 +2080,7 @@
           </w:tcPr>
           <w:p>
             <w:pPr>
-              <w:pStyle w:val="user4"/>
+              <w:pStyle w:val="Style16"/>
               <w:spacing w:lineRule="auto" w:line="240"/>
               <w:ind w:hanging="0" w:left="0"/>
               <w:rPr>
@@ -2128,7 +2099,7 @@
         </w:tc>
         <w:tc>
           <w:tcPr>
-            <w:tcW w:w="6350" w:type="dxa"/>
+            <w:tcW w:w="6351" w:type="dxa"/>
             <w:tcBorders>
               <w:left w:val="single" w:sz="4" w:space="0" w:color="000000"/>
               <w:bottom w:val="single" w:sz="4" w:space="0" w:color="000000"/>
@@ -2137,7 +2108,7 @@
           </w:tcPr>
           <w:p>
             <w:pPr>
-              <w:pStyle w:val="user4"/>
+              <w:pStyle w:val="Style16"/>
               <w:spacing w:lineRule="auto" w:line="240"/>
               <w:ind w:hanging="0" w:left="0"/>
               <w:rPr>
@@ -2156,7 +2127,7 @@
         </w:tc>
         <w:tc>
           <w:tcPr>
-            <w:tcW w:w="1992" w:type="dxa"/>
+            <w:tcW w:w="1991" w:type="dxa"/>
             <w:tcBorders>
               <w:left w:val="single" w:sz="4" w:space="0" w:color="000000"/>
               <w:bottom w:val="single" w:sz="4" w:space="0" w:color="000000"/>
@@ -2165,7 +2136,7 @@
           </w:tcPr>
           <w:p>
             <w:pPr>
-              <w:pStyle w:val="user4"/>
+              <w:pStyle w:val="Style16"/>
               <w:spacing w:lineRule="auto" w:line="240"/>
               <w:ind w:hanging="0" w:left="0"/>
               <w:rPr>
@@ -2184,7 +2155,7 @@
         </w:tc>
         <w:tc>
           <w:tcPr>
-            <w:tcW w:w="2904" w:type="dxa"/>
+            <w:tcW w:w="2905" w:type="dxa"/>
             <w:tcBorders>
               <w:left w:val="single" w:sz="4" w:space="0" w:color="000000"/>
               <w:bottom w:val="single" w:sz="4" w:space="0" w:color="000000"/>
@@ -2272,19 +2243,7 @@
         <w:rPr>
           <w:lang w:val="uk-UA"/>
         </w:rPr>
-        <w:t xml:space="preserve">Компанія займається виготовленням та поширенням новин </w:t>
-      </w:r>
-      <w:r>
-        <w:rPr>
-          <w:lang w:val="uk-UA"/>
-        </w:rPr>
-        <w:t xml:space="preserve">Запорізької області </w:t>
-      </w:r>
-      <w:r>
-        <w:rPr>
-          <w:lang w:val="uk-UA"/>
-        </w:rPr>
-        <w:t xml:space="preserve">на своєму веб-сайті та сторінках у соціальних мережах, а саме </w:t>
+        <w:t xml:space="preserve">Компанія займається виготовленням та поширенням новин Запорізької області на своєму веб-сайті та сторінках у соціальних мережах, а саме </w:t>
       </w:r>
       <w:r>
         <w:rPr>
@@ -2669,15 +2628,7 @@
       </w:pPr>
       <w:r>
         <w:rPr/>
-        <w:t xml:space="preserve">Діяльність компанії полягає в пошуку та поширенні новин </w:t>
-      </w:r>
-      <w:r>
-        <w:rPr/>
-        <w:t>області</w:t>
-      </w:r>
-      <w:r>
-        <w:rPr/>
-        <w:t xml:space="preserve">. </w:t>
+        <w:t xml:space="preserve">Діяльність компанії полягає в пошуку та поширенні новин області. </w:t>
       </w:r>
     </w:p>
     <w:p>
@@ -2708,15 +2659,7 @@
       </w:pPr>
       <w:r>
         <w:rPr/>
-        <w:t xml:space="preserve">моніторинг: команда збору новин приймає дзвінки від мешканців </w:t>
-      </w:r>
-      <w:r>
-        <w:rPr/>
-        <w:t>області</w:t>
-      </w:r>
-      <w:r>
-        <w:rPr/>
-        <w:t>, а також переглядає соціальні мережі на наявність новин;</w:t>
+        <w:t>моніторинг: команда збору новин приймає дзвінки від мешканців області, а також переглядає соціальні мережі на наявність новин;</w:t>
       </w:r>
     </w:p>
     <w:p>
@@ -2988,31 +2931,7 @@
       </w:pPr>
       <w:r>
         <w:rPr/>
-        <w:t xml:space="preserve">Аудиторія, на яку розраховує компанія, це мешканці </w:t>
-      </w:r>
-      <w:r>
-        <w:rPr/>
-        <w:t>Запорізької області</w:t>
-      </w:r>
-      <w:r>
-        <w:rPr/>
-        <w:t xml:space="preserve">, а саме </w:t>
-      </w:r>
-      <w:r>
-        <w:rPr/>
-        <w:t xml:space="preserve">30,000 </w:t>
-      </w:r>
-      <w:r>
-        <w:rPr/>
-        <w:t xml:space="preserve">людей з її популяції (що складає </w:t>
-      </w:r>
-      <w:r>
-        <w:rPr/>
-        <w:t>3</w:t>
-      </w:r>
-      <w:r>
-        <w:rPr/>
-        <w:t>0% її мешканців) через те, що не всі мають доступ до інтернету.</w:t>
+        <w:t>Аудиторія, на яку розраховує компанія, це мешканці Запорізької області, а саме 30,000 людей з її популяції (що складає 30% її мешканців) через те, що не всі мають доступ до інтернету.</w:t>
       </w:r>
     </w:p>
     <w:p>
@@ -3087,11 +3006,7 @@
       </w:pPr>
       <w:r>
         <w:rPr/>
-        <w:t>Актуальн</w:t>
-      </w:r>
-      <w:r>
-        <w:rPr/>
-        <w:t>а новина — така, що надає потрібну інформацію у відповідний момент часу</w:t>
+        <w:t>Актуальна новина — така, що надає потрібну інформацію у відповідний момент часу</w:t>
       </w:r>
     </w:p>
     <w:p>
@@ -3614,17 +3529,17 @@
         </w:tblCellMar>
       </w:tblPr>
       <w:tblGrid>
-        <w:gridCol w:w="372"/>
+        <w:gridCol w:w="371"/>
         <w:gridCol w:w="3125"/>
-        <w:gridCol w:w="1189"/>
-        <w:gridCol w:w="1851"/>
-        <w:gridCol w:w="2489"/>
+        <w:gridCol w:w="1190"/>
+        <w:gridCol w:w="1850"/>
+        <w:gridCol w:w="2490"/>
       </w:tblGrid>
       <w:tr>
         <w:trPr/>
         <w:tc>
           <w:tcPr>
-            <w:tcW w:w="372" w:type="dxa"/>
+            <w:tcW w:w="371" w:type="dxa"/>
             <w:tcBorders>
               <w:top w:val="single" w:sz="4" w:space="0" w:color="000000"/>
               <w:left w:val="single" w:sz="4" w:space="0" w:color="000000"/>
@@ -3633,7 +3548,7 @@
           </w:tcPr>
           <w:p>
             <w:pPr>
-              <w:pStyle w:val="Style16"/>
+              <w:pStyle w:val="user4"/>
               <w:spacing w:lineRule="auto" w:line="240"/>
               <w:ind w:hanging="0" w:left="0"/>
               <w:rPr>
@@ -3665,7 +3580,7 @@
           </w:tcPr>
           <w:p>
             <w:pPr>
-              <w:pStyle w:val="Style16"/>
+              <w:pStyle w:val="user4"/>
               <w:spacing w:lineRule="auto" w:line="240"/>
               <w:ind w:hanging="0" w:left="0"/>
               <w:rPr>
@@ -3688,7 +3603,7 @@
         </w:tc>
         <w:tc>
           <w:tcPr>
-            <w:tcW w:w="1189" w:type="dxa"/>
+            <w:tcW w:w="1190" w:type="dxa"/>
             <w:tcBorders>
               <w:top w:val="single" w:sz="4" w:space="0" w:color="000000"/>
               <w:left w:val="single" w:sz="4" w:space="0" w:color="000000"/>
@@ -3697,7 +3612,7 @@
           </w:tcPr>
           <w:p>
             <w:pPr>
-              <w:pStyle w:val="Style16"/>
+              <w:pStyle w:val="user4"/>
               <w:spacing w:lineRule="auto" w:line="240"/>
               <w:ind w:hanging="0" w:left="0"/>
               <w:rPr>
@@ -3720,7 +3635,7 @@
         </w:tc>
         <w:tc>
           <w:tcPr>
-            <w:tcW w:w="1851" w:type="dxa"/>
+            <w:tcW w:w="1850" w:type="dxa"/>
             <w:tcBorders>
               <w:top w:val="single" w:sz="4" w:space="0" w:color="000000"/>
               <w:left w:val="single" w:sz="4" w:space="0" w:color="000000"/>
@@ -3729,7 +3644,7 @@
           </w:tcPr>
           <w:p>
             <w:pPr>
-              <w:pStyle w:val="Style16"/>
+              <w:pStyle w:val="user4"/>
               <w:spacing w:lineRule="auto" w:line="240"/>
               <w:ind w:hanging="0" w:left="0"/>
               <w:rPr>
@@ -3752,7 +3667,7 @@
         </w:tc>
         <w:tc>
           <w:tcPr>
-            <w:tcW w:w="2489" w:type="dxa"/>
+            <w:tcW w:w="2490" w:type="dxa"/>
             <w:tcBorders>
               <w:top w:val="single" w:sz="4" w:space="0" w:color="000000"/>
               <w:left w:val="single" w:sz="4" w:space="0" w:color="000000"/>
@@ -3762,7 +3677,7 @@
           </w:tcPr>
           <w:p>
             <w:pPr>
-              <w:pStyle w:val="Style16"/>
+              <w:pStyle w:val="user4"/>
               <w:spacing w:lineRule="auto" w:line="240"/>
               <w:ind w:hanging="0" w:left="0"/>
               <w:rPr>
@@ -3788,7 +3703,7 @@
         <w:trPr/>
         <w:tc>
           <w:tcPr>
-            <w:tcW w:w="372" w:type="dxa"/>
+            <w:tcW w:w="371" w:type="dxa"/>
             <w:tcBorders>
               <w:left w:val="single" w:sz="4" w:space="0" w:color="000000"/>
               <w:bottom w:val="single" w:sz="4" w:space="0" w:color="000000"/>
@@ -3796,7 +3711,7 @@
           </w:tcPr>
           <w:p>
             <w:pPr>
-              <w:pStyle w:val="Style16"/>
+              <w:pStyle w:val="user4"/>
               <w:spacing w:lineRule="auto" w:line="240"/>
               <w:ind w:hanging="0" w:left="0"/>
               <w:rPr>
@@ -3823,7 +3738,7 @@
           </w:tcPr>
           <w:p>
             <w:pPr>
-              <w:pStyle w:val="Style16"/>
+              <w:pStyle w:val="user4"/>
               <w:spacing w:lineRule="auto" w:line="240"/>
               <w:ind w:hanging="0" w:left="0"/>
               <w:rPr>
@@ -3850,7 +3765,7 @@
         </w:tc>
         <w:tc>
           <w:tcPr>
-            <w:tcW w:w="1189" w:type="dxa"/>
+            <w:tcW w:w="1190" w:type="dxa"/>
             <w:tcBorders>
               <w:left w:val="single" w:sz="4" w:space="0" w:color="000000"/>
               <w:bottom w:val="single" w:sz="4" w:space="0" w:color="000000"/>
@@ -3858,7 +3773,7 @@
           </w:tcPr>
           <w:p>
             <w:pPr>
-              <w:pStyle w:val="Style16"/>
+              <w:pStyle w:val="user4"/>
               <w:spacing w:lineRule="auto" w:line="240"/>
               <w:ind w:hanging="0" w:left="0"/>
               <w:rPr>
@@ -3877,7 +3792,7 @@
         </w:tc>
         <w:tc>
           <w:tcPr>
-            <w:tcW w:w="1851" w:type="dxa"/>
+            <w:tcW w:w="1850" w:type="dxa"/>
             <w:tcBorders>
               <w:left w:val="single" w:sz="4" w:space="0" w:color="000000"/>
               <w:bottom w:val="single" w:sz="4" w:space="0" w:color="000000"/>
@@ -3885,7 +3800,7 @@
           </w:tcPr>
           <w:p>
             <w:pPr>
-              <w:pStyle w:val="Style16"/>
+              <w:pStyle w:val="user4"/>
               <w:spacing w:lineRule="auto" w:line="240"/>
               <w:ind w:hanging="0" w:left="0"/>
               <w:rPr>
@@ -3904,7 +3819,7 @@
         </w:tc>
         <w:tc>
           <w:tcPr>
-            <w:tcW w:w="2489" w:type="dxa"/>
+            <w:tcW w:w="2490" w:type="dxa"/>
             <w:tcBorders>
               <w:left w:val="single" w:sz="4" w:space="0" w:color="000000"/>
               <w:bottom w:val="single" w:sz="4" w:space="0" w:color="000000"/>
@@ -3913,7 +3828,7 @@
           </w:tcPr>
           <w:p>
             <w:pPr>
-              <w:pStyle w:val="Style16"/>
+              <w:pStyle w:val="user4"/>
               <w:spacing w:lineRule="auto" w:line="240"/>
               <w:ind w:hanging="0" w:left="0"/>
               <w:rPr>
@@ -3939,7 +3854,7 @@
         <w:trPr/>
         <w:tc>
           <w:tcPr>
-            <w:tcW w:w="372" w:type="dxa"/>
+            <w:tcW w:w="371" w:type="dxa"/>
             <w:tcBorders>
               <w:left w:val="single" w:sz="4" w:space="0" w:color="000000"/>
               <w:bottom w:val="single" w:sz="4" w:space="0" w:color="000000"/>
@@ -3947,7 +3862,7 @@
           </w:tcPr>
           <w:p>
             <w:pPr>
-              <w:pStyle w:val="Style16"/>
+              <w:pStyle w:val="user4"/>
               <w:spacing w:lineRule="auto" w:line="240"/>
               <w:ind w:hanging="0" w:left="0"/>
               <w:rPr>
@@ -3974,7 +3889,7 @@
           </w:tcPr>
           <w:p>
             <w:pPr>
-              <w:pStyle w:val="Style16"/>
+              <w:pStyle w:val="user4"/>
               <w:spacing w:lineRule="auto" w:line="240"/>
               <w:ind w:hanging="0" w:left="0"/>
               <w:rPr>
@@ -4001,7 +3916,7 @@
         </w:tc>
         <w:tc>
           <w:tcPr>
-            <w:tcW w:w="1189" w:type="dxa"/>
+            <w:tcW w:w="1190" w:type="dxa"/>
             <w:tcBorders>
               <w:left w:val="single" w:sz="4" w:space="0" w:color="000000"/>
               <w:bottom w:val="single" w:sz="4" w:space="0" w:color="000000"/>
@@ -4009,7 +3924,7 @@
           </w:tcPr>
           <w:p>
             <w:pPr>
-              <w:pStyle w:val="Style16"/>
+              <w:pStyle w:val="user4"/>
               <w:spacing w:lineRule="auto" w:line="240"/>
               <w:ind w:hanging="0" w:left="0"/>
               <w:rPr>
@@ -4030,7 +3945,7 @@
         </w:tc>
         <w:tc>
           <w:tcPr>
-            <w:tcW w:w="1851" w:type="dxa"/>
+            <w:tcW w:w="1850" w:type="dxa"/>
             <w:tcBorders>
               <w:left w:val="single" w:sz="4" w:space="0" w:color="000000"/>
               <w:bottom w:val="single" w:sz="4" w:space="0" w:color="000000"/>
@@ -4038,7 +3953,7 @@
           </w:tcPr>
           <w:p>
             <w:pPr>
-              <w:pStyle w:val="Style16"/>
+              <w:pStyle w:val="user4"/>
               <w:spacing w:lineRule="auto" w:line="240"/>
               <w:ind w:hanging="0" w:left="0"/>
               <w:rPr>
@@ -4057,7 +3972,7 @@
         </w:tc>
         <w:tc>
           <w:tcPr>
-            <w:tcW w:w="2489" w:type="dxa"/>
+            <w:tcW w:w="2490" w:type="dxa"/>
             <w:tcBorders>
               <w:left w:val="single" w:sz="4" w:space="0" w:color="000000"/>
               <w:bottom w:val="single" w:sz="4" w:space="0" w:color="000000"/>
@@ -4066,7 +3981,7 @@
           </w:tcPr>
           <w:p>
             <w:pPr>
-              <w:pStyle w:val="Style16"/>
+              <w:pStyle w:val="user4"/>
               <w:spacing w:lineRule="auto" w:line="240"/>
               <w:ind w:hanging="0" w:left="0"/>
               <w:rPr>
@@ -4088,7 +4003,7 @@
         <w:trPr/>
         <w:tc>
           <w:tcPr>
-            <w:tcW w:w="372" w:type="dxa"/>
+            <w:tcW w:w="371" w:type="dxa"/>
             <w:tcBorders>
               <w:left w:val="single" w:sz="4" w:space="0" w:color="000000"/>
               <w:bottom w:val="single" w:sz="4" w:space="0" w:color="000000"/>
@@ -4096,7 +4011,7 @@
           </w:tcPr>
           <w:p>
             <w:pPr>
-              <w:pStyle w:val="Style16"/>
+              <w:pStyle w:val="user4"/>
               <w:spacing w:lineRule="auto" w:line="240"/>
               <w:ind w:hanging="0" w:left="0"/>
               <w:rPr>
@@ -4123,7 +4038,7 @@
           </w:tcPr>
           <w:p>
             <w:pPr>
-              <w:pStyle w:val="Style16"/>
+              <w:pStyle w:val="user4"/>
               <w:spacing w:lineRule="auto" w:line="240"/>
               <w:ind w:hanging="0" w:left="0"/>
               <w:rPr>
@@ -4142,7 +4057,7 @@
         </w:tc>
         <w:tc>
           <w:tcPr>
-            <w:tcW w:w="1189" w:type="dxa"/>
+            <w:tcW w:w="1190" w:type="dxa"/>
             <w:tcBorders>
               <w:left w:val="single" w:sz="4" w:space="0" w:color="000000"/>
               <w:bottom w:val="single" w:sz="4" w:space="0" w:color="000000"/>
@@ -4150,7 +4065,7 @@
           </w:tcPr>
           <w:p>
             <w:pPr>
-              <w:pStyle w:val="Style16"/>
+              <w:pStyle w:val="user4"/>
               <w:spacing w:lineRule="auto" w:line="240"/>
               <w:ind w:hanging="0" w:left="0"/>
               <w:rPr>
@@ -4171,7 +4086,7 @@
         </w:tc>
         <w:tc>
           <w:tcPr>
-            <w:tcW w:w="1851" w:type="dxa"/>
+            <w:tcW w:w="1850" w:type="dxa"/>
             <w:tcBorders>
               <w:left w:val="single" w:sz="4" w:space="0" w:color="000000"/>
               <w:bottom w:val="single" w:sz="4" w:space="0" w:color="000000"/>
@@ -4179,7 +4094,7 @@
           </w:tcPr>
           <w:p>
             <w:pPr>
-              <w:pStyle w:val="Style16"/>
+              <w:pStyle w:val="user4"/>
               <w:spacing w:lineRule="auto" w:line="240"/>
               <w:ind w:hanging="0" w:left="0"/>
               <w:rPr>
@@ -4198,7 +4113,7 @@
         </w:tc>
         <w:tc>
           <w:tcPr>
-            <w:tcW w:w="2489" w:type="dxa"/>
+            <w:tcW w:w="2490" w:type="dxa"/>
             <w:tcBorders>
               <w:left w:val="single" w:sz="4" w:space="0" w:color="000000"/>
               <w:bottom w:val="single" w:sz="4" w:space="0" w:color="000000"/>
@@ -4207,7 +4122,7 @@
           </w:tcPr>
           <w:p>
             <w:pPr>
-              <w:pStyle w:val="Style16"/>
+              <w:pStyle w:val="user4"/>
               <w:spacing w:lineRule="auto" w:line="240"/>
               <w:ind w:hanging="0" w:left="0"/>
               <w:rPr>
@@ -4229,7 +4144,7 @@
         <w:trPr/>
         <w:tc>
           <w:tcPr>
-            <w:tcW w:w="372" w:type="dxa"/>
+            <w:tcW w:w="371" w:type="dxa"/>
             <w:tcBorders>
               <w:left w:val="single" w:sz="4" w:space="0" w:color="000000"/>
               <w:bottom w:val="single" w:sz="4" w:space="0" w:color="000000"/>
@@ -4237,7 +4152,7 @@
           </w:tcPr>
           <w:p>
             <w:pPr>
-              <w:pStyle w:val="Style16"/>
+              <w:pStyle w:val="user4"/>
               <w:spacing w:lineRule="auto" w:line="240"/>
               <w:ind w:hanging="0" w:left="0"/>
               <w:rPr>
@@ -4264,7 +4179,7 @@
           </w:tcPr>
           <w:p>
             <w:pPr>
-              <w:pStyle w:val="Style16"/>
+              <w:pStyle w:val="user4"/>
               <w:spacing w:lineRule="auto" w:line="240"/>
               <w:ind w:hanging="0" w:left="0"/>
               <w:rPr>
@@ -4291,7 +4206,7 @@
         </w:tc>
         <w:tc>
           <w:tcPr>
-            <w:tcW w:w="1189" w:type="dxa"/>
+            <w:tcW w:w="1190" w:type="dxa"/>
             <w:tcBorders>
               <w:left w:val="single" w:sz="4" w:space="0" w:color="000000"/>
               <w:bottom w:val="single" w:sz="4" w:space="0" w:color="000000"/>
@@ -4299,7 +4214,7 @@
           </w:tcPr>
           <w:p>
             <w:pPr>
-              <w:pStyle w:val="Style16"/>
+              <w:pStyle w:val="user4"/>
               <w:spacing w:lineRule="auto" w:line="240"/>
               <w:ind w:hanging="0" w:left="0"/>
               <w:rPr>
@@ -4320,7 +4235,7 @@
         </w:tc>
         <w:tc>
           <w:tcPr>
-            <w:tcW w:w="1851" w:type="dxa"/>
+            <w:tcW w:w="1850" w:type="dxa"/>
             <w:tcBorders>
               <w:left w:val="single" w:sz="4" w:space="0" w:color="000000"/>
               <w:bottom w:val="single" w:sz="4" w:space="0" w:color="000000"/>
@@ -4328,7 +4243,7 @@
           </w:tcPr>
           <w:p>
             <w:pPr>
-              <w:pStyle w:val="Style16"/>
+              <w:pStyle w:val="user4"/>
               <w:spacing w:lineRule="auto" w:line="240"/>
               <w:ind w:hanging="0" w:left="0"/>
               <w:rPr>
@@ -4347,7 +4262,7 @@
         </w:tc>
         <w:tc>
           <w:tcPr>
-            <w:tcW w:w="2489" w:type="dxa"/>
+            <w:tcW w:w="2490" w:type="dxa"/>
             <w:tcBorders>
               <w:left w:val="single" w:sz="4" w:space="0" w:color="000000"/>
               <w:bottom w:val="single" w:sz="4" w:space="0" w:color="000000"/>
@@ -4356,7 +4271,7 @@
           </w:tcPr>
           <w:p>
             <w:pPr>
-              <w:pStyle w:val="Style16"/>
+              <w:pStyle w:val="user4"/>
               <w:spacing w:lineRule="auto" w:line="240"/>
               <w:ind w:hanging="0" w:left="0"/>
               <w:rPr>
@@ -4378,7 +4293,7 @@
         <w:trPr/>
         <w:tc>
           <w:tcPr>
-            <w:tcW w:w="372" w:type="dxa"/>
+            <w:tcW w:w="371" w:type="dxa"/>
             <w:tcBorders>
               <w:left w:val="single" w:sz="4" w:space="0" w:color="000000"/>
               <w:bottom w:val="single" w:sz="4" w:space="0" w:color="000000"/>
@@ -4386,7 +4301,7 @@
           </w:tcPr>
           <w:p>
             <w:pPr>
-              <w:pStyle w:val="Style16"/>
+              <w:pStyle w:val="user4"/>
               <w:spacing w:lineRule="auto" w:line="240"/>
               <w:ind w:hanging="0" w:left="0"/>
               <w:rPr>
@@ -4413,7 +4328,7 @@
           </w:tcPr>
           <w:p>
             <w:pPr>
-              <w:pStyle w:val="Style16"/>
+              <w:pStyle w:val="user4"/>
               <w:spacing w:lineRule="auto" w:line="240"/>
               <w:ind w:hanging="0" w:left="0"/>
               <w:rPr>
@@ -4440,7 +4355,7 @@
         </w:tc>
         <w:tc>
           <w:tcPr>
-            <w:tcW w:w="1189" w:type="dxa"/>
+            <w:tcW w:w="1190" w:type="dxa"/>
             <w:tcBorders>
               <w:left w:val="single" w:sz="4" w:space="0" w:color="000000"/>
               <w:bottom w:val="single" w:sz="4" w:space="0" w:color="000000"/>
@@ -4448,7 +4363,7 @@
           </w:tcPr>
           <w:p>
             <w:pPr>
-              <w:pStyle w:val="Style16"/>
+              <w:pStyle w:val="user4"/>
               <w:spacing w:lineRule="auto" w:line="240"/>
               <w:ind w:hanging="0" w:left="0"/>
               <w:rPr>
@@ -4469,7 +4384,7 @@
         </w:tc>
         <w:tc>
           <w:tcPr>
-            <w:tcW w:w="1851" w:type="dxa"/>
+            <w:tcW w:w="1850" w:type="dxa"/>
             <w:tcBorders>
               <w:left w:val="single" w:sz="4" w:space="0" w:color="000000"/>
               <w:bottom w:val="single" w:sz="4" w:space="0" w:color="000000"/>
@@ -4477,7 +4392,7 @@
           </w:tcPr>
           <w:p>
             <w:pPr>
-              <w:pStyle w:val="Style16"/>
+              <w:pStyle w:val="user4"/>
               <w:spacing w:lineRule="auto" w:line="240"/>
               <w:ind w:hanging="0" w:left="0"/>
               <w:rPr>
@@ -4496,7 +4411,7 @@
         </w:tc>
         <w:tc>
           <w:tcPr>
-            <w:tcW w:w="2489" w:type="dxa"/>
+            <w:tcW w:w="2490" w:type="dxa"/>
             <w:tcBorders>
               <w:left w:val="single" w:sz="4" w:space="0" w:color="000000"/>
               <w:bottom w:val="single" w:sz="4" w:space="0" w:color="000000"/>
@@ -4505,7 +4420,7 @@
           </w:tcPr>
           <w:p>
             <w:pPr>
-              <w:pStyle w:val="Style16"/>
+              <w:pStyle w:val="user4"/>
               <w:spacing w:lineRule="auto" w:line="240"/>
               <w:ind w:hanging="0" w:left="0"/>
               <w:rPr>
@@ -4603,7 +4518,9 @@
         </w:rPr>
       </w:pPr>
       <w:r>
-        <w:rPr/>
+        <w:rPr>
+          <w:lang w:val="uk-UA"/>
+        </w:rPr>
       </w:r>
     </w:p>
     <w:p>
@@ -4689,23 +4606,7 @@
       </w:pPr>
       <w:r>
         <w:rPr/>
-        <w:t xml:space="preserve">Новина перестає бути актуальною через 1 день після її публікації. За 3 дні </w:t>
-      </w:r>
-      <w:r>
-        <w:rPr/>
-        <w:t>п</w:t>
-      </w:r>
-      <w:r>
-        <w:rPr/>
-        <w:t>іс</w:t>
-      </w:r>
-      <w:r>
-        <w:rPr/>
-        <w:t>л</w:t>
-      </w:r>
-      <w:r>
-        <w:rPr/>
-        <w:t xml:space="preserve">я публікації новина переходить в архів компанії. </w:t>
+        <w:t xml:space="preserve">Новина перестає бути актуальною через 1 день після її публікації. За 3 дні після публікації новина переходить в архів компанії. </w:t>
       </w:r>
     </w:p>
     <w:p>
@@ -4802,15 +4703,7 @@
       </w:pPr>
       <w:r>
         <w:rPr/>
-        <w:t xml:space="preserve">кількість переглядів </w:t>
-      </w:r>
-      <w:r>
-        <w:rPr/>
-        <w:t>новинної статті</w:t>
-      </w:r>
-      <w:r>
-        <w:rPr/>
-        <w:t>;</w:t>
+        <w:t>кількість переглядів новинної статті;</w:t>
       </w:r>
     </w:p>
     <w:p>
@@ -4844,19 +4737,7 @@
         <w:rPr>
           <w:lang w:val="uk-UA"/>
         </w:rPr>
-        <w:t xml:space="preserve">Кожна новина аналізується на правдивість. Якщо новина не є правдивою, її </w:t>
-      </w:r>
-      <w:r>
-        <w:rPr>
-          <w:lang w:val="uk-UA"/>
-        </w:rPr>
-        <w:t>не публікують на сайті</w:t>
-      </w:r>
-      <w:r>
-        <w:rPr>
-          <w:lang w:val="uk-UA"/>
-        </w:rPr>
-        <w:t xml:space="preserve">. </w:t>
+        <w:t xml:space="preserve">Кожна новина аналізується на правдивість. Якщо новина не є правдивою, її не публікують на сайті. </w:t>
       </w:r>
     </w:p>
     <w:p>
@@ -6780,27 +6661,27 @@
       <w:lang w:val="en-US" w:eastAsia="uk-UA"/>
     </w:rPr>
   </w:style>
-  <w:style w:type="character" w:styleId="user">
-    <w:name w:val="Символ нумерації (user)"/>
+  <w:style w:type="character" w:styleId="Style12">
+    <w:name w:val="Символ нумерації"/>
     <w:qFormat/>
     <w:rPr/>
   </w:style>
-  <w:style w:type="character" w:styleId="user1">
+  <w:style w:type="character" w:styleId="Style13">
+    <w:name w:val="Маркери"/>
+    <w:qFormat/>
+    <w:rPr>
+      <w:rFonts w:ascii="OpenSymbol" w:hAnsi="OpenSymbol" w:eastAsia="OpenSymbol" w:cs="OpenSymbol"/>
+    </w:rPr>
+  </w:style>
+  <w:style w:type="character" w:styleId="user">
     <w:name w:val="Маркери (user)"/>
     <w:qFormat/>
     <w:rPr>
       <w:rFonts w:ascii="OpenSymbol" w:hAnsi="OpenSymbol" w:eastAsia="OpenSymbol" w:cs="OpenSymbol"/>
     </w:rPr>
   </w:style>
-  <w:style w:type="character" w:styleId="Style12">
-    <w:name w:val="Маркери"/>
-    <w:qFormat/>
-    <w:rPr>
-      <w:rFonts w:ascii="OpenSymbol" w:hAnsi="OpenSymbol" w:eastAsia="OpenSymbol" w:cs="OpenSymbol"/>
-    </w:rPr>
-  </w:style>
-  <w:style w:type="character" w:styleId="Style13">
-    <w:name w:val="Символ нумерації"/>
+  <w:style w:type="character" w:styleId="user1">
+    <w:name w:val="Символ нумерації (user)"/>
     <w:qFormat/>
     <w:rPr/>
   </w:style>
@@ -6814,7 +6695,7 @@
       <w:spacing w:before="240" w:after="120"/>
     </w:pPr>
     <w:rPr>
-      <w:rFonts w:ascii="Liberation Sans" w:hAnsi="Liberation Sans" w:eastAsia="Microsoft YaHei" w:cs="Arial Unicode MS"/>
+      <w:rFonts w:ascii="Liberation Sans" w:hAnsi="Liberation Sans" w:eastAsia="Microsoft YaHei" w:cs="Lucida Sans"/>
       <w:sz w:val="28"/>
       <w:szCs w:val="28"/>
     </w:rPr>
@@ -6859,7 +6740,7 @@
       <w:suppressLineNumbers/>
     </w:pPr>
     <w:rPr>
-      <w:rFonts w:cs="Arial Unicode MS"/>
+      <w:rFonts w:cs="Lucida Sans"/>
     </w:rPr>
   </w:style>
   <w:style w:type="paragraph" w:styleId="user2">
@@ -6872,7 +6753,7 @@
       <w:spacing w:before="240" w:after="120"/>
     </w:pPr>
     <w:rPr>
-      <w:rFonts w:ascii="Liberation Sans" w:hAnsi="Liberation Sans" w:eastAsia="Microsoft YaHei" w:cs="Lucida Sans"/>
+      <w:rFonts w:ascii="Liberation Sans" w:hAnsi="Liberation Sans" w:eastAsia="Microsoft YaHei" w:cs="Arial Unicode MS"/>
       <w:sz w:val="28"/>
       <w:szCs w:val="28"/>
     </w:rPr>
@@ -6885,12 +6766,12 @@
       <w:suppressLineNumbers/>
     </w:pPr>
     <w:rPr>
-      <w:rFonts w:cs="Lucida Sans"/>
+      <w:rFonts w:cs="Arial Unicode MS"/>
     </w:rPr>
   </w:style>
   <w:style w:type="paragraph" w:styleId="IndexHeading">
     <w:name w:val="index heading"/>
-    <w:basedOn w:val="Style14"/>
+    <w:basedOn w:val="user2"/>
     <w:pPr/>
     <w:rPr/>
   </w:style>
@@ -7168,6 +7049,16 @@
     </w:pPr>
     <w:rPr/>
   </w:style>
+  <w:style w:type="paragraph" w:styleId="Style16">
+    <w:name w:val="Вміст таблиці"/>
+    <w:basedOn w:val="Normal"/>
+    <w:qFormat/>
+    <w:pPr>
+      <w:widowControl w:val="false"/>
+      <w:suppressLineNumbers/>
+    </w:pPr>
+    <w:rPr/>
+  </w:style>
   <w:style w:type="paragraph" w:styleId="user4">
     <w:name w:val="Вміст таблиці (user)"/>
     <w:basedOn w:val="Normal"/>
@@ -7178,19 +7069,9 @@
     </w:pPr>
     <w:rPr/>
   </w:style>
-  <w:style w:type="paragraph" w:styleId="Style16">
-    <w:name w:val="Вміст таблиці"/>
-    <w:basedOn w:val="Normal"/>
-    <w:qFormat/>
-    <w:pPr>
-      <w:widowControl w:val="false"/>
-      <w:suppressLineNumbers/>
-    </w:pPr>
-    <w:rPr/>
-  </w:style>
-  <w:style w:type="paragraph" w:styleId="Style17">
-    <w:name w:val="Заголовок таблиці"/>
-    <w:basedOn w:val="Style16"/>
+  <w:style w:type="paragraph" w:styleId="user5">
+    <w:name w:val="Заголовок таблиці (user)"/>
+    <w:basedOn w:val="user4"/>
     <w:qFormat/>
     <w:pPr>
       <w:suppressLineNumbers/>
@@ -7201,8 +7082,8 @@
       <w:bCs/>
     </w:rPr>
   </w:style>
-  <w:style w:type="numbering" w:styleId="Style18" w:default="1">
-    <w:name w:val="Без маркерів"/>
+  <w:style w:type="numbering" w:styleId="user6" w:default="1">
+    <w:name w:val="Без маркерів (user)"/>
     <w:uiPriority w:val="99"/>
     <w:semiHidden/>
     <w:unhideWhenUsed/>

</xml_diff>

<commit_message>
refactor: clear the process for now
</commit_message>
<xml_diff>
--- a/51SP Sertyficazija PZ/1/SP1_KNT-116m_Onyshchenko_15.docx
+++ b/51SP Sertyficazija PZ/1/SP1_KNT-116m_Onyshchenko_15.docx
@@ -844,197 +844,867 @@
         <w:rPr>
           <w:lang w:val="uk-UA"/>
         </w:rPr>
-        <w:t>Замовником компанії є читач новин. Спосіб заробітку є публікація реклами на сайті. За це відповідальний ІТ відділ.</w:t>
-      </w:r>
-    </w:p>
-    <w:p>
-      <w:pPr>
-        <w:pStyle w:val="P1"/>
-        <w:rPr>
-          <w:lang w:val="uk-UA"/>
-        </w:rPr>
-      </w:pPr>
-      <w:r>
-        <w:rPr>
-          <w:lang w:val="uk-UA"/>
-        </w:rPr>
-        <w:t>Ресурси компанії наступні:</w:t>
-      </w:r>
-    </w:p>
-    <w:p>
-      <w:pPr>
-        <w:pStyle w:val="P1"/>
-        <w:widowControl/>
-        <w:numPr>
-          <w:ilvl w:val="0"/>
-          <w:numId w:val="1"/>
-        </w:numPr>
-        <w:suppressAutoHyphens w:val="true"/>
-        <w:bidi w:val="0"/>
-        <w:spacing w:lineRule="auto" w:line="360" w:before="0" w:after="0"/>
-        <w:ind w:firstLine="850" w:left="0" w:right="0"/>
-        <w:jc w:val="both"/>
-        <w:rPr>
-          <w:lang w:val="uk-UA"/>
-        </w:rPr>
-      </w:pPr>
-      <w:r>
-        <w:rPr>
-          <w:lang w:val="uk-UA"/>
-        </w:rPr>
-        <w:t xml:space="preserve">1 автомобіль </w:t>
+        <w:t>Замовником компанії є читач новин. Спосіб заробітку є публікація реклами на сайті. За це відповідальн</w:t>
+      </w:r>
+      <w:r>
+        <w:rPr>
+          <w:lang w:val="uk-UA"/>
+        </w:rPr>
+        <w:t>ий робітник фронтенду.</w:t>
+      </w:r>
+    </w:p>
+    <w:p>
+      <w:pPr>
+        <w:pStyle w:val="P1"/>
+        <w:rPr>
+          <w:lang w:val="uk-UA"/>
+        </w:rPr>
+      </w:pPr>
+      <w:r>
+        <w:rPr>
+          <w:lang w:val="uk-UA"/>
+        </w:rPr>
+        <w:t xml:space="preserve">Ресурси компанії </w:t>
+      </w:r>
+      <w:r>
+        <w:rPr>
+          <w:lang w:val="uk-UA"/>
+        </w:rPr>
+        <w:t>наведені на таблиці 1.1.</w:t>
+      </w:r>
+    </w:p>
+    <w:p>
+      <w:pPr>
+        <w:pStyle w:val="P1"/>
+        <w:rPr>
+          <w:lang w:val="uk-UA"/>
+        </w:rPr>
+      </w:pPr>
+      <w:r>
+        <w:rPr>
+          <w:lang w:val="uk-UA"/>
+        </w:rPr>
+      </w:r>
+    </w:p>
+    <w:p>
+      <w:pPr>
+        <w:pStyle w:val="P1"/>
+        <w:rPr>
+          <w:lang w:val="uk-UA"/>
+        </w:rPr>
+      </w:pPr>
+      <w:r>
+        <w:rPr>
+          <w:lang w:val="uk-UA"/>
+        </w:rPr>
+        <w:t>Таблиця 1.1 — Ресурси компанії</w:t>
+      </w:r>
+    </w:p>
+    <w:tbl>
+      <w:tblPr>
+        <w:tblW w:w="11508" w:type="dxa"/>
+        <w:jc w:val="left"/>
+        <w:tblInd w:w="-1303" w:type="dxa"/>
+        <w:tblLayout w:type="fixed"/>
+        <w:tblCellMar>
+          <w:top w:w="55" w:type="dxa"/>
+          <w:left w:w="55" w:type="dxa"/>
+          <w:bottom w:w="55" w:type="dxa"/>
+          <w:right w:w="55" w:type="dxa"/>
+        </w:tblCellMar>
+      </w:tblPr>
+      <w:tblGrid>
+        <w:gridCol w:w="412"/>
+        <w:gridCol w:w="3624"/>
+        <w:gridCol w:w="1365"/>
+        <w:gridCol w:w="2709"/>
+        <w:gridCol w:w="3398"/>
+      </w:tblGrid>
+      <w:tr>
+        <w:trPr/>
+        <w:tc>
+          <w:tcPr>
+            <w:tcW w:w="412" w:type="dxa"/>
+            <w:tcBorders>
+              <w:top w:val="single" w:sz="4" w:space="0" w:color="000000"/>
+              <w:left w:val="single" w:sz="4" w:space="0" w:color="000000"/>
+              <w:bottom w:val="single" w:sz="4" w:space="0" w:color="000000"/>
+            </w:tcBorders>
+            <w:vAlign w:val="center"/>
+          </w:tcPr>
+          <w:p>
+            <w:pPr>
+              <w:pStyle w:val="Style16"/>
+              <w:spacing w:lineRule="auto" w:line="240"/>
+              <w:ind w:hanging="0" w:left="0"/>
+              <w:rPr>
+                <w:b/>
+                <w:bCs/>
+              </w:rPr>
+            </w:pPr>
+            <w:r>
+              <w:rPr>
+                <w:b/>
+                <w:bCs/>
+              </w:rPr>
+              <w:t>№</w:t>
+            </w:r>
+          </w:p>
+        </w:tc>
+        <w:tc>
+          <w:tcPr>
+            <w:tcW w:w="3624" w:type="dxa"/>
+            <w:tcBorders>
+              <w:top w:val="single" w:sz="4" w:space="0" w:color="000000"/>
+              <w:left w:val="single" w:sz="4" w:space="0" w:color="000000"/>
+              <w:bottom w:val="single" w:sz="4" w:space="0" w:color="000000"/>
+            </w:tcBorders>
+            <w:vAlign w:val="center"/>
+          </w:tcPr>
+          <w:p>
+            <w:pPr>
+              <w:pStyle w:val="Style16"/>
+              <w:spacing w:lineRule="auto" w:line="240"/>
+              <w:ind w:hanging="0" w:left="0"/>
+              <w:rPr>
+                <w:b/>
+                <w:bCs/>
+              </w:rPr>
+            </w:pPr>
+            <w:r>
+              <w:rPr>
+                <w:b/>
+                <w:bCs/>
+              </w:rPr>
+              <w:t>Назва</w:t>
+            </w:r>
+          </w:p>
+        </w:tc>
+        <w:tc>
+          <w:tcPr>
+            <w:tcW w:w="1365" w:type="dxa"/>
+            <w:tcBorders>
+              <w:top w:val="single" w:sz="4" w:space="0" w:color="000000"/>
+              <w:left w:val="single" w:sz="4" w:space="0" w:color="000000"/>
+              <w:bottom w:val="single" w:sz="4" w:space="0" w:color="000000"/>
+            </w:tcBorders>
+            <w:vAlign w:val="center"/>
+          </w:tcPr>
+          <w:p>
+            <w:pPr>
+              <w:pStyle w:val="Style16"/>
+              <w:spacing w:lineRule="auto" w:line="240"/>
+              <w:ind w:hanging="0" w:left="0"/>
+              <w:rPr>
+                <w:b/>
+                <w:bCs/>
+              </w:rPr>
+            </w:pPr>
+            <w:r>
+              <w:rPr>
+                <w:b/>
+                <w:bCs/>
+              </w:rPr>
+              <w:t>Кількість</w:t>
+            </w:r>
+          </w:p>
+        </w:tc>
+        <w:tc>
+          <w:tcPr>
+            <w:tcW w:w="2709" w:type="dxa"/>
+            <w:tcBorders>
+              <w:top w:val="single" w:sz="4" w:space="0" w:color="000000"/>
+              <w:left w:val="single" w:sz="4" w:space="0" w:color="000000"/>
+              <w:bottom w:val="single" w:sz="4" w:space="0" w:color="000000"/>
+            </w:tcBorders>
+            <w:vAlign w:val="center"/>
+          </w:tcPr>
+          <w:p>
+            <w:pPr>
+              <w:pStyle w:val="Style16"/>
+              <w:spacing w:lineRule="auto" w:line="240"/>
+              <w:ind w:hanging="0" w:left="0"/>
+              <w:rPr>
+                <w:b/>
+                <w:bCs/>
+              </w:rPr>
+            </w:pPr>
+            <w:r>
+              <w:rPr>
+                <w:b/>
+                <w:bCs/>
+              </w:rPr>
+              <w:t>Відповідальна особа</w:t>
+            </w:r>
+          </w:p>
+        </w:tc>
+        <w:tc>
+          <w:tcPr>
+            <w:tcW w:w="3398" w:type="dxa"/>
+            <w:tcBorders>
+              <w:top w:val="single" w:sz="4" w:space="0" w:color="000000"/>
+              <w:left w:val="single" w:sz="4" w:space="0" w:color="000000"/>
+              <w:bottom w:val="single" w:sz="4" w:space="0" w:color="000000"/>
+              <w:right w:val="single" w:sz="4" w:space="0" w:color="000000"/>
+            </w:tcBorders>
+            <w:vAlign w:val="center"/>
+          </w:tcPr>
+          <w:p>
+            <w:pPr>
+              <w:pStyle w:val="Style16"/>
+              <w:spacing w:lineRule="auto" w:line="240"/>
+              <w:ind w:hanging="0" w:left="0"/>
+              <w:rPr>
+                <w:b/>
+                <w:bCs/>
+              </w:rPr>
+            </w:pPr>
+            <w:r>
+              <w:rPr>
+                <w:b/>
+                <w:bCs/>
+              </w:rPr>
+              <w:t>Власний чи Орендований</w:t>
+            </w:r>
+          </w:p>
+        </w:tc>
+      </w:tr>
+      <w:tr>
+        <w:trPr/>
+        <w:tc>
+          <w:tcPr>
+            <w:tcW w:w="412" w:type="dxa"/>
+            <w:tcBorders>
+              <w:left w:val="single" w:sz="4" w:space="0" w:color="000000"/>
+              <w:bottom w:val="single" w:sz="4" w:space="0" w:color="000000"/>
+            </w:tcBorders>
+            <w:vAlign w:val="center"/>
+          </w:tcPr>
+          <w:p>
+            <w:pPr>
+              <w:pStyle w:val="Style16"/>
+              <w:spacing w:lineRule="auto" w:line="240"/>
+              <w:ind w:hanging="0" w:left="0"/>
+              <w:rPr/>
+            </w:pPr>
+            <w:r>
+              <w:rPr/>
+              <w:t>1</w:t>
+            </w:r>
+          </w:p>
+        </w:tc>
+        <w:tc>
+          <w:tcPr>
+            <w:tcW w:w="3624" w:type="dxa"/>
+            <w:tcBorders>
+              <w:left w:val="single" w:sz="4" w:space="0" w:color="000000"/>
+              <w:bottom w:val="single" w:sz="4" w:space="0" w:color="000000"/>
+            </w:tcBorders>
+            <w:vAlign w:val="center"/>
+          </w:tcPr>
+          <w:p>
+            <w:pPr>
+              <w:pStyle w:val="Style16"/>
+              <w:spacing w:lineRule="auto" w:line="240"/>
+              <w:ind w:hanging="0" w:left="0"/>
+              <w:rPr/>
+            </w:pPr>
+            <w:r>
+              <w:rPr/>
+              <w:t xml:space="preserve">Автомобіль Skoda Fabia 2008 </w:t>
+            </w:r>
+          </w:p>
+        </w:tc>
+        <w:tc>
+          <w:tcPr>
+            <w:tcW w:w="1365" w:type="dxa"/>
+            <w:tcBorders>
+              <w:left w:val="single" w:sz="4" w:space="0" w:color="000000"/>
+              <w:bottom w:val="single" w:sz="4" w:space="0" w:color="000000"/>
+            </w:tcBorders>
+            <w:vAlign w:val="center"/>
+          </w:tcPr>
+          <w:p>
+            <w:pPr>
+              <w:pStyle w:val="Style16"/>
+              <w:spacing w:lineRule="auto" w:line="240"/>
+              <w:ind w:hanging="0" w:left="0"/>
+              <w:rPr/>
+            </w:pPr>
+            <w:r>
+              <w:rPr/>
+              <w:t>1</w:t>
+            </w:r>
+          </w:p>
+        </w:tc>
+        <w:tc>
+          <w:tcPr>
+            <w:tcW w:w="2709" w:type="dxa"/>
+            <w:tcBorders>
+              <w:left w:val="single" w:sz="4" w:space="0" w:color="000000"/>
+              <w:bottom w:val="single" w:sz="4" w:space="0" w:color="000000"/>
+            </w:tcBorders>
+            <w:vAlign w:val="center"/>
+          </w:tcPr>
+          <w:p>
+            <w:pPr>
+              <w:pStyle w:val="Style16"/>
+              <w:spacing w:lineRule="auto" w:line="240"/>
+              <w:ind w:hanging="0" w:left="0"/>
+              <w:rPr/>
+            </w:pPr>
+            <w:r>
+              <w:rPr/>
+              <w:t>Водій</w:t>
+            </w:r>
+          </w:p>
+        </w:tc>
+        <w:tc>
+          <w:tcPr>
+            <w:tcW w:w="3398" w:type="dxa"/>
+            <w:tcBorders>
+              <w:left w:val="single" w:sz="4" w:space="0" w:color="000000"/>
+              <w:bottom w:val="single" w:sz="4" w:space="0" w:color="000000"/>
+              <w:right w:val="single" w:sz="4" w:space="0" w:color="000000"/>
+            </w:tcBorders>
+            <w:vAlign w:val="center"/>
+          </w:tcPr>
+          <w:p>
+            <w:pPr>
+              <w:pStyle w:val="Style16"/>
+              <w:spacing w:lineRule="auto" w:line="240"/>
+              <w:ind w:hanging="0" w:left="0"/>
+              <w:rPr/>
+            </w:pPr>
+            <w:r>
+              <w:rPr/>
+              <w:t>Власний</w:t>
+            </w:r>
+          </w:p>
+        </w:tc>
+      </w:tr>
+      <w:tr>
+        <w:trPr/>
+        <w:tc>
+          <w:tcPr>
+            <w:tcW w:w="412" w:type="dxa"/>
+            <w:tcBorders>
+              <w:left w:val="single" w:sz="4" w:space="0" w:color="000000"/>
+              <w:bottom w:val="single" w:sz="4" w:space="0" w:color="000000"/>
+            </w:tcBorders>
+            <w:vAlign w:val="center"/>
+          </w:tcPr>
+          <w:p>
+            <w:pPr>
+              <w:pStyle w:val="Style16"/>
+              <w:spacing w:lineRule="auto" w:line="240"/>
+              <w:ind w:hanging="0" w:left="0"/>
+              <w:rPr/>
+            </w:pPr>
+            <w:r>
+              <w:rPr/>
+              <w:t>2</w:t>
+            </w:r>
+          </w:p>
+        </w:tc>
+        <w:tc>
+          <w:tcPr>
+            <w:tcW w:w="3624" w:type="dxa"/>
+            <w:tcBorders>
+              <w:left w:val="single" w:sz="4" w:space="0" w:color="000000"/>
+              <w:bottom w:val="single" w:sz="4" w:space="0" w:color="000000"/>
+            </w:tcBorders>
+            <w:vAlign w:val="center"/>
+          </w:tcPr>
+          <w:p>
+            <w:pPr>
+              <w:pStyle w:val="Style16"/>
+              <w:spacing w:lineRule="auto" w:line="240"/>
+              <w:ind w:hanging="0" w:left="0"/>
+              <w:rPr/>
+            </w:pPr>
+            <w:r>
+              <w:rPr/>
+              <w:t>В</w:t>
+            </w:r>
+            <w:r>
+              <w:rPr>
+                <w:lang w:val="uk-UA"/>
+              </w:rPr>
+              <w:t xml:space="preserve">ідеокамера </w:t>
+            </w:r>
+            <w:r>
+              <w:rPr>
+                <w:lang w:val="en-US"/>
+              </w:rPr>
+              <w:t>Sony a7 V</w:t>
+            </w:r>
+          </w:p>
+        </w:tc>
+        <w:tc>
+          <w:tcPr>
+            <w:tcW w:w="1365" w:type="dxa"/>
+            <w:tcBorders>
+              <w:left w:val="single" w:sz="4" w:space="0" w:color="000000"/>
+              <w:bottom w:val="single" w:sz="4" w:space="0" w:color="000000"/>
+            </w:tcBorders>
+            <w:vAlign w:val="center"/>
+          </w:tcPr>
+          <w:p>
+            <w:pPr>
+              <w:pStyle w:val="Style16"/>
+              <w:spacing w:lineRule="auto" w:line="240"/>
+              <w:ind w:hanging="0" w:left="0"/>
+              <w:rPr/>
+            </w:pPr>
+            <w:r>
+              <w:rPr/>
+              <w:t>1</w:t>
+            </w:r>
+          </w:p>
+        </w:tc>
+        <w:tc>
+          <w:tcPr>
+            <w:tcW w:w="2709" w:type="dxa"/>
+            <w:tcBorders>
+              <w:left w:val="single" w:sz="4" w:space="0" w:color="000000"/>
+              <w:bottom w:val="single" w:sz="4" w:space="0" w:color="000000"/>
+            </w:tcBorders>
+            <w:vAlign w:val="center"/>
+          </w:tcPr>
+          <w:p>
+            <w:pPr>
+              <w:pStyle w:val="Style16"/>
+              <w:spacing w:lineRule="auto" w:line="240"/>
+              <w:ind w:hanging="0" w:left="0"/>
+              <w:rPr/>
+            </w:pPr>
+            <w:r>
+              <w:rPr/>
+              <w:t>Оператор</w:t>
+            </w:r>
+          </w:p>
+        </w:tc>
+        <w:tc>
+          <w:tcPr>
+            <w:tcW w:w="3398" w:type="dxa"/>
+            <w:tcBorders>
+              <w:left w:val="single" w:sz="4" w:space="0" w:color="000000"/>
+              <w:bottom w:val="single" w:sz="4" w:space="0" w:color="000000"/>
+              <w:right w:val="single" w:sz="4" w:space="0" w:color="000000"/>
+            </w:tcBorders>
+            <w:vAlign w:val="center"/>
+          </w:tcPr>
+          <w:p>
+            <w:pPr>
+              <w:pStyle w:val="Style16"/>
+              <w:spacing w:lineRule="auto" w:line="240"/>
+              <w:ind w:hanging="0" w:left="0"/>
+              <w:rPr/>
+            </w:pPr>
+            <w:r>
+              <w:rPr/>
+              <w:t>Орендований</w:t>
+            </w:r>
+          </w:p>
+        </w:tc>
+      </w:tr>
+      <w:tr>
+        <w:trPr/>
+        <w:tc>
+          <w:tcPr>
+            <w:tcW w:w="412" w:type="dxa"/>
+            <w:tcBorders>
+              <w:left w:val="single" w:sz="4" w:space="0" w:color="000000"/>
+              <w:bottom w:val="single" w:sz="4" w:space="0" w:color="000000"/>
+            </w:tcBorders>
+            <w:vAlign w:val="center"/>
+          </w:tcPr>
+          <w:p>
+            <w:pPr>
+              <w:pStyle w:val="Style16"/>
+              <w:spacing w:lineRule="auto" w:line="240"/>
+              <w:ind w:hanging="0" w:left="0"/>
+              <w:rPr/>
+            </w:pPr>
+            <w:r>
+              <w:rPr/>
+              <w:t>3</w:t>
+            </w:r>
+          </w:p>
+        </w:tc>
+        <w:tc>
+          <w:tcPr>
+            <w:tcW w:w="3624" w:type="dxa"/>
+            <w:tcBorders>
+              <w:left w:val="single" w:sz="4" w:space="0" w:color="000000"/>
+              <w:bottom w:val="single" w:sz="4" w:space="0" w:color="000000"/>
+            </w:tcBorders>
+            <w:vAlign w:val="center"/>
+          </w:tcPr>
+          <w:p>
+            <w:pPr>
+              <w:pStyle w:val="Style16"/>
+              <w:spacing w:lineRule="auto" w:line="240"/>
+              <w:ind w:hanging="0" w:left="0"/>
+              <w:rPr/>
+            </w:pPr>
+            <w:r>
+              <w:rPr/>
+              <w:t>М</w:t>
+            </w:r>
+            <w:r>
+              <w:rPr>
+                <w:lang w:val="uk-UA"/>
+              </w:rPr>
+              <w:t>ікрофон Sennheiser MD46</w:t>
+            </w:r>
+          </w:p>
+        </w:tc>
+        <w:tc>
+          <w:tcPr>
+            <w:tcW w:w="1365" w:type="dxa"/>
+            <w:tcBorders>
+              <w:left w:val="single" w:sz="4" w:space="0" w:color="000000"/>
+              <w:bottom w:val="single" w:sz="4" w:space="0" w:color="000000"/>
+            </w:tcBorders>
+            <w:vAlign w:val="center"/>
+          </w:tcPr>
+          <w:p>
+            <w:pPr>
+              <w:pStyle w:val="Style16"/>
+              <w:spacing w:lineRule="auto" w:line="240"/>
+              <w:ind w:hanging="0" w:left="0"/>
+              <w:rPr/>
+            </w:pPr>
+            <w:r>
+              <w:rPr/>
+              <w:t>1</w:t>
+            </w:r>
+          </w:p>
+        </w:tc>
+        <w:tc>
+          <w:tcPr>
+            <w:tcW w:w="2709" w:type="dxa"/>
+            <w:tcBorders>
+              <w:left w:val="single" w:sz="4" w:space="0" w:color="000000"/>
+              <w:bottom w:val="single" w:sz="4" w:space="0" w:color="000000"/>
+            </w:tcBorders>
+            <w:vAlign w:val="center"/>
+          </w:tcPr>
+          <w:p>
+            <w:pPr>
+              <w:pStyle w:val="Style16"/>
+              <w:spacing w:lineRule="auto" w:line="240"/>
+              <w:ind w:hanging="0" w:left="0"/>
+              <w:rPr/>
+            </w:pPr>
+            <w:r>
+              <w:rPr/>
+              <w:t>Репортер</w:t>
+            </w:r>
+          </w:p>
+        </w:tc>
+        <w:tc>
+          <w:tcPr>
+            <w:tcW w:w="3398" w:type="dxa"/>
+            <w:tcBorders>
+              <w:left w:val="single" w:sz="4" w:space="0" w:color="000000"/>
+              <w:bottom w:val="single" w:sz="4" w:space="0" w:color="000000"/>
+              <w:right w:val="single" w:sz="4" w:space="0" w:color="000000"/>
+            </w:tcBorders>
+            <w:vAlign w:val="center"/>
+          </w:tcPr>
+          <w:p>
+            <w:pPr>
+              <w:pStyle w:val="Style16"/>
+              <w:spacing w:lineRule="auto" w:line="240"/>
+              <w:ind w:hanging="0" w:left="0"/>
+              <w:rPr/>
+            </w:pPr>
+            <w:r>
+              <w:rPr/>
+              <w:t>Власний</w:t>
+            </w:r>
+          </w:p>
+        </w:tc>
+      </w:tr>
+      <w:tr>
+        <w:trPr/>
+        <w:tc>
+          <w:tcPr>
+            <w:tcW w:w="412" w:type="dxa"/>
+            <w:tcBorders>
+              <w:left w:val="single" w:sz="4" w:space="0" w:color="000000"/>
+              <w:bottom w:val="single" w:sz="4" w:space="0" w:color="000000"/>
+            </w:tcBorders>
+            <w:vAlign w:val="center"/>
+          </w:tcPr>
+          <w:p>
+            <w:pPr>
+              <w:pStyle w:val="Style16"/>
+              <w:spacing w:lineRule="auto" w:line="240"/>
+              <w:ind w:hanging="0" w:left="0"/>
+              <w:rPr/>
+            </w:pPr>
+            <w:r>
+              <w:rPr/>
+              <w:t>4</w:t>
+            </w:r>
+          </w:p>
+        </w:tc>
+        <w:tc>
+          <w:tcPr>
+            <w:tcW w:w="3624" w:type="dxa"/>
+            <w:tcBorders>
+              <w:left w:val="single" w:sz="4" w:space="0" w:color="000000"/>
+              <w:bottom w:val="single" w:sz="4" w:space="0" w:color="000000"/>
+            </w:tcBorders>
+            <w:vAlign w:val="center"/>
+          </w:tcPr>
+          <w:p>
+            <w:pPr>
+              <w:pStyle w:val="Style16"/>
+              <w:spacing w:lineRule="auto" w:line="240"/>
+              <w:ind w:hanging="0" w:left="0"/>
+              <w:rPr/>
+            </w:pPr>
+            <w:r>
+              <w:rPr/>
+              <w:t>Ноутбук Apple MacBook Air</w:t>
+            </w:r>
+          </w:p>
+        </w:tc>
+        <w:tc>
+          <w:tcPr>
+            <w:tcW w:w="1365" w:type="dxa"/>
+            <w:tcBorders>
+              <w:left w:val="single" w:sz="4" w:space="0" w:color="000000"/>
+              <w:bottom w:val="single" w:sz="4" w:space="0" w:color="000000"/>
+            </w:tcBorders>
+            <w:vAlign w:val="center"/>
+          </w:tcPr>
+          <w:p>
+            <w:pPr>
+              <w:pStyle w:val="Style16"/>
+              <w:spacing w:lineRule="auto" w:line="240"/>
+              <w:ind w:hanging="0" w:left="0"/>
+              <w:rPr/>
+            </w:pPr>
+            <w:r>
+              <w:rPr/>
+              <w:t>2</w:t>
+            </w:r>
+          </w:p>
+        </w:tc>
+        <w:tc>
+          <w:tcPr>
+            <w:tcW w:w="2709" w:type="dxa"/>
+            <w:tcBorders>
+              <w:left w:val="single" w:sz="4" w:space="0" w:color="000000"/>
+              <w:bottom w:val="single" w:sz="4" w:space="0" w:color="000000"/>
+            </w:tcBorders>
+            <w:vAlign w:val="center"/>
+          </w:tcPr>
+          <w:p>
+            <w:pPr>
+              <w:pStyle w:val="Style16"/>
+              <w:spacing w:lineRule="auto" w:line="240"/>
+              <w:ind w:hanging="0" w:left="0"/>
+              <w:rPr/>
+            </w:pPr>
+            <w:r>
+              <w:rPr/>
+              <w:t>Бекенд особа</w:t>
+            </w:r>
+          </w:p>
+        </w:tc>
+        <w:tc>
+          <w:tcPr>
+            <w:tcW w:w="3398" w:type="dxa"/>
+            <w:tcBorders>
+              <w:left w:val="single" w:sz="4" w:space="0" w:color="000000"/>
+              <w:bottom w:val="single" w:sz="4" w:space="0" w:color="000000"/>
+              <w:right w:val="single" w:sz="4" w:space="0" w:color="000000"/>
+            </w:tcBorders>
+            <w:vAlign w:val="center"/>
+          </w:tcPr>
+          <w:p>
+            <w:pPr>
+              <w:pStyle w:val="Style16"/>
+              <w:spacing w:lineRule="auto" w:line="240"/>
+              <w:ind w:hanging="0" w:left="0"/>
+              <w:rPr/>
+            </w:pPr>
+            <w:r>
+              <w:rPr/>
+              <w:t>Власний</w:t>
+            </w:r>
+          </w:p>
+        </w:tc>
+      </w:tr>
+      <w:tr>
+        <w:trPr/>
+        <w:tc>
+          <w:tcPr>
+            <w:tcW w:w="412" w:type="dxa"/>
+            <w:tcBorders>
+              <w:left w:val="single" w:sz="4" w:space="0" w:color="000000"/>
+              <w:bottom w:val="single" w:sz="4" w:space="0" w:color="000000"/>
+            </w:tcBorders>
+            <w:vAlign w:val="center"/>
+          </w:tcPr>
+          <w:p>
+            <w:pPr>
+              <w:pStyle w:val="Style16"/>
+              <w:spacing w:lineRule="auto" w:line="240"/>
+              <w:ind w:hanging="0" w:left="0"/>
+              <w:rPr/>
+            </w:pPr>
+            <w:r>
+              <w:rPr/>
+              <w:t>5</w:t>
+            </w:r>
+          </w:p>
+        </w:tc>
+        <w:tc>
+          <w:tcPr>
+            <w:tcW w:w="3624" w:type="dxa"/>
+            <w:tcBorders>
+              <w:left w:val="single" w:sz="4" w:space="0" w:color="000000"/>
+              <w:bottom w:val="single" w:sz="4" w:space="0" w:color="000000"/>
+            </w:tcBorders>
+            <w:vAlign w:val="center"/>
+          </w:tcPr>
+          <w:p>
+            <w:pPr>
+              <w:pStyle w:val="Style16"/>
+              <w:spacing w:lineRule="auto" w:line="240"/>
+              <w:ind w:hanging="0" w:left="0"/>
+              <w:rPr/>
+            </w:pPr>
+            <w:r>
+              <w:rPr/>
+              <w:t>М</w:t>
+            </w:r>
+            <w:r>
+              <w:rPr>
+                <w:lang w:val="uk-UA"/>
+              </w:rPr>
+              <w:t>онітор BenQ GW2486TC</w:t>
+            </w:r>
+          </w:p>
+        </w:tc>
+        <w:tc>
+          <w:tcPr>
+            <w:tcW w:w="1365" w:type="dxa"/>
+            <w:tcBorders>
+              <w:left w:val="single" w:sz="4" w:space="0" w:color="000000"/>
+              <w:bottom w:val="single" w:sz="4" w:space="0" w:color="000000"/>
+            </w:tcBorders>
+            <w:vAlign w:val="center"/>
+          </w:tcPr>
+          <w:p>
+            <w:pPr>
+              <w:pStyle w:val="Style16"/>
+              <w:spacing w:lineRule="auto" w:line="240"/>
+              <w:ind w:hanging="0" w:left="0"/>
+              <w:rPr/>
+            </w:pPr>
+            <w:r>
+              <w:rPr/>
+              <w:t>1</w:t>
+            </w:r>
+          </w:p>
+        </w:tc>
+        <w:tc>
+          <w:tcPr>
+            <w:tcW w:w="2709" w:type="dxa"/>
+            <w:tcBorders>
+              <w:left w:val="single" w:sz="4" w:space="0" w:color="000000"/>
+              <w:bottom w:val="single" w:sz="4" w:space="0" w:color="000000"/>
+            </w:tcBorders>
+            <w:vAlign w:val="center"/>
+          </w:tcPr>
+          <w:p>
+            <w:pPr>
+              <w:pStyle w:val="Style16"/>
+              <w:spacing w:lineRule="auto" w:line="240"/>
+              <w:ind w:hanging="0" w:left="0"/>
+              <w:rPr/>
+            </w:pPr>
+            <w:r>
+              <w:rPr/>
+              <w:t>Фронтенд особа</w:t>
+            </w:r>
+          </w:p>
+        </w:tc>
+        <w:tc>
+          <w:tcPr>
+            <w:tcW w:w="3398" w:type="dxa"/>
+            <w:tcBorders>
+              <w:left w:val="single" w:sz="4" w:space="0" w:color="000000"/>
+              <w:bottom w:val="single" w:sz="4" w:space="0" w:color="000000"/>
+              <w:right w:val="single" w:sz="4" w:space="0" w:color="000000"/>
+            </w:tcBorders>
+            <w:vAlign w:val="center"/>
+          </w:tcPr>
+          <w:p>
+            <w:pPr>
+              <w:pStyle w:val="Style16"/>
+              <w:spacing w:lineRule="auto" w:line="240"/>
+              <w:ind w:hanging="0" w:left="0"/>
+              <w:rPr/>
+            </w:pPr>
+            <w:r>
+              <w:rPr/>
+              <w:t>Орендований</w:t>
+            </w:r>
+          </w:p>
+        </w:tc>
+      </w:tr>
+    </w:tbl>
+    <w:p>
+      <w:pPr>
+        <w:pStyle w:val="P1"/>
+        <w:rPr>
+          <w:lang w:val="uk-UA"/>
+        </w:rPr>
+      </w:pPr>
+      <w:r>
+        <w:rPr/>
+      </w:r>
+    </w:p>
+    <w:p>
+      <w:pPr>
+        <w:pStyle w:val="P1"/>
+        <w:rPr>
+          <w:lang w:val="uk-UA"/>
+        </w:rPr>
+      </w:pPr>
+      <w:r>
+        <w:rPr>
+          <w:lang w:val="uk-UA"/>
+        </w:rPr>
+        <w:t xml:space="preserve">Для перевірки достовірності новин використовується стороннє програмне забезпечення, а саме інтелектуальні асистенти, такі як </w:t>
       </w:r>
       <w:r>
         <w:rPr>
           <w:lang w:val="en-US"/>
         </w:rPr>
-        <w:t xml:space="preserve">Skoda Fabia 2008, </w:t>
-      </w:r>
-      <w:r>
-        <w:rPr>
-          <w:lang w:val="uk-UA"/>
-        </w:rPr>
-        <w:t>відповідальний водій, власне;</w:t>
-      </w:r>
-    </w:p>
-    <w:p>
-      <w:pPr>
-        <w:pStyle w:val="P1"/>
-        <w:widowControl/>
-        <w:numPr>
-          <w:ilvl w:val="0"/>
-          <w:numId w:val="1"/>
-        </w:numPr>
-        <w:suppressAutoHyphens w:val="true"/>
-        <w:bidi w:val="0"/>
-        <w:spacing w:lineRule="auto" w:line="360" w:before="0" w:after="0"/>
-        <w:ind w:firstLine="850" w:left="0" w:right="0"/>
-        <w:jc w:val="both"/>
-        <w:rPr>
-          <w:lang w:val="uk-UA"/>
-        </w:rPr>
-      </w:pPr>
-      <w:r>
-        <w:rPr>
-          <w:lang w:val="uk-UA"/>
-        </w:rPr>
-        <w:t xml:space="preserve">1 відеокамера </w:t>
+        <w:t xml:space="preserve">Claude </w:t>
       </w:r>
       <w:r>
         <w:rPr>
           <w:lang w:val="en-US"/>
         </w:rPr>
-        <w:t xml:space="preserve">Sony a7 V, </w:t>
-      </w:r>
-      <w:r>
-        <w:rPr>
-          <w:lang w:val="uk-UA"/>
-        </w:rPr>
-        <w:t>відповідальний оператор, орендується;</w:t>
-      </w:r>
-    </w:p>
-    <w:p>
-      <w:pPr>
-        <w:pStyle w:val="P1"/>
-        <w:widowControl/>
-        <w:numPr>
-          <w:ilvl w:val="0"/>
-          <w:numId w:val="1"/>
-        </w:numPr>
-        <w:suppressAutoHyphens w:val="true"/>
-        <w:bidi w:val="0"/>
-        <w:spacing w:lineRule="auto" w:line="360" w:before="0" w:after="0"/>
-        <w:ind w:firstLine="850" w:left="0" w:right="0"/>
-        <w:jc w:val="both"/>
-        <w:rPr>
-          <w:lang w:val="uk-UA"/>
-        </w:rPr>
-      </w:pPr>
-      <w:r>
-        <w:rPr>
-          <w:lang w:val="uk-UA"/>
-        </w:rPr>
-        <w:t>1 мікрофон Sennheiser MD46, відповідальний репортер, власне;</w:t>
-      </w:r>
-    </w:p>
-    <w:p>
-      <w:pPr>
-        <w:pStyle w:val="P1"/>
-        <w:widowControl/>
-        <w:numPr>
-          <w:ilvl w:val="0"/>
-          <w:numId w:val="1"/>
-        </w:numPr>
-        <w:suppressAutoHyphens w:val="true"/>
-        <w:bidi w:val="0"/>
-        <w:spacing w:lineRule="auto" w:line="360" w:before="0" w:after="0"/>
-        <w:ind w:firstLine="850" w:left="0" w:right="0"/>
-        <w:jc w:val="both"/>
-        <w:rPr>
-          <w:lang w:val="uk-UA"/>
-        </w:rPr>
-      </w:pPr>
-      <w:r>
-        <w:rPr>
-          <w:lang w:val="uk-UA"/>
-        </w:rPr>
-        <w:t>2 ноутбуки Apple MacBook Air, відповідальний ІТ відділ, власне;</w:t>
-      </w:r>
-    </w:p>
-    <w:p>
-      <w:pPr>
-        <w:pStyle w:val="P1"/>
-        <w:widowControl/>
-        <w:numPr>
-          <w:ilvl w:val="0"/>
-          <w:numId w:val="1"/>
-        </w:numPr>
-        <w:suppressAutoHyphens w:val="true"/>
-        <w:bidi w:val="0"/>
-        <w:spacing w:lineRule="auto" w:line="360" w:before="0" w:after="0"/>
-        <w:ind w:firstLine="850" w:left="0" w:right="0"/>
-        <w:jc w:val="both"/>
-        <w:rPr>
-          <w:lang w:val="en-US"/>
-        </w:rPr>
-      </w:pPr>
-      <w:r>
-        <w:rPr>
-          <w:lang w:val="en-US"/>
-        </w:rPr>
-        <w:t xml:space="preserve">1 </w:t>
-      </w:r>
-      <w:r>
-        <w:rPr>
-          <w:lang w:val="uk-UA"/>
-        </w:rPr>
-        <w:t>монітор BenQ GW2486TC, відповідальна особа бекенду, орендується.</w:t>
-      </w:r>
-    </w:p>
-    <w:p>
-      <w:pPr>
-        <w:pStyle w:val="P1"/>
-        <w:rPr>
-          <w:lang w:val="uk-UA"/>
-        </w:rPr>
-      </w:pPr>
-      <w:r>
-        <w:rPr>
-          <w:lang w:val="uk-UA"/>
-        </w:rPr>
-        <w:t xml:space="preserve">Для перевірки достовірності новин використовується стороннє програмне забезпечення, а саме інтелектуальні асистенти, такі як </w:t>
-      </w:r>
-      <w:r>
-        <w:rPr>
-          <w:lang w:val="en-US"/>
-        </w:rPr>
-        <w:t xml:space="preserve">Claude </w:t>
-      </w:r>
-      <w:r>
-        <w:rPr>
-          <w:lang w:val="uk-UA"/>
-        </w:rPr>
-        <w:t xml:space="preserve">та </w:t>
+        <w:t>й</w:t>
+      </w:r>
+      <w:r>
+        <w:rPr>
+          <w:lang w:val="uk-UA"/>
+        </w:rPr>
+        <w:t xml:space="preserve"> </w:t>
       </w:r>
       <w:r>
         <w:rPr>
@@ -1417,7 +2087,15 @@
       </w:pPr>
       <w:r>
         <w:rPr/>
-        <w:t>Цілі в галузі якості описані у таблиці 1.1.</w:t>
+        <w:t xml:space="preserve">Цілі в галузі якості описані у таблиці </w:t>
+      </w:r>
+      <w:r>
+        <w:rPr/>
+        <w:t>3</w:t>
+      </w:r>
+      <w:r>
+        <w:rPr/>
+        <w:t>.1.</w:t>
       </w:r>
     </w:p>
     <w:p>
@@ -1436,7 +2114,15 @@
       </w:pPr>
       <w:r>
         <w:rPr/>
-        <w:t>Таблиця 1.1 — Цілі в галузі якості та відповідні показники ступеня їх досягнення</w:t>
+        <w:t xml:space="preserve">Таблиця </w:t>
+      </w:r>
+      <w:r>
+        <w:rPr/>
+        <w:t>3</w:t>
+      </w:r>
+      <w:r>
+        <w:rPr/>
+        <w:t>.1 — Цілі в галузі якості та відповідні показники ступеня їх досягнення</w:t>
         <w:tab/>
       </w:r>
     </w:p>

</xml_diff>

<commit_message>
refactor: sort the files into their folders.
</commit_message>
<xml_diff>
--- a/51SP Sertyficazija PZ/1/SP1_KNT-116m_Onyshchenko_15.docx
+++ b/51SP Sertyficazija PZ/1/SP1_KNT-116m_Onyshchenko_15.docx
@@ -844,33 +844,21 @@
         <w:rPr>
           <w:lang w:val="uk-UA"/>
         </w:rPr>
-        <w:t>Замовником компанії є читач новин. Спосіб заробітку є публікація реклами на сайті. За це відповідальн</w:t>
-      </w:r>
-      <w:r>
-        <w:rPr>
-          <w:lang w:val="uk-UA"/>
-        </w:rPr>
-        <w:t>ий робітник фронтенду.</w:t>
-      </w:r>
-    </w:p>
-    <w:p>
-      <w:pPr>
-        <w:pStyle w:val="P1"/>
-        <w:rPr>
-          <w:lang w:val="uk-UA"/>
-        </w:rPr>
-      </w:pPr>
-      <w:r>
-        <w:rPr>
-          <w:lang w:val="uk-UA"/>
-        </w:rPr>
-        <w:t xml:space="preserve">Ресурси компанії </w:t>
-      </w:r>
-      <w:r>
-        <w:rPr>
-          <w:lang w:val="uk-UA"/>
-        </w:rPr>
-        <w:t>наведені на таблиці 1.1.</w:t>
+        <w:t>Замовником компанії є читач новин. Спосіб заробітку є публікація реклами на сайті. За це відповідальний робітник фронтенду.</w:t>
+      </w:r>
+    </w:p>
+    <w:p>
+      <w:pPr>
+        <w:pStyle w:val="P1"/>
+        <w:rPr>
+          <w:lang w:val="uk-UA"/>
+        </w:rPr>
+      </w:pPr>
+      <w:r>
+        <w:rPr>
+          <w:lang w:val="uk-UA"/>
+        </w:rPr>
+        <w:t>Ресурси компанії наведені на таблиці 1.1.</w:t>
       </w:r>
     </w:p>
     <w:p>
@@ -914,17 +902,17 @@
         </w:tblCellMar>
       </w:tblPr>
       <w:tblGrid>
-        <w:gridCol w:w="412"/>
+        <w:gridCol w:w="411"/>
         <w:gridCol w:w="3624"/>
         <w:gridCol w:w="1365"/>
         <w:gridCol w:w="2709"/>
-        <w:gridCol w:w="3398"/>
+        <w:gridCol w:w="3399"/>
       </w:tblGrid>
       <w:tr>
         <w:trPr/>
         <w:tc>
           <w:tcPr>
-            <w:tcW w:w="412" w:type="dxa"/>
+            <w:tcW w:w="411" w:type="dxa"/>
             <w:tcBorders>
               <w:top w:val="single" w:sz="4" w:space="0" w:color="000000"/>
               <w:left w:val="single" w:sz="4" w:space="0" w:color="000000"/>
@@ -934,7 +922,7 @@
           </w:tcPr>
           <w:p>
             <w:pPr>
-              <w:pStyle w:val="Style16"/>
+              <w:pStyle w:val="user4"/>
               <w:spacing w:lineRule="auto" w:line="240"/>
               <w:ind w:hanging="0" w:left="0"/>
               <w:rPr>
@@ -963,7 +951,7 @@
           </w:tcPr>
           <w:p>
             <w:pPr>
-              <w:pStyle w:val="Style16"/>
+              <w:pStyle w:val="user4"/>
               <w:spacing w:lineRule="auto" w:line="240"/>
               <w:ind w:hanging="0" w:left="0"/>
               <w:rPr>
@@ -992,7 +980,7 @@
           </w:tcPr>
           <w:p>
             <w:pPr>
-              <w:pStyle w:val="Style16"/>
+              <w:pStyle w:val="user4"/>
               <w:spacing w:lineRule="auto" w:line="240"/>
               <w:ind w:hanging="0" w:left="0"/>
               <w:rPr>
@@ -1021,7 +1009,7 @@
           </w:tcPr>
           <w:p>
             <w:pPr>
-              <w:pStyle w:val="Style16"/>
+              <w:pStyle w:val="user4"/>
               <w:spacing w:lineRule="auto" w:line="240"/>
               <w:ind w:hanging="0" w:left="0"/>
               <w:rPr>
@@ -1040,7 +1028,7 @@
         </w:tc>
         <w:tc>
           <w:tcPr>
-            <w:tcW w:w="3398" w:type="dxa"/>
+            <w:tcW w:w="3399" w:type="dxa"/>
             <w:tcBorders>
               <w:top w:val="single" w:sz="4" w:space="0" w:color="000000"/>
               <w:left w:val="single" w:sz="4" w:space="0" w:color="000000"/>
@@ -1051,7 +1039,7 @@
           </w:tcPr>
           <w:p>
             <w:pPr>
-              <w:pStyle w:val="Style16"/>
+              <w:pStyle w:val="user4"/>
               <w:spacing w:lineRule="auto" w:line="240"/>
               <w:ind w:hanging="0" w:left="0"/>
               <w:rPr>
@@ -1073,7 +1061,7 @@
         <w:trPr/>
         <w:tc>
           <w:tcPr>
-            <w:tcW w:w="412" w:type="dxa"/>
+            <w:tcW w:w="411" w:type="dxa"/>
             <w:tcBorders>
               <w:left w:val="single" w:sz="4" w:space="0" w:color="000000"/>
               <w:bottom w:val="single" w:sz="4" w:space="0" w:color="000000"/>
@@ -1082,7 +1070,7 @@
           </w:tcPr>
           <w:p>
             <w:pPr>
-              <w:pStyle w:val="Style16"/>
+              <w:pStyle w:val="user4"/>
               <w:spacing w:lineRule="auto" w:line="240"/>
               <w:ind w:hanging="0" w:left="0"/>
               <w:rPr/>
@@ -1104,14 +1092,14 @@
           </w:tcPr>
           <w:p>
             <w:pPr>
-              <w:pStyle w:val="Style16"/>
+              <w:pStyle w:val="user4"/>
               <w:spacing w:lineRule="auto" w:line="240"/>
               <w:ind w:hanging="0" w:left="0"/>
               <w:rPr/>
             </w:pPr>
             <w:r>
               <w:rPr/>
-              <w:t xml:space="preserve">Автомобіль Skoda Fabia 2008 </w:t>
+              <w:t>Автомобіль Skoda Fabia 2008</w:t>
             </w:r>
           </w:p>
         </w:tc>
@@ -1126,7 +1114,7 @@
           </w:tcPr>
           <w:p>
             <w:pPr>
-              <w:pStyle w:val="Style16"/>
+              <w:pStyle w:val="user4"/>
               <w:spacing w:lineRule="auto" w:line="240"/>
               <w:ind w:hanging="0" w:left="0"/>
               <w:rPr/>
@@ -1148,7 +1136,7 @@
           </w:tcPr>
           <w:p>
             <w:pPr>
-              <w:pStyle w:val="Style16"/>
+              <w:pStyle w:val="user4"/>
               <w:spacing w:lineRule="auto" w:line="240"/>
               <w:ind w:hanging="0" w:left="0"/>
               <w:rPr/>
@@ -1161,7 +1149,7 @@
         </w:tc>
         <w:tc>
           <w:tcPr>
-            <w:tcW w:w="3398" w:type="dxa"/>
+            <w:tcW w:w="3399" w:type="dxa"/>
             <w:tcBorders>
               <w:left w:val="single" w:sz="4" w:space="0" w:color="000000"/>
               <w:bottom w:val="single" w:sz="4" w:space="0" w:color="000000"/>
@@ -1171,7 +1159,7 @@
           </w:tcPr>
           <w:p>
             <w:pPr>
-              <w:pStyle w:val="Style16"/>
+              <w:pStyle w:val="user4"/>
               <w:spacing w:lineRule="auto" w:line="240"/>
               <w:ind w:hanging="0" w:left="0"/>
               <w:rPr/>
@@ -1187,7 +1175,7 @@
         <w:trPr/>
         <w:tc>
           <w:tcPr>
-            <w:tcW w:w="412" w:type="dxa"/>
+            <w:tcW w:w="411" w:type="dxa"/>
             <w:tcBorders>
               <w:left w:val="single" w:sz="4" w:space="0" w:color="000000"/>
               <w:bottom w:val="single" w:sz="4" w:space="0" w:color="000000"/>
@@ -1196,7 +1184,7 @@
           </w:tcPr>
           <w:p>
             <w:pPr>
-              <w:pStyle w:val="Style16"/>
+              <w:pStyle w:val="user4"/>
               <w:spacing w:lineRule="auto" w:line="240"/>
               <w:ind w:hanging="0" w:left="0"/>
               <w:rPr/>
@@ -1218,7 +1206,7 @@
           </w:tcPr>
           <w:p>
             <w:pPr>
-              <w:pStyle w:val="Style16"/>
+              <w:pStyle w:val="user4"/>
               <w:spacing w:lineRule="auto" w:line="240"/>
               <w:ind w:hanging="0" w:left="0"/>
               <w:rPr/>
@@ -1252,7 +1240,7 @@
           </w:tcPr>
           <w:p>
             <w:pPr>
-              <w:pStyle w:val="Style16"/>
+              <w:pStyle w:val="user4"/>
               <w:spacing w:lineRule="auto" w:line="240"/>
               <w:ind w:hanging="0" w:left="0"/>
               <w:rPr/>
@@ -1274,7 +1262,7 @@
           </w:tcPr>
           <w:p>
             <w:pPr>
-              <w:pStyle w:val="Style16"/>
+              <w:pStyle w:val="user4"/>
               <w:spacing w:lineRule="auto" w:line="240"/>
               <w:ind w:hanging="0" w:left="0"/>
               <w:rPr/>
@@ -1287,7 +1275,7 @@
         </w:tc>
         <w:tc>
           <w:tcPr>
-            <w:tcW w:w="3398" w:type="dxa"/>
+            <w:tcW w:w="3399" w:type="dxa"/>
             <w:tcBorders>
               <w:left w:val="single" w:sz="4" w:space="0" w:color="000000"/>
               <w:bottom w:val="single" w:sz="4" w:space="0" w:color="000000"/>
@@ -1297,7 +1285,7 @@
           </w:tcPr>
           <w:p>
             <w:pPr>
-              <w:pStyle w:val="Style16"/>
+              <w:pStyle w:val="user4"/>
               <w:spacing w:lineRule="auto" w:line="240"/>
               <w:ind w:hanging="0" w:left="0"/>
               <w:rPr/>
@@ -1313,7 +1301,7 @@
         <w:trPr/>
         <w:tc>
           <w:tcPr>
-            <w:tcW w:w="412" w:type="dxa"/>
+            <w:tcW w:w="411" w:type="dxa"/>
             <w:tcBorders>
               <w:left w:val="single" w:sz="4" w:space="0" w:color="000000"/>
               <w:bottom w:val="single" w:sz="4" w:space="0" w:color="000000"/>
@@ -1322,7 +1310,7 @@
           </w:tcPr>
           <w:p>
             <w:pPr>
-              <w:pStyle w:val="Style16"/>
+              <w:pStyle w:val="user4"/>
               <w:spacing w:lineRule="auto" w:line="240"/>
               <w:ind w:hanging="0" w:left="0"/>
               <w:rPr/>
@@ -1344,7 +1332,7 @@
           </w:tcPr>
           <w:p>
             <w:pPr>
-              <w:pStyle w:val="Style16"/>
+              <w:pStyle w:val="user4"/>
               <w:spacing w:lineRule="auto" w:line="240"/>
               <w:ind w:hanging="0" w:left="0"/>
               <w:rPr/>
@@ -1372,7 +1360,7 @@
           </w:tcPr>
           <w:p>
             <w:pPr>
-              <w:pStyle w:val="Style16"/>
+              <w:pStyle w:val="user4"/>
               <w:spacing w:lineRule="auto" w:line="240"/>
               <w:ind w:hanging="0" w:left="0"/>
               <w:rPr/>
@@ -1394,7 +1382,7 @@
           </w:tcPr>
           <w:p>
             <w:pPr>
-              <w:pStyle w:val="Style16"/>
+              <w:pStyle w:val="user4"/>
               <w:spacing w:lineRule="auto" w:line="240"/>
               <w:ind w:hanging="0" w:left="0"/>
               <w:rPr/>
@@ -1407,7 +1395,7 @@
         </w:tc>
         <w:tc>
           <w:tcPr>
-            <w:tcW w:w="3398" w:type="dxa"/>
+            <w:tcW w:w="3399" w:type="dxa"/>
             <w:tcBorders>
               <w:left w:val="single" w:sz="4" w:space="0" w:color="000000"/>
               <w:bottom w:val="single" w:sz="4" w:space="0" w:color="000000"/>
@@ -1417,7 +1405,7 @@
           </w:tcPr>
           <w:p>
             <w:pPr>
-              <w:pStyle w:val="Style16"/>
+              <w:pStyle w:val="user4"/>
               <w:spacing w:lineRule="auto" w:line="240"/>
               <w:ind w:hanging="0" w:left="0"/>
               <w:rPr/>
@@ -1433,7 +1421,7 @@
         <w:trPr/>
         <w:tc>
           <w:tcPr>
-            <w:tcW w:w="412" w:type="dxa"/>
+            <w:tcW w:w="411" w:type="dxa"/>
             <w:tcBorders>
               <w:left w:val="single" w:sz="4" w:space="0" w:color="000000"/>
               <w:bottom w:val="single" w:sz="4" w:space="0" w:color="000000"/>
@@ -1442,7 +1430,7 @@
           </w:tcPr>
           <w:p>
             <w:pPr>
-              <w:pStyle w:val="Style16"/>
+              <w:pStyle w:val="user4"/>
               <w:spacing w:lineRule="auto" w:line="240"/>
               <w:ind w:hanging="0" w:left="0"/>
               <w:rPr/>
@@ -1464,7 +1452,7 @@
           </w:tcPr>
           <w:p>
             <w:pPr>
-              <w:pStyle w:val="Style16"/>
+              <w:pStyle w:val="user4"/>
               <w:spacing w:lineRule="auto" w:line="240"/>
               <w:ind w:hanging="0" w:left="0"/>
               <w:rPr/>
@@ -1486,7 +1474,7 @@
           </w:tcPr>
           <w:p>
             <w:pPr>
-              <w:pStyle w:val="Style16"/>
+              <w:pStyle w:val="user4"/>
               <w:spacing w:lineRule="auto" w:line="240"/>
               <w:ind w:hanging="0" w:left="0"/>
               <w:rPr/>
@@ -1508,7 +1496,7 @@
           </w:tcPr>
           <w:p>
             <w:pPr>
-              <w:pStyle w:val="Style16"/>
+              <w:pStyle w:val="user4"/>
               <w:spacing w:lineRule="auto" w:line="240"/>
               <w:ind w:hanging="0" w:left="0"/>
               <w:rPr/>
@@ -1521,7 +1509,7 @@
         </w:tc>
         <w:tc>
           <w:tcPr>
-            <w:tcW w:w="3398" w:type="dxa"/>
+            <w:tcW w:w="3399" w:type="dxa"/>
             <w:tcBorders>
               <w:left w:val="single" w:sz="4" w:space="0" w:color="000000"/>
               <w:bottom w:val="single" w:sz="4" w:space="0" w:color="000000"/>
@@ -1531,7 +1519,7 @@
           </w:tcPr>
           <w:p>
             <w:pPr>
-              <w:pStyle w:val="Style16"/>
+              <w:pStyle w:val="user4"/>
               <w:spacing w:lineRule="auto" w:line="240"/>
               <w:ind w:hanging="0" w:left="0"/>
               <w:rPr/>
@@ -1547,7 +1535,7 @@
         <w:trPr/>
         <w:tc>
           <w:tcPr>
-            <w:tcW w:w="412" w:type="dxa"/>
+            <w:tcW w:w="411" w:type="dxa"/>
             <w:tcBorders>
               <w:left w:val="single" w:sz="4" w:space="0" w:color="000000"/>
               <w:bottom w:val="single" w:sz="4" w:space="0" w:color="000000"/>
@@ -1556,7 +1544,7 @@
           </w:tcPr>
           <w:p>
             <w:pPr>
-              <w:pStyle w:val="Style16"/>
+              <w:pStyle w:val="user4"/>
               <w:spacing w:lineRule="auto" w:line="240"/>
               <w:ind w:hanging="0" w:left="0"/>
               <w:rPr/>
@@ -1578,7 +1566,7 @@
           </w:tcPr>
           <w:p>
             <w:pPr>
-              <w:pStyle w:val="Style16"/>
+              <w:pStyle w:val="user4"/>
               <w:spacing w:lineRule="auto" w:line="240"/>
               <w:ind w:hanging="0" w:left="0"/>
               <w:rPr/>
@@ -1606,7 +1594,7 @@
           </w:tcPr>
           <w:p>
             <w:pPr>
-              <w:pStyle w:val="Style16"/>
+              <w:pStyle w:val="user4"/>
               <w:spacing w:lineRule="auto" w:line="240"/>
               <w:ind w:hanging="0" w:left="0"/>
               <w:rPr/>
@@ -1628,7 +1616,7 @@
           </w:tcPr>
           <w:p>
             <w:pPr>
-              <w:pStyle w:val="Style16"/>
+              <w:pStyle w:val="user4"/>
               <w:spacing w:lineRule="auto" w:line="240"/>
               <w:ind w:hanging="0" w:left="0"/>
               <w:rPr/>
@@ -1641,7 +1629,7 @@
         </w:tc>
         <w:tc>
           <w:tcPr>
-            <w:tcW w:w="3398" w:type="dxa"/>
+            <w:tcW w:w="3399" w:type="dxa"/>
             <w:tcBorders>
               <w:left w:val="single" w:sz="4" w:space="0" w:color="000000"/>
               <w:bottom w:val="single" w:sz="4" w:space="0" w:color="000000"/>
@@ -1651,7 +1639,7 @@
           </w:tcPr>
           <w:p>
             <w:pPr>
-              <w:pStyle w:val="Style16"/>
+              <w:pStyle w:val="user4"/>
               <w:spacing w:lineRule="auto" w:line="240"/>
               <w:ind w:hanging="0" w:left="0"/>
               <w:rPr/>
@@ -1672,7 +1660,9 @@
         </w:rPr>
       </w:pPr>
       <w:r>
-        <w:rPr/>
+        <w:rPr>
+          <w:lang w:val="uk-UA"/>
+        </w:rPr>
       </w:r>
     </w:p>
     <w:p>
@@ -1692,13 +1682,7 @@
         <w:rPr>
           <w:lang w:val="en-US"/>
         </w:rPr>
-        <w:t xml:space="preserve">Claude </w:t>
-      </w:r>
-      <w:r>
-        <w:rPr>
-          <w:lang w:val="en-US"/>
-        </w:rPr>
-        <w:t>й</w:t>
+        <w:t>Claude й</w:t>
       </w:r>
       <w:r>
         <w:rPr>
@@ -2087,15 +2071,7 @@
       </w:pPr>
       <w:r>
         <w:rPr/>
-        <w:t xml:space="preserve">Цілі в галузі якості описані у таблиці </w:t>
-      </w:r>
-      <w:r>
-        <w:rPr/>
-        <w:t>3</w:t>
-      </w:r>
-      <w:r>
-        <w:rPr/>
-        <w:t>.1.</w:t>
+        <w:t>Цілі в галузі якості описані у таблиці 3.1.</w:t>
       </w:r>
     </w:p>
     <w:p>
@@ -2114,15 +2090,7 @@
       </w:pPr>
       <w:r>
         <w:rPr/>
-        <w:t xml:space="preserve">Таблиця </w:t>
-      </w:r>
-      <w:r>
-        <w:rPr/>
-        <w:t>3</w:t>
-      </w:r>
-      <w:r>
-        <w:rPr/>
-        <w:t>.1 — Цілі в галузі якості та відповідні показники ступеня їх досягнення</w:t>
+        <w:t>Таблиця 3.1 — Цілі в галузі якості та відповідні показники ступеня їх досягнення</w:t>
         <w:tab/>
       </w:r>
     </w:p>
@@ -2140,8 +2108,8 @@
         </w:tblCellMar>
       </w:tblPr>
       <w:tblGrid>
-        <w:gridCol w:w="371"/>
-        <w:gridCol w:w="6351"/>
+        <w:gridCol w:w="370"/>
+        <w:gridCol w:w="6352"/>
         <w:gridCol w:w="1991"/>
         <w:gridCol w:w="2905"/>
       </w:tblGrid>
@@ -2151,7 +2119,7 @@
         </w:trPr>
         <w:tc>
           <w:tcPr>
-            <w:tcW w:w="371" w:type="dxa"/>
+            <w:tcW w:w="370" w:type="dxa"/>
             <w:tcBorders>
               <w:top w:val="single" w:sz="4" w:space="0" w:color="000000"/>
               <w:left w:val="single" w:sz="4" w:space="0" w:color="000000"/>
@@ -2161,7 +2129,7 @@
           </w:tcPr>
           <w:p>
             <w:pPr>
-              <w:pStyle w:val="Style16"/>
+              <w:pStyle w:val="user4"/>
               <w:spacing w:lineRule="auto" w:line="240"/>
               <w:ind w:hanging="0" w:left="0"/>
               <w:jc w:val="center"/>
@@ -2187,7 +2155,7 @@
         </w:tc>
         <w:tc>
           <w:tcPr>
-            <w:tcW w:w="6351" w:type="dxa"/>
+            <w:tcW w:w="6352" w:type="dxa"/>
             <w:tcBorders>
               <w:top w:val="single" w:sz="4" w:space="0" w:color="000000"/>
               <w:left w:val="single" w:sz="4" w:space="0" w:color="000000"/>
@@ -2197,7 +2165,7 @@
           </w:tcPr>
           <w:p>
             <w:pPr>
-              <w:pStyle w:val="Style16"/>
+              <w:pStyle w:val="user4"/>
               <w:spacing w:lineRule="auto" w:line="240"/>
               <w:ind w:hanging="0" w:left="0"/>
               <w:jc w:val="center"/>
@@ -2231,7 +2199,7 @@
           </w:tcPr>
           <w:p>
             <w:pPr>
-              <w:pStyle w:val="Style16"/>
+              <w:pStyle w:val="user4"/>
               <w:spacing w:lineRule="auto" w:line="240"/>
               <w:ind w:hanging="0" w:left="0"/>
               <w:jc w:val="center"/>
@@ -2293,7 +2261,7 @@
         <w:trPr/>
         <w:tc>
           <w:tcPr>
-            <w:tcW w:w="371" w:type="dxa"/>
+            <w:tcW w:w="370" w:type="dxa"/>
             <w:tcBorders>
               <w:left w:val="single" w:sz="4" w:space="0" w:color="000000"/>
               <w:bottom w:val="single" w:sz="4" w:space="0" w:color="000000"/>
@@ -2302,7 +2270,7 @@
           </w:tcPr>
           <w:p>
             <w:pPr>
-              <w:pStyle w:val="Style16"/>
+              <w:pStyle w:val="user4"/>
               <w:spacing w:lineRule="auto" w:line="240"/>
               <w:ind w:hanging="0" w:left="0"/>
               <w:rPr>
@@ -2321,7 +2289,7 @@
         </w:tc>
         <w:tc>
           <w:tcPr>
-            <w:tcW w:w="6351" w:type="dxa"/>
+            <w:tcW w:w="6352" w:type="dxa"/>
             <w:tcBorders>
               <w:left w:val="single" w:sz="4" w:space="0" w:color="000000"/>
               <w:bottom w:val="single" w:sz="4" w:space="0" w:color="000000"/>
@@ -2330,7 +2298,7 @@
           </w:tcPr>
           <w:p>
             <w:pPr>
-              <w:pStyle w:val="Style16"/>
+              <w:pStyle w:val="user4"/>
               <w:spacing w:lineRule="auto" w:line="240"/>
               <w:ind w:hanging="0" w:left="0"/>
               <w:rPr>
@@ -2358,7 +2326,7 @@
           </w:tcPr>
           <w:p>
             <w:pPr>
-              <w:pStyle w:val="Style16"/>
+              <w:pStyle w:val="user4"/>
               <w:spacing w:lineRule="auto" w:line="240"/>
               <w:ind w:hanging="0" w:left="0"/>
               <w:rPr>
@@ -2409,7 +2377,7 @@
         <w:trPr/>
         <w:tc>
           <w:tcPr>
-            <w:tcW w:w="371" w:type="dxa"/>
+            <w:tcW w:w="370" w:type="dxa"/>
             <w:tcBorders>
               <w:left w:val="single" w:sz="4" w:space="0" w:color="000000"/>
               <w:bottom w:val="single" w:sz="4" w:space="0" w:color="000000"/>
@@ -2418,7 +2386,7 @@
           </w:tcPr>
           <w:p>
             <w:pPr>
-              <w:pStyle w:val="Style16"/>
+              <w:pStyle w:val="user4"/>
               <w:spacing w:lineRule="auto" w:line="240"/>
               <w:ind w:hanging="0" w:left="0"/>
               <w:rPr>
@@ -2437,7 +2405,7 @@
         </w:tc>
         <w:tc>
           <w:tcPr>
-            <w:tcW w:w="6351" w:type="dxa"/>
+            <w:tcW w:w="6352" w:type="dxa"/>
             <w:tcBorders>
               <w:left w:val="single" w:sz="4" w:space="0" w:color="000000"/>
               <w:bottom w:val="single" w:sz="4" w:space="0" w:color="000000"/>
@@ -2446,7 +2414,7 @@
           </w:tcPr>
           <w:p>
             <w:pPr>
-              <w:pStyle w:val="Style16"/>
+              <w:pStyle w:val="user4"/>
               <w:spacing w:lineRule="auto" w:line="240"/>
               <w:ind w:hanging="0" w:left="0"/>
               <w:rPr>
@@ -2474,7 +2442,7 @@
           </w:tcPr>
           <w:p>
             <w:pPr>
-              <w:pStyle w:val="Style16"/>
+              <w:pStyle w:val="user4"/>
               <w:spacing w:lineRule="auto" w:line="240"/>
               <w:ind w:hanging="0" w:left="0"/>
               <w:rPr>
@@ -2525,7 +2493,7 @@
         <w:trPr/>
         <w:tc>
           <w:tcPr>
-            <w:tcW w:w="371" w:type="dxa"/>
+            <w:tcW w:w="370" w:type="dxa"/>
             <w:tcBorders>
               <w:left w:val="single" w:sz="4" w:space="0" w:color="000000"/>
               <w:bottom w:val="single" w:sz="4" w:space="0" w:color="000000"/>
@@ -2534,7 +2502,7 @@
           </w:tcPr>
           <w:p>
             <w:pPr>
-              <w:pStyle w:val="Style16"/>
+              <w:pStyle w:val="user4"/>
               <w:spacing w:lineRule="auto" w:line="240"/>
               <w:ind w:hanging="0" w:left="0"/>
               <w:rPr>
@@ -2553,7 +2521,7 @@
         </w:tc>
         <w:tc>
           <w:tcPr>
-            <w:tcW w:w="6351" w:type="dxa"/>
+            <w:tcW w:w="6352" w:type="dxa"/>
             <w:tcBorders>
               <w:left w:val="single" w:sz="4" w:space="0" w:color="000000"/>
               <w:bottom w:val="single" w:sz="4" w:space="0" w:color="000000"/>
@@ -2562,7 +2530,7 @@
           </w:tcPr>
           <w:p>
             <w:pPr>
-              <w:pStyle w:val="Style16"/>
+              <w:pStyle w:val="user4"/>
               <w:spacing w:lineRule="auto" w:line="240"/>
               <w:ind w:hanging="0" w:left="0"/>
               <w:rPr>
@@ -2590,7 +2558,7 @@
           </w:tcPr>
           <w:p>
             <w:pPr>
-              <w:pStyle w:val="Style16"/>
+              <w:pStyle w:val="user4"/>
               <w:spacing w:lineRule="auto" w:line="240"/>
               <w:ind w:hanging="0" w:left="0"/>
               <w:rPr>
@@ -2641,7 +2609,7 @@
         <w:trPr/>
         <w:tc>
           <w:tcPr>
-            <w:tcW w:w="371" w:type="dxa"/>
+            <w:tcW w:w="370" w:type="dxa"/>
             <w:tcBorders>
               <w:left w:val="single" w:sz="4" w:space="0" w:color="000000"/>
               <w:bottom w:val="single" w:sz="4" w:space="0" w:color="000000"/>
@@ -2650,7 +2618,7 @@
           </w:tcPr>
           <w:p>
             <w:pPr>
-              <w:pStyle w:val="Style16"/>
+              <w:pStyle w:val="user4"/>
               <w:spacing w:lineRule="auto" w:line="240"/>
               <w:ind w:hanging="0" w:left="0"/>
               <w:rPr>
@@ -2669,7 +2637,7 @@
         </w:tc>
         <w:tc>
           <w:tcPr>
-            <w:tcW w:w="6351" w:type="dxa"/>
+            <w:tcW w:w="6352" w:type="dxa"/>
             <w:tcBorders>
               <w:left w:val="single" w:sz="4" w:space="0" w:color="000000"/>
               <w:bottom w:val="single" w:sz="4" w:space="0" w:color="000000"/>
@@ -2678,7 +2646,7 @@
           </w:tcPr>
           <w:p>
             <w:pPr>
-              <w:pStyle w:val="Style16"/>
+              <w:pStyle w:val="user4"/>
               <w:spacing w:lineRule="auto" w:line="240"/>
               <w:ind w:hanging="0" w:left="0"/>
               <w:rPr>
@@ -2706,7 +2674,7 @@
           </w:tcPr>
           <w:p>
             <w:pPr>
-              <w:pStyle w:val="Style16"/>
+              <w:pStyle w:val="user4"/>
               <w:spacing w:lineRule="auto" w:line="240"/>
               <w:ind w:hanging="0" w:left="0"/>
               <w:rPr>
@@ -2757,7 +2725,7 @@
         <w:trPr/>
         <w:tc>
           <w:tcPr>
-            <w:tcW w:w="371" w:type="dxa"/>
+            <w:tcW w:w="370" w:type="dxa"/>
             <w:tcBorders>
               <w:left w:val="single" w:sz="4" w:space="0" w:color="000000"/>
               <w:bottom w:val="single" w:sz="4" w:space="0" w:color="000000"/>
@@ -2766,7 +2734,7 @@
           </w:tcPr>
           <w:p>
             <w:pPr>
-              <w:pStyle w:val="Style16"/>
+              <w:pStyle w:val="user4"/>
               <w:spacing w:lineRule="auto" w:line="240"/>
               <w:ind w:hanging="0" w:left="0"/>
               <w:rPr>
@@ -2785,7 +2753,7 @@
         </w:tc>
         <w:tc>
           <w:tcPr>
-            <w:tcW w:w="6351" w:type="dxa"/>
+            <w:tcW w:w="6352" w:type="dxa"/>
             <w:tcBorders>
               <w:left w:val="single" w:sz="4" w:space="0" w:color="000000"/>
               <w:bottom w:val="single" w:sz="4" w:space="0" w:color="000000"/>
@@ -2794,7 +2762,7 @@
           </w:tcPr>
           <w:p>
             <w:pPr>
-              <w:pStyle w:val="Style16"/>
+              <w:pStyle w:val="user4"/>
               <w:spacing w:lineRule="auto" w:line="240"/>
               <w:ind w:hanging="0" w:left="0"/>
               <w:rPr>
@@ -2822,7 +2790,7 @@
           </w:tcPr>
           <w:p>
             <w:pPr>
-              <w:pStyle w:val="Style16"/>
+              <w:pStyle w:val="user4"/>
               <w:spacing w:lineRule="auto" w:line="240"/>
               <w:ind w:hanging="0" w:left="0"/>
               <w:rPr>
@@ -3659,62 +3627,191 @@
       </w:pPr>
       <w:r>
         <w:rPr/>
-        <w:t>Новина — стислий виклад якоїсь актуальної інформації, яка сталася нещодавно</w:t>
-      </w:r>
-    </w:p>
-    <w:p>
-      <w:pPr>
-        <w:pStyle w:val="P1"/>
-        <w:spacing w:before="0" w:after="0"/>
-        <w:rPr/>
-      </w:pPr>
-      <w:r>
-        <w:rPr/>
-        <w:t>Якість — ступінь, до якого сукупність власних характеристик об’єкта задовольняє вимоги</w:t>
-      </w:r>
-    </w:p>
-    <w:p>
-      <w:pPr>
-        <w:pStyle w:val="P1"/>
-        <w:spacing w:before="0" w:after="0"/>
-        <w:rPr/>
-      </w:pPr>
-      <w:r>
-        <w:rPr/>
-        <w:t>Медіа — канали та інструменти для зберігання, передавання та подачі інформації чи даних</w:t>
-      </w:r>
-    </w:p>
-    <w:p>
-      <w:pPr>
-        <w:pStyle w:val="P1"/>
-        <w:spacing w:before="0" w:after="0"/>
-        <w:rPr/>
-      </w:pPr>
-      <w:r>
-        <w:rPr/>
-        <w:t>Актуальна новина — така, що надає потрібну інформацію у відповідний момент часу</w:t>
-      </w:r>
-    </w:p>
-    <w:p>
-      <w:pPr>
-        <w:pStyle w:val="P1"/>
-        <w:spacing w:before="0" w:after="0"/>
-        <w:rPr/>
-      </w:pPr>
-      <w:r>
-        <w:rPr/>
-        <w:t>Веб-сайт компанії — набір програмних засобів (включно з системою управління контентом), які дозволяють команді публікувати новини в мережі інтернет, а споживачам переглядати ці новини</w:t>
-      </w:r>
-    </w:p>
-    <w:p>
-      <w:pPr>
-        <w:pStyle w:val="P1"/>
-        <w:spacing w:before="0" w:after="0"/>
-        <w:rPr/>
-      </w:pPr>
-      <w:r>
-        <w:rPr/>
-        <w:t>Система управління контентом — програмні засоби, які дозволяють відносно легко керувати вмістом веб-сайту</w:t>
+        <w:t>Існують наступні те</w:t>
+      </w:r>
+      <w:r>
+        <w:rPr/>
+        <w:t>р</w:t>
+      </w:r>
+      <w:r>
+        <w:rPr/>
+        <w:t>міни:</w:t>
+      </w:r>
+    </w:p>
+    <w:p>
+      <w:pPr>
+        <w:pStyle w:val="P1"/>
+        <w:widowControl/>
+        <w:numPr>
+          <w:ilvl w:val="0"/>
+          <w:numId w:val="8"/>
+        </w:numPr>
+        <w:suppressAutoHyphens w:val="true"/>
+        <w:bidi w:val="0"/>
+        <w:spacing w:lineRule="auto" w:line="360" w:before="0" w:after="0"/>
+        <w:ind w:firstLine="850" w:left="0" w:right="0"/>
+        <w:jc w:val="both"/>
+        <w:rPr/>
+      </w:pPr>
+      <w:r>
+        <w:rPr/>
+        <w:t>новинна стаття — публікація, що містить інформацію про певну подію.</w:t>
+      </w:r>
+    </w:p>
+    <w:p>
+      <w:pPr>
+        <w:pStyle w:val="P1"/>
+        <w:widowControl/>
+        <w:numPr>
+          <w:ilvl w:val="0"/>
+          <w:numId w:val="8"/>
+        </w:numPr>
+        <w:suppressAutoHyphens w:val="true"/>
+        <w:bidi w:val="0"/>
+        <w:spacing w:lineRule="auto" w:line="360" w:before="0" w:after="0"/>
+        <w:ind w:firstLine="850" w:left="0" w:right="0"/>
+        <w:jc w:val="both"/>
+        <w:rPr/>
+      </w:pPr>
+      <w:r>
+        <w:rPr/>
+        <w:t>посилання на новинну статтю — веб-адреса, за якою користувач може перейти до відповідної новинної статті на веб-сайті.</w:t>
+      </w:r>
+    </w:p>
+    <w:p>
+      <w:pPr>
+        <w:pStyle w:val="P1"/>
+        <w:widowControl/>
+        <w:numPr>
+          <w:ilvl w:val="0"/>
+          <w:numId w:val="8"/>
+        </w:numPr>
+        <w:suppressAutoHyphens w:val="true"/>
+        <w:bidi w:val="0"/>
+        <w:spacing w:lineRule="auto" w:line="360" w:before="0" w:after="0"/>
+        <w:ind w:firstLine="850" w:left="0" w:right="0"/>
+        <w:jc w:val="both"/>
+        <w:rPr/>
+      </w:pPr>
+      <w:r>
+        <w:rPr/>
+        <w:t>публікація — інформаційний матеріал, розміщений на веб-сайті для ознайомлення користувачів.</w:t>
+      </w:r>
+    </w:p>
+    <w:p>
+      <w:pPr>
+        <w:pStyle w:val="P1"/>
+        <w:widowControl/>
+        <w:numPr>
+          <w:ilvl w:val="0"/>
+          <w:numId w:val="8"/>
+        </w:numPr>
+        <w:suppressAutoHyphens w:val="true"/>
+        <w:bidi w:val="0"/>
+        <w:spacing w:lineRule="auto" w:line="360" w:before="0" w:after="0"/>
+        <w:ind w:firstLine="850" w:left="0" w:right="0"/>
+        <w:jc w:val="both"/>
+        <w:rPr/>
+      </w:pPr>
+      <w:r>
+        <w:rPr/>
+        <w:t xml:space="preserve">подія — факт або випадок, що відбувається в певному місці та часі й може становити інтерес для громадськості. </w:t>
+      </w:r>
+    </w:p>
+    <w:p>
+      <w:pPr>
+        <w:pStyle w:val="P1"/>
+        <w:widowControl/>
+        <w:numPr>
+          <w:ilvl w:val="0"/>
+          <w:numId w:val="8"/>
+        </w:numPr>
+        <w:suppressAutoHyphens w:val="true"/>
+        <w:bidi w:val="0"/>
+        <w:spacing w:lineRule="auto" w:line="360" w:before="0" w:after="0"/>
+        <w:ind w:firstLine="850" w:left="0" w:right="0"/>
+        <w:jc w:val="both"/>
+        <w:rPr/>
+      </w:pPr>
+      <w:r>
+        <w:rPr/>
+        <w:t>веб-сайт — сукупність веб-сторінок компанії, вмістом яких керують за допомогою CMS</w:t>
+      </w:r>
+      <w:r>
+        <w:rPr>
+          <w:lang w:val="en-US"/>
+        </w:rPr>
+        <w:t>.</w:t>
+      </w:r>
+    </w:p>
+    <w:p>
+      <w:pPr>
+        <w:pStyle w:val="P1"/>
+        <w:widowControl/>
+        <w:numPr>
+          <w:ilvl w:val="0"/>
+          <w:numId w:val="8"/>
+        </w:numPr>
+        <w:suppressAutoHyphens w:val="true"/>
+        <w:bidi w:val="0"/>
+        <w:spacing w:lineRule="auto" w:line="360" w:before="0" w:after="0"/>
+        <w:ind w:firstLine="850" w:left="0" w:right="0"/>
+        <w:jc w:val="both"/>
+        <w:rPr>
+          <w:lang w:val="uk-UA"/>
+        </w:rPr>
+      </w:pPr>
+      <w:r>
+        <w:rPr>
+          <w:lang w:val="uk-UA"/>
+        </w:rPr>
+        <w:t>компанія — організація, що здійснює збір та поширення новинних статей про події Запорізької області.</w:t>
+      </w:r>
+    </w:p>
+    <w:p>
+      <w:pPr>
+        <w:pStyle w:val="P1"/>
+        <w:widowControl/>
+        <w:numPr>
+          <w:ilvl w:val="0"/>
+          <w:numId w:val="8"/>
+        </w:numPr>
+        <w:suppressAutoHyphens w:val="true"/>
+        <w:bidi w:val="0"/>
+        <w:spacing w:lineRule="auto" w:line="360" w:before="0" w:after="0"/>
+        <w:ind w:firstLine="850" w:left="0" w:right="0"/>
+        <w:jc w:val="both"/>
+        <w:rPr>
+          <w:lang w:val="uk-UA"/>
+        </w:rPr>
+      </w:pPr>
+      <w:r>
+        <w:rPr>
+          <w:lang w:val="uk-UA"/>
+        </w:rPr>
+        <w:t>організація — група людей, які об'єдналися для спільної діяльності та досягнення певної мети.</w:t>
+      </w:r>
+    </w:p>
+    <w:p>
+      <w:pPr>
+        <w:pStyle w:val="P1"/>
+        <w:widowControl/>
+        <w:numPr>
+          <w:ilvl w:val="0"/>
+          <w:numId w:val="8"/>
+        </w:numPr>
+        <w:suppressAutoHyphens w:val="true"/>
+        <w:bidi w:val="0"/>
+        <w:spacing w:lineRule="auto" w:line="360" w:before="0" w:after="0"/>
+        <w:ind w:firstLine="850" w:left="0" w:right="0"/>
+        <w:jc w:val="both"/>
+        <w:rPr/>
+      </w:pPr>
+      <w:r>
+        <w:rPr>
+          <w:lang w:val="uk-UA"/>
+        </w:rPr>
+        <w:t>CMS (система керування контентом) — програмне забезпечення для керування вмістом веб-сайту.</w:t>
       </w:r>
     </w:p>
     <w:p>
@@ -4215,17 +4312,17 @@
         </w:tblCellMar>
       </w:tblPr>
       <w:tblGrid>
-        <w:gridCol w:w="371"/>
+        <w:gridCol w:w="370"/>
         <w:gridCol w:w="3125"/>
-        <w:gridCol w:w="1190"/>
-        <w:gridCol w:w="1850"/>
-        <w:gridCol w:w="2490"/>
+        <w:gridCol w:w="1191"/>
+        <w:gridCol w:w="1849"/>
+        <w:gridCol w:w="2491"/>
       </w:tblGrid>
       <w:tr>
         <w:trPr/>
         <w:tc>
           <w:tcPr>
-            <w:tcW w:w="371" w:type="dxa"/>
+            <w:tcW w:w="370" w:type="dxa"/>
             <w:tcBorders>
               <w:top w:val="single" w:sz="4" w:space="0" w:color="000000"/>
               <w:left w:val="single" w:sz="4" w:space="0" w:color="000000"/>
@@ -4234,7 +4331,7 @@
           </w:tcPr>
           <w:p>
             <w:pPr>
-              <w:pStyle w:val="user4"/>
+              <w:pStyle w:val="Style16"/>
               <w:spacing w:lineRule="auto" w:line="240"/>
               <w:ind w:hanging="0" w:left="0"/>
               <w:rPr>
@@ -4266,7 +4363,7 @@
           </w:tcPr>
           <w:p>
             <w:pPr>
-              <w:pStyle w:val="user4"/>
+              <w:pStyle w:val="Style16"/>
               <w:spacing w:lineRule="auto" w:line="240"/>
               <w:ind w:hanging="0" w:left="0"/>
               <w:rPr>
@@ -4289,7 +4386,7 @@
         </w:tc>
         <w:tc>
           <w:tcPr>
-            <w:tcW w:w="1190" w:type="dxa"/>
+            <w:tcW w:w="1191" w:type="dxa"/>
             <w:tcBorders>
               <w:top w:val="single" w:sz="4" w:space="0" w:color="000000"/>
               <w:left w:val="single" w:sz="4" w:space="0" w:color="000000"/>
@@ -4298,7 +4395,7 @@
           </w:tcPr>
           <w:p>
             <w:pPr>
-              <w:pStyle w:val="user4"/>
+              <w:pStyle w:val="Style16"/>
               <w:spacing w:lineRule="auto" w:line="240"/>
               <w:ind w:hanging="0" w:left="0"/>
               <w:rPr>
@@ -4321,7 +4418,7 @@
         </w:tc>
         <w:tc>
           <w:tcPr>
-            <w:tcW w:w="1850" w:type="dxa"/>
+            <w:tcW w:w="1849" w:type="dxa"/>
             <w:tcBorders>
               <w:top w:val="single" w:sz="4" w:space="0" w:color="000000"/>
               <w:left w:val="single" w:sz="4" w:space="0" w:color="000000"/>
@@ -4330,7 +4427,7 @@
           </w:tcPr>
           <w:p>
             <w:pPr>
-              <w:pStyle w:val="user4"/>
+              <w:pStyle w:val="Style16"/>
               <w:spacing w:lineRule="auto" w:line="240"/>
               <w:ind w:hanging="0" w:left="0"/>
               <w:rPr>
@@ -4353,7 +4450,7 @@
         </w:tc>
         <w:tc>
           <w:tcPr>
-            <w:tcW w:w="2490" w:type="dxa"/>
+            <w:tcW w:w="2491" w:type="dxa"/>
             <w:tcBorders>
               <w:top w:val="single" w:sz="4" w:space="0" w:color="000000"/>
               <w:left w:val="single" w:sz="4" w:space="0" w:color="000000"/>
@@ -4363,7 +4460,7 @@
           </w:tcPr>
           <w:p>
             <w:pPr>
-              <w:pStyle w:val="user4"/>
+              <w:pStyle w:val="Style16"/>
               <w:spacing w:lineRule="auto" w:line="240"/>
               <w:ind w:hanging="0" w:left="0"/>
               <w:rPr>
@@ -4389,15 +4486,15 @@
         <w:trPr/>
         <w:tc>
           <w:tcPr>
-            <w:tcW w:w="371" w:type="dxa"/>
-            <w:tcBorders>
-              <w:left w:val="single" w:sz="4" w:space="0" w:color="000000"/>
-              <w:bottom w:val="single" w:sz="4" w:space="0" w:color="000000"/>
-            </w:tcBorders>
-          </w:tcPr>
-          <w:p>
-            <w:pPr>
-              <w:pStyle w:val="user4"/>
+            <w:tcW w:w="370" w:type="dxa"/>
+            <w:tcBorders>
+              <w:left w:val="single" w:sz="4" w:space="0" w:color="000000"/>
+              <w:bottom w:val="single" w:sz="4" w:space="0" w:color="000000"/>
+            </w:tcBorders>
+          </w:tcPr>
+          <w:p>
+            <w:pPr>
+              <w:pStyle w:val="Style16"/>
               <w:spacing w:lineRule="auto" w:line="240"/>
               <w:ind w:hanging="0" w:left="0"/>
               <w:rPr>
@@ -4424,7 +4521,7 @@
           </w:tcPr>
           <w:p>
             <w:pPr>
-              <w:pStyle w:val="user4"/>
+              <w:pStyle w:val="Style16"/>
               <w:spacing w:lineRule="auto" w:line="240"/>
               <w:ind w:hanging="0" w:left="0"/>
               <w:rPr>
@@ -4451,15 +4548,15 @@
         </w:tc>
         <w:tc>
           <w:tcPr>
-            <w:tcW w:w="1190" w:type="dxa"/>
-            <w:tcBorders>
-              <w:left w:val="single" w:sz="4" w:space="0" w:color="000000"/>
-              <w:bottom w:val="single" w:sz="4" w:space="0" w:color="000000"/>
-            </w:tcBorders>
-          </w:tcPr>
-          <w:p>
-            <w:pPr>
-              <w:pStyle w:val="user4"/>
+            <w:tcW w:w="1191" w:type="dxa"/>
+            <w:tcBorders>
+              <w:left w:val="single" w:sz="4" w:space="0" w:color="000000"/>
+              <w:bottom w:val="single" w:sz="4" w:space="0" w:color="000000"/>
+            </w:tcBorders>
+          </w:tcPr>
+          <w:p>
+            <w:pPr>
+              <w:pStyle w:val="Style16"/>
               <w:spacing w:lineRule="auto" w:line="240"/>
               <w:ind w:hanging="0" w:left="0"/>
               <w:rPr>
@@ -4478,15 +4575,15 @@
         </w:tc>
         <w:tc>
           <w:tcPr>
-            <w:tcW w:w="1850" w:type="dxa"/>
-            <w:tcBorders>
-              <w:left w:val="single" w:sz="4" w:space="0" w:color="000000"/>
-              <w:bottom w:val="single" w:sz="4" w:space="0" w:color="000000"/>
-            </w:tcBorders>
-          </w:tcPr>
-          <w:p>
-            <w:pPr>
-              <w:pStyle w:val="user4"/>
+            <w:tcW w:w="1849" w:type="dxa"/>
+            <w:tcBorders>
+              <w:left w:val="single" w:sz="4" w:space="0" w:color="000000"/>
+              <w:bottom w:val="single" w:sz="4" w:space="0" w:color="000000"/>
+            </w:tcBorders>
+          </w:tcPr>
+          <w:p>
+            <w:pPr>
+              <w:pStyle w:val="Style16"/>
               <w:spacing w:lineRule="auto" w:line="240"/>
               <w:ind w:hanging="0" w:left="0"/>
               <w:rPr>
@@ -4505,7 +4602,7 @@
         </w:tc>
         <w:tc>
           <w:tcPr>
-            <w:tcW w:w="2490" w:type="dxa"/>
+            <w:tcW w:w="2491" w:type="dxa"/>
             <w:tcBorders>
               <w:left w:val="single" w:sz="4" w:space="0" w:color="000000"/>
               <w:bottom w:val="single" w:sz="4" w:space="0" w:color="000000"/>
@@ -4514,7 +4611,7 @@
           </w:tcPr>
           <w:p>
             <w:pPr>
-              <w:pStyle w:val="user4"/>
+              <w:pStyle w:val="Style16"/>
               <w:spacing w:lineRule="auto" w:line="240"/>
               <w:ind w:hanging="0" w:left="0"/>
               <w:rPr>
@@ -4540,15 +4637,15 @@
         <w:trPr/>
         <w:tc>
           <w:tcPr>
-            <w:tcW w:w="371" w:type="dxa"/>
-            <w:tcBorders>
-              <w:left w:val="single" w:sz="4" w:space="0" w:color="000000"/>
-              <w:bottom w:val="single" w:sz="4" w:space="0" w:color="000000"/>
-            </w:tcBorders>
-          </w:tcPr>
-          <w:p>
-            <w:pPr>
-              <w:pStyle w:val="user4"/>
+            <w:tcW w:w="370" w:type="dxa"/>
+            <w:tcBorders>
+              <w:left w:val="single" w:sz="4" w:space="0" w:color="000000"/>
+              <w:bottom w:val="single" w:sz="4" w:space="0" w:color="000000"/>
+            </w:tcBorders>
+          </w:tcPr>
+          <w:p>
+            <w:pPr>
+              <w:pStyle w:val="Style16"/>
               <w:spacing w:lineRule="auto" w:line="240"/>
               <w:ind w:hanging="0" w:left="0"/>
               <w:rPr>
@@ -4575,7 +4672,7 @@
           </w:tcPr>
           <w:p>
             <w:pPr>
-              <w:pStyle w:val="user4"/>
+              <w:pStyle w:val="Style16"/>
               <w:spacing w:lineRule="auto" w:line="240"/>
               <w:ind w:hanging="0" w:left="0"/>
               <w:rPr>
@@ -4602,15 +4699,15 @@
         </w:tc>
         <w:tc>
           <w:tcPr>
-            <w:tcW w:w="1190" w:type="dxa"/>
-            <w:tcBorders>
-              <w:left w:val="single" w:sz="4" w:space="0" w:color="000000"/>
-              <w:bottom w:val="single" w:sz="4" w:space="0" w:color="000000"/>
-            </w:tcBorders>
-          </w:tcPr>
-          <w:p>
-            <w:pPr>
-              <w:pStyle w:val="user4"/>
+            <w:tcW w:w="1191" w:type="dxa"/>
+            <w:tcBorders>
+              <w:left w:val="single" w:sz="4" w:space="0" w:color="000000"/>
+              <w:bottom w:val="single" w:sz="4" w:space="0" w:color="000000"/>
+            </w:tcBorders>
+          </w:tcPr>
+          <w:p>
+            <w:pPr>
+              <w:pStyle w:val="Style16"/>
               <w:spacing w:lineRule="auto" w:line="240"/>
               <w:ind w:hanging="0" w:left="0"/>
               <w:rPr>
@@ -4631,15 +4728,15 @@
         </w:tc>
         <w:tc>
           <w:tcPr>
-            <w:tcW w:w="1850" w:type="dxa"/>
-            <w:tcBorders>
-              <w:left w:val="single" w:sz="4" w:space="0" w:color="000000"/>
-              <w:bottom w:val="single" w:sz="4" w:space="0" w:color="000000"/>
-            </w:tcBorders>
-          </w:tcPr>
-          <w:p>
-            <w:pPr>
-              <w:pStyle w:val="user4"/>
+            <w:tcW w:w="1849" w:type="dxa"/>
+            <w:tcBorders>
+              <w:left w:val="single" w:sz="4" w:space="0" w:color="000000"/>
+              <w:bottom w:val="single" w:sz="4" w:space="0" w:color="000000"/>
+            </w:tcBorders>
+          </w:tcPr>
+          <w:p>
+            <w:pPr>
+              <w:pStyle w:val="Style16"/>
               <w:spacing w:lineRule="auto" w:line="240"/>
               <w:ind w:hanging="0" w:left="0"/>
               <w:rPr>
@@ -4658,7 +4755,7 @@
         </w:tc>
         <w:tc>
           <w:tcPr>
-            <w:tcW w:w="2490" w:type="dxa"/>
+            <w:tcW w:w="2491" w:type="dxa"/>
             <w:tcBorders>
               <w:left w:val="single" w:sz="4" w:space="0" w:color="000000"/>
               <w:bottom w:val="single" w:sz="4" w:space="0" w:color="000000"/>
@@ -4667,7 +4764,7 @@
           </w:tcPr>
           <w:p>
             <w:pPr>
-              <w:pStyle w:val="user4"/>
+              <w:pStyle w:val="Style16"/>
               <w:spacing w:lineRule="auto" w:line="240"/>
               <w:ind w:hanging="0" w:left="0"/>
               <w:rPr>
@@ -4689,15 +4786,15 @@
         <w:trPr/>
         <w:tc>
           <w:tcPr>
-            <w:tcW w:w="371" w:type="dxa"/>
-            <w:tcBorders>
-              <w:left w:val="single" w:sz="4" w:space="0" w:color="000000"/>
-              <w:bottom w:val="single" w:sz="4" w:space="0" w:color="000000"/>
-            </w:tcBorders>
-          </w:tcPr>
-          <w:p>
-            <w:pPr>
-              <w:pStyle w:val="user4"/>
+            <w:tcW w:w="370" w:type="dxa"/>
+            <w:tcBorders>
+              <w:left w:val="single" w:sz="4" w:space="0" w:color="000000"/>
+              <w:bottom w:val="single" w:sz="4" w:space="0" w:color="000000"/>
+            </w:tcBorders>
+          </w:tcPr>
+          <w:p>
+            <w:pPr>
+              <w:pStyle w:val="Style16"/>
               <w:spacing w:lineRule="auto" w:line="240"/>
               <w:ind w:hanging="0" w:left="0"/>
               <w:rPr>
@@ -4724,7 +4821,7 @@
           </w:tcPr>
           <w:p>
             <w:pPr>
-              <w:pStyle w:val="user4"/>
+              <w:pStyle w:val="Style16"/>
               <w:spacing w:lineRule="auto" w:line="240"/>
               <w:ind w:hanging="0" w:left="0"/>
               <w:rPr>
@@ -4743,15 +4840,15 @@
         </w:tc>
         <w:tc>
           <w:tcPr>
-            <w:tcW w:w="1190" w:type="dxa"/>
-            <w:tcBorders>
-              <w:left w:val="single" w:sz="4" w:space="0" w:color="000000"/>
-              <w:bottom w:val="single" w:sz="4" w:space="0" w:color="000000"/>
-            </w:tcBorders>
-          </w:tcPr>
-          <w:p>
-            <w:pPr>
-              <w:pStyle w:val="user4"/>
+            <w:tcW w:w="1191" w:type="dxa"/>
+            <w:tcBorders>
+              <w:left w:val="single" w:sz="4" w:space="0" w:color="000000"/>
+              <w:bottom w:val="single" w:sz="4" w:space="0" w:color="000000"/>
+            </w:tcBorders>
+          </w:tcPr>
+          <w:p>
+            <w:pPr>
+              <w:pStyle w:val="Style16"/>
               <w:spacing w:lineRule="auto" w:line="240"/>
               <w:ind w:hanging="0" w:left="0"/>
               <w:rPr>
@@ -4772,15 +4869,15 @@
         </w:tc>
         <w:tc>
           <w:tcPr>
-            <w:tcW w:w="1850" w:type="dxa"/>
-            <w:tcBorders>
-              <w:left w:val="single" w:sz="4" w:space="0" w:color="000000"/>
-              <w:bottom w:val="single" w:sz="4" w:space="0" w:color="000000"/>
-            </w:tcBorders>
-          </w:tcPr>
-          <w:p>
-            <w:pPr>
-              <w:pStyle w:val="user4"/>
+            <w:tcW w:w="1849" w:type="dxa"/>
+            <w:tcBorders>
+              <w:left w:val="single" w:sz="4" w:space="0" w:color="000000"/>
+              <w:bottom w:val="single" w:sz="4" w:space="0" w:color="000000"/>
+            </w:tcBorders>
+          </w:tcPr>
+          <w:p>
+            <w:pPr>
+              <w:pStyle w:val="Style16"/>
               <w:spacing w:lineRule="auto" w:line="240"/>
               <w:ind w:hanging="0" w:left="0"/>
               <w:rPr>
@@ -4799,7 +4896,7 @@
         </w:tc>
         <w:tc>
           <w:tcPr>
-            <w:tcW w:w="2490" w:type="dxa"/>
+            <w:tcW w:w="2491" w:type="dxa"/>
             <w:tcBorders>
               <w:left w:val="single" w:sz="4" w:space="0" w:color="000000"/>
               <w:bottom w:val="single" w:sz="4" w:space="0" w:color="000000"/>
@@ -4808,7 +4905,7 @@
           </w:tcPr>
           <w:p>
             <w:pPr>
-              <w:pStyle w:val="user4"/>
+              <w:pStyle w:val="Style16"/>
               <w:spacing w:lineRule="auto" w:line="240"/>
               <w:ind w:hanging="0" w:left="0"/>
               <w:rPr>
@@ -4830,15 +4927,15 @@
         <w:trPr/>
         <w:tc>
           <w:tcPr>
-            <w:tcW w:w="371" w:type="dxa"/>
-            <w:tcBorders>
-              <w:left w:val="single" w:sz="4" w:space="0" w:color="000000"/>
-              <w:bottom w:val="single" w:sz="4" w:space="0" w:color="000000"/>
-            </w:tcBorders>
-          </w:tcPr>
-          <w:p>
-            <w:pPr>
-              <w:pStyle w:val="user4"/>
+            <w:tcW w:w="370" w:type="dxa"/>
+            <w:tcBorders>
+              <w:left w:val="single" w:sz="4" w:space="0" w:color="000000"/>
+              <w:bottom w:val="single" w:sz="4" w:space="0" w:color="000000"/>
+            </w:tcBorders>
+          </w:tcPr>
+          <w:p>
+            <w:pPr>
+              <w:pStyle w:val="Style16"/>
               <w:spacing w:lineRule="auto" w:line="240"/>
               <w:ind w:hanging="0" w:left="0"/>
               <w:rPr>
@@ -4865,7 +4962,7 @@
           </w:tcPr>
           <w:p>
             <w:pPr>
-              <w:pStyle w:val="user4"/>
+              <w:pStyle w:val="Style16"/>
               <w:spacing w:lineRule="auto" w:line="240"/>
               <w:ind w:hanging="0" w:left="0"/>
               <w:rPr>
@@ -4892,15 +4989,15 @@
         </w:tc>
         <w:tc>
           <w:tcPr>
-            <w:tcW w:w="1190" w:type="dxa"/>
-            <w:tcBorders>
-              <w:left w:val="single" w:sz="4" w:space="0" w:color="000000"/>
-              <w:bottom w:val="single" w:sz="4" w:space="0" w:color="000000"/>
-            </w:tcBorders>
-          </w:tcPr>
-          <w:p>
-            <w:pPr>
-              <w:pStyle w:val="user4"/>
+            <w:tcW w:w="1191" w:type="dxa"/>
+            <w:tcBorders>
+              <w:left w:val="single" w:sz="4" w:space="0" w:color="000000"/>
+              <w:bottom w:val="single" w:sz="4" w:space="0" w:color="000000"/>
+            </w:tcBorders>
+          </w:tcPr>
+          <w:p>
+            <w:pPr>
+              <w:pStyle w:val="Style16"/>
               <w:spacing w:lineRule="auto" w:line="240"/>
               <w:ind w:hanging="0" w:left="0"/>
               <w:rPr>
@@ -4921,15 +5018,15 @@
         </w:tc>
         <w:tc>
           <w:tcPr>
-            <w:tcW w:w="1850" w:type="dxa"/>
-            <w:tcBorders>
-              <w:left w:val="single" w:sz="4" w:space="0" w:color="000000"/>
-              <w:bottom w:val="single" w:sz="4" w:space="0" w:color="000000"/>
-            </w:tcBorders>
-          </w:tcPr>
-          <w:p>
-            <w:pPr>
-              <w:pStyle w:val="user4"/>
+            <w:tcW w:w="1849" w:type="dxa"/>
+            <w:tcBorders>
+              <w:left w:val="single" w:sz="4" w:space="0" w:color="000000"/>
+              <w:bottom w:val="single" w:sz="4" w:space="0" w:color="000000"/>
+            </w:tcBorders>
+          </w:tcPr>
+          <w:p>
+            <w:pPr>
+              <w:pStyle w:val="Style16"/>
               <w:spacing w:lineRule="auto" w:line="240"/>
               <w:ind w:hanging="0" w:left="0"/>
               <w:rPr>
@@ -4948,7 +5045,7 @@
         </w:tc>
         <w:tc>
           <w:tcPr>
-            <w:tcW w:w="2490" w:type="dxa"/>
+            <w:tcW w:w="2491" w:type="dxa"/>
             <w:tcBorders>
               <w:left w:val="single" w:sz="4" w:space="0" w:color="000000"/>
               <w:bottom w:val="single" w:sz="4" w:space="0" w:color="000000"/>
@@ -4957,7 +5054,7 @@
           </w:tcPr>
           <w:p>
             <w:pPr>
-              <w:pStyle w:val="user4"/>
+              <w:pStyle w:val="Style16"/>
               <w:spacing w:lineRule="auto" w:line="240"/>
               <w:ind w:hanging="0" w:left="0"/>
               <w:rPr>
@@ -4979,15 +5076,15 @@
         <w:trPr/>
         <w:tc>
           <w:tcPr>
-            <w:tcW w:w="371" w:type="dxa"/>
-            <w:tcBorders>
-              <w:left w:val="single" w:sz="4" w:space="0" w:color="000000"/>
-              <w:bottom w:val="single" w:sz="4" w:space="0" w:color="000000"/>
-            </w:tcBorders>
-          </w:tcPr>
-          <w:p>
-            <w:pPr>
-              <w:pStyle w:val="user4"/>
+            <w:tcW w:w="370" w:type="dxa"/>
+            <w:tcBorders>
+              <w:left w:val="single" w:sz="4" w:space="0" w:color="000000"/>
+              <w:bottom w:val="single" w:sz="4" w:space="0" w:color="000000"/>
+            </w:tcBorders>
+          </w:tcPr>
+          <w:p>
+            <w:pPr>
+              <w:pStyle w:val="Style16"/>
               <w:spacing w:lineRule="auto" w:line="240"/>
               <w:ind w:hanging="0" w:left="0"/>
               <w:rPr>
@@ -5014,7 +5111,7 @@
           </w:tcPr>
           <w:p>
             <w:pPr>
-              <w:pStyle w:val="user4"/>
+              <w:pStyle w:val="Style16"/>
               <w:spacing w:lineRule="auto" w:line="240"/>
               <w:ind w:hanging="0" w:left="0"/>
               <w:rPr>
@@ -5041,15 +5138,15 @@
         </w:tc>
         <w:tc>
           <w:tcPr>
-            <w:tcW w:w="1190" w:type="dxa"/>
-            <w:tcBorders>
-              <w:left w:val="single" w:sz="4" w:space="0" w:color="000000"/>
-              <w:bottom w:val="single" w:sz="4" w:space="0" w:color="000000"/>
-            </w:tcBorders>
-          </w:tcPr>
-          <w:p>
-            <w:pPr>
-              <w:pStyle w:val="user4"/>
+            <w:tcW w:w="1191" w:type="dxa"/>
+            <w:tcBorders>
+              <w:left w:val="single" w:sz="4" w:space="0" w:color="000000"/>
+              <w:bottom w:val="single" w:sz="4" w:space="0" w:color="000000"/>
+            </w:tcBorders>
+          </w:tcPr>
+          <w:p>
+            <w:pPr>
+              <w:pStyle w:val="Style16"/>
               <w:spacing w:lineRule="auto" w:line="240"/>
               <w:ind w:hanging="0" w:left="0"/>
               <w:rPr>
@@ -5070,15 +5167,15 @@
         </w:tc>
         <w:tc>
           <w:tcPr>
-            <w:tcW w:w="1850" w:type="dxa"/>
-            <w:tcBorders>
-              <w:left w:val="single" w:sz="4" w:space="0" w:color="000000"/>
-              <w:bottom w:val="single" w:sz="4" w:space="0" w:color="000000"/>
-            </w:tcBorders>
-          </w:tcPr>
-          <w:p>
-            <w:pPr>
-              <w:pStyle w:val="user4"/>
+            <w:tcW w:w="1849" w:type="dxa"/>
+            <w:tcBorders>
+              <w:left w:val="single" w:sz="4" w:space="0" w:color="000000"/>
+              <w:bottom w:val="single" w:sz="4" w:space="0" w:color="000000"/>
+            </w:tcBorders>
+          </w:tcPr>
+          <w:p>
+            <w:pPr>
+              <w:pStyle w:val="Style16"/>
               <w:spacing w:lineRule="auto" w:line="240"/>
               <w:ind w:hanging="0" w:left="0"/>
               <w:rPr>
@@ -5097,7 +5194,7 @@
         </w:tc>
         <w:tc>
           <w:tcPr>
-            <w:tcW w:w="2490" w:type="dxa"/>
+            <w:tcW w:w="2491" w:type="dxa"/>
             <w:tcBorders>
               <w:left w:val="single" w:sz="4" w:space="0" w:color="000000"/>
               <w:bottom w:val="single" w:sz="4" w:space="0" w:color="000000"/>
@@ -5106,7 +5203,7 @@
           </w:tcPr>
           <w:p>
             <w:pPr>
-              <w:pStyle w:val="user4"/>
+              <w:pStyle w:val="Style16"/>
               <w:spacing w:lineRule="auto" w:line="240"/>
               <w:ind w:hanging="0" w:left="0"/>
               <w:rPr>
@@ -6417,6 +6514,143 @@
     </w:lvl>
   </w:abstractNum>
   <w:abstractNum w:abstractNumId="8">
+    <w:lvl w:ilvl="0">
+      <w:start w:val="1"/>
+      <w:numFmt w:val="bullet"/>
+      <w:lvlText w:val=""/>
+      <w:lvlJc w:val="left"/>
+      <w:pPr>
+        <w:tabs>
+          <w:tab w:val="num" w:pos="720"/>
+        </w:tabs>
+        <w:ind w:left="720" w:hanging="360"/>
+      </w:pPr>
+      <w:rPr>
+        <w:rFonts w:ascii="Symbol" w:hAnsi="Symbol" w:cs="Symbol" w:hint="default"/>
+      </w:rPr>
+    </w:lvl>
+    <w:lvl w:ilvl="1">
+      <w:start w:val="1"/>
+      <w:numFmt w:val="bullet"/>
+      <w:lvlText w:val="◦"/>
+      <w:lvlJc w:val="left"/>
+      <w:pPr>
+        <w:tabs>
+          <w:tab w:val="num" w:pos="1080"/>
+        </w:tabs>
+        <w:ind w:left="1080" w:hanging="360"/>
+      </w:pPr>
+      <w:rPr>
+        <w:rFonts w:ascii="OpenSymbol" w:hAnsi="OpenSymbol" w:cs="OpenSymbol" w:hint="default"/>
+      </w:rPr>
+    </w:lvl>
+    <w:lvl w:ilvl="2">
+      <w:start w:val="1"/>
+      <w:numFmt w:val="bullet"/>
+      <w:lvlText w:val="▪"/>
+      <w:lvlJc w:val="left"/>
+      <w:pPr>
+        <w:tabs>
+          <w:tab w:val="num" w:pos="1440"/>
+        </w:tabs>
+        <w:ind w:left="1440" w:hanging="360"/>
+      </w:pPr>
+      <w:rPr>
+        <w:rFonts w:ascii="OpenSymbol" w:hAnsi="OpenSymbol" w:cs="OpenSymbol" w:hint="default"/>
+      </w:rPr>
+    </w:lvl>
+    <w:lvl w:ilvl="3">
+      <w:start w:val="1"/>
+      <w:numFmt w:val="bullet"/>
+      <w:lvlText w:val=""/>
+      <w:lvlJc w:val="left"/>
+      <w:pPr>
+        <w:tabs>
+          <w:tab w:val="num" w:pos="1800"/>
+        </w:tabs>
+        <w:ind w:left="1800" w:hanging="360"/>
+      </w:pPr>
+      <w:rPr>
+        <w:rFonts w:ascii="Symbol" w:hAnsi="Symbol" w:cs="Symbol" w:hint="default"/>
+      </w:rPr>
+    </w:lvl>
+    <w:lvl w:ilvl="4">
+      <w:start w:val="1"/>
+      <w:numFmt w:val="bullet"/>
+      <w:lvlText w:val="◦"/>
+      <w:lvlJc w:val="left"/>
+      <w:pPr>
+        <w:tabs>
+          <w:tab w:val="num" w:pos="2160"/>
+        </w:tabs>
+        <w:ind w:left="2160" w:hanging="360"/>
+      </w:pPr>
+      <w:rPr>
+        <w:rFonts w:ascii="OpenSymbol" w:hAnsi="OpenSymbol" w:cs="OpenSymbol" w:hint="default"/>
+      </w:rPr>
+    </w:lvl>
+    <w:lvl w:ilvl="5">
+      <w:start w:val="1"/>
+      <w:numFmt w:val="bullet"/>
+      <w:lvlText w:val="▪"/>
+      <w:lvlJc w:val="left"/>
+      <w:pPr>
+        <w:tabs>
+          <w:tab w:val="num" w:pos="2520"/>
+        </w:tabs>
+        <w:ind w:left="2520" w:hanging="360"/>
+      </w:pPr>
+      <w:rPr>
+        <w:rFonts w:ascii="OpenSymbol" w:hAnsi="OpenSymbol" w:cs="OpenSymbol" w:hint="default"/>
+      </w:rPr>
+    </w:lvl>
+    <w:lvl w:ilvl="6">
+      <w:start w:val="1"/>
+      <w:numFmt w:val="bullet"/>
+      <w:lvlText w:val=""/>
+      <w:lvlJc w:val="left"/>
+      <w:pPr>
+        <w:tabs>
+          <w:tab w:val="num" w:pos="2880"/>
+        </w:tabs>
+        <w:ind w:left="2880" w:hanging="360"/>
+      </w:pPr>
+      <w:rPr>
+        <w:rFonts w:ascii="Symbol" w:hAnsi="Symbol" w:cs="Symbol" w:hint="default"/>
+      </w:rPr>
+    </w:lvl>
+    <w:lvl w:ilvl="7">
+      <w:start w:val="1"/>
+      <w:numFmt w:val="bullet"/>
+      <w:lvlText w:val="◦"/>
+      <w:lvlJc w:val="left"/>
+      <w:pPr>
+        <w:tabs>
+          <w:tab w:val="num" w:pos="3240"/>
+        </w:tabs>
+        <w:ind w:left="3240" w:hanging="360"/>
+      </w:pPr>
+      <w:rPr>
+        <w:rFonts w:ascii="OpenSymbol" w:hAnsi="OpenSymbol" w:cs="OpenSymbol" w:hint="default"/>
+      </w:rPr>
+    </w:lvl>
+    <w:lvl w:ilvl="8">
+      <w:start w:val="1"/>
+      <w:numFmt w:val="bullet"/>
+      <w:lvlText w:val="▪"/>
+      <w:lvlJc w:val="left"/>
+      <w:pPr>
+        <w:tabs>
+          <w:tab w:val="num" w:pos="3600"/>
+        </w:tabs>
+        <w:ind w:left="3600" w:hanging="360"/>
+      </w:pPr>
+      <w:rPr>
+        <w:rFonts w:ascii="OpenSymbol" w:hAnsi="OpenSymbol" w:cs="OpenSymbol" w:hint="default"/>
+      </w:rPr>
+    </w:lvl>
+  </w:abstractNum>
+  <w:abstractNum w:abstractNumId="9">
     <w:lvl w:ilvl="0">
       <w:start w:val="1"/>
       <w:numFmt w:val="none"/>
@@ -6558,6 +6792,9 @@
   </w:num>
   <w:num w:numId="8">
     <w:abstractNumId w:val="8"/>
+  </w:num>
+  <w:num w:numId="9">
+    <w:abstractNumId w:val="9"/>
   </w:num>
 </w:numbering>
 </file>
@@ -7347,27 +7584,27 @@
       <w:lang w:val="en-US" w:eastAsia="uk-UA"/>
     </w:rPr>
   </w:style>
-  <w:style w:type="character" w:styleId="Style12">
-    <w:name w:val="Символ нумерації"/>
+  <w:style w:type="character" w:styleId="user">
+    <w:name w:val="Символ нумерації (user)"/>
     <w:qFormat/>
     <w:rPr/>
   </w:style>
-  <w:style w:type="character" w:styleId="Style13">
+  <w:style w:type="character" w:styleId="user1">
+    <w:name w:val="Маркери (user)"/>
+    <w:qFormat/>
+    <w:rPr>
+      <w:rFonts w:ascii="OpenSymbol" w:hAnsi="OpenSymbol" w:eastAsia="OpenSymbol" w:cs="OpenSymbol"/>
+    </w:rPr>
+  </w:style>
+  <w:style w:type="character" w:styleId="Style12">
     <w:name w:val="Маркери"/>
     <w:qFormat/>
     <w:rPr>
       <w:rFonts w:ascii="OpenSymbol" w:hAnsi="OpenSymbol" w:eastAsia="OpenSymbol" w:cs="OpenSymbol"/>
     </w:rPr>
   </w:style>
-  <w:style w:type="character" w:styleId="user">
-    <w:name w:val="Маркери (user)"/>
-    <w:qFormat/>
-    <w:rPr>
-      <w:rFonts w:ascii="OpenSymbol" w:hAnsi="OpenSymbol" w:eastAsia="OpenSymbol" w:cs="OpenSymbol"/>
-    </w:rPr>
-  </w:style>
-  <w:style w:type="character" w:styleId="user1">
-    <w:name w:val="Символ нумерації (user)"/>
+  <w:style w:type="character" w:styleId="Style13">
+    <w:name w:val="Символ нумерації"/>
     <w:qFormat/>
     <w:rPr/>
   </w:style>
@@ -7381,7 +7618,7 @@
       <w:spacing w:before="240" w:after="120"/>
     </w:pPr>
     <w:rPr>
-      <w:rFonts w:ascii="Liberation Sans" w:hAnsi="Liberation Sans" w:eastAsia="Microsoft YaHei" w:cs="Lucida Sans"/>
+      <w:rFonts w:ascii="Liberation Sans" w:hAnsi="Liberation Sans" w:eastAsia="Microsoft YaHei" w:cs="Arial Unicode MS"/>
       <w:sz w:val="28"/>
       <w:szCs w:val="28"/>
     </w:rPr>
@@ -7426,7 +7663,7 @@
       <w:suppressLineNumbers/>
     </w:pPr>
     <w:rPr>
-      <w:rFonts w:cs="Lucida Sans"/>
+      <w:rFonts w:cs="Arial Unicode MS"/>
     </w:rPr>
   </w:style>
   <w:style w:type="paragraph" w:styleId="user2">
@@ -7439,7 +7676,7 @@
       <w:spacing w:before="240" w:after="120"/>
     </w:pPr>
     <w:rPr>
-      <w:rFonts w:ascii="Liberation Sans" w:hAnsi="Liberation Sans" w:eastAsia="Microsoft YaHei" w:cs="Arial Unicode MS"/>
+      <w:rFonts w:ascii="Liberation Sans" w:hAnsi="Liberation Sans" w:eastAsia="Microsoft YaHei" w:cs="Lucida Sans"/>
       <w:sz w:val="28"/>
       <w:szCs w:val="28"/>
     </w:rPr>
@@ -7452,12 +7689,12 @@
       <w:suppressLineNumbers/>
     </w:pPr>
     <w:rPr>
-      <w:rFonts w:cs="Arial Unicode MS"/>
+      <w:rFonts w:cs="Lucida Sans"/>
     </w:rPr>
   </w:style>
   <w:style w:type="paragraph" w:styleId="IndexHeading">
     <w:name w:val="index heading"/>
-    <w:basedOn w:val="user2"/>
+    <w:basedOn w:val="Style14"/>
     <w:pPr/>
     <w:rPr/>
   </w:style>
@@ -7735,6 +7972,16 @@
     </w:pPr>
     <w:rPr/>
   </w:style>
+  <w:style w:type="paragraph" w:styleId="user4">
+    <w:name w:val="Вміст таблиці (user)"/>
+    <w:basedOn w:val="Normal"/>
+    <w:qFormat/>
+    <w:pPr>
+      <w:widowControl w:val="false"/>
+      <w:suppressLineNumbers/>
+    </w:pPr>
+    <w:rPr/>
+  </w:style>
   <w:style w:type="paragraph" w:styleId="Style16">
     <w:name w:val="Вміст таблиці"/>
     <w:basedOn w:val="Normal"/>
@@ -7745,19 +7992,9 @@
     </w:pPr>
     <w:rPr/>
   </w:style>
-  <w:style w:type="paragraph" w:styleId="user4">
-    <w:name w:val="Вміст таблиці (user)"/>
-    <w:basedOn w:val="Normal"/>
-    <w:qFormat/>
-    <w:pPr>
-      <w:widowControl w:val="false"/>
-      <w:suppressLineNumbers/>
-    </w:pPr>
-    <w:rPr/>
-  </w:style>
-  <w:style w:type="paragraph" w:styleId="user5">
-    <w:name w:val="Заголовок таблиці (user)"/>
-    <w:basedOn w:val="user4"/>
+  <w:style w:type="paragraph" w:styleId="Style17">
+    <w:name w:val="Заголовок таблиці"/>
+    <w:basedOn w:val="Style16"/>
     <w:qFormat/>
     <w:pPr>
       <w:suppressLineNumbers/>
@@ -7768,8 +8005,8 @@
       <w:bCs/>
     </w:rPr>
   </w:style>
-  <w:style w:type="numbering" w:styleId="user6" w:default="1">
-    <w:name w:val="Без маркерів (user)"/>
+  <w:style w:type="numbering" w:styleId="Style18" w:default="1">
+    <w:name w:val="Без маркерів"/>
     <w:uiPriority w:val="99"/>
     <w:semiHidden/>
     <w:unhideWhenUsed/>

</xml_diff>

<commit_message>
docs: SP1 going through the questions for the first chapter
</commit_message>
<xml_diff>
--- a/51SP Sertyficazija PZ/1/SP1_KNT-116m_Onyshchenko_15.docx
+++ b/51SP Sertyficazija PZ/1/SP1_KNT-116m_Onyshchenko_15.docx
@@ -786,106 +786,88 @@
       </w:pPr>
       <w:r>
         <w:rPr/>
-        <w:t xml:space="preserve">Створена медіа компанія займається новинами Запорізької області. Компанією керує директор, він займається системою управління якістю. У компанії є ІТ відділ (складається з двох осіб: один відповідальний за фронтенд та публікацію новин, другий за бекенд), який відповідальний за розробку та підтримку вебсайту компанії та публікації новин на сторінках у соціальних мережах: </w:t>
-      </w:r>
-      <w:r>
-        <w:rPr>
-          <w:lang w:val="en-US"/>
-        </w:rPr>
-        <w:t>Telegram, Instagram, Facebook.</w:t>
-      </w:r>
-      <w:r>
-        <w:rPr>
-          <w:lang w:val="uk-UA"/>
-        </w:rPr>
-        <w:t xml:space="preserve"> У соціальних мережах публікуються лише посилання на новинну статтю з сайту. Також у компанії є команда збору новин, три людини: один водій, один оператор, один репортер. У компанії є одна людина, відповідальна за приймання людей на роботу та бухгалтерію.</w:t>
-      </w:r>
-    </w:p>
-    <w:p>
-      <w:pPr>
-        <w:pStyle w:val="P1"/>
-        <w:rPr>
-          <w:lang w:val="uk-UA"/>
-        </w:rPr>
-      </w:pPr>
-      <w:r>
-        <w:rPr>
-          <w:lang w:val="uk-UA"/>
-        </w:rPr>
-        <w:t xml:space="preserve">Через невеликий масштаб компанії ІТ відділ використовує безкоштовне програмне забезпечення з відкритим кодом. Як редактор коду використовується </w:t>
-      </w:r>
-      <w:r>
-        <w:rPr>
-          <w:lang w:val="en-US"/>
-        </w:rPr>
-        <w:t xml:space="preserve">Visual Studio Code. </w:t>
-      </w:r>
-      <w:r>
-        <w:rPr>
-          <w:lang w:val="uk-UA"/>
-        </w:rPr>
-        <w:t xml:space="preserve">Як система менеджменту контенту використовується </w:t>
-      </w:r>
-      <w:r>
-        <w:rPr>
-          <w:lang w:val="en-US"/>
-        </w:rPr>
-        <w:t>Strapi.</w:t>
-      </w:r>
-    </w:p>
-    <w:p>
-      <w:pPr>
-        <w:pStyle w:val="P1"/>
-        <w:rPr>
-          <w:lang w:val="uk-UA"/>
-        </w:rPr>
-      </w:pPr>
-      <w:r>
-        <w:rPr>
-          <w:lang w:val="uk-UA"/>
-        </w:rPr>
-        <w:t>Замовником компанії є читач новин. Спосіб заробітку є публікація реклами на сайті. За це відповідальний робітник фронтенду.</w:t>
-      </w:r>
-    </w:p>
-    <w:p>
-      <w:pPr>
-        <w:pStyle w:val="P1"/>
-        <w:rPr>
-          <w:lang w:val="uk-UA"/>
-        </w:rPr>
-      </w:pPr>
-      <w:r>
-        <w:rPr>
-          <w:lang w:val="uk-UA"/>
-        </w:rPr>
-        <w:t>Ресурси компанії наведені на таблиці 1.1.</w:t>
-      </w:r>
-    </w:p>
-    <w:p>
-      <w:pPr>
-        <w:pStyle w:val="P1"/>
-        <w:rPr>
-          <w:lang w:val="uk-UA"/>
-        </w:rPr>
-      </w:pPr>
-      <w:r>
-        <w:rPr>
-          <w:lang w:val="uk-UA"/>
-        </w:rPr>
-      </w:r>
-    </w:p>
-    <w:p>
-      <w:pPr>
-        <w:pStyle w:val="P1"/>
-        <w:rPr>
-          <w:lang w:val="uk-UA"/>
-        </w:rPr>
-      </w:pPr>
-      <w:r>
-        <w:rPr>
-          <w:lang w:val="uk-UA"/>
-        </w:rPr>
-        <w:t>Таблиця 1.1 — Ресурси компанії</w:t>
+        <w:t>Компанія займається виготовленням новинних статей про події Запорізької області для свого веб-сайту.</w:t>
+      </w:r>
+    </w:p>
+    <w:p>
+      <w:pPr>
+        <w:pStyle w:val="P1"/>
+        <w:rPr/>
+      </w:pPr>
+      <w:r>
+        <w:rPr/>
+        <w:t xml:space="preserve">Зацікавленими сторонами компанії є читачі </w:t>
+      </w:r>
+      <w:r>
+        <w:rPr/>
+        <w:t>новинних статей</w:t>
+      </w:r>
+      <w:r>
+        <w:rPr/>
+        <w:t xml:space="preserve">, власник компанії, її працівники </w:t>
+      </w:r>
+      <w:r>
+        <w:rPr/>
+        <w:t xml:space="preserve">та </w:t>
+      </w:r>
+      <w:r>
+        <w:rPr/>
+        <w:t>рекламодавці.</w:t>
+      </w:r>
+    </w:p>
+    <w:p>
+      <w:pPr>
+        <w:pStyle w:val="P1"/>
+        <w:rPr/>
+      </w:pPr>
+      <w:r>
+        <w:rPr/>
+        <w:t>Компанію заробляє шляхом публікації рекламних банерів на сайті та рекламних постів на сторінках у соціальних мережах.</w:t>
+      </w:r>
+    </w:p>
+    <w:p>
+      <w:pPr>
+        <w:pStyle w:val="P1"/>
+        <w:rPr/>
+      </w:pPr>
+      <w:r>
+        <w:rPr/>
+        <w:t>Поточні ресурси компанії наведені на таблиці 1.1.</w:t>
+      </w:r>
+    </w:p>
+    <w:p>
+      <w:pPr>
+        <w:pStyle w:val="P1"/>
+        <w:rPr/>
+      </w:pPr>
+      <w:r>
+        <w:rPr/>
+      </w:r>
+    </w:p>
+    <w:p>
+      <w:pPr>
+        <w:pStyle w:val="P1"/>
+        <w:rPr>
+          <w:lang w:val="uk-UA"/>
+        </w:rPr>
+      </w:pPr>
+      <w:r>
+        <w:rPr>
+          <w:lang w:val="uk-UA"/>
+        </w:rPr>
+        <w:t xml:space="preserve">Таблиця 1.1 — </w:t>
+      </w:r>
+      <w:r>
+        <w:rPr>
+          <w:lang w:val="uk-UA"/>
+        </w:rPr>
+        <w:t>Поточні р</w:t>
+      </w:r>
+      <w:r>
+        <w:rPr>
+          <w:lang w:val="uk-UA"/>
+        </w:rPr>
+        <w:t>есурси компанії</w:t>
       </w:r>
     </w:p>
     <w:tbl>
@@ -1652,6 +1634,281 @@
         </w:tc>
       </w:tr>
     </w:tbl>
+    <w:p>
+      <w:pPr>
+        <w:pStyle w:val="P1"/>
+        <w:rPr>
+          <w:lang w:val="uk-UA"/>
+        </w:rPr>
+      </w:pPr>
+      <w:r>
+        <w:rPr/>
+      </w:r>
+    </w:p>
+    <w:p>
+      <w:pPr>
+        <w:pStyle w:val="p11"/>
+        <w:rPr/>
+      </w:pPr>
+      <w:r>
+        <w:rPr/>
+        <w:t>Компанія потребує наступне програмне забезпечення:</w:t>
+      </w:r>
+    </w:p>
+    <w:p>
+      <w:pPr>
+        <w:pStyle w:val="p11"/>
+        <w:widowControl/>
+        <w:numPr>
+          <w:ilvl w:val="0"/>
+          <w:numId w:val="9"/>
+        </w:numPr>
+        <w:suppressAutoHyphens w:val="true"/>
+        <w:bidi w:val="0"/>
+        <w:spacing w:lineRule="auto" w:line="360" w:before="0" w:after="0"/>
+        <w:ind w:firstLine="850" w:left="0" w:right="0"/>
+        <w:jc w:val="left"/>
+        <w:rPr>
+          <w:lang w:val="en-US"/>
+        </w:rPr>
+      </w:pPr>
+      <w:r>
+        <w:rPr>
+          <w:lang w:val="en-US"/>
+        </w:rPr>
+        <w:t xml:space="preserve">Strapi CMS – </w:t>
+      </w:r>
+      <w:r>
+        <w:rPr>
+          <w:lang w:val="uk-UA"/>
+        </w:rPr>
+        <w:t>керування новинними матеріалами;</w:t>
+      </w:r>
+    </w:p>
+    <w:p>
+      <w:pPr>
+        <w:pStyle w:val="p11"/>
+        <w:widowControl/>
+        <w:numPr>
+          <w:ilvl w:val="0"/>
+          <w:numId w:val="9"/>
+        </w:numPr>
+        <w:suppressAutoHyphens w:val="true"/>
+        <w:bidi w:val="0"/>
+        <w:spacing w:lineRule="auto" w:line="360" w:before="0" w:after="0"/>
+        <w:ind w:firstLine="850" w:left="0" w:right="0"/>
+        <w:jc w:val="left"/>
+        <w:rPr>
+          <w:lang w:val="en-US"/>
+        </w:rPr>
+      </w:pPr>
+      <w:r>
+        <w:rPr>
+          <w:lang w:val="en-US"/>
+        </w:rPr>
+        <w:t xml:space="preserve">Visual Studio Code – </w:t>
+      </w:r>
+      <w:r>
+        <w:rPr>
+          <w:lang w:val="uk-UA"/>
+        </w:rPr>
+        <w:t>редагування новинних матеріалів;</w:t>
+      </w:r>
+    </w:p>
+    <w:p>
+      <w:pPr>
+        <w:pStyle w:val="p11"/>
+        <w:widowControl/>
+        <w:numPr>
+          <w:ilvl w:val="0"/>
+          <w:numId w:val="9"/>
+        </w:numPr>
+        <w:suppressAutoHyphens w:val="true"/>
+        <w:bidi w:val="0"/>
+        <w:spacing w:lineRule="auto" w:line="360" w:before="0" w:after="0"/>
+        <w:ind w:firstLine="850" w:left="0" w:right="0"/>
+        <w:jc w:val="left"/>
+        <w:rPr>
+          <w:lang w:val="en-US"/>
+        </w:rPr>
+      </w:pPr>
+      <w:r>
+        <w:rPr>
+          <w:lang w:val="en-US"/>
+        </w:rPr>
+        <w:t xml:space="preserve">Telegram Bot API </w:t>
+      </w:r>
+      <w:r>
+        <w:rPr>
+          <w:lang w:val="uk-UA"/>
+        </w:rPr>
+        <w:t xml:space="preserve">та власний скрипт — автоматичне поширення посилань на новинну статтю у каналі </w:t>
+      </w:r>
+      <w:r>
+        <w:rPr>
+          <w:lang w:val="en-US"/>
+        </w:rPr>
+        <w:t>Telegram;</w:t>
+      </w:r>
+    </w:p>
+    <w:p>
+      <w:pPr>
+        <w:pStyle w:val="p11"/>
+        <w:widowControl/>
+        <w:numPr>
+          <w:ilvl w:val="0"/>
+          <w:numId w:val="9"/>
+        </w:numPr>
+        <w:suppressAutoHyphens w:val="true"/>
+        <w:bidi w:val="0"/>
+        <w:spacing w:lineRule="auto" w:line="360" w:before="0" w:after="0"/>
+        <w:ind w:firstLine="850" w:left="0" w:right="0"/>
+        <w:jc w:val="left"/>
+        <w:rPr>
+          <w:lang w:val="uk-UA"/>
+        </w:rPr>
+      </w:pPr>
+      <w:r>
+        <w:rPr>
+          <w:lang w:val="uk-UA"/>
+        </w:rPr>
+        <w:t>Система перевірки на плагіат Copyscape — перевірка статей на оригінальність;</w:t>
+      </w:r>
+    </w:p>
+    <w:p>
+      <w:pPr>
+        <w:pStyle w:val="p11"/>
+        <w:widowControl/>
+        <w:numPr>
+          <w:ilvl w:val="0"/>
+          <w:numId w:val="9"/>
+        </w:numPr>
+        <w:suppressAutoHyphens w:val="true"/>
+        <w:bidi w:val="0"/>
+        <w:spacing w:lineRule="auto" w:line="360" w:before="0" w:after="0"/>
+        <w:ind w:firstLine="850" w:left="0" w:right="0"/>
+        <w:jc w:val="left"/>
+        <w:rPr>
+          <w:lang w:val="en-US"/>
+        </w:rPr>
+      </w:pPr>
+      <w:r>
+        <w:rPr>
+          <w:lang w:val="en-US"/>
+        </w:rPr>
+        <w:t xml:space="preserve">Google Analytics – </w:t>
+      </w:r>
+      <w:r>
+        <w:rPr>
+          <w:lang w:val="uk-UA"/>
+        </w:rPr>
+        <w:t>аналіз відвідуваності веб-сайту.</w:t>
+      </w:r>
+    </w:p>
+    <w:p>
+      <w:pPr>
+        <w:pStyle w:val="P1"/>
+        <w:rPr>
+          <w:lang w:val="uk-UA"/>
+        </w:rPr>
+      </w:pPr>
+      <w:r>
+        <w:rPr/>
+      </w:r>
+    </w:p>
+    <w:p>
+      <w:pPr>
+        <w:pStyle w:val="P1"/>
+        <w:rPr>
+          <w:lang w:val="uk-UA"/>
+        </w:rPr>
+      </w:pPr>
+      <w:r>
+        <w:rPr/>
+      </w:r>
+    </w:p>
+    <w:p>
+      <w:pPr>
+        <w:pStyle w:val="P1"/>
+        <w:rPr/>
+      </w:pPr>
+      <w:r>
+        <w:rPr/>
+        <w:t xml:space="preserve">Створена медіа компанія займається новинами Запорізької області. Компанією керує директор, він займається системою управління якістю. У компанії є ІТ відділ (складається з двох осіб: один відповідальний за фронтенд та публікацію новин, другий за бекенд), який відповідальний за розробку та підтримку вебсайту компанії та публікації новин на сторінках у соціальних мережах: </w:t>
+      </w:r>
+      <w:r>
+        <w:rPr>
+          <w:lang w:val="en-US"/>
+        </w:rPr>
+        <w:t>Telegram, Instagram, Facebook.</w:t>
+      </w:r>
+      <w:r>
+        <w:rPr>
+          <w:lang w:val="uk-UA"/>
+        </w:rPr>
+        <w:t xml:space="preserve"> У соціальних мережах публікуються лише посилання на новинну статтю з сайту. Також у компанії є команда збору новин, три людини: один водій, один оператор, один репортер. У компанії є одна людина, відповідальна за приймання людей на роботу та бухгалтерію.</w:t>
+      </w:r>
+    </w:p>
+    <w:p>
+      <w:pPr>
+        <w:pStyle w:val="P1"/>
+        <w:rPr>
+          <w:lang w:val="uk-UA"/>
+        </w:rPr>
+      </w:pPr>
+      <w:r>
+        <w:rPr>
+          <w:lang w:val="uk-UA"/>
+        </w:rPr>
+        <w:t xml:space="preserve">Через невеликий масштаб компанії ІТ відділ використовує безкоштовне програмне забезпечення з відкритим кодом. Як редактор коду використовується </w:t>
+      </w:r>
+      <w:r>
+        <w:rPr>
+          <w:lang w:val="en-US"/>
+        </w:rPr>
+        <w:t xml:space="preserve">Visual Studio Code. </w:t>
+      </w:r>
+      <w:r>
+        <w:rPr>
+          <w:lang w:val="uk-UA"/>
+        </w:rPr>
+        <w:t xml:space="preserve">Як система менеджменту контенту використовується </w:t>
+      </w:r>
+      <w:r>
+        <w:rPr>
+          <w:lang w:val="en-US"/>
+        </w:rPr>
+        <w:t>Strapi.</w:t>
+      </w:r>
+    </w:p>
+    <w:p>
+      <w:pPr>
+        <w:pStyle w:val="P1"/>
+        <w:rPr>
+          <w:lang w:val="uk-UA"/>
+        </w:rPr>
+      </w:pPr>
+      <w:r>
+        <w:rPr>
+          <w:lang w:val="uk-UA"/>
+        </w:rPr>
+        <w:t>Замовником компанії є читач новин. Спосіб заробітку є публікація реклами на сайті. За це відповідальний робітник фронтенду.</w:t>
+      </w:r>
+    </w:p>
+    <w:p>
+      <w:pPr>
+        <w:pStyle w:val="P1"/>
+        <w:rPr>
+          <w:lang w:val="uk-UA"/>
+        </w:rPr>
+      </w:pPr>
+      <w:r>
+        <w:rPr>
+          <w:lang w:val="uk-UA"/>
+        </w:rPr>
+        <w:t>Ресурси компанії наведені на таблиці 1.1.</w:t>
+      </w:r>
+    </w:p>
     <w:p>
       <w:pPr>
         <w:pStyle w:val="P1"/>
@@ -3789,7 +4046,7 @@
         <w:rPr>
           <w:lang w:val="uk-UA"/>
         </w:rPr>
-        <w:t>організація — група людей, які об'єдналися для спільної діяльності та досягнення певної мети.</w:t>
+        <w:t>організація — група людей, які об’єдналися для спільної діяльності та досягнення певної мети.</w:t>
       </w:r>
     </w:p>
     <w:p>
@@ -3805,13 +4062,87 @@
         <w:spacing w:lineRule="auto" w:line="360" w:before="0" w:after="0"/>
         <w:ind w:firstLine="850" w:left="0" w:right="0"/>
         <w:jc w:val="both"/>
-        <w:rPr/>
+        <w:rPr>
+          <w:lang w:val="uk-UA"/>
+        </w:rPr>
       </w:pPr>
       <w:r>
         <w:rPr>
           <w:lang w:val="uk-UA"/>
         </w:rPr>
         <w:t>CMS (система керування контентом) — програмне забезпечення для керування вмістом веб-сайту.</w:t>
+      </w:r>
+    </w:p>
+    <w:p>
+      <w:pPr>
+        <w:pStyle w:val="P1"/>
+        <w:widowControl/>
+        <w:numPr>
+          <w:ilvl w:val="0"/>
+          <w:numId w:val="8"/>
+        </w:numPr>
+        <w:suppressAutoHyphens w:val="true"/>
+        <w:bidi w:val="0"/>
+        <w:spacing w:lineRule="auto" w:line="360" w:before="0" w:after="0"/>
+        <w:ind w:firstLine="850" w:left="0" w:right="0"/>
+        <w:jc w:val="both"/>
+        <w:rPr>
+          <w:lang w:val="uk-UA"/>
+        </w:rPr>
+      </w:pPr>
+      <w:r>
+        <w:rPr>
+          <w:lang w:val="uk-UA"/>
+        </w:rPr>
+        <w:t>рекламодавець — особа, яка оплачує розміщення реклами на веб-сайті з метою просування своєї діяльності.</w:t>
+      </w:r>
+    </w:p>
+    <w:p>
+      <w:pPr>
+        <w:pStyle w:val="P1"/>
+        <w:widowControl/>
+        <w:numPr>
+          <w:ilvl w:val="0"/>
+          <w:numId w:val="8"/>
+        </w:numPr>
+        <w:suppressAutoHyphens w:val="true"/>
+        <w:bidi w:val="0"/>
+        <w:spacing w:lineRule="auto" w:line="360" w:before="0" w:after="0"/>
+        <w:ind w:firstLine="850" w:left="0" w:right="0"/>
+        <w:jc w:val="both"/>
+        <w:rPr>
+          <w:lang w:val="uk-UA"/>
+        </w:rPr>
+      </w:pPr>
+      <w:r>
+        <w:rPr>
+          <w:lang w:val="uk-UA"/>
+        </w:rPr>
+        <w:t>Copyscape — програмне забезпечення для перевірки оригінальності текстів шляхом пошуку збігів з матеріалами, опублікованими в інтернеті.</w:t>
+      </w:r>
+    </w:p>
+    <w:p>
+      <w:pPr>
+        <w:pStyle w:val="P1"/>
+        <w:widowControl/>
+        <w:numPr>
+          <w:ilvl w:val="0"/>
+          <w:numId w:val="8"/>
+        </w:numPr>
+        <w:suppressAutoHyphens w:val="true"/>
+        <w:bidi w:val="0"/>
+        <w:spacing w:lineRule="auto" w:line="360" w:before="0" w:after="0"/>
+        <w:ind w:firstLine="850" w:left="0" w:right="0"/>
+        <w:jc w:val="both"/>
+        <w:rPr>
+          <w:lang w:val="uk-UA"/>
+        </w:rPr>
+      </w:pPr>
+      <w:r>
+        <w:rPr>
+          <w:lang w:val="uk-UA"/>
+        </w:rPr>
+        <w:t>новинний матеріал — текст або публікація, що висвітлює певну подію.</w:t>
       </w:r>
     </w:p>
     <w:p>
@@ -6517,140 +6848,277 @@
     <w:lvl w:ilvl="0">
       <w:start w:val="1"/>
       <w:numFmt w:val="bullet"/>
+      <w:lvlText w:val="-"/>
+      <w:lvlJc w:val="left"/>
+      <w:pPr>
+        <w:tabs>
+          <w:tab w:val="num" w:pos="720"/>
+        </w:tabs>
+        <w:ind w:left="720" w:hanging="360"/>
+      </w:pPr>
+      <w:rPr>
+        <w:rFonts w:ascii="OpenSymbol" w:hAnsi="OpenSymbol" w:cs="OpenSymbol" w:hint="default"/>
+      </w:rPr>
+    </w:lvl>
+    <w:lvl w:ilvl="1">
+      <w:start w:val="1"/>
+      <w:numFmt w:val="bullet"/>
+      <w:lvlText w:val="◦"/>
+      <w:lvlJc w:val="left"/>
+      <w:pPr>
+        <w:tabs>
+          <w:tab w:val="num" w:pos="1080"/>
+        </w:tabs>
+        <w:ind w:left="1080" w:hanging="360"/>
+      </w:pPr>
+      <w:rPr>
+        <w:rFonts w:ascii="OpenSymbol" w:hAnsi="OpenSymbol" w:cs="OpenSymbol" w:hint="default"/>
+      </w:rPr>
+    </w:lvl>
+    <w:lvl w:ilvl="2">
+      <w:start w:val="1"/>
+      <w:numFmt w:val="bullet"/>
+      <w:lvlText w:val="▪"/>
+      <w:lvlJc w:val="left"/>
+      <w:pPr>
+        <w:tabs>
+          <w:tab w:val="num" w:pos="1440"/>
+        </w:tabs>
+        <w:ind w:left="1440" w:hanging="360"/>
+      </w:pPr>
+      <w:rPr>
+        <w:rFonts w:ascii="OpenSymbol" w:hAnsi="OpenSymbol" w:cs="OpenSymbol" w:hint="default"/>
+      </w:rPr>
+    </w:lvl>
+    <w:lvl w:ilvl="3">
+      <w:start w:val="1"/>
+      <w:numFmt w:val="bullet"/>
       <w:lvlText w:val=""/>
       <w:lvlJc w:val="left"/>
       <w:pPr>
         <w:tabs>
-          <w:tab w:val="num" w:pos="720"/>
-        </w:tabs>
-        <w:ind w:left="720" w:hanging="360"/>
+          <w:tab w:val="num" w:pos="1800"/>
+        </w:tabs>
+        <w:ind w:left="1800" w:hanging="360"/>
       </w:pPr>
       <w:rPr>
         <w:rFonts w:ascii="Symbol" w:hAnsi="Symbol" w:cs="Symbol" w:hint="default"/>
       </w:rPr>
     </w:lvl>
-    <w:lvl w:ilvl="1">
+    <w:lvl w:ilvl="4">
       <w:start w:val="1"/>
       <w:numFmt w:val="bullet"/>
       <w:lvlText w:val="◦"/>
       <w:lvlJc w:val="left"/>
       <w:pPr>
         <w:tabs>
-          <w:tab w:val="num" w:pos="1080"/>
-        </w:tabs>
-        <w:ind w:left="1080" w:hanging="360"/>
+          <w:tab w:val="num" w:pos="2160"/>
+        </w:tabs>
+        <w:ind w:left="2160" w:hanging="360"/>
       </w:pPr>
       <w:rPr>
         <w:rFonts w:ascii="OpenSymbol" w:hAnsi="OpenSymbol" w:cs="OpenSymbol" w:hint="default"/>
       </w:rPr>
     </w:lvl>
-    <w:lvl w:ilvl="2">
+    <w:lvl w:ilvl="5">
       <w:start w:val="1"/>
       <w:numFmt w:val="bullet"/>
       <w:lvlText w:val="▪"/>
       <w:lvlJc w:val="left"/>
       <w:pPr>
         <w:tabs>
-          <w:tab w:val="num" w:pos="1440"/>
-        </w:tabs>
-        <w:ind w:left="1440" w:hanging="360"/>
+          <w:tab w:val="num" w:pos="2520"/>
+        </w:tabs>
+        <w:ind w:left="2520" w:hanging="360"/>
       </w:pPr>
       <w:rPr>
         <w:rFonts w:ascii="OpenSymbol" w:hAnsi="OpenSymbol" w:cs="OpenSymbol" w:hint="default"/>
       </w:rPr>
     </w:lvl>
-    <w:lvl w:ilvl="3">
+    <w:lvl w:ilvl="6">
       <w:start w:val="1"/>
       <w:numFmt w:val="bullet"/>
       <w:lvlText w:val=""/>
       <w:lvlJc w:val="left"/>
       <w:pPr>
         <w:tabs>
-          <w:tab w:val="num" w:pos="1800"/>
-        </w:tabs>
-        <w:ind w:left="1800" w:hanging="360"/>
+          <w:tab w:val="num" w:pos="2880"/>
+        </w:tabs>
+        <w:ind w:left="2880" w:hanging="360"/>
       </w:pPr>
       <w:rPr>
         <w:rFonts w:ascii="Symbol" w:hAnsi="Symbol" w:cs="Symbol" w:hint="default"/>
       </w:rPr>
     </w:lvl>
-    <w:lvl w:ilvl="4">
+    <w:lvl w:ilvl="7">
       <w:start w:val="1"/>
       <w:numFmt w:val="bullet"/>
       <w:lvlText w:val="◦"/>
       <w:lvlJc w:val="left"/>
       <w:pPr>
         <w:tabs>
-          <w:tab w:val="num" w:pos="2160"/>
-        </w:tabs>
-        <w:ind w:left="2160" w:hanging="360"/>
+          <w:tab w:val="num" w:pos="3240"/>
+        </w:tabs>
+        <w:ind w:left="3240" w:hanging="360"/>
       </w:pPr>
       <w:rPr>
         <w:rFonts w:ascii="OpenSymbol" w:hAnsi="OpenSymbol" w:cs="OpenSymbol" w:hint="default"/>
       </w:rPr>
     </w:lvl>
-    <w:lvl w:ilvl="5">
+    <w:lvl w:ilvl="8">
       <w:start w:val="1"/>
       <w:numFmt w:val="bullet"/>
       <w:lvlText w:val="▪"/>
       <w:lvlJc w:val="left"/>
       <w:pPr>
         <w:tabs>
-          <w:tab w:val="num" w:pos="2520"/>
-        </w:tabs>
-        <w:ind w:left="2520" w:hanging="360"/>
+          <w:tab w:val="num" w:pos="3600"/>
+        </w:tabs>
+        <w:ind w:left="3600" w:hanging="360"/>
       </w:pPr>
       <w:rPr>
         <w:rFonts w:ascii="OpenSymbol" w:hAnsi="OpenSymbol" w:cs="OpenSymbol" w:hint="default"/>
       </w:rPr>
     </w:lvl>
-    <w:lvl w:ilvl="6">
+  </w:abstractNum>
+  <w:abstractNum w:abstractNumId="9">
+    <w:lvl w:ilvl="0">
+      <w:start w:val="1"/>
+      <w:numFmt w:val="bullet"/>
+      <w:lvlText w:val="-"/>
+      <w:lvlJc w:val="left"/>
+      <w:pPr>
+        <w:tabs>
+          <w:tab w:val="num" w:pos="720"/>
+        </w:tabs>
+        <w:ind w:left="720" w:hanging="360"/>
+      </w:pPr>
+      <w:rPr>
+        <w:rFonts w:ascii="OpenSymbol" w:hAnsi="OpenSymbol" w:cs="OpenSymbol" w:hint="default"/>
+      </w:rPr>
+    </w:lvl>
+    <w:lvl w:ilvl="1">
+      <w:start w:val="1"/>
+      <w:numFmt w:val="bullet"/>
+      <w:lvlText w:val="◦"/>
+      <w:lvlJc w:val="left"/>
+      <w:pPr>
+        <w:tabs>
+          <w:tab w:val="num" w:pos="1080"/>
+        </w:tabs>
+        <w:ind w:left="1080" w:hanging="360"/>
+      </w:pPr>
+      <w:rPr>
+        <w:rFonts w:ascii="OpenSymbol" w:hAnsi="OpenSymbol" w:cs="OpenSymbol" w:hint="default"/>
+      </w:rPr>
+    </w:lvl>
+    <w:lvl w:ilvl="2">
+      <w:start w:val="1"/>
+      <w:numFmt w:val="bullet"/>
+      <w:lvlText w:val="▪"/>
+      <w:lvlJc w:val="left"/>
+      <w:pPr>
+        <w:tabs>
+          <w:tab w:val="num" w:pos="1440"/>
+        </w:tabs>
+        <w:ind w:left="1440" w:hanging="360"/>
+      </w:pPr>
+      <w:rPr>
+        <w:rFonts w:ascii="OpenSymbol" w:hAnsi="OpenSymbol" w:cs="OpenSymbol" w:hint="default"/>
+      </w:rPr>
+    </w:lvl>
+    <w:lvl w:ilvl="3">
       <w:start w:val="1"/>
       <w:numFmt w:val="bullet"/>
       <w:lvlText w:val=""/>
       <w:lvlJc w:val="left"/>
       <w:pPr>
         <w:tabs>
-          <w:tab w:val="num" w:pos="2880"/>
-        </w:tabs>
-        <w:ind w:left="2880" w:hanging="360"/>
+          <w:tab w:val="num" w:pos="1800"/>
+        </w:tabs>
+        <w:ind w:left="1800" w:hanging="360"/>
       </w:pPr>
       <w:rPr>
         <w:rFonts w:ascii="Symbol" w:hAnsi="Symbol" w:cs="Symbol" w:hint="default"/>
       </w:rPr>
     </w:lvl>
-    <w:lvl w:ilvl="7">
+    <w:lvl w:ilvl="4">
       <w:start w:val="1"/>
       <w:numFmt w:val="bullet"/>
       <w:lvlText w:val="◦"/>
       <w:lvlJc w:val="left"/>
       <w:pPr>
         <w:tabs>
-          <w:tab w:val="num" w:pos="3240"/>
-        </w:tabs>
-        <w:ind w:left="3240" w:hanging="360"/>
+          <w:tab w:val="num" w:pos="2160"/>
+        </w:tabs>
+        <w:ind w:left="2160" w:hanging="360"/>
       </w:pPr>
       <w:rPr>
         <w:rFonts w:ascii="OpenSymbol" w:hAnsi="OpenSymbol" w:cs="OpenSymbol" w:hint="default"/>
       </w:rPr>
     </w:lvl>
-    <w:lvl w:ilvl="8">
+    <w:lvl w:ilvl="5">
       <w:start w:val="1"/>
       <w:numFmt w:val="bullet"/>
       <w:lvlText w:val="▪"/>
       <w:lvlJc w:val="left"/>
       <w:pPr>
         <w:tabs>
-          <w:tab w:val="num" w:pos="3600"/>
-        </w:tabs>
-        <w:ind w:left="3600" w:hanging="360"/>
+          <w:tab w:val="num" w:pos="2520"/>
+        </w:tabs>
+        <w:ind w:left="2520" w:hanging="360"/>
       </w:pPr>
       <w:rPr>
         <w:rFonts w:ascii="OpenSymbol" w:hAnsi="OpenSymbol" w:cs="OpenSymbol" w:hint="default"/>
       </w:rPr>
     </w:lvl>
+    <w:lvl w:ilvl="6">
+      <w:start w:val="1"/>
+      <w:numFmt w:val="bullet"/>
+      <w:lvlText w:val=""/>
+      <w:lvlJc w:val="left"/>
+      <w:pPr>
+        <w:tabs>
+          <w:tab w:val="num" w:pos="2880"/>
+        </w:tabs>
+        <w:ind w:left="2880" w:hanging="360"/>
+      </w:pPr>
+      <w:rPr>
+        <w:rFonts w:ascii="Symbol" w:hAnsi="Symbol" w:cs="Symbol" w:hint="default"/>
+      </w:rPr>
+    </w:lvl>
+    <w:lvl w:ilvl="7">
+      <w:start w:val="1"/>
+      <w:numFmt w:val="bullet"/>
+      <w:lvlText w:val="◦"/>
+      <w:lvlJc w:val="left"/>
+      <w:pPr>
+        <w:tabs>
+          <w:tab w:val="num" w:pos="3240"/>
+        </w:tabs>
+        <w:ind w:left="3240" w:hanging="360"/>
+      </w:pPr>
+      <w:rPr>
+        <w:rFonts w:ascii="OpenSymbol" w:hAnsi="OpenSymbol" w:cs="OpenSymbol" w:hint="default"/>
+      </w:rPr>
+    </w:lvl>
+    <w:lvl w:ilvl="8">
+      <w:start w:val="1"/>
+      <w:numFmt w:val="bullet"/>
+      <w:lvlText w:val="▪"/>
+      <w:lvlJc w:val="left"/>
+      <w:pPr>
+        <w:tabs>
+          <w:tab w:val="num" w:pos="3600"/>
+        </w:tabs>
+        <w:ind w:left="3600" w:hanging="360"/>
+      </w:pPr>
+      <w:rPr>
+        <w:rFonts w:ascii="OpenSymbol" w:hAnsi="OpenSymbol" w:cs="OpenSymbol" w:hint="default"/>
+      </w:rPr>
+    </w:lvl>
   </w:abstractNum>
-  <w:abstractNum w:abstractNumId="9">
+  <w:abstractNum w:abstractNumId="10">
     <w:lvl w:ilvl="0">
       <w:start w:val="1"/>
       <w:numFmt w:val="none"/>
@@ -6795,6 +7263,9 @@
   </w:num>
   <w:num w:numId="9">
     <w:abstractNumId w:val="9"/>
+  </w:num>
+  <w:num w:numId="10">
+    <w:abstractNumId w:val="10"/>
   </w:num>
 </w:numbering>
 </file>
@@ -8005,7 +8476,29 @@
       <w:bCs/>
     </w:rPr>
   </w:style>
-  <w:style w:type="numbering" w:styleId="Style18" w:default="1">
+  <w:style w:type="paragraph" w:styleId="Style18">
+    <w:name w:val="Верхній і нижній колонтитули"/>
+    <w:basedOn w:val="Normal"/>
+    <w:qFormat/>
+    <w:pPr>
+      <w:suppressLineNumbers/>
+      <w:tabs>
+        <w:tab w:val="clear" w:pos="851"/>
+        <w:tab w:val="center" w:pos="4513" w:leader="none"/>
+        <w:tab w:val="right" w:pos="9026" w:leader="none"/>
+      </w:tabs>
+    </w:pPr>
+    <w:rPr/>
+  </w:style>
+  <w:style w:type="paragraph" w:styleId="Header">
+    <w:name w:val="header"/>
+    <w:basedOn w:val="Style18"/>
+    <w:pPr>
+      <w:suppressLineNumbers/>
+    </w:pPr>
+    <w:rPr/>
+  </w:style>
+  <w:style w:type="numbering" w:styleId="Style19" w:default="1">
     <w:name w:val="Без маркерів"/>
     <w:uiPriority w:val="99"/>
     <w:semiHidden/>

</xml_diff>

<commit_message>
feat: SP1 chapter 1 done
</commit_message>
<xml_diff>
--- a/51SP Sertyficazija PZ/1/SP1_KNT-116m_Onyshchenko_15.docx
+++ b/51SP Sertyficazija PZ/1/SP1_KNT-116m_Onyshchenko_15.docx
@@ -822,7 +822,23 @@
       </w:pPr>
       <w:r>
         <w:rPr/>
-        <w:t>Компанію заробляє шляхом публікації рекламних банерів на сайті та рекламних постів на сторінках у соціальних мережах.</w:t>
+        <w:t xml:space="preserve">Компанія заробляє шляхом публікації рекламних банерів на сайті та рекламних постів у своєму </w:t>
+      </w:r>
+      <w:r>
+        <w:rPr>
+          <w:lang w:val="en-US"/>
+        </w:rPr>
+        <w:t xml:space="preserve">Telegram </w:t>
+      </w:r>
+      <w:r>
+        <w:rPr>
+          <w:lang w:val="uk-UA"/>
+        </w:rPr>
+        <w:t>каналі</w:t>
+      </w:r>
+      <w:r>
+        <w:rPr/>
+        <w:t>.</w:t>
       </w:r>
     </w:p>
     <w:p>
@@ -1699,20 +1715,14 @@
         <w:ind w:firstLine="850" w:left="0" w:right="0"/>
         <w:jc w:val="left"/>
         <w:rPr>
-          <w:lang w:val="en-US"/>
-        </w:rPr>
-      </w:pPr>
-      <w:r>
-        <w:rPr>
-          <w:lang w:val="en-US"/>
-        </w:rPr>
-        <w:t xml:space="preserve">Visual Studio Code – </w:t>
-      </w:r>
-      <w:r>
-        <w:rPr>
-          <w:lang w:val="uk-UA"/>
-        </w:rPr>
-        <w:t>редагування новинних матеріалів;</w:t>
+          <w:lang w:val="uk-UA"/>
+        </w:rPr>
+      </w:pPr>
+      <w:r>
+        <w:rPr>
+          <w:lang w:val="uk-UA"/>
+        </w:rPr>
+        <w:t>Веб-застосунок компанії — представлення новинних статей читачам;</w:t>
       </w:r>
     </w:p>
     <w:p>
@@ -1742,13 +1752,25 @@
         <w:rPr>
           <w:lang w:val="uk-UA"/>
         </w:rPr>
-        <w:t xml:space="preserve">та власний скрипт — автоматичне поширення посилань на новинну статтю у каналі </w:t>
+        <w:t xml:space="preserve">та власний скрипт — автоматичне поширення посилань на новинну статтю у </w:t>
       </w:r>
       <w:r>
         <w:rPr>
           <w:lang w:val="en-US"/>
         </w:rPr>
-        <w:t>Telegram;</w:t>
+        <w:t xml:space="preserve">Telegram </w:t>
+      </w:r>
+      <w:r>
+        <w:rPr>
+          <w:lang w:val="uk-UA"/>
+        </w:rPr>
+        <w:t>каналі</w:t>
+      </w:r>
+      <w:r>
+        <w:rPr>
+          <w:lang w:val="en-US"/>
+        </w:rPr>
+        <w:t>;</w:t>
       </w:r>
     </w:p>
     <w:p>
@@ -1814,164 +1836,179 @@
       </w:pPr>
       <w:r>
         <w:rPr/>
-      </w:r>
-    </w:p>
-    <w:p>
-      <w:pPr>
-        <w:pStyle w:val="P1"/>
-        <w:rPr>
-          <w:lang w:val="uk-UA"/>
-        </w:rPr>
-      </w:pPr>
-      <w:r>
-        <w:rPr/>
-      </w:r>
-    </w:p>
-    <w:p>
-      <w:pPr>
-        <w:pStyle w:val="P1"/>
-        <w:rPr/>
-      </w:pPr>
-      <w:r>
-        <w:rPr/>
-        <w:t xml:space="preserve">Створена медіа компанія займається новинами Запорізької області. Компанією керує директор, він займається системою управління якістю. У компанії є ІТ відділ (складається з двох осіб: один відповідальний за фронтенд та публікацію новин, другий за бекенд), який відповідальний за розробку та підтримку вебсайту компанії та публікації новин на сторінках у соціальних мережах: </w:t>
-      </w:r>
-      <w:r>
-        <w:rPr>
-          <w:lang w:val="en-US"/>
-        </w:rPr>
-        <w:t>Telegram, Instagram, Facebook.</w:t>
-      </w:r>
-      <w:r>
-        <w:rPr>
-          <w:lang w:val="uk-UA"/>
-        </w:rPr>
-        <w:t xml:space="preserve"> У соціальних мережах публікуються лише посилання на новинну статтю з сайту. Також у компанії є команда збору новин, три людини: один водій, один оператор, один репортер. У компанії є одна людина, відповідальна за приймання людей на роботу та бухгалтерію.</w:t>
-      </w:r>
-    </w:p>
-    <w:p>
-      <w:pPr>
-        <w:pStyle w:val="P1"/>
-        <w:rPr>
-          <w:lang w:val="uk-UA"/>
-        </w:rPr>
-      </w:pPr>
-      <w:r>
-        <w:rPr>
-          <w:lang w:val="uk-UA"/>
-        </w:rPr>
-        <w:t xml:space="preserve">Через невеликий масштаб компанії ІТ відділ використовує безкоштовне програмне забезпечення з відкритим кодом. Як редактор коду використовується </w:t>
-      </w:r>
-      <w:r>
-        <w:rPr>
-          <w:lang w:val="en-US"/>
-        </w:rPr>
-        <w:t xml:space="preserve">Visual Studio Code. </w:t>
-      </w:r>
-      <w:r>
-        <w:rPr>
-          <w:lang w:val="uk-UA"/>
-        </w:rPr>
-        <w:t xml:space="preserve">Як система менеджменту контенту використовується </w:t>
-      </w:r>
-      <w:r>
-        <w:rPr>
-          <w:lang w:val="en-US"/>
-        </w:rPr>
-        <w:t>Strapi.</w:t>
-      </w:r>
-    </w:p>
-    <w:p>
-      <w:pPr>
-        <w:pStyle w:val="P1"/>
-        <w:rPr>
-          <w:lang w:val="uk-UA"/>
-        </w:rPr>
-      </w:pPr>
-      <w:r>
-        <w:rPr>
-          <w:lang w:val="uk-UA"/>
-        </w:rPr>
-        <w:t>Замовником компанії є читач новин. Спосіб заробітку є публікація реклами на сайті. За це відповідальний робітник фронтенду.</w:t>
-      </w:r>
-    </w:p>
-    <w:p>
-      <w:pPr>
-        <w:pStyle w:val="P1"/>
-        <w:rPr>
-          <w:lang w:val="uk-UA"/>
-        </w:rPr>
-      </w:pPr>
-      <w:r>
-        <w:rPr>
-          <w:lang w:val="uk-UA"/>
-        </w:rPr>
-        <w:t>Ресурси компанії наведені на таблиці 1.1.</w:t>
-      </w:r>
-    </w:p>
-    <w:p>
-      <w:pPr>
-        <w:pStyle w:val="P1"/>
-        <w:rPr>
-          <w:lang w:val="uk-UA"/>
-        </w:rPr>
-      </w:pPr>
-      <w:r>
-        <w:rPr>
-          <w:lang w:val="uk-UA"/>
-        </w:rPr>
-      </w:r>
-    </w:p>
-    <w:p>
-      <w:pPr>
-        <w:pStyle w:val="P1"/>
-        <w:rPr>
-          <w:lang w:val="uk-UA"/>
-        </w:rPr>
-      </w:pPr>
-      <w:r>
-        <w:rPr>
-          <w:lang w:val="uk-UA"/>
-        </w:rPr>
-        <w:t xml:space="preserve">Для перевірки достовірності новин використовується стороннє програмне забезпечення, а саме інтелектуальні асистенти, такі як </w:t>
-      </w:r>
-      <w:r>
-        <w:rPr>
-          <w:lang w:val="en-US"/>
-        </w:rPr>
-        <w:t>Claude й</w:t>
-      </w:r>
-      <w:r>
-        <w:rPr>
-          <w:lang w:val="uk-UA"/>
-        </w:rPr>
-        <w:t xml:space="preserve"> </w:t>
-      </w:r>
-      <w:r>
-        <w:rPr>
-          <w:lang w:val="en-US"/>
-        </w:rPr>
-        <w:t>Gemini</w:t>
-      </w:r>
-      <w:r>
-        <w:rPr>
-          <w:lang w:val="uk-UA"/>
-        </w:rPr>
-        <w:t>, які мають доступ для інтернету та можуть перевіряти текст на оригінальність.</w:t>
-      </w:r>
-    </w:p>
-    <w:p>
-      <w:pPr>
-        <w:pStyle w:val="P1"/>
-        <w:rPr>
-          <w:lang w:val="uk-UA"/>
-        </w:rPr>
-      </w:pPr>
-      <w:r>
-        <w:rPr>
-          <w:lang w:val="uk-UA"/>
-        </w:rPr>
-        <w:t>Розмежування зобов’язань наступне: компанія сама виробляє новини — виїжджає на місце подій, знімає матеріал, монтує його, викладає на сайт та у соціальні мережі. А такі роботи як хостинг сайту, юридичні послуги компанія закуповує у третіх осіб.</w:t>
+        <w:t>Компанія власноруч виконує наступні процеси:</w:t>
+      </w:r>
+    </w:p>
+    <w:p>
+      <w:pPr>
+        <w:pStyle w:val="P1"/>
+        <w:widowControl/>
+        <w:numPr>
+          <w:ilvl w:val="0"/>
+          <w:numId w:val="10"/>
+        </w:numPr>
+        <w:suppressAutoHyphens w:val="true"/>
+        <w:bidi w:val="0"/>
+        <w:spacing w:lineRule="auto" w:line="360" w:before="0" w:after="0"/>
+        <w:ind w:firstLine="850" w:left="0" w:right="0"/>
+        <w:jc w:val="both"/>
+        <w:rPr/>
+      </w:pPr>
+      <w:r>
+        <w:rPr/>
+        <w:t>моніторинг подій — пошук актуальних подій області;</w:t>
+      </w:r>
+    </w:p>
+    <w:p>
+      <w:pPr>
+        <w:pStyle w:val="P1"/>
+        <w:widowControl/>
+        <w:numPr>
+          <w:ilvl w:val="0"/>
+          <w:numId w:val="10"/>
+        </w:numPr>
+        <w:suppressAutoHyphens w:val="true"/>
+        <w:bidi w:val="0"/>
+        <w:spacing w:lineRule="auto" w:line="360" w:before="0" w:after="0"/>
+        <w:ind w:firstLine="850" w:left="0" w:right="0"/>
+        <w:jc w:val="both"/>
+        <w:rPr/>
+      </w:pPr>
+      <w:r>
+        <w:rPr/>
+        <w:t>збір новинних матеріалів — отримання інформації від очевидців;</w:t>
+      </w:r>
+    </w:p>
+    <w:p>
+      <w:pPr>
+        <w:pStyle w:val="P1"/>
+        <w:widowControl/>
+        <w:numPr>
+          <w:ilvl w:val="0"/>
+          <w:numId w:val="10"/>
+        </w:numPr>
+        <w:suppressAutoHyphens w:val="true"/>
+        <w:bidi w:val="0"/>
+        <w:spacing w:lineRule="auto" w:line="360" w:before="0" w:after="0"/>
+        <w:ind w:firstLine="850" w:left="0" w:right="0"/>
+        <w:jc w:val="both"/>
+        <w:rPr/>
+      </w:pPr>
+      <w:r>
+        <w:rPr/>
+        <w:t>перевірка інформації — перевірка достовірності отриманих даних;</w:t>
+      </w:r>
+    </w:p>
+    <w:p>
+      <w:pPr>
+        <w:pStyle w:val="P1"/>
+        <w:widowControl/>
+        <w:numPr>
+          <w:ilvl w:val="0"/>
+          <w:numId w:val="10"/>
+        </w:numPr>
+        <w:suppressAutoHyphens w:val="true"/>
+        <w:bidi w:val="0"/>
+        <w:spacing w:lineRule="auto" w:line="360" w:before="0" w:after="0"/>
+        <w:ind w:firstLine="850" w:left="0" w:right="0"/>
+        <w:jc w:val="both"/>
+        <w:rPr/>
+      </w:pPr>
+      <w:r>
+        <w:rPr/>
+        <w:t>підготовка новинних матеріалів — написання новинної статті та підготовка відео й зображень;</w:t>
+      </w:r>
+    </w:p>
+    <w:p>
+      <w:pPr>
+        <w:pStyle w:val="P1"/>
+        <w:widowControl/>
+        <w:numPr>
+          <w:ilvl w:val="0"/>
+          <w:numId w:val="10"/>
+        </w:numPr>
+        <w:suppressAutoHyphens w:val="true"/>
+        <w:bidi w:val="0"/>
+        <w:spacing w:lineRule="auto" w:line="360" w:before="0" w:after="0"/>
+        <w:ind w:firstLine="850" w:left="0" w:right="0"/>
+        <w:jc w:val="both"/>
+        <w:rPr/>
+      </w:pPr>
+      <w:r>
+        <w:rPr/>
+        <w:t>публікація новин — розміщення статей на веб-сайті через Strapi та посилань у Telegram каналі.</w:t>
+      </w:r>
+    </w:p>
+    <w:p>
+      <w:pPr>
+        <w:pStyle w:val="P1"/>
+        <w:rPr>
+          <w:lang w:val="uk-UA"/>
+        </w:rPr>
+      </w:pPr>
+      <w:r>
+        <w:rPr/>
+        <w:t>Компанія залучає зовнішніх виконавців для наступних процесів:</w:t>
+      </w:r>
+    </w:p>
+    <w:p>
+      <w:pPr>
+        <w:pStyle w:val="P1"/>
+        <w:widowControl/>
+        <w:numPr>
+          <w:ilvl w:val="0"/>
+          <w:numId w:val="11"/>
+        </w:numPr>
+        <w:suppressAutoHyphens w:val="true"/>
+        <w:bidi w:val="0"/>
+        <w:spacing w:lineRule="auto" w:line="360" w:before="0" w:after="0"/>
+        <w:ind w:firstLine="850" w:left="0" w:right="0"/>
+        <w:jc w:val="both"/>
+        <w:rPr/>
+      </w:pPr>
+      <w:r>
+        <w:rPr/>
+        <w:t>хостинг веб-сайту та його технічне обслуговування;</w:t>
+      </w:r>
+    </w:p>
+    <w:p>
+      <w:pPr>
+        <w:pStyle w:val="P1"/>
+        <w:widowControl/>
+        <w:numPr>
+          <w:ilvl w:val="0"/>
+          <w:numId w:val="11"/>
+        </w:numPr>
+        <w:suppressAutoHyphens w:val="true"/>
+        <w:bidi w:val="0"/>
+        <w:spacing w:lineRule="auto" w:line="360" w:before="0" w:after="0"/>
+        <w:ind w:firstLine="850" w:left="0" w:right="0"/>
+        <w:jc w:val="both"/>
+        <w:rPr/>
+      </w:pPr>
+      <w:r>
+        <w:rPr/>
+        <w:t>бухгалтерський облік;</w:t>
+      </w:r>
+    </w:p>
+    <w:p>
+      <w:pPr>
+        <w:pStyle w:val="P1"/>
+        <w:widowControl/>
+        <w:numPr>
+          <w:ilvl w:val="0"/>
+          <w:numId w:val="11"/>
+        </w:numPr>
+        <w:suppressAutoHyphens w:val="true"/>
+        <w:bidi w:val="0"/>
+        <w:spacing w:lineRule="auto" w:line="360" w:before="0" w:after="0"/>
+        <w:ind w:firstLine="850" w:left="0" w:right="0"/>
+        <w:jc w:val="both"/>
+        <w:rPr/>
+      </w:pPr>
+      <w:r>
+        <w:rPr/>
+        <w:t>юридичне обслуговування.</w:t>
       </w:r>
     </w:p>
     <w:p>
@@ -7121,6 +7158,244 @@
   <w:abstractNum w:abstractNumId="10">
     <w:lvl w:ilvl="0">
       <w:start w:val="1"/>
+      <w:numFmt w:val="decimal"/>
+      <w:lvlText w:val="%1."/>
+      <w:lvlJc w:val="left"/>
+      <w:pPr>
+        <w:tabs>
+          <w:tab w:val="num" w:pos="720"/>
+        </w:tabs>
+        <w:ind w:left="720" w:hanging="360"/>
+      </w:pPr>
+      <w:rPr/>
+    </w:lvl>
+    <w:lvl w:ilvl="1">
+      <w:start w:val="1"/>
+      <w:numFmt w:val="decimal"/>
+      <w:lvlText w:val="%2."/>
+      <w:lvlJc w:val="left"/>
+      <w:pPr>
+        <w:tabs>
+          <w:tab w:val="num" w:pos="1080"/>
+        </w:tabs>
+        <w:ind w:left="1080" w:hanging="360"/>
+      </w:pPr>
+      <w:rPr/>
+    </w:lvl>
+    <w:lvl w:ilvl="2">
+      <w:start w:val="1"/>
+      <w:numFmt w:val="decimal"/>
+      <w:lvlText w:val="%3."/>
+      <w:lvlJc w:val="left"/>
+      <w:pPr>
+        <w:tabs>
+          <w:tab w:val="num" w:pos="1440"/>
+        </w:tabs>
+        <w:ind w:left="1440" w:hanging="360"/>
+      </w:pPr>
+      <w:rPr/>
+    </w:lvl>
+    <w:lvl w:ilvl="3">
+      <w:start w:val="1"/>
+      <w:numFmt w:val="decimal"/>
+      <w:lvlText w:val="%4."/>
+      <w:lvlJc w:val="left"/>
+      <w:pPr>
+        <w:tabs>
+          <w:tab w:val="num" w:pos="1800"/>
+        </w:tabs>
+        <w:ind w:left="1800" w:hanging="360"/>
+      </w:pPr>
+      <w:rPr/>
+    </w:lvl>
+    <w:lvl w:ilvl="4">
+      <w:start w:val="1"/>
+      <w:numFmt w:val="decimal"/>
+      <w:lvlText w:val="%5."/>
+      <w:lvlJc w:val="left"/>
+      <w:pPr>
+        <w:tabs>
+          <w:tab w:val="num" w:pos="2160"/>
+        </w:tabs>
+        <w:ind w:left="2160" w:hanging="360"/>
+      </w:pPr>
+      <w:rPr/>
+    </w:lvl>
+    <w:lvl w:ilvl="5">
+      <w:start w:val="1"/>
+      <w:numFmt w:val="decimal"/>
+      <w:lvlText w:val="%6."/>
+      <w:lvlJc w:val="left"/>
+      <w:pPr>
+        <w:tabs>
+          <w:tab w:val="num" w:pos="2520"/>
+        </w:tabs>
+        <w:ind w:left="2520" w:hanging="360"/>
+      </w:pPr>
+      <w:rPr/>
+    </w:lvl>
+    <w:lvl w:ilvl="6">
+      <w:start w:val="1"/>
+      <w:numFmt w:val="decimal"/>
+      <w:lvlText w:val="%7."/>
+      <w:lvlJc w:val="left"/>
+      <w:pPr>
+        <w:tabs>
+          <w:tab w:val="num" w:pos="2880"/>
+        </w:tabs>
+        <w:ind w:left="2880" w:hanging="360"/>
+      </w:pPr>
+      <w:rPr/>
+    </w:lvl>
+    <w:lvl w:ilvl="7">
+      <w:start w:val="1"/>
+      <w:numFmt w:val="decimal"/>
+      <w:lvlText w:val="%8."/>
+      <w:lvlJc w:val="left"/>
+      <w:pPr>
+        <w:tabs>
+          <w:tab w:val="num" w:pos="3240"/>
+        </w:tabs>
+        <w:ind w:left="3240" w:hanging="360"/>
+      </w:pPr>
+      <w:rPr/>
+    </w:lvl>
+    <w:lvl w:ilvl="8">
+      <w:start w:val="1"/>
+      <w:numFmt w:val="decimal"/>
+      <w:lvlText w:val="%9."/>
+      <w:lvlJc w:val="left"/>
+      <w:pPr>
+        <w:tabs>
+          <w:tab w:val="num" w:pos="3600"/>
+        </w:tabs>
+        <w:ind w:left="3600" w:hanging="360"/>
+      </w:pPr>
+      <w:rPr/>
+    </w:lvl>
+  </w:abstractNum>
+  <w:abstractNum w:abstractNumId="11">
+    <w:lvl w:ilvl="0">
+      <w:start w:val="1"/>
+      <w:numFmt w:val="decimal"/>
+      <w:lvlText w:val="%1."/>
+      <w:lvlJc w:val="left"/>
+      <w:pPr>
+        <w:tabs>
+          <w:tab w:val="num" w:pos="720"/>
+        </w:tabs>
+        <w:ind w:left="720" w:hanging="360"/>
+      </w:pPr>
+      <w:rPr/>
+    </w:lvl>
+    <w:lvl w:ilvl="1">
+      <w:start w:val="1"/>
+      <w:numFmt w:val="decimal"/>
+      <w:lvlText w:val="%2."/>
+      <w:lvlJc w:val="left"/>
+      <w:pPr>
+        <w:tabs>
+          <w:tab w:val="num" w:pos="1080"/>
+        </w:tabs>
+        <w:ind w:left="1080" w:hanging="360"/>
+      </w:pPr>
+      <w:rPr/>
+    </w:lvl>
+    <w:lvl w:ilvl="2">
+      <w:start w:val="1"/>
+      <w:numFmt w:val="decimal"/>
+      <w:lvlText w:val="%3."/>
+      <w:lvlJc w:val="left"/>
+      <w:pPr>
+        <w:tabs>
+          <w:tab w:val="num" w:pos="1440"/>
+        </w:tabs>
+        <w:ind w:left="1440" w:hanging="360"/>
+      </w:pPr>
+      <w:rPr/>
+    </w:lvl>
+    <w:lvl w:ilvl="3">
+      <w:start w:val="1"/>
+      <w:numFmt w:val="decimal"/>
+      <w:lvlText w:val="%4."/>
+      <w:lvlJc w:val="left"/>
+      <w:pPr>
+        <w:tabs>
+          <w:tab w:val="num" w:pos="1800"/>
+        </w:tabs>
+        <w:ind w:left="1800" w:hanging="360"/>
+      </w:pPr>
+      <w:rPr/>
+    </w:lvl>
+    <w:lvl w:ilvl="4">
+      <w:start w:val="1"/>
+      <w:numFmt w:val="decimal"/>
+      <w:lvlText w:val="%5."/>
+      <w:lvlJc w:val="left"/>
+      <w:pPr>
+        <w:tabs>
+          <w:tab w:val="num" w:pos="2160"/>
+        </w:tabs>
+        <w:ind w:left="2160" w:hanging="360"/>
+      </w:pPr>
+      <w:rPr/>
+    </w:lvl>
+    <w:lvl w:ilvl="5">
+      <w:start w:val="1"/>
+      <w:numFmt w:val="decimal"/>
+      <w:lvlText w:val="%6."/>
+      <w:lvlJc w:val="left"/>
+      <w:pPr>
+        <w:tabs>
+          <w:tab w:val="num" w:pos="2520"/>
+        </w:tabs>
+        <w:ind w:left="2520" w:hanging="360"/>
+      </w:pPr>
+      <w:rPr/>
+    </w:lvl>
+    <w:lvl w:ilvl="6">
+      <w:start w:val="1"/>
+      <w:numFmt w:val="decimal"/>
+      <w:lvlText w:val="%7."/>
+      <w:lvlJc w:val="left"/>
+      <w:pPr>
+        <w:tabs>
+          <w:tab w:val="num" w:pos="2880"/>
+        </w:tabs>
+        <w:ind w:left="2880" w:hanging="360"/>
+      </w:pPr>
+      <w:rPr/>
+    </w:lvl>
+    <w:lvl w:ilvl="7">
+      <w:start w:val="1"/>
+      <w:numFmt w:val="decimal"/>
+      <w:lvlText w:val="%8."/>
+      <w:lvlJc w:val="left"/>
+      <w:pPr>
+        <w:tabs>
+          <w:tab w:val="num" w:pos="3240"/>
+        </w:tabs>
+        <w:ind w:left="3240" w:hanging="360"/>
+      </w:pPr>
+      <w:rPr/>
+    </w:lvl>
+    <w:lvl w:ilvl="8">
+      <w:start w:val="1"/>
+      <w:numFmt w:val="decimal"/>
+      <w:lvlText w:val="%9."/>
+      <w:lvlJc w:val="left"/>
+      <w:pPr>
+        <w:tabs>
+          <w:tab w:val="num" w:pos="3600"/>
+        </w:tabs>
+        <w:ind w:left="3600" w:hanging="360"/>
+      </w:pPr>
+      <w:rPr/>
+    </w:lvl>
+  </w:abstractNum>
+  <w:abstractNum w:abstractNumId="12">
+    <w:lvl w:ilvl="0">
+      <w:start w:val="1"/>
       <w:numFmt w:val="none"/>
       <w:suff w:val="nothing"/>
       <w:lvlText w:val=""/>
@@ -7266,6 +7541,12 @@
   </w:num>
   <w:num w:numId="10">
     <w:abstractNumId w:val="10"/>
+  </w:num>
+  <w:num w:numId="11">
+    <w:abstractNumId w:val="11"/>
+  </w:num>
+  <w:num w:numId="12">
+    <w:abstractNumId w:val="12"/>
   </w:num>
 </w:numbering>
 </file>

</xml_diff>

<commit_message>
docs: SP1 chapter 2 done
</commit_message>
<xml_diff>
--- a/51SP Sertyficazija PZ/1/SP1_KNT-116m_Onyshchenko_15.docx
+++ b/51SP Sertyficazija PZ/1/SP1_KNT-116m_Onyshchenko_15.docx
@@ -1968,7 +1968,7 @@
       </w:pPr>
       <w:r>
         <w:rPr/>
-        <w:t>хостинг веб-сайту та його технічне обслуговування;</w:t>
+        <w:t>хостинг веб-сайту;</w:t>
       </w:r>
     </w:p>
     <w:p>
@@ -2037,306 +2037,902 @@
     <w:p>
       <w:pPr>
         <w:pStyle w:val="P1"/>
-        <w:rPr>
-          <w:lang w:val="uk-UA"/>
-        </w:rPr>
-      </w:pPr>
-      <w:r>
-        <w:rPr>
-          <w:lang w:val="uk-UA"/>
-        </w:rPr>
-      </w:r>
-    </w:p>
-    <w:p>
-      <w:pPr>
-        <w:pStyle w:val="P1"/>
-        <w:rPr>
-          <w:lang w:val="uk-UA"/>
-        </w:rPr>
-      </w:pPr>
-      <w:r>
-        <w:rPr>
-          <w:lang w:val="uk-UA"/>
-        </w:rPr>
-        <w:t>Організаційна структура компанії наведена на рисунку 1.1.</w:t>
-      </w:r>
-    </w:p>
-    <w:p>
-      <w:pPr>
-        <w:pStyle w:val="P1"/>
-        <w:rPr>
-          <w:lang w:val="uk-UA"/>
-        </w:rPr>
-      </w:pPr>
-      <w:r>
-        <w:rPr>
-          <w:lang w:val="uk-UA"/>
-        </w:rPr>
-      </w:r>
-    </w:p>
-    <w:p>
-      <w:pPr>
-        <w:pStyle w:val="img1"/>
-        <w:rPr/>
-      </w:pPr>
-      <w:r>
-        <w:rPr/>
-        <w:drawing>
-          <wp:inline distT="0" distB="0" distL="0" distR="0">
-            <wp:extent cx="5731510" cy="2940685"/>
-            <wp:effectExtent l="0" t="0" r="0" b="0"/>
-            <wp:docPr id="1" name="Зображення1"/>
-            <wp:cNvGraphicFramePr>
-              <a:graphicFrameLocks xmlns:a="http://schemas.openxmlformats.org/drawingml/2006/main" noChangeAspect="1"/>
-            </wp:cNvGraphicFramePr>
-            <a:graphic xmlns:a="http://schemas.openxmlformats.org/drawingml/2006/main">
-              <a:graphicData uri="http://schemas.openxmlformats.org/drawingml/2006/picture">
-                <pic:pic xmlns:pic="http://schemas.openxmlformats.org/drawingml/2006/picture">
-                  <pic:nvPicPr>
-                    <pic:cNvPr id="1" name="Зображення1"/>
-                    <pic:cNvPicPr>
-                      <a:picLocks noChangeAspect="1" noChangeArrowheads="1"/>
-                    </pic:cNvPicPr>
-                  </pic:nvPicPr>
-                  <pic:blipFill>
-                    <a:blip r:embed="rId2"/>
-                    <a:stretch>
-                      <a:fillRect/>
-                    </a:stretch>
-                  </pic:blipFill>
-                  <pic:spPr bwMode="auto">
-                    <a:xfrm>
-                      <a:off x="0" y="0"/>
-                      <a:ext cx="5731510" cy="2940685"/>
-                    </a:xfrm>
-                    <a:prstGeom prst="rect">
-                      <a:avLst/>
-                    </a:prstGeom>
-                    <a:noFill/>
-                  </pic:spPr>
-                </pic:pic>
-              </a:graphicData>
-            </a:graphic>
-          </wp:inline>
-        </w:drawing>
-      </w:r>
-    </w:p>
-    <w:p>
-      <w:pPr>
-        <w:pStyle w:val="img1"/>
-        <w:rPr/>
-      </w:pPr>
-      <w:r>
-        <w:rPr/>
-        <w:t>Рисунок 1.1 — Організаційна структура компанії</w:t>
-      </w:r>
-    </w:p>
-    <w:p>
-      <w:pPr>
-        <w:pStyle w:val="P1"/>
-        <w:rPr>
-          <w:lang w:val="uk-UA"/>
-        </w:rPr>
-      </w:pPr>
-      <w:r>
-        <w:rPr>
-          <w:lang w:val="uk-UA"/>
-        </w:rPr>
-      </w:r>
-    </w:p>
-    <w:p>
-      <w:pPr>
-        <w:pStyle w:val="P1"/>
-        <w:rPr>
-          <w:lang w:val="uk-UA"/>
-        </w:rPr>
-      </w:pPr>
-      <w:r>
-        <w:rPr>
-          <w:lang w:val="uk-UA"/>
-        </w:rPr>
-        <w:t>Обов’язки кожної особи в команді:</w:t>
-      </w:r>
-    </w:p>
-    <w:p>
-      <w:pPr>
-        <w:pStyle w:val="P1"/>
-        <w:widowControl/>
-        <w:numPr>
-          <w:ilvl w:val="0"/>
-          <w:numId w:val="1"/>
-        </w:numPr>
-        <w:suppressAutoHyphens w:val="true"/>
-        <w:bidi w:val="0"/>
-        <w:spacing w:lineRule="auto" w:line="360" w:before="0" w:after="0"/>
-        <w:ind w:firstLine="850" w:left="0" w:right="0"/>
-        <w:jc w:val="both"/>
-        <w:rPr/>
-      </w:pPr>
-      <w:r>
-        <w:rPr/>
-        <w:t>Директор: управління ресурсами компанії, розподіл обов’язків по команді;</w:t>
-      </w:r>
-    </w:p>
-    <w:p>
-      <w:pPr>
-        <w:pStyle w:val="P1"/>
-        <w:widowControl/>
-        <w:numPr>
-          <w:ilvl w:val="0"/>
-          <w:numId w:val="1"/>
-        </w:numPr>
-        <w:suppressAutoHyphens w:val="true"/>
-        <w:bidi w:val="0"/>
-        <w:spacing w:lineRule="auto" w:line="360" w:before="0" w:after="0"/>
-        <w:ind w:firstLine="850" w:left="0" w:right="0"/>
-        <w:jc w:val="both"/>
-        <w:rPr>
-          <w:lang w:val="en-US"/>
-        </w:rPr>
-      </w:pPr>
-      <w:r>
-        <w:rPr>
-          <w:lang w:val="en-US"/>
-        </w:rPr>
-        <w:t xml:space="preserve">HR &amp; </w:t>
-      </w:r>
-      <w:r>
-        <w:rPr>
-          <w:lang w:val="uk-UA"/>
-        </w:rPr>
-        <w:t>Бухгалтер: фінансові потоки компанії, наймання працівників у компанію;</w:t>
-      </w:r>
-    </w:p>
-    <w:p>
-      <w:pPr>
-        <w:pStyle w:val="P1"/>
-        <w:widowControl/>
-        <w:numPr>
-          <w:ilvl w:val="0"/>
-          <w:numId w:val="1"/>
-        </w:numPr>
-        <w:suppressAutoHyphens w:val="true"/>
-        <w:bidi w:val="0"/>
-        <w:spacing w:lineRule="auto" w:line="360" w:before="0" w:after="0"/>
-        <w:ind w:firstLine="850" w:left="0" w:right="0"/>
-        <w:jc w:val="both"/>
-        <w:rPr>
-          <w:lang w:val="uk-UA"/>
-        </w:rPr>
-      </w:pPr>
-      <w:r>
-        <w:rPr>
-          <w:lang w:val="uk-UA"/>
-        </w:rPr>
-        <w:t>ІТ відділ, фронтенд: розробка клієнтської частини вебсайту, публікація новин;</w:t>
-      </w:r>
-    </w:p>
-    <w:p>
-      <w:pPr>
-        <w:pStyle w:val="P1"/>
-        <w:widowControl/>
-        <w:numPr>
-          <w:ilvl w:val="0"/>
-          <w:numId w:val="1"/>
-        </w:numPr>
-        <w:suppressAutoHyphens w:val="true"/>
-        <w:bidi w:val="0"/>
-        <w:spacing w:lineRule="auto" w:line="360" w:before="0" w:after="0"/>
-        <w:ind w:firstLine="850" w:left="0" w:right="0"/>
-        <w:jc w:val="both"/>
-        <w:rPr>
-          <w:lang w:val="uk-UA"/>
-        </w:rPr>
-      </w:pPr>
-      <w:r>
-        <w:rPr>
-          <w:lang w:val="uk-UA"/>
-        </w:rPr>
-        <w:t>ІТ відділ, бекенд: розробка серверної частини вебсайту, організація реклами на сайті;</w:t>
-      </w:r>
-    </w:p>
-    <w:p>
-      <w:pPr>
-        <w:pStyle w:val="P1"/>
-        <w:widowControl/>
-        <w:numPr>
-          <w:ilvl w:val="0"/>
-          <w:numId w:val="1"/>
-        </w:numPr>
-        <w:suppressAutoHyphens w:val="true"/>
-        <w:bidi w:val="0"/>
-        <w:spacing w:lineRule="auto" w:line="360" w:before="0" w:after="0"/>
-        <w:ind w:firstLine="850" w:left="0" w:right="0"/>
-        <w:jc w:val="both"/>
-        <w:rPr>
-          <w:lang w:val="uk-UA"/>
-        </w:rPr>
-      </w:pPr>
-      <w:r>
-        <w:rPr>
-          <w:lang w:val="uk-UA"/>
-        </w:rPr>
-        <w:t>Відділ збору новин, водій: підтримка робочого стану автомобіля компанії, розвезення працівників команди на локації новин;</w:t>
-      </w:r>
-    </w:p>
-    <w:p>
-      <w:pPr>
-        <w:pStyle w:val="P1"/>
-        <w:widowControl/>
-        <w:numPr>
-          <w:ilvl w:val="0"/>
-          <w:numId w:val="1"/>
-        </w:numPr>
-        <w:suppressAutoHyphens w:val="true"/>
-        <w:bidi w:val="0"/>
-        <w:spacing w:lineRule="auto" w:line="360" w:before="0" w:after="0"/>
-        <w:ind w:firstLine="850" w:left="0" w:right="0"/>
-        <w:jc w:val="both"/>
-        <w:rPr>
-          <w:lang w:val="uk-UA"/>
-        </w:rPr>
-      </w:pPr>
-      <w:r>
-        <w:rPr>
-          <w:lang w:val="uk-UA"/>
-        </w:rPr>
-        <w:t>Відділ збору новин, оператор: підтримка камери компанії в робочому стані, відеофіксація репортажів;</w:t>
-      </w:r>
-    </w:p>
-    <w:p>
-      <w:pPr>
-        <w:pStyle w:val="P1"/>
-        <w:widowControl/>
-        <w:numPr>
-          <w:ilvl w:val="0"/>
-          <w:numId w:val="1"/>
-        </w:numPr>
-        <w:suppressAutoHyphens w:val="true"/>
-        <w:bidi w:val="0"/>
-        <w:spacing w:lineRule="auto" w:line="360" w:before="0" w:after="0"/>
-        <w:ind w:firstLine="850" w:left="0" w:right="0"/>
-        <w:jc w:val="both"/>
-        <w:rPr/>
-      </w:pPr>
-      <w:r>
-        <w:rPr>
-          <w:lang w:val="uk-UA"/>
-        </w:rPr>
-        <w:t>Відділ збору новин, репортер: озвучування тексту новини на локації чи в студії, перевірка новин на достовірність.</w:t>
-      </w:r>
-    </w:p>
-    <w:p>
-      <w:pPr>
-        <w:pStyle w:val="P1"/>
-        <w:rPr>
-          <w:lang w:val="uk-UA"/>
-        </w:rPr>
-      </w:pPr>
-      <w:r>
-        <w:rPr>
-          <w:lang w:val="uk-UA"/>
-        </w:rPr>
+        <w:rPr/>
+      </w:pPr>
+      <w:r>
+        <w:rPr/>
+      </w:r>
+    </w:p>
+    <w:p>
+      <w:pPr>
+        <w:pStyle w:val="P1"/>
+        <w:rPr/>
+      </w:pPr>
+      <w:r>
+        <w:rPr/>
+        <w:t>Організаційна структура підприємства з описом обов’язків представлена на таблиці 2.1.</w:t>
+      </w:r>
+    </w:p>
+    <w:p>
+      <w:pPr>
+        <w:pStyle w:val="P1"/>
+        <w:rPr/>
+      </w:pPr>
+      <w:r>
+        <w:rPr/>
+      </w:r>
+    </w:p>
+    <w:p>
+      <w:pPr>
+        <w:pStyle w:val="P1"/>
+        <w:rPr/>
+      </w:pPr>
+      <w:r>
+        <w:rPr/>
+        <w:t>Таблиця 2.1 — Організаційна структура компанії</w:t>
+      </w:r>
+    </w:p>
+    <w:tbl>
+      <w:tblPr>
+        <w:tblW w:w="11502" w:type="dxa"/>
+        <w:jc w:val="left"/>
+        <w:tblInd w:w="-1218" w:type="dxa"/>
+        <w:tblLayout w:type="fixed"/>
+        <w:tblCellMar>
+          <w:top w:w="55" w:type="dxa"/>
+          <w:left w:w="55" w:type="dxa"/>
+          <w:bottom w:w="55" w:type="dxa"/>
+          <w:right w:w="55" w:type="dxa"/>
+        </w:tblCellMar>
+      </w:tblPr>
+      <w:tblGrid>
+        <w:gridCol w:w="412"/>
+        <w:gridCol w:w="2483"/>
+        <w:gridCol w:w="1365"/>
+        <w:gridCol w:w="7242"/>
+      </w:tblGrid>
+      <w:tr>
+        <w:trPr/>
+        <w:tc>
+          <w:tcPr>
+            <w:tcW w:w="412" w:type="dxa"/>
+            <w:tcBorders>
+              <w:top w:val="single" w:sz="4" w:space="0" w:color="000000"/>
+              <w:left w:val="single" w:sz="4" w:space="0" w:color="000000"/>
+              <w:bottom w:val="single" w:sz="4" w:space="0" w:color="000000"/>
+            </w:tcBorders>
+            <w:vAlign w:val="center"/>
+          </w:tcPr>
+          <w:p>
+            <w:pPr>
+              <w:pStyle w:val="Style16"/>
+              <w:spacing w:lineRule="auto" w:line="240"/>
+              <w:ind w:hanging="0" w:left="0"/>
+              <w:rPr>
+                <w:b/>
+                <w:bCs/>
+                <w:lang w:val="uk-UA"/>
+              </w:rPr>
+            </w:pPr>
+            <w:r>
+              <w:rPr>
+                <w:b/>
+                <w:bCs/>
+                <w:lang w:val="uk-UA"/>
+              </w:rPr>
+              <w:t>№</w:t>
+            </w:r>
+          </w:p>
+        </w:tc>
+        <w:tc>
+          <w:tcPr>
+            <w:tcW w:w="2483" w:type="dxa"/>
+            <w:tcBorders>
+              <w:top w:val="single" w:sz="4" w:space="0" w:color="000000"/>
+              <w:left w:val="single" w:sz="4" w:space="0" w:color="000000"/>
+              <w:bottom w:val="single" w:sz="4" w:space="0" w:color="000000"/>
+            </w:tcBorders>
+            <w:vAlign w:val="center"/>
+          </w:tcPr>
+          <w:p>
+            <w:pPr>
+              <w:pStyle w:val="Style16"/>
+              <w:spacing w:lineRule="auto" w:line="240"/>
+              <w:ind w:hanging="0" w:left="0"/>
+              <w:rPr>
+                <w:b/>
+                <w:bCs/>
+              </w:rPr>
+            </w:pPr>
+            <w:r>
+              <w:rPr>
+                <w:b/>
+                <w:bCs/>
+              </w:rPr>
+              <w:t>Посада</w:t>
+            </w:r>
+          </w:p>
+        </w:tc>
+        <w:tc>
+          <w:tcPr>
+            <w:tcW w:w="1365" w:type="dxa"/>
+            <w:tcBorders>
+              <w:top w:val="single" w:sz="4" w:space="0" w:color="000000"/>
+              <w:left w:val="single" w:sz="4" w:space="0" w:color="000000"/>
+              <w:bottom w:val="single" w:sz="4" w:space="0" w:color="000000"/>
+            </w:tcBorders>
+            <w:vAlign w:val="center"/>
+          </w:tcPr>
+          <w:p>
+            <w:pPr>
+              <w:pStyle w:val="Style16"/>
+              <w:spacing w:lineRule="auto" w:line="240"/>
+              <w:ind w:hanging="0" w:left="0"/>
+              <w:rPr>
+                <w:b/>
+                <w:bCs/>
+              </w:rPr>
+            </w:pPr>
+            <w:r>
+              <w:rPr>
+                <w:b/>
+                <w:bCs/>
+              </w:rPr>
+              <w:t>Кількість</w:t>
+            </w:r>
+          </w:p>
+        </w:tc>
+        <w:tc>
+          <w:tcPr>
+            <w:tcW w:w="7242" w:type="dxa"/>
+            <w:tcBorders>
+              <w:top w:val="single" w:sz="4" w:space="0" w:color="000000"/>
+              <w:left w:val="single" w:sz="4" w:space="0" w:color="000000"/>
+              <w:bottom w:val="single" w:sz="4" w:space="0" w:color="000000"/>
+              <w:right w:val="single" w:sz="4" w:space="0" w:color="000000"/>
+            </w:tcBorders>
+            <w:vAlign w:val="center"/>
+          </w:tcPr>
+          <w:p>
+            <w:pPr>
+              <w:pStyle w:val="Style16"/>
+              <w:spacing w:lineRule="auto" w:line="240"/>
+              <w:ind w:hanging="0" w:left="0"/>
+              <w:rPr>
+                <w:b/>
+                <w:bCs/>
+              </w:rPr>
+            </w:pPr>
+            <w:r>
+              <w:rPr>
+                <w:b/>
+                <w:bCs/>
+              </w:rPr>
+              <w:t>Обов’язки</w:t>
+            </w:r>
+          </w:p>
+        </w:tc>
+      </w:tr>
+      <w:tr>
+        <w:trPr/>
+        <w:tc>
+          <w:tcPr>
+            <w:tcW w:w="412" w:type="dxa"/>
+            <w:tcBorders>
+              <w:left w:val="single" w:sz="4" w:space="0" w:color="000000"/>
+              <w:bottom w:val="single" w:sz="4" w:space="0" w:color="000000"/>
+            </w:tcBorders>
+            <w:vAlign w:val="center"/>
+          </w:tcPr>
+          <w:p>
+            <w:pPr>
+              <w:pStyle w:val="Style16"/>
+              <w:spacing w:lineRule="auto" w:line="240"/>
+              <w:ind w:hanging="0" w:left="0"/>
+              <w:rPr>
+                <w:lang w:val="uk-UA"/>
+              </w:rPr>
+            </w:pPr>
+            <w:r>
+              <w:rPr>
+                <w:lang w:val="uk-UA"/>
+              </w:rPr>
+              <w:t>1</w:t>
+            </w:r>
+          </w:p>
+        </w:tc>
+        <w:tc>
+          <w:tcPr>
+            <w:tcW w:w="2483" w:type="dxa"/>
+            <w:tcBorders>
+              <w:left w:val="single" w:sz="4" w:space="0" w:color="000000"/>
+              <w:bottom w:val="single" w:sz="4" w:space="0" w:color="000000"/>
+            </w:tcBorders>
+            <w:vAlign w:val="center"/>
+          </w:tcPr>
+          <w:p>
+            <w:pPr>
+              <w:pStyle w:val="Style16"/>
+              <w:spacing w:lineRule="auto" w:line="240"/>
+              <w:ind w:hanging="0" w:left="0"/>
+              <w:rPr>
+                <w:lang w:val="uk-UA"/>
+              </w:rPr>
+            </w:pPr>
+            <w:r>
+              <w:rPr>
+                <w:lang w:val="uk-UA"/>
+              </w:rPr>
+              <w:t>Директор</w:t>
+            </w:r>
+          </w:p>
+        </w:tc>
+        <w:tc>
+          <w:tcPr>
+            <w:tcW w:w="1365" w:type="dxa"/>
+            <w:tcBorders>
+              <w:left w:val="single" w:sz="4" w:space="0" w:color="000000"/>
+              <w:bottom w:val="single" w:sz="4" w:space="0" w:color="000000"/>
+            </w:tcBorders>
+            <w:vAlign w:val="center"/>
+          </w:tcPr>
+          <w:p>
+            <w:pPr>
+              <w:pStyle w:val="Style16"/>
+              <w:spacing w:lineRule="auto" w:line="240"/>
+              <w:ind w:hanging="0" w:left="0"/>
+              <w:rPr/>
+            </w:pPr>
+            <w:r>
+              <w:rPr/>
+              <w:t>1</w:t>
+            </w:r>
+          </w:p>
+        </w:tc>
+        <w:tc>
+          <w:tcPr>
+            <w:tcW w:w="7242" w:type="dxa"/>
+            <w:tcBorders>
+              <w:left w:val="single" w:sz="4" w:space="0" w:color="000000"/>
+              <w:bottom w:val="single" w:sz="4" w:space="0" w:color="000000"/>
+              <w:right w:val="single" w:sz="4" w:space="0" w:color="000000"/>
+            </w:tcBorders>
+            <w:vAlign w:val="center"/>
+          </w:tcPr>
+          <w:p>
+            <w:pPr>
+              <w:pStyle w:val="Style16"/>
+              <w:spacing w:lineRule="auto" w:line="240"/>
+              <w:ind w:hanging="0" w:left="0"/>
+              <w:rPr/>
+            </w:pPr>
+            <w:r>
+              <w:rPr/>
+              <w:t>Керування компанією, фінансове планування, взаємодія з партнерами.</w:t>
+            </w:r>
+          </w:p>
+        </w:tc>
+      </w:tr>
+      <w:tr>
+        <w:trPr/>
+        <w:tc>
+          <w:tcPr>
+            <w:tcW w:w="412" w:type="dxa"/>
+            <w:tcBorders>
+              <w:left w:val="single" w:sz="4" w:space="0" w:color="000000"/>
+              <w:bottom w:val="single" w:sz="4" w:space="0" w:color="000000"/>
+            </w:tcBorders>
+            <w:vAlign w:val="center"/>
+          </w:tcPr>
+          <w:p>
+            <w:pPr>
+              <w:pStyle w:val="Style16"/>
+              <w:spacing w:lineRule="auto" w:line="240"/>
+              <w:ind w:hanging="0" w:left="0"/>
+              <w:rPr>
+                <w:lang w:val="uk-UA"/>
+              </w:rPr>
+            </w:pPr>
+            <w:r>
+              <w:rPr>
+                <w:lang w:val="uk-UA"/>
+              </w:rPr>
+              <w:t>2</w:t>
+            </w:r>
+          </w:p>
+        </w:tc>
+        <w:tc>
+          <w:tcPr>
+            <w:tcW w:w="2483" w:type="dxa"/>
+            <w:tcBorders>
+              <w:left w:val="single" w:sz="4" w:space="0" w:color="000000"/>
+              <w:bottom w:val="single" w:sz="4" w:space="0" w:color="000000"/>
+            </w:tcBorders>
+            <w:vAlign w:val="center"/>
+          </w:tcPr>
+          <w:p>
+            <w:pPr>
+              <w:pStyle w:val="Style16"/>
+              <w:spacing w:lineRule="auto" w:line="240"/>
+              <w:ind w:hanging="0" w:left="0"/>
+              <w:rPr>
+                <w:lang w:val="uk-UA"/>
+              </w:rPr>
+            </w:pPr>
+            <w:r>
+              <w:rPr>
+                <w:lang w:val="uk-UA"/>
+              </w:rPr>
+              <w:t>Головний редактор</w:t>
+            </w:r>
+          </w:p>
+        </w:tc>
+        <w:tc>
+          <w:tcPr>
+            <w:tcW w:w="1365" w:type="dxa"/>
+            <w:tcBorders>
+              <w:left w:val="single" w:sz="4" w:space="0" w:color="000000"/>
+              <w:bottom w:val="single" w:sz="4" w:space="0" w:color="000000"/>
+            </w:tcBorders>
+            <w:vAlign w:val="center"/>
+          </w:tcPr>
+          <w:p>
+            <w:pPr>
+              <w:pStyle w:val="Style16"/>
+              <w:spacing w:lineRule="auto" w:line="240"/>
+              <w:ind w:hanging="0" w:left="0"/>
+              <w:rPr/>
+            </w:pPr>
+            <w:r>
+              <w:rPr/>
+              <w:t>1</w:t>
+            </w:r>
+          </w:p>
+        </w:tc>
+        <w:tc>
+          <w:tcPr>
+            <w:tcW w:w="7242" w:type="dxa"/>
+            <w:tcBorders>
+              <w:left w:val="single" w:sz="4" w:space="0" w:color="000000"/>
+              <w:bottom w:val="single" w:sz="4" w:space="0" w:color="000000"/>
+              <w:right w:val="single" w:sz="4" w:space="0" w:color="000000"/>
+            </w:tcBorders>
+            <w:vAlign w:val="center"/>
+          </w:tcPr>
+          <w:p>
+            <w:pPr>
+              <w:pStyle w:val="Style16"/>
+              <w:spacing w:lineRule="auto" w:line="240"/>
+              <w:ind w:hanging="0" w:left="0"/>
+              <w:rPr/>
+            </w:pPr>
+            <w:r>
+              <w:rPr/>
+              <w:t>Організація роботи редакції, перевірка та затвердження новин.</w:t>
+            </w:r>
+          </w:p>
+        </w:tc>
+      </w:tr>
+      <w:tr>
+        <w:trPr/>
+        <w:tc>
+          <w:tcPr>
+            <w:tcW w:w="412" w:type="dxa"/>
+            <w:tcBorders>
+              <w:left w:val="single" w:sz="4" w:space="0" w:color="000000"/>
+              <w:bottom w:val="single" w:sz="4" w:space="0" w:color="000000"/>
+            </w:tcBorders>
+            <w:vAlign w:val="center"/>
+          </w:tcPr>
+          <w:p>
+            <w:pPr>
+              <w:pStyle w:val="Style16"/>
+              <w:spacing w:lineRule="auto" w:line="240"/>
+              <w:ind w:hanging="0" w:left="0"/>
+              <w:rPr>
+                <w:lang w:val="en-US"/>
+              </w:rPr>
+            </w:pPr>
+            <w:r>
+              <w:rPr>
+                <w:lang w:val="en-US"/>
+              </w:rPr>
+              <w:t>3</w:t>
+            </w:r>
+          </w:p>
+        </w:tc>
+        <w:tc>
+          <w:tcPr>
+            <w:tcW w:w="2483" w:type="dxa"/>
+            <w:tcBorders>
+              <w:left w:val="single" w:sz="4" w:space="0" w:color="000000"/>
+              <w:bottom w:val="single" w:sz="4" w:space="0" w:color="000000"/>
+            </w:tcBorders>
+            <w:vAlign w:val="center"/>
+          </w:tcPr>
+          <w:p>
+            <w:pPr>
+              <w:pStyle w:val="Style16"/>
+              <w:spacing w:lineRule="auto" w:line="240"/>
+              <w:ind w:hanging="0" w:left="0"/>
+              <w:rPr>
+                <w:lang w:val="uk-UA"/>
+              </w:rPr>
+            </w:pPr>
+            <w:r>
+              <w:rPr>
+                <w:lang w:val="uk-UA"/>
+              </w:rPr>
+              <w:t>Репортер</w:t>
+            </w:r>
+          </w:p>
+        </w:tc>
+        <w:tc>
+          <w:tcPr>
+            <w:tcW w:w="1365" w:type="dxa"/>
+            <w:tcBorders>
+              <w:left w:val="single" w:sz="4" w:space="0" w:color="000000"/>
+              <w:bottom w:val="single" w:sz="4" w:space="0" w:color="000000"/>
+            </w:tcBorders>
+            <w:vAlign w:val="center"/>
+          </w:tcPr>
+          <w:p>
+            <w:pPr>
+              <w:pStyle w:val="Style16"/>
+              <w:spacing w:lineRule="auto" w:line="240"/>
+              <w:ind w:hanging="0" w:left="0"/>
+              <w:rPr/>
+            </w:pPr>
+            <w:r>
+              <w:rPr/>
+              <w:t>2</w:t>
+            </w:r>
+          </w:p>
+        </w:tc>
+        <w:tc>
+          <w:tcPr>
+            <w:tcW w:w="7242" w:type="dxa"/>
+            <w:tcBorders>
+              <w:left w:val="single" w:sz="4" w:space="0" w:color="000000"/>
+              <w:bottom w:val="single" w:sz="4" w:space="0" w:color="000000"/>
+              <w:right w:val="single" w:sz="4" w:space="0" w:color="000000"/>
+            </w:tcBorders>
+            <w:vAlign w:val="center"/>
+          </w:tcPr>
+          <w:p>
+            <w:pPr>
+              <w:pStyle w:val="Style16"/>
+              <w:spacing w:lineRule="auto" w:line="240"/>
+              <w:ind w:hanging="0" w:left="0"/>
+              <w:rPr/>
+            </w:pPr>
+            <w:r>
+              <w:rPr/>
+              <w:t>Пошук інформації, збір матеріалів, написання статей.</w:t>
+            </w:r>
+          </w:p>
+        </w:tc>
+      </w:tr>
+      <w:tr>
+        <w:trPr/>
+        <w:tc>
+          <w:tcPr>
+            <w:tcW w:w="412" w:type="dxa"/>
+            <w:tcBorders>
+              <w:left w:val="single" w:sz="4" w:space="0" w:color="000000"/>
+              <w:bottom w:val="single" w:sz="4" w:space="0" w:color="000000"/>
+            </w:tcBorders>
+            <w:vAlign w:val="center"/>
+          </w:tcPr>
+          <w:p>
+            <w:pPr>
+              <w:pStyle w:val="Style16"/>
+              <w:spacing w:lineRule="auto" w:line="240"/>
+              <w:ind w:hanging="0" w:left="0"/>
+              <w:rPr>
+                <w:lang w:val="uk-UA"/>
+              </w:rPr>
+            </w:pPr>
+            <w:r>
+              <w:rPr>
+                <w:lang w:val="uk-UA"/>
+              </w:rPr>
+              <w:t>4</w:t>
+            </w:r>
+          </w:p>
+        </w:tc>
+        <w:tc>
+          <w:tcPr>
+            <w:tcW w:w="2483" w:type="dxa"/>
+            <w:tcBorders>
+              <w:left w:val="single" w:sz="4" w:space="0" w:color="000000"/>
+              <w:bottom w:val="single" w:sz="4" w:space="0" w:color="000000"/>
+            </w:tcBorders>
+            <w:vAlign w:val="center"/>
+          </w:tcPr>
+          <w:p>
+            <w:pPr>
+              <w:pStyle w:val="Style16"/>
+              <w:spacing w:lineRule="auto" w:line="240"/>
+              <w:ind w:hanging="0" w:left="0"/>
+              <w:rPr>
+                <w:lang w:val="uk-UA"/>
+              </w:rPr>
+            </w:pPr>
+            <w:r>
+              <w:rPr>
+                <w:lang w:val="uk-UA"/>
+              </w:rPr>
+              <w:t>Відеооператор</w:t>
+            </w:r>
+          </w:p>
+        </w:tc>
+        <w:tc>
+          <w:tcPr>
+            <w:tcW w:w="1365" w:type="dxa"/>
+            <w:tcBorders>
+              <w:left w:val="single" w:sz="4" w:space="0" w:color="000000"/>
+              <w:bottom w:val="single" w:sz="4" w:space="0" w:color="000000"/>
+            </w:tcBorders>
+            <w:vAlign w:val="center"/>
+          </w:tcPr>
+          <w:p>
+            <w:pPr>
+              <w:pStyle w:val="Style16"/>
+              <w:spacing w:lineRule="auto" w:line="240"/>
+              <w:ind w:hanging="0" w:left="0"/>
+              <w:rPr/>
+            </w:pPr>
+            <w:r>
+              <w:rPr/>
+              <w:t>1</w:t>
+            </w:r>
+          </w:p>
+        </w:tc>
+        <w:tc>
+          <w:tcPr>
+            <w:tcW w:w="7242" w:type="dxa"/>
+            <w:tcBorders>
+              <w:left w:val="single" w:sz="4" w:space="0" w:color="000000"/>
+              <w:bottom w:val="single" w:sz="4" w:space="0" w:color="000000"/>
+              <w:right w:val="single" w:sz="4" w:space="0" w:color="000000"/>
+            </w:tcBorders>
+            <w:vAlign w:val="center"/>
+          </w:tcPr>
+          <w:p>
+            <w:pPr>
+              <w:pStyle w:val="Style16"/>
+              <w:spacing w:lineRule="auto" w:line="240"/>
+              <w:ind w:hanging="0" w:left="0"/>
+              <w:rPr/>
+            </w:pPr>
+            <w:r>
+              <w:rPr/>
+              <w:t>Фото та відеозйомка подій</w:t>
+            </w:r>
+          </w:p>
+        </w:tc>
+      </w:tr>
+      <w:tr>
+        <w:trPr/>
+        <w:tc>
+          <w:tcPr>
+            <w:tcW w:w="412" w:type="dxa"/>
+            <w:tcBorders>
+              <w:left w:val="single" w:sz="4" w:space="0" w:color="000000"/>
+              <w:bottom w:val="single" w:sz="4" w:space="0" w:color="000000"/>
+            </w:tcBorders>
+            <w:vAlign w:val="center"/>
+          </w:tcPr>
+          <w:p>
+            <w:pPr>
+              <w:pStyle w:val="Style16"/>
+              <w:spacing w:lineRule="auto" w:line="240"/>
+              <w:ind w:hanging="0" w:left="0"/>
+              <w:rPr>
+                <w:lang w:val="uk-UA"/>
+              </w:rPr>
+            </w:pPr>
+            <w:r>
+              <w:rPr>
+                <w:lang w:val="uk-UA"/>
+              </w:rPr>
+              <w:t>5</w:t>
+            </w:r>
+          </w:p>
+        </w:tc>
+        <w:tc>
+          <w:tcPr>
+            <w:tcW w:w="2483" w:type="dxa"/>
+            <w:tcBorders>
+              <w:left w:val="single" w:sz="4" w:space="0" w:color="000000"/>
+              <w:bottom w:val="single" w:sz="4" w:space="0" w:color="000000"/>
+            </w:tcBorders>
+            <w:vAlign w:val="center"/>
+          </w:tcPr>
+          <w:p>
+            <w:pPr>
+              <w:pStyle w:val="Style16"/>
+              <w:spacing w:lineRule="auto" w:line="240"/>
+              <w:ind w:hanging="0" w:left="0"/>
+              <w:rPr>
+                <w:lang w:val="uk-UA"/>
+              </w:rPr>
+            </w:pPr>
+            <w:r>
+              <w:rPr>
+                <w:lang w:val="uk-UA"/>
+              </w:rPr>
+              <w:t>Водій</w:t>
+            </w:r>
+          </w:p>
+        </w:tc>
+        <w:tc>
+          <w:tcPr>
+            <w:tcW w:w="1365" w:type="dxa"/>
+            <w:tcBorders>
+              <w:left w:val="single" w:sz="4" w:space="0" w:color="000000"/>
+              <w:bottom w:val="single" w:sz="4" w:space="0" w:color="000000"/>
+            </w:tcBorders>
+            <w:vAlign w:val="center"/>
+          </w:tcPr>
+          <w:p>
+            <w:pPr>
+              <w:pStyle w:val="Style16"/>
+              <w:spacing w:lineRule="auto" w:line="240"/>
+              <w:ind w:hanging="0" w:left="0"/>
+              <w:rPr/>
+            </w:pPr>
+            <w:r>
+              <w:rPr/>
+              <w:t>1</w:t>
+            </w:r>
+          </w:p>
+        </w:tc>
+        <w:tc>
+          <w:tcPr>
+            <w:tcW w:w="7242" w:type="dxa"/>
+            <w:tcBorders>
+              <w:left w:val="single" w:sz="4" w:space="0" w:color="000000"/>
+              <w:bottom w:val="single" w:sz="4" w:space="0" w:color="000000"/>
+              <w:right w:val="single" w:sz="4" w:space="0" w:color="000000"/>
+            </w:tcBorders>
+            <w:vAlign w:val="center"/>
+          </w:tcPr>
+          <w:p>
+            <w:pPr>
+              <w:pStyle w:val="Style16"/>
+              <w:spacing w:lineRule="auto" w:line="240"/>
+              <w:ind w:hanging="0" w:left="0"/>
+              <w:rPr/>
+            </w:pPr>
+            <w:r>
+              <w:rPr/>
+              <w:t>Транспортне забезпечення виїздів журналістів.</w:t>
+            </w:r>
+          </w:p>
+        </w:tc>
+      </w:tr>
+      <w:tr>
+        <w:trPr/>
+        <w:tc>
+          <w:tcPr>
+            <w:tcW w:w="412" w:type="dxa"/>
+            <w:tcBorders>
+              <w:left w:val="single" w:sz="4" w:space="0" w:color="000000"/>
+              <w:bottom w:val="single" w:sz="4" w:space="0" w:color="000000"/>
+            </w:tcBorders>
+            <w:vAlign w:val="center"/>
+          </w:tcPr>
+          <w:p>
+            <w:pPr>
+              <w:pStyle w:val="Style16"/>
+              <w:spacing w:lineRule="auto" w:line="240"/>
+              <w:ind w:hanging="0" w:left="0"/>
+              <w:rPr>
+                <w:lang w:val="uk-UA"/>
+              </w:rPr>
+            </w:pPr>
+            <w:r>
+              <w:rPr>
+                <w:lang w:val="uk-UA"/>
+              </w:rPr>
+              <w:t>6</w:t>
+            </w:r>
+          </w:p>
+        </w:tc>
+        <w:tc>
+          <w:tcPr>
+            <w:tcW w:w="2483" w:type="dxa"/>
+            <w:tcBorders>
+              <w:left w:val="single" w:sz="4" w:space="0" w:color="000000"/>
+              <w:bottom w:val="single" w:sz="4" w:space="0" w:color="000000"/>
+            </w:tcBorders>
+            <w:vAlign w:val="center"/>
+          </w:tcPr>
+          <w:p>
+            <w:pPr>
+              <w:pStyle w:val="Style16"/>
+              <w:spacing w:lineRule="auto" w:line="240"/>
+              <w:ind w:hanging="0" w:left="0"/>
+              <w:rPr>
+                <w:lang w:val="en-US"/>
+              </w:rPr>
+            </w:pPr>
+            <w:r>
+              <w:rPr>
+                <w:lang w:val="en-US"/>
+              </w:rPr>
+              <w:t>Backend-</w:t>
+            </w:r>
+            <w:r>
+              <w:rPr>
+                <w:lang w:val="uk-UA"/>
+              </w:rPr>
+              <w:t>розробник</w:t>
+            </w:r>
+          </w:p>
+        </w:tc>
+        <w:tc>
+          <w:tcPr>
+            <w:tcW w:w="1365" w:type="dxa"/>
+            <w:tcBorders>
+              <w:left w:val="single" w:sz="4" w:space="0" w:color="000000"/>
+              <w:bottom w:val="single" w:sz="4" w:space="0" w:color="000000"/>
+            </w:tcBorders>
+            <w:vAlign w:val="center"/>
+          </w:tcPr>
+          <w:p>
+            <w:pPr>
+              <w:pStyle w:val="Style16"/>
+              <w:spacing w:lineRule="auto" w:line="240"/>
+              <w:ind w:hanging="0" w:left="0"/>
+              <w:rPr/>
+            </w:pPr>
+            <w:r>
+              <w:rPr/>
+              <w:t>1</w:t>
+            </w:r>
+          </w:p>
+        </w:tc>
+        <w:tc>
+          <w:tcPr>
+            <w:tcW w:w="7242" w:type="dxa"/>
+            <w:tcBorders>
+              <w:left w:val="single" w:sz="4" w:space="0" w:color="000000"/>
+              <w:bottom w:val="single" w:sz="4" w:space="0" w:color="000000"/>
+              <w:right w:val="single" w:sz="4" w:space="0" w:color="000000"/>
+            </w:tcBorders>
+            <w:vAlign w:val="center"/>
+          </w:tcPr>
+          <w:p>
+            <w:pPr>
+              <w:pStyle w:val="Style16"/>
+              <w:spacing w:lineRule="auto" w:line="240"/>
+              <w:ind w:hanging="0" w:left="0"/>
+              <w:rPr/>
+            </w:pPr>
+            <w:r>
+              <w:rPr/>
+              <w:t>Розробка та підтримка серверної частини веб-сайту.</w:t>
+            </w:r>
+          </w:p>
+        </w:tc>
+      </w:tr>
+      <w:tr>
+        <w:trPr/>
+        <w:tc>
+          <w:tcPr>
+            <w:tcW w:w="412" w:type="dxa"/>
+            <w:tcBorders>
+              <w:left w:val="single" w:sz="4" w:space="0" w:color="000000"/>
+              <w:bottom w:val="single" w:sz="4" w:space="0" w:color="000000"/>
+            </w:tcBorders>
+            <w:vAlign w:val="center"/>
+          </w:tcPr>
+          <w:p>
+            <w:pPr>
+              <w:pStyle w:val="Style16"/>
+              <w:spacing w:lineRule="auto" w:line="240"/>
+              <w:ind w:hanging="0" w:left="0"/>
+              <w:rPr>
+                <w:lang w:val="uk-UA"/>
+              </w:rPr>
+            </w:pPr>
+            <w:r>
+              <w:rPr>
+                <w:lang w:val="uk-UA"/>
+              </w:rPr>
+              <w:t>7</w:t>
+            </w:r>
+          </w:p>
+        </w:tc>
+        <w:tc>
+          <w:tcPr>
+            <w:tcW w:w="2483" w:type="dxa"/>
+            <w:tcBorders>
+              <w:left w:val="single" w:sz="4" w:space="0" w:color="000000"/>
+              <w:bottom w:val="single" w:sz="4" w:space="0" w:color="000000"/>
+            </w:tcBorders>
+            <w:vAlign w:val="center"/>
+          </w:tcPr>
+          <w:p>
+            <w:pPr>
+              <w:pStyle w:val="Style16"/>
+              <w:spacing w:lineRule="auto" w:line="240"/>
+              <w:ind w:hanging="0" w:left="0"/>
+              <w:rPr>
+                <w:lang w:val="en-US"/>
+              </w:rPr>
+            </w:pPr>
+            <w:r>
+              <w:rPr>
+                <w:lang w:val="en-US"/>
+              </w:rPr>
+              <w:t>Frontend-</w:t>
+            </w:r>
+            <w:r>
+              <w:rPr>
+                <w:lang w:val="uk-UA"/>
+              </w:rPr>
+              <w:t>розробник</w:t>
+            </w:r>
+          </w:p>
+        </w:tc>
+        <w:tc>
+          <w:tcPr>
+            <w:tcW w:w="1365" w:type="dxa"/>
+            <w:tcBorders>
+              <w:left w:val="single" w:sz="4" w:space="0" w:color="000000"/>
+              <w:bottom w:val="single" w:sz="4" w:space="0" w:color="000000"/>
+            </w:tcBorders>
+            <w:vAlign w:val="center"/>
+          </w:tcPr>
+          <w:p>
+            <w:pPr>
+              <w:pStyle w:val="Style16"/>
+              <w:spacing w:lineRule="auto" w:line="240"/>
+              <w:ind w:hanging="0" w:left="0"/>
+              <w:rPr/>
+            </w:pPr>
+            <w:r>
+              <w:rPr/>
+              <w:t>1</w:t>
+            </w:r>
+          </w:p>
+        </w:tc>
+        <w:tc>
+          <w:tcPr>
+            <w:tcW w:w="7242" w:type="dxa"/>
+            <w:tcBorders>
+              <w:left w:val="single" w:sz="4" w:space="0" w:color="000000"/>
+              <w:bottom w:val="single" w:sz="4" w:space="0" w:color="000000"/>
+              <w:right w:val="single" w:sz="4" w:space="0" w:color="000000"/>
+            </w:tcBorders>
+            <w:vAlign w:val="center"/>
+          </w:tcPr>
+          <w:p>
+            <w:pPr>
+              <w:pStyle w:val="Style16"/>
+              <w:spacing w:lineRule="auto" w:line="240"/>
+              <w:ind w:hanging="0" w:left="0"/>
+              <w:rPr/>
+            </w:pPr>
+            <w:r>
+              <w:rPr/>
+              <w:t>Розробка та підтримка інтерфейсу веб-сайту.</w:t>
+            </w:r>
+          </w:p>
+        </w:tc>
+      </w:tr>
+    </w:tbl>
+    <w:p>
+      <w:pPr>
+        <w:pStyle w:val="P1"/>
+        <w:rPr/>
+      </w:pPr>
+      <w:r>
+        <w:rPr/>
       </w:r>
     </w:p>
     <w:p>
@@ -4391,7 +4987,7 @@
           <wp:inline distT="0" distB="0" distL="0" distR="0">
             <wp:extent cx="1661160" cy="2910205"/>
             <wp:effectExtent l="0" t="0" r="0" b="0"/>
-            <wp:docPr id="2" name="Зображення2"/>
+            <wp:docPr id="1" name="Зображення2"/>
             <wp:cNvGraphicFramePr>
               <a:graphicFrameLocks xmlns:a="http://schemas.openxmlformats.org/drawingml/2006/main" noChangeAspect="1"/>
             </wp:cNvGraphicFramePr>
@@ -4399,13 +4995,13 @@
               <a:graphicData uri="http://schemas.openxmlformats.org/drawingml/2006/picture">
                 <pic:pic xmlns:pic="http://schemas.openxmlformats.org/drawingml/2006/picture">
                   <pic:nvPicPr>
-                    <pic:cNvPr id="2" name="Зображення2"/>
+                    <pic:cNvPr id="1" name="Зображення2"/>
                     <pic:cNvPicPr>
                       <a:picLocks noChangeAspect="1" noChangeArrowheads="1"/>
                     </pic:cNvPicPr>
                   </pic:nvPicPr>
                   <pic:blipFill>
-                    <a:blip r:embed="rId3"/>
+                    <a:blip r:embed="rId2"/>
                     <a:stretch>
                       <a:fillRect/>
                     </a:stretch>

</xml_diff>

<commit_message>
feat: SP1 chapter 3 done
</commit_message>
<xml_diff>
--- a/51SP Sertyficazija PZ/1/SP1_KNT-116m_Onyshchenko_15.docx
+++ b/51SP Sertyficazija PZ/1/SP1_KNT-116m_Onyshchenko_15.docx
@@ -2050,7 +2050,17 @@
       </w:pPr>
       <w:r>
         <w:rPr/>
-        <w:t>Організаційна структура підприємства з описом обов’язків представлена на таблиці 2.1.</w:t>
+        <w:t xml:space="preserve">Організаційна структура підприємства з описом обов’язків представлена </w:t>
+      </w:r>
+      <w:r>
+        <w:rPr>
+          <w:lang w:val="uk-UA"/>
+        </w:rPr>
+        <w:t>у</w:t>
+      </w:r>
+      <w:r>
+        <w:rPr/>
+        <w:t xml:space="preserve"> таблиці 2.1.</w:t>
       </w:r>
     </w:p>
     <w:p>
@@ -2088,8 +2098,8 @@
       <w:tblGrid>
         <w:gridCol w:w="412"/>
         <w:gridCol w:w="2483"/>
+        <w:gridCol w:w="7242"/>
         <w:gridCol w:w="1365"/>
-        <w:gridCol w:w="7242"/>
       </w:tblGrid>
       <w:tr>
         <w:trPr/>
@@ -2155,7 +2165,7 @@
         </w:tc>
         <w:tc>
           <w:tcPr>
-            <w:tcW w:w="1365" w:type="dxa"/>
+            <w:tcW w:w="7242" w:type="dxa"/>
             <w:tcBorders>
               <w:top w:val="single" w:sz="4" w:space="0" w:color="000000"/>
               <w:left w:val="single" w:sz="4" w:space="0" w:color="000000"/>
@@ -2178,13 +2188,13 @@
                 <w:b/>
                 <w:bCs/>
               </w:rPr>
-              <w:t>Кількість</w:t>
-            </w:r>
-          </w:p>
-        </w:tc>
-        <w:tc>
-          <w:tcPr>
-            <w:tcW w:w="7242" w:type="dxa"/>
+              <w:t>Обов’язки</w:t>
+            </w:r>
+          </w:p>
+        </w:tc>
+        <w:tc>
+          <w:tcPr>
+            <w:tcW w:w="1365" w:type="dxa"/>
             <w:tcBorders>
               <w:top w:val="single" w:sz="4" w:space="0" w:color="000000"/>
               <w:left w:val="single" w:sz="4" w:space="0" w:color="000000"/>
@@ -2208,7 +2218,7 @@
                 <w:b/>
                 <w:bCs/>
               </w:rPr>
-              <w:t>Обов’язки</w:t>
+              <w:t>Кількість</w:t>
             </w:r>
           </w:p>
         </w:tc>
@@ -2269,10 +2279,33 @@
         </w:tc>
         <w:tc>
           <w:tcPr>
+            <w:tcW w:w="7242" w:type="dxa"/>
+            <w:tcBorders>
+              <w:left w:val="single" w:sz="4" w:space="0" w:color="000000"/>
+              <w:bottom w:val="single" w:sz="4" w:space="0" w:color="000000"/>
+            </w:tcBorders>
+            <w:vAlign w:val="center"/>
+          </w:tcPr>
+          <w:p>
+            <w:pPr>
+              <w:pStyle w:val="Style16"/>
+              <w:spacing w:lineRule="auto" w:line="240"/>
+              <w:ind w:hanging="0" w:left="0"/>
+              <w:rPr/>
+            </w:pPr>
+            <w:r>
+              <w:rPr/>
+              <w:t>Керування компанією, фінансове планування, взаємодія з партнерами.</w:t>
+            </w:r>
+          </w:p>
+        </w:tc>
+        <w:tc>
+          <w:tcPr>
             <w:tcW w:w="1365" w:type="dxa"/>
             <w:tcBorders>
               <w:left w:val="single" w:sz="4" w:space="0" w:color="000000"/>
               <w:bottom w:val="single" w:sz="4" w:space="0" w:color="000000"/>
+              <w:right w:val="single" w:sz="4" w:space="0" w:color="000000"/>
             </w:tcBorders>
             <w:vAlign w:val="center"/>
           </w:tcPr>
@@ -2286,29 +2319,6 @@
             <w:r>
               <w:rPr/>
               <w:t>1</w:t>
-            </w:r>
-          </w:p>
-        </w:tc>
-        <w:tc>
-          <w:tcPr>
-            <w:tcW w:w="7242" w:type="dxa"/>
-            <w:tcBorders>
-              <w:left w:val="single" w:sz="4" w:space="0" w:color="000000"/>
-              <w:bottom w:val="single" w:sz="4" w:space="0" w:color="000000"/>
-              <w:right w:val="single" w:sz="4" w:space="0" w:color="000000"/>
-            </w:tcBorders>
-            <w:vAlign w:val="center"/>
-          </w:tcPr>
-          <w:p>
-            <w:pPr>
-              <w:pStyle w:val="Style16"/>
-              <w:spacing w:lineRule="auto" w:line="240"/>
-              <w:ind w:hanging="0" w:left="0"/>
-              <w:rPr/>
-            </w:pPr>
-            <w:r>
-              <w:rPr/>
-              <w:t>Керування компанією, фінансове планування, взаємодія з партнерами.</w:t>
             </w:r>
           </w:p>
         </w:tc>
@@ -2369,10 +2379,33 @@
         </w:tc>
         <w:tc>
           <w:tcPr>
+            <w:tcW w:w="7242" w:type="dxa"/>
+            <w:tcBorders>
+              <w:left w:val="single" w:sz="4" w:space="0" w:color="000000"/>
+              <w:bottom w:val="single" w:sz="4" w:space="0" w:color="000000"/>
+            </w:tcBorders>
+            <w:vAlign w:val="center"/>
+          </w:tcPr>
+          <w:p>
+            <w:pPr>
+              <w:pStyle w:val="Style16"/>
+              <w:spacing w:lineRule="auto" w:line="240"/>
+              <w:ind w:hanging="0" w:left="0"/>
+              <w:rPr/>
+            </w:pPr>
+            <w:r>
+              <w:rPr/>
+              <w:t>Організація роботи редакції, перевірка та затвердження новин.</w:t>
+            </w:r>
+          </w:p>
+        </w:tc>
+        <w:tc>
+          <w:tcPr>
             <w:tcW w:w="1365" w:type="dxa"/>
             <w:tcBorders>
               <w:left w:val="single" w:sz="4" w:space="0" w:color="000000"/>
               <w:bottom w:val="single" w:sz="4" w:space="0" w:color="000000"/>
+              <w:right w:val="single" w:sz="4" w:space="0" w:color="000000"/>
             </w:tcBorders>
             <w:vAlign w:val="center"/>
           </w:tcPr>
@@ -2386,29 +2419,6 @@
             <w:r>
               <w:rPr/>
               <w:t>1</w:t>
-            </w:r>
-          </w:p>
-        </w:tc>
-        <w:tc>
-          <w:tcPr>
-            <w:tcW w:w="7242" w:type="dxa"/>
-            <w:tcBorders>
-              <w:left w:val="single" w:sz="4" w:space="0" w:color="000000"/>
-              <w:bottom w:val="single" w:sz="4" w:space="0" w:color="000000"/>
-              <w:right w:val="single" w:sz="4" w:space="0" w:color="000000"/>
-            </w:tcBorders>
-            <w:vAlign w:val="center"/>
-          </w:tcPr>
-          <w:p>
-            <w:pPr>
-              <w:pStyle w:val="Style16"/>
-              <w:spacing w:lineRule="auto" w:line="240"/>
-              <w:ind w:hanging="0" w:left="0"/>
-              <w:rPr/>
-            </w:pPr>
-            <w:r>
-              <w:rPr/>
-              <w:t>Організація роботи редакції, перевірка та затвердження новин.</w:t>
             </w:r>
           </w:p>
         </w:tc>
@@ -2469,10 +2479,33 @@
         </w:tc>
         <w:tc>
           <w:tcPr>
+            <w:tcW w:w="7242" w:type="dxa"/>
+            <w:tcBorders>
+              <w:left w:val="single" w:sz="4" w:space="0" w:color="000000"/>
+              <w:bottom w:val="single" w:sz="4" w:space="0" w:color="000000"/>
+            </w:tcBorders>
+            <w:vAlign w:val="center"/>
+          </w:tcPr>
+          <w:p>
+            <w:pPr>
+              <w:pStyle w:val="Style16"/>
+              <w:spacing w:lineRule="auto" w:line="240"/>
+              <w:ind w:hanging="0" w:left="0"/>
+              <w:rPr/>
+            </w:pPr>
+            <w:r>
+              <w:rPr/>
+              <w:t>Пошук інформації, збір матеріалів, написання статей.</w:t>
+            </w:r>
+          </w:p>
+        </w:tc>
+        <w:tc>
+          <w:tcPr>
             <w:tcW w:w="1365" w:type="dxa"/>
             <w:tcBorders>
               <w:left w:val="single" w:sz="4" w:space="0" w:color="000000"/>
               <w:bottom w:val="single" w:sz="4" w:space="0" w:color="000000"/>
+              <w:right w:val="single" w:sz="4" w:space="0" w:color="000000"/>
             </w:tcBorders>
             <w:vAlign w:val="center"/>
           </w:tcPr>
@@ -2486,29 +2519,6 @@
             <w:r>
               <w:rPr/>
               <w:t>2</w:t>
-            </w:r>
-          </w:p>
-        </w:tc>
-        <w:tc>
-          <w:tcPr>
-            <w:tcW w:w="7242" w:type="dxa"/>
-            <w:tcBorders>
-              <w:left w:val="single" w:sz="4" w:space="0" w:color="000000"/>
-              <w:bottom w:val="single" w:sz="4" w:space="0" w:color="000000"/>
-              <w:right w:val="single" w:sz="4" w:space="0" w:color="000000"/>
-            </w:tcBorders>
-            <w:vAlign w:val="center"/>
-          </w:tcPr>
-          <w:p>
-            <w:pPr>
-              <w:pStyle w:val="Style16"/>
-              <w:spacing w:lineRule="auto" w:line="240"/>
-              <w:ind w:hanging="0" w:left="0"/>
-              <w:rPr/>
-            </w:pPr>
-            <w:r>
-              <w:rPr/>
-              <w:t>Пошук інформації, збір матеріалів, написання статей.</w:t>
             </w:r>
           </w:p>
         </w:tc>
@@ -2569,10 +2579,33 @@
         </w:tc>
         <w:tc>
           <w:tcPr>
+            <w:tcW w:w="7242" w:type="dxa"/>
+            <w:tcBorders>
+              <w:left w:val="single" w:sz="4" w:space="0" w:color="000000"/>
+              <w:bottom w:val="single" w:sz="4" w:space="0" w:color="000000"/>
+            </w:tcBorders>
+            <w:vAlign w:val="center"/>
+          </w:tcPr>
+          <w:p>
+            <w:pPr>
+              <w:pStyle w:val="Style16"/>
+              <w:spacing w:lineRule="auto" w:line="240"/>
+              <w:ind w:hanging="0" w:left="0"/>
+              <w:rPr/>
+            </w:pPr>
+            <w:r>
+              <w:rPr/>
+              <w:t>Фото та відеозйомка подій</w:t>
+            </w:r>
+          </w:p>
+        </w:tc>
+        <w:tc>
+          <w:tcPr>
             <w:tcW w:w="1365" w:type="dxa"/>
             <w:tcBorders>
               <w:left w:val="single" w:sz="4" w:space="0" w:color="000000"/>
               <w:bottom w:val="single" w:sz="4" w:space="0" w:color="000000"/>
+              <w:right w:val="single" w:sz="4" w:space="0" w:color="000000"/>
             </w:tcBorders>
             <w:vAlign w:val="center"/>
           </w:tcPr>
@@ -2586,29 +2619,6 @@
             <w:r>
               <w:rPr/>
               <w:t>1</w:t>
-            </w:r>
-          </w:p>
-        </w:tc>
-        <w:tc>
-          <w:tcPr>
-            <w:tcW w:w="7242" w:type="dxa"/>
-            <w:tcBorders>
-              <w:left w:val="single" w:sz="4" w:space="0" w:color="000000"/>
-              <w:bottom w:val="single" w:sz="4" w:space="0" w:color="000000"/>
-              <w:right w:val="single" w:sz="4" w:space="0" w:color="000000"/>
-            </w:tcBorders>
-            <w:vAlign w:val="center"/>
-          </w:tcPr>
-          <w:p>
-            <w:pPr>
-              <w:pStyle w:val="Style16"/>
-              <w:spacing w:lineRule="auto" w:line="240"/>
-              <w:ind w:hanging="0" w:left="0"/>
-              <w:rPr/>
-            </w:pPr>
-            <w:r>
-              <w:rPr/>
-              <w:t>Фото та відеозйомка подій</w:t>
             </w:r>
           </w:p>
         </w:tc>
@@ -2669,10 +2679,33 @@
         </w:tc>
         <w:tc>
           <w:tcPr>
+            <w:tcW w:w="7242" w:type="dxa"/>
+            <w:tcBorders>
+              <w:left w:val="single" w:sz="4" w:space="0" w:color="000000"/>
+              <w:bottom w:val="single" w:sz="4" w:space="0" w:color="000000"/>
+            </w:tcBorders>
+            <w:vAlign w:val="center"/>
+          </w:tcPr>
+          <w:p>
+            <w:pPr>
+              <w:pStyle w:val="Style16"/>
+              <w:spacing w:lineRule="auto" w:line="240"/>
+              <w:ind w:hanging="0" w:left="0"/>
+              <w:rPr/>
+            </w:pPr>
+            <w:r>
+              <w:rPr/>
+              <w:t>Транспортне забезпечення виїздів журналістів.</w:t>
+            </w:r>
+          </w:p>
+        </w:tc>
+        <w:tc>
+          <w:tcPr>
             <w:tcW w:w="1365" w:type="dxa"/>
             <w:tcBorders>
               <w:left w:val="single" w:sz="4" w:space="0" w:color="000000"/>
               <w:bottom w:val="single" w:sz="4" w:space="0" w:color="000000"/>
+              <w:right w:val="single" w:sz="4" w:space="0" w:color="000000"/>
             </w:tcBorders>
             <w:vAlign w:val="center"/>
           </w:tcPr>
@@ -2686,29 +2719,6 @@
             <w:r>
               <w:rPr/>
               <w:t>1</w:t>
-            </w:r>
-          </w:p>
-        </w:tc>
-        <w:tc>
-          <w:tcPr>
-            <w:tcW w:w="7242" w:type="dxa"/>
-            <w:tcBorders>
-              <w:left w:val="single" w:sz="4" w:space="0" w:color="000000"/>
-              <w:bottom w:val="single" w:sz="4" w:space="0" w:color="000000"/>
-              <w:right w:val="single" w:sz="4" w:space="0" w:color="000000"/>
-            </w:tcBorders>
-            <w:vAlign w:val="center"/>
-          </w:tcPr>
-          <w:p>
-            <w:pPr>
-              <w:pStyle w:val="Style16"/>
-              <w:spacing w:lineRule="auto" w:line="240"/>
-              <w:ind w:hanging="0" w:left="0"/>
-              <w:rPr/>
-            </w:pPr>
-            <w:r>
-              <w:rPr/>
-              <w:t>Транспортне забезпечення виїздів журналістів.</w:t>
             </w:r>
           </w:p>
         </w:tc>
@@ -2775,10 +2785,33 @@
         </w:tc>
         <w:tc>
           <w:tcPr>
+            <w:tcW w:w="7242" w:type="dxa"/>
+            <w:tcBorders>
+              <w:left w:val="single" w:sz="4" w:space="0" w:color="000000"/>
+              <w:bottom w:val="single" w:sz="4" w:space="0" w:color="000000"/>
+            </w:tcBorders>
+            <w:vAlign w:val="center"/>
+          </w:tcPr>
+          <w:p>
+            <w:pPr>
+              <w:pStyle w:val="Style16"/>
+              <w:spacing w:lineRule="auto" w:line="240"/>
+              <w:ind w:hanging="0" w:left="0"/>
+              <w:rPr/>
+            </w:pPr>
+            <w:r>
+              <w:rPr/>
+              <w:t>Розробка та підтримка серверної частини веб-сайту.</w:t>
+            </w:r>
+          </w:p>
+        </w:tc>
+        <w:tc>
+          <w:tcPr>
             <w:tcW w:w="1365" w:type="dxa"/>
             <w:tcBorders>
               <w:left w:val="single" w:sz="4" w:space="0" w:color="000000"/>
               <w:bottom w:val="single" w:sz="4" w:space="0" w:color="000000"/>
+              <w:right w:val="single" w:sz="4" w:space="0" w:color="000000"/>
             </w:tcBorders>
             <w:vAlign w:val="center"/>
           </w:tcPr>
@@ -2792,29 +2825,6 @@
             <w:r>
               <w:rPr/>
               <w:t>1</w:t>
-            </w:r>
-          </w:p>
-        </w:tc>
-        <w:tc>
-          <w:tcPr>
-            <w:tcW w:w="7242" w:type="dxa"/>
-            <w:tcBorders>
-              <w:left w:val="single" w:sz="4" w:space="0" w:color="000000"/>
-              <w:bottom w:val="single" w:sz="4" w:space="0" w:color="000000"/>
-              <w:right w:val="single" w:sz="4" w:space="0" w:color="000000"/>
-            </w:tcBorders>
-            <w:vAlign w:val="center"/>
-          </w:tcPr>
-          <w:p>
-            <w:pPr>
-              <w:pStyle w:val="Style16"/>
-              <w:spacing w:lineRule="auto" w:line="240"/>
-              <w:ind w:hanging="0" w:left="0"/>
-              <w:rPr/>
-            </w:pPr>
-            <w:r>
-              <w:rPr/>
-              <w:t>Розробка та підтримка серверної частини веб-сайту.</w:t>
             </w:r>
           </w:p>
         </w:tc>
@@ -2881,10 +2891,45 @@
         </w:tc>
         <w:tc>
           <w:tcPr>
+            <w:tcW w:w="7242" w:type="dxa"/>
+            <w:tcBorders>
+              <w:left w:val="single" w:sz="4" w:space="0" w:color="000000"/>
+              <w:bottom w:val="single" w:sz="4" w:space="0" w:color="000000"/>
+            </w:tcBorders>
+            <w:vAlign w:val="center"/>
+          </w:tcPr>
+          <w:p>
+            <w:pPr>
+              <w:pStyle w:val="Style16"/>
+              <w:spacing w:lineRule="auto" w:line="240"/>
+              <w:ind w:hanging="0" w:left="0"/>
+              <w:rPr/>
+            </w:pPr>
+            <w:r>
+              <w:rPr/>
+              <w:t xml:space="preserve">Розробка та підтримка інтерфейсу веб-сайту, </w:t>
+            </w:r>
+            <w:r>
+              <w:rPr>
+                <w:lang w:val="en-US"/>
+              </w:rPr>
+              <w:t xml:space="preserve">Telegram </w:t>
+            </w:r>
+            <w:r>
+              <w:rPr>
+                <w:lang w:val="uk-UA"/>
+              </w:rPr>
+              <w:t>канал.</w:t>
+            </w:r>
+          </w:p>
+        </w:tc>
+        <w:tc>
+          <w:tcPr>
             <w:tcW w:w="1365" w:type="dxa"/>
             <w:tcBorders>
               <w:left w:val="single" w:sz="4" w:space="0" w:color="000000"/>
               <w:bottom w:val="single" w:sz="4" w:space="0" w:color="000000"/>
+              <w:right w:val="single" w:sz="4" w:space="0" w:color="000000"/>
             </w:tcBorders>
             <w:vAlign w:val="center"/>
           </w:tcPr>
@@ -2901,29 +2946,6 @@
             </w:r>
           </w:p>
         </w:tc>
-        <w:tc>
-          <w:tcPr>
-            <w:tcW w:w="7242" w:type="dxa"/>
-            <w:tcBorders>
-              <w:left w:val="single" w:sz="4" w:space="0" w:color="000000"/>
-              <w:bottom w:val="single" w:sz="4" w:space="0" w:color="000000"/>
-              <w:right w:val="single" w:sz="4" w:space="0" w:color="000000"/>
-            </w:tcBorders>
-            <w:vAlign w:val="center"/>
-          </w:tcPr>
-          <w:p>
-            <w:pPr>
-              <w:pStyle w:val="Style16"/>
-              <w:spacing w:lineRule="auto" w:line="240"/>
-              <w:ind w:hanging="0" w:left="0"/>
-              <w:rPr/>
-            </w:pPr>
-            <w:r>
-              <w:rPr/>
-              <w:t>Розробка та підтримка інтерфейсу веб-сайту.</w:t>
-            </w:r>
-          </w:p>
-        </w:tc>
       </w:tr>
     </w:tbl>
     <w:p>
@@ -2938,6 +2960,7 @@
     <w:p>
       <w:pPr>
         <w:pStyle w:val="H2"/>
+        <w:spacing w:lineRule="auto" w:line="360"/>
         <w:rPr/>
       </w:pPr>
       <w:r>
@@ -2986,7 +3009,7 @@
     </w:p>
     <w:tbl>
       <w:tblPr>
-        <w:tblW w:w="11618" w:type="dxa"/>
+        <w:tblW w:w="11678" w:type="dxa"/>
         <w:jc w:val="left"/>
         <w:tblInd w:w="-1258" w:type="dxa"/>
         <w:tblLayout w:type="fixed"/>
@@ -2998,10 +3021,10 @@
         </w:tblCellMar>
       </w:tblPr>
       <w:tblGrid>
-        <w:gridCol w:w="370"/>
-        <w:gridCol w:w="6352"/>
-        <w:gridCol w:w="1991"/>
-        <w:gridCol w:w="2905"/>
+        <w:gridCol w:w="412"/>
+        <w:gridCol w:w="5084"/>
+        <w:gridCol w:w="3473"/>
+        <w:gridCol w:w="2709"/>
       </w:tblGrid>
       <w:tr>
         <w:trPr>
@@ -3009,7 +3032,7 @@
         </w:trPr>
         <w:tc>
           <w:tcPr>
-            <w:tcW w:w="370" w:type="dxa"/>
+            <w:tcW w:w="412" w:type="dxa"/>
             <w:tcBorders>
               <w:top w:val="single" w:sz="4" w:space="0" w:color="000000"/>
               <w:left w:val="single" w:sz="4" w:space="0" w:color="000000"/>
@@ -3023,29 +3046,58 @@
               <w:spacing w:lineRule="auto" w:line="240"/>
               <w:ind w:hanging="0" w:left="0"/>
               <w:jc w:val="center"/>
+              <w:rPr>
+                <w:sz w:val="28"/>
+                <w:szCs w:val="28"/>
+              </w:rPr>
+            </w:pPr>
+            <w:r>
               <w:rPr>
                 <w:b/>
                 <w:bCs/>
-                <w:sz w:val="24"/>
-                <w:szCs w:val="24"/>
+                <w:sz w:val="28"/>
+                <w:szCs w:val="28"/>
                 <w:lang w:val="uk-UA"/>
+              </w:rPr>
+              <w:t>№</w:t>
+            </w:r>
+          </w:p>
+        </w:tc>
+        <w:tc>
+          <w:tcPr>
+            <w:tcW w:w="5084" w:type="dxa"/>
+            <w:tcBorders>
+              <w:top w:val="single" w:sz="4" w:space="0" w:color="000000"/>
+              <w:left w:val="single" w:sz="4" w:space="0" w:color="000000"/>
+              <w:bottom w:val="single" w:sz="4" w:space="0" w:color="000000"/>
+            </w:tcBorders>
+            <w:vAlign w:val="center"/>
+          </w:tcPr>
+          <w:p>
+            <w:pPr>
+              <w:pStyle w:val="user4"/>
+              <w:spacing w:lineRule="auto" w:line="240"/>
+              <w:ind w:hanging="0" w:left="0"/>
+              <w:jc w:val="center"/>
+              <w:rPr>
+                <w:sz w:val="28"/>
+                <w:szCs w:val="28"/>
               </w:rPr>
             </w:pPr>
             <w:r>
               <w:rPr>
                 <w:b/>
                 <w:bCs/>
-                <w:sz w:val="24"/>
-                <w:szCs w:val="24"/>
-                <w:lang w:val="uk-UA"/>
-              </w:rPr>
-              <w:t>№</w:t>
-            </w:r>
-          </w:p>
-        </w:tc>
-        <w:tc>
-          <w:tcPr>
-            <w:tcW w:w="6352" w:type="dxa"/>
+                <w:sz w:val="28"/>
+                <w:szCs w:val="28"/>
+              </w:rPr>
+              <w:t>Ціль</w:t>
+            </w:r>
+          </w:p>
+        </w:tc>
+        <w:tc>
+          <w:tcPr>
+            <w:tcW w:w="3473" w:type="dxa"/>
             <w:tcBorders>
               <w:top w:val="single" w:sz="4" w:space="0" w:color="000000"/>
               <w:left w:val="single" w:sz="4" w:space="0" w:color="000000"/>
@@ -3055,94 +3107,62 @@
           </w:tcPr>
           <w:p>
             <w:pPr>
-              <w:pStyle w:val="user4"/>
+              <w:pStyle w:val="p11"/>
               <w:spacing w:lineRule="auto" w:line="240"/>
               <w:ind w:hanging="0" w:left="0"/>
               <w:jc w:val="center"/>
               <w:rPr>
                 <w:b/>
                 <w:bCs/>
-                <w:sz w:val="24"/>
-                <w:szCs w:val="24"/>
+                <w:sz w:val="28"/>
+                <w:szCs w:val="28"/>
               </w:rPr>
             </w:pPr>
             <w:r>
               <w:rPr>
                 <w:b/>
                 <w:bCs/>
-                <w:sz w:val="24"/>
-                <w:szCs w:val="24"/>
-              </w:rPr>
-              <w:t>Ціль</w:t>
-            </w:r>
-          </w:p>
-        </w:tc>
-        <w:tc>
-          <w:tcPr>
-            <w:tcW w:w="1991" w:type="dxa"/>
+                <w:sz w:val="28"/>
+                <w:szCs w:val="28"/>
+              </w:rPr>
+              <w:t>Показник досягнення</w:t>
+            </w:r>
+          </w:p>
+        </w:tc>
+        <w:tc>
+          <w:tcPr>
+            <w:tcW w:w="2709" w:type="dxa"/>
             <w:tcBorders>
               <w:top w:val="single" w:sz="4" w:space="0" w:color="000000"/>
               <w:left w:val="single" w:sz="4" w:space="0" w:color="000000"/>
               <w:bottom w:val="single" w:sz="4" w:space="0" w:color="000000"/>
+              <w:right w:val="single" w:sz="4" w:space="0" w:color="000000"/>
             </w:tcBorders>
             <w:vAlign w:val="center"/>
           </w:tcPr>
           <w:p>
             <w:pPr>
-              <w:pStyle w:val="user4"/>
-              <w:spacing w:lineRule="auto" w:line="240"/>
+              <w:pStyle w:val="BodyText"/>
+              <w:spacing w:lineRule="auto" w:line="240" w:before="0" w:after="0"/>
               <w:ind w:hanging="0" w:left="0"/>
               <w:jc w:val="center"/>
               <w:rPr>
                 <w:b/>
                 <w:bCs/>
-                <w:sz w:val="24"/>
-                <w:szCs w:val="24"/>
+                <w:sz w:val="28"/>
+                <w:szCs w:val="28"/>
+                <w:lang w:val="uk-UA"/>
               </w:rPr>
             </w:pPr>
             <w:r>
               <w:rPr>
                 <w:b/>
                 <w:bCs/>
-                <w:sz w:val="24"/>
-                <w:szCs w:val="24"/>
-              </w:rPr>
-              <w:t>Термін</w:t>
-            </w:r>
-          </w:p>
-        </w:tc>
-        <w:tc>
-          <w:tcPr>
-            <w:tcW w:w="2905" w:type="dxa"/>
-            <w:tcBorders>
-              <w:top w:val="single" w:sz="4" w:space="0" w:color="000000"/>
-              <w:left w:val="single" w:sz="4" w:space="0" w:color="000000"/>
-              <w:bottom w:val="single" w:sz="4" w:space="0" w:color="000000"/>
-              <w:right w:val="single" w:sz="4" w:space="0" w:color="000000"/>
-            </w:tcBorders>
-            <w:vAlign w:val="center"/>
-          </w:tcPr>
-          <w:p>
-            <w:pPr>
-              <w:pStyle w:val="p11"/>
-              <w:spacing w:lineRule="auto" w:line="240"/>
-              <w:ind w:hanging="0" w:left="0"/>
-              <w:jc w:val="center"/>
-              <w:rPr>
-                <w:b/>
-                <w:bCs/>
-                <w:sz w:val="24"/>
-                <w:szCs w:val="24"/>
-              </w:rPr>
-            </w:pPr>
-            <w:r>
-              <w:rPr>
-                <w:b/>
-                <w:bCs/>
-                <w:sz w:val="24"/>
-                <w:szCs w:val="24"/>
-              </w:rPr>
-              <w:t>Показник досягнення</w:t>
+                <w:sz w:val="28"/>
+                <w:szCs w:val="28"/>
+                <w:lang w:val="uk-UA"/>
+              </w:rPr>
+              <w:t>Відповідальна особа</w:t>
             </w:r>
           </w:p>
         </w:tc>
@@ -3151,7 +3171,7 @@
         <w:trPr/>
         <w:tc>
           <w:tcPr>
-            <w:tcW w:w="370" w:type="dxa"/>
+            <w:tcW w:w="412" w:type="dxa"/>
             <w:tcBorders>
               <w:left w:val="single" w:sz="4" w:space="0" w:color="000000"/>
               <w:bottom w:val="single" w:sz="4" w:space="0" w:color="000000"/>
@@ -3164,14 +3184,14 @@
               <w:spacing w:lineRule="auto" w:line="240"/>
               <w:ind w:hanging="0" w:left="0"/>
               <w:rPr>
-                <w:sz w:val="24"/>
-                <w:szCs w:val="24"/>
-              </w:rPr>
-            </w:pPr>
-            <w:r>
-              <w:rPr>
-                <w:sz w:val="24"/>
-                <w:szCs w:val="24"/>
+                <w:sz w:val="28"/>
+                <w:szCs w:val="28"/>
+              </w:rPr>
+            </w:pPr>
+            <w:r>
+              <w:rPr>
+                <w:sz w:val="28"/>
+                <w:szCs w:val="28"/>
               </w:rPr>
               <w:t>1</w:t>
             </w:r>
@@ -3179,7 +3199,7 @@
         </w:tc>
         <w:tc>
           <w:tcPr>
-            <w:tcW w:w="6352" w:type="dxa"/>
+            <w:tcW w:w="5084" w:type="dxa"/>
             <w:tcBorders>
               <w:left w:val="single" w:sz="4" w:space="0" w:color="000000"/>
               <w:bottom w:val="single" w:sz="4" w:space="0" w:color="000000"/>
@@ -3192,22 +3212,22 @@
               <w:spacing w:lineRule="auto" w:line="240"/>
               <w:ind w:hanging="0" w:left="0"/>
               <w:rPr>
-                <w:sz w:val="24"/>
-                <w:szCs w:val="24"/>
-              </w:rPr>
-            </w:pPr>
-            <w:r>
-              <w:rPr>
-                <w:sz w:val="24"/>
-                <w:szCs w:val="24"/>
-              </w:rPr>
-              <w:t>Забезпечити роботу сайту у 99% випадків на добу</w:t>
-            </w:r>
-          </w:p>
-        </w:tc>
-        <w:tc>
-          <w:tcPr>
-            <w:tcW w:w="1991" w:type="dxa"/>
+                <w:sz w:val="28"/>
+                <w:szCs w:val="28"/>
+              </w:rPr>
+            </w:pPr>
+            <w:r>
+              <w:rPr>
+                <w:sz w:val="28"/>
+                <w:szCs w:val="28"/>
+              </w:rPr>
+              <w:t>Забезпечити достовірність новини</w:t>
+            </w:r>
+          </w:p>
+        </w:tc>
+        <w:tc>
+          <w:tcPr>
+            <w:tcW w:w="3473" w:type="dxa"/>
             <w:tcBorders>
               <w:left w:val="single" w:sz="4" w:space="0" w:color="000000"/>
               <w:bottom w:val="single" w:sz="4" w:space="0" w:color="000000"/>
@@ -3216,26 +3236,26 @@
           </w:tcPr>
           <w:p>
             <w:pPr>
-              <w:pStyle w:val="user4"/>
-              <w:spacing w:lineRule="auto" w:line="240"/>
-              <w:ind w:hanging="0" w:left="0"/>
-              <w:rPr>
-                <w:sz w:val="24"/>
-                <w:szCs w:val="24"/>
-              </w:rPr>
-            </w:pPr>
-            <w:r>
-              <w:rPr>
-                <w:sz w:val="24"/>
-                <w:szCs w:val="24"/>
-              </w:rPr>
-              <w:t>До кінця місяця</w:t>
-            </w:r>
-          </w:p>
-        </w:tc>
-        <w:tc>
-          <w:tcPr>
-            <w:tcW w:w="2905" w:type="dxa"/>
+              <w:pStyle w:val="p11"/>
+              <w:spacing w:lineRule="auto" w:line="240"/>
+              <w:ind w:hanging="0" w:left="0"/>
+              <w:rPr>
+                <w:sz w:val="28"/>
+                <w:szCs w:val="28"/>
+              </w:rPr>
+            </w:pPr>
+            <w:r>
+              <w:rPr>
+                <w:sz w:val="28"/>
+                <w:szCs w:val="28"/>
+              </w:rPr>
+              <w:t>Не менше 98% опублікованих матеріалів без підтверджених фактичних помилок за місяць</w:t>
+            </w:r>
+          </w:p>
+        </w:tc>
+        <w:tc>
+          <w:tcPr>
+            <w:tcW w:w="2709" w:type="dxa"/>
             <w:tcBorders>
               <w:left w:val="single" w:sz="4" w:space="0" w:color="000000"/>
               <w:bottom w:val="single" w:sz="4" w:space="0" w:color="000000"/>
@@ -3245,20 +3265,20 @@
           </w:tcPr>
           <w:p>
             <w:pPr>
-              <w:pStyle w:val="p11"/>
-              <w:spacing w:lineRule="auto" w:line="240"/>
-              <w:ind w:hanging="0" w:left="0"/>
-              <w:rPr>
-                <w:sz w:val="24"/>
-                <w:szCs w:val="24"/>
-              </w:rPr>
-            </w:pPr>
-            <w:r>
-              <w:rPr>
-                <w:sz w:val="24"/>
-                <w:szCs w:val="24"/>
-              </w:rPr>
-              <w:t>Сайт працює у 99% випадків на добу</w:t>
+              <w:pStyle w:val="BodyText"/>
+              <w:spacing w:lineRule="auto" w:line="240" w:before="0" w:after="140"/>
+              <w:ind w:hanging="0" w:left="0"/>
+              <w:rPr>
+                <w:sz w:val="28"/>
+                <w:szCs w:val="28"/>
+              </w:rPr>
+            </w:pPr>
+            <w:r>
+              <w:rPr>
+                <w:sz w:val="28"/>
+                <w:szCs w:val="28"/>
+              </w:rPr>
+              <w:t>Головний редактор</w:t>
             </w:r>
           </w:p>
         </w:tc>
@@ -3267,7 +3287,7 @@
         <w:trPr/>
         <w:tc>
           <w:tcPr>
-            <w:tcW w:w="370" w:type="dxa"/>
+            <w:tcW w:w="412" w:type="dxa"/>
             <w:tcBorders>
               <w:left w:val="single" w:sz="4" w:space="0" w:color="000000"/>
               <w:bottom w:val="single" w:sz="4" w:space="0" w:color="000000"/>
@@ -3280,14 +3300,14 @@
               <w:spacing w:lineRule="auto" w:line="240"/>
               <w:ind w:hanging="0" w:left="0"/>
               <w:rPr>
-                <w:sz w:val="24"/>
-                <w:szCs w:val="24"/>
-              </w:rPr>
-            </w:pPr>
-            <w:r>
-              <w:rPr>
-                <w:sz w:val="24"/>
-                <w:szCs w:val="24"/>
+                <w:sz w:val="28"/>
+                <w:szCs w:val="28"/>
+              </w:rPr>
+            </w:pPr>
+            <w:r>
+              <w:rPr>
+                <w:sz w:val="28"/>
+                <w:szCs w:val="28"/>
               </w:rPr>
               <w:t>2</w:t>
             </w:r>
@@ -3295,7 +3315,7 @@
         </w:tc>
         <w:tc>
           <w:tcPr>
-            <w:tcW w:w="6352" w:type="dxa"/>
+            <w:tcW w:w="5084" w:type="dxa"/>
             <w:tcBorders>
               <w:left w:val="single" w:sz="4" w:space="0" w:color="000000"/>
               <w:bottom w:val="single" w:sz="4" w:space="0" w:color="000000"/>
@@ -3308,22 +3328,22 @@
               <w:spacing w:lineRule="auto" w:line="240"/>
               <w:ind w:hanging="0" w:left="0"/>
               <w:rPr>
-                <w:sz w:val="24"/>
-                <w:szCs w:val="24"/>
-              </w:rPr>
-            </w:pPr>
-            <w:r>
-              <w:rPr>
-                <w:sz w:val="24"/>
-                <w:szCs w:val="24"/>
-              </w:rPr>
-              <w:t>Забезпечити наявність хоча б одної фотографії для кожної новинної статті</w:t>
-            </w:r>
-          </w:p>
-        </w:tc>
-        <w:tc>
-          <w:tcPr>
-            <w:tcW w:w="1991" w:type="dxa"/>
+                <w:sz w:val="28"/>
+                <w:szCs w:val="28"/>
+              </w:rPr>
+            </w:pPr>
+            <w:r>
+              <w:rPr>
+                <w:sz w:val="28"/>
+                <w:szCs w:val="28"/>
+              </w:rPr>
+              <w:t>Забезпечити своєчасну публікацію новин</w:t>
+            </w:r>
+          </w:p>
+        </w:tc>
+        <w:tc>
+          <w:tcPr>
+            <w:tcW w:w="3473" w:type="dxa"/>
             <w:tcBorders>
               <w:left w:val="single" w:sz="4" w:space="0" w:color="000000"/>
               <w:bottom w:val="single" w:sz="4" w:space="0" w:color="000000"/>
@@ -3332,26 +3352,26 @@
           </w:tcPr>
           <w:p>
             <w:pPr>
-              <w:pStyle w:val="user4"/>
-              <w:spacing w:lineRule="auto" w:line="240"/>
-              <w:ind w:hanging="0" w:left="0"/>
-              <w:rPr>
-                <w:sz w:val="24"/>
-                <w:szCs w:val="24"/>
-              </w:rPr>
-            </w:pPr>
-            <w:r>
-              <w:rPr>
-                <w:sz w:val="24"/>
-                <w:szCs w:val="24"/>
-              </w:rPr>
-              <w:t>До кінця тижня</w:t>
-            </w:r>
-          </w:p>
-        </w:tc>
-        <w:tc>
-          <w:tcPr>
-            <w:tcW w:w="2905" w:type="dxa"/>
+              <w:pStyle w:val="p11"/>
+              <w:spacing w:lineRule="auto" w:line="240"/>
+              <w:ind w:hanging="0" w:left="0"/>
+              <w:rPr>
+                <w:sz w:val="28"/>
+                <w:szCs w:val="28"/>
+              </w:rPr>
+            </w:pPr>
+            <w:r>
+              <w:rPr>
+                <w:sz w:val="28"/>
+                <w:szCs w:val="28"/>
+              </w:rPr>
+              <w:t>Не менше 90% новин публікуються протягом 2 годин після отримання та перевірки всієї необхідної інформації</w:t>
+            </w:r>
+          </w:p>
+        </w:tc>
+        <w:tc>
+          <w:tcPr>
+            <w:tcW w:w="2709" w:type="dxa"/>
             <w:tcBorders>
               <w:left w:val="single" w:sz="4" w:space="0" w:color="000000"/>
               <w:bottom w:val="single" w:sz="4" w:space="0" w:color="000000"/>
@@ -3361,20 +3381,20 @@
           </w:tcPr>
           <w:p>
             <w:pPr>
-              <w:pStyle w:val="p11"/>
-              <w:spacing w:lineRule="auto" w:line="240"/>
-              <w:ind w:hanging="0" w:left="0"/>
-              <w:rPr>
-                <w:sz w:val="24"/>
-                <w:szCs w:val="24"/>
-              </w:rPr>
-            </w:pPr>
-            <w:r>
-              <w:rPr>
-                <w:sz w:val="24"/>
-                <w:szCs w:val="24"/>
-              </w:rPr>
-              <w:t>Кожна новина містить хоча б оду фотографію</w:t>
+              <w:pStyle w:val="BodyText"/>
+              <w:spacing w:lineRule="auto" w:line="240" w:before="0" w:after="140"/>
+              <w:ind w:hanging="0" w:left="0"/>
+              <w:rPr>
+                <w:sz w:val="28"/>
+                <w:szCs w:val="28"/>
+              </w:rPr>
+            </w:pPr>
+            <w:r>
+              <w:rPr>
+                <w:sz w:val="28"/>
+                <w:szCs w:val="28"/>
+              </w:rPr>
+              <w:t>Головний редактор</w:t>
             </w:r>
           </w:p>
         </w:tc>
@@ -3383,7 +3403,7 @@
         <w:trPr/>
         <w:tc>
           <w:tcPr>
-            <w:tcW w:w="370" w:type="dxa"/>
+            <w:tcW w:w="412" w:type="dxa"/>
             <w:tcBorders>
               <w:left w:val="single" w:sz="4" w:space="0" w:color="000000"/>
               <w:bottom w:val="single" w:sz="4" w:space="0" w:color="000000"/>
@@ -3396,14 +3416,14 @@
               <w:spacing w:lineRule="auto" w:line="240"/>
               <w:ind w:hanging="0" w:left="0"/>
               <w:rPr>
-                <w:sz w:val="24"/>
-                <w:szCs w:val="24"/>
-              </w:rPr>
-            </w:pPr>
-            <w:r>
-              <w:rPr>
-                <w:sz w:val="24"/>
-                <w:szCs w:val="24"/>
+                <w:sz w:val="28"/>
+                <w:szCs w:val="28"/>
+              </w:rPr>
+            </w:pPr>
+            <w:r>
+              <w:rPr>
+                <w:sz w:val="28"/>
+                <w:szCs w:val="28"/>
               </w:rPr>
               <w:t>3</w:t>
             </w:r>
@@ -3411,7 +3431,7 @@
         </w:tc>
         <w:tc>
           <w:tcPr>
-            <w:tcW w:w="6352" w:type="dxa"/>
+            <w:tcW w:w="5084" w:type="dxa"/>
             <w:tcBorders>
               <w:left w:val="single" w:sz="4" w:space="0" w:color="000000"/>
               <w:bottom w:val="single" w:sz="4" w:space="0" w:color="000000"/>
@@ -3424,22 +3444,22 @@
               <w:spacing w:lineRule="auto" w:line="240"/>
               <w:ind w:hanging="0" w:left="0"/>
               <w:rPr>
-                <w:sz w:val="24"/>
-                <w:szCs w:val="24"/>
-              </w:rPr>
-            </w:pPr>
-            <w:r>
-              <w:rPr>
-                <w:sz w:val="24"/>
-                <w:szCs w:val="24"/>
-              </w:rPr>
-              <w:t>Підвищити рівень задоволеності клієнтів веб-сайту</w:t>
-            </w:r>
-          </w:p>
-        </w:tc>
-        <w:tc>
-          <w:tcPr>
-            <w:tcW w:w="1991" w:type="dxa"/>
+                <w:sz w:val="28"/>
+                <w:szCs w:val="28"/>
+              </w:rPr>
+            </w:pPr>
+            <w:r>
+              <w:rPr>
+                <w:sz w:val="28"/>
+                <w:szCs w:val="28"/>
+              </w:rPr>
+              <w:t>Підвищити задоволеність читачів</w:t>
+            </w:r>
+          </w:p>
+        </w:tc>
+        <w:tc>
+          <w:tcPr>
+            <w:tcW w:w="3473" w:type="dxa"/>
             <w:tcBorders>
               <w:left w:val="single" w:sz="4" w:space="0" w:color="000000"/>
               <w:bottom w:val="single" w:sz="4" w:space="0" w:color="000000"/>
@@ -3448,26 +3468,26 @@
           </w:tcPr>
           <w:p>
             <w:pPr>
-              <w:pStyle w:val="user4"/>
-              <w:spacing w:lineRule="auto" w:line="240"/>
-              <w:ind w:hanging="0" w:left="0"/>
-              <w:rPr>
-                <w:sz w:val="24"/>
-                <w:szCs w:val="24"/>
-              </w:rPr>
-            </w:pPr>
-            <w:r>
-              <w:rPr>
-                <w:sz w:val="24"/>
-                <w:szCs w:val="24"/>
-              </w:rPr>
-              <w:t>До кінця року</w:t>
-            </w:r>
-          </w:p>
-        </w:tc>
-        <w:tc>
-          <w:tcPr>
-            <w:tcW w:w="2905" w:type="dxa"/>
+              <w:pStyle w:val="p11"/>
+              <w:spacing w:lineRule="auto" w:line="240"/>
+              <w:ind w:hanging="0" w:left="0"/>
+              <w:rPr>
+                <w:sz w:val="28"/>
+                <w:szCs w:val="28"/>
+              </w:rPr>
+            </w:pPr>
+            <w:r>
+              <w:rPr>
+                <w:sz w:val="28"/>
+                <w:szCs w:val="28"/>
+              </w:rPr>
+              <w:t>Середня оцінка читачів за результатами опитування — не менше 4 із 5 балів</w:t>
+            </w:r>
+          </w:p>
+        </w:tc>
+        <w:tc>
+          <w:tcPr>
+            <w:tcW w:w="2709" w:type="dxa"/>
             <w:tcBorders>
               <w:left w:val="single" w:sz="4" w:space="0" w:color="000000"/>
               <w:bottom w:val="single" w:sz="4" w:space="0" w:color="000000"/>
@@ -3477,20 +3497,20 @@
           </w:tcPr>
           <w:p>
             <w:pPr>
-              <w:pStyle w:val="p11"/>
-              <w:spacing w:lineRule="auto" w:line="240"/>
-              <w:ind w:hanging="0" w:left="0"/>
-              <w:rPr>
-                <w:sz w:val="24"/>
-                <w:szCs w:val="24"/>
-              </w:rPr>
-            </w:pPr>
-            <w:r>
-              <w:rPr>
-                <w:sz w:val="24"/>
-                <w:szCs w:val="24"/>
-              </w:rPr>
-              <w:t>Відгуки користувачів після прочитання статті в середньому є більше 4 балів з 5-и</w:t>
+              <w:pStyle w:val="BodyText"/>
+              <w:spacing w:lineRule="auto" w:line="240" w:before="0" w:after="140"/>
+              <w:ind w:hanging="0" w:left="0"/>
+              <w:rPr>
+                <w:sz w:val="28"/>
+                <w:szCs w:val="28"/>
+              </w:rPr>
+            </w:pPr>
+            <w:r>
+              <w:rPr>
+                <w:sz w:val="28"/>
+                <w:szCs w:val="28"/>
+              </w:rPr>
+              <w:t>Директор</w:t>
             </w:r>
           </w:p>
         </w:tc>
@@ -3499,7 +3519,7 @@
         <w:trPr/>
         <w:tc>
           <w:tcPr>
-            <w:tcW w:w="370" w:type="dxa"/>
+            <w:tcW w:w="412" w:type="dxa"/>
             <w:tcBorders>
               <w:left w:val="single" w:sz="4" w:space="0" w:color="000000"/>
               <w:bottom w:val="single" w:sz="4" w:space="0" w:color="000000"/>
@@ -3512,14 +3532,14 @@
               <w:spacing w:lineRule="auto" w:line="240"/>
               <w:ind w:hanging="0" w:left="0"/>
               <w:rPr>
-                <w:sz w:val="24"/>
-                <w:szCs w:val="24"/>
-              </w:rPr>
-            </w:pPr>
-            <w:r>
-              <w:rPr>
-                <w:sz w:val="24"/>
-                <w:szCs w:val="24"/>
+                <w:sz w:val="28"/>
+                <w:szCs w:val="28"/>
+              </w:rPr>
+            </w:pPr>
+            <w:r>
+              <w:rPr>
+                <w:sz w:val="28"/>
+                <w:szCs w:val="28"/>
               </w:rPr>
               <w:t>4</w:t>
             </w:r>
@@ -3527,7 +3547,7 @@
         </w:tc>
         <w:tc>
           <w:tcPr>
-            <w:tcW w:w="6352" w:type="dxa"/>
+            <w:tcW w:w="5084" w:type="dxa"/>
             <w:tcBorders>
               <w:left w:val="single" w:sz="4" w:space="0" w:color="000000"/>
               <w:bottom w:val="single" w:sz="4" w:space="0" w:color="000000"/>
@@ -3540,22 +3560,22 @@
               <w:spacing w:lineRule="auto" w:line="240"/>
               <w:ind w:hanging="0" w:left="0"/>
               <w:rPr>
-                <w:sz w:val="24"/>
-                <w:szCs w:val="24"/>
-              </w:rPr>
-            </w:pPr>
-            <w:r>
-              <w:rPr>
-                <w:sz w:val="24"/>
-                <w:szCs w:val="24"/>
-              </w:rPr>
-              <w:t>Підвищити оперативність публікації новин</w:t>
-            </w:r>
-          </w:p>
-        </w:tc>
-        <w:tc>
-          <w:tcPr>
-            <w:tcW w:w="1991" w:type="dxa"/>
+                <w:sz w:val="28"/>
+                <w:szCs w:val="28"/>
+              </w:rPr>
+            </w:pPr>
+            <w:r>
+              <w:rPr>
+                <w:sz w:val="28"/>
+                <w:szCs w:val="28"/>
+              </w:rPr>
+              <w:t>Забезпечити стабільну роботу вебсайту</w:t>
+            </w:r>
+          </w:p>
+        </w:tc>
+        <w:tc>
+          <w:tcPr>
+            <w:tcW w:w="3473" w:type="dxa"/>
             <w:tcBorders>
               <w:left w:val="single" w:sz="4" w:space="0" w:color="000000"/>
               <w:bottom w:val="single" w:sz="4" w:space="0" w:color="000000"/>
@@ -3564,26 +3584,26 @@
           </w:tcPr>
           <w:p>
             <w:pPr>
-              <w:pStyle w:val="user4"/>
-              <w:spacing w:lineRule="auto" w:line="240"/>
-              <w:ind w:hanging="0" w:left="0"/>
-              <w:rPr>
-                <w:sz w:val="24"/>
-                <w:szCs w:val="24"/>
-              </w:rPr>
-            </w:pPr>
-            <w:r>
-              <w:rPr>
-                <w:sz w:val="24"/>
-                <w:szCs w:val="24"/>
-              </w:rPr>
-              <w:t>До кінця кварталу</w:t>
-            </w:r>
-          </w:p>
-        </w:tc>
-        <w:tc>
-          <w:tcPr>
-            <w:tcW w:w="2905" w:type="dxa"/>
+              <w:pStyle w:val="p11"/>
+              <w:spacing w:lineRule="auto" w:line="240"/>
+              <w:ind w:hanging="0" w:left="0"/>
+              <w:rPr>
+                <w:sz w:val="28"/>
+                <w:szCs w:val="28"/>
+              </w:rPr>
+            </w:pPr>
+            <w:r>
+              <w:rPr>
+                <w:sz w:val="28"/>
+                <w:szCs w:val="28"/>
+              </w:rPr>
+              <w:t>Доступність вебсайту — не менше 99% часу протягом місяця</w:t>
+            </w:r>
+          </w:p>
+        </w:tc>
+        <w:tc>
+          <w:tcPr>
+            <w:tcW w:w="2709" w:type="dxa"/>
             <w:tcBorders>
               <w:left w:val="single" w:sz="4" w:space="0" w:color="000000"/>
               <w:bottom w:val="single" w:sz="4" w:space="0" w:color="000000"/>
@@ -3593,20 +3613,20 @@
           </w:tcPr>
           <w:p>
             <w:pPr>
-              <w:pStyle w:val="p11"/>
-              <w:spacing w:lineRule="auto" w:line="240"/>
-              <w:ind w:hanging="0" w:left="0"/>
-              <w:rPr>
-                <w:sz w:val="24"/>
-                <w:szCs w:val="24"/>
-              </w:rPr>
-            </w:pPr>
-            <w:r>
-              <w:rPr>
-                <w:sz w:val="24"/>
-                <w:szCs w:val="24"/>
-              </w:rPr>
-              <w:t>Новина публікується не більше ніж за 3 години після її знахідки</w:t>
+              <w:pStyle w:val="BodyText"/>
+              <w:spacing w:lineRule="auto" w:line="240" w:before="0" w:after="140"/>
+              <w:ind w:hanging="0" w:left="0"/>
+              <w:rPr>
+                <w:sz w:val="28"/>
+                <w:szCs w:val="28"/>
+              </w:rPr>
+            </w:pPr>
+            <w:r>
+              <w:rPr>
+                <w:sz w:val="28"/>
+                <w:szCs w:val="28"/>
+              </w:rPr>
+              <w:t>Backend-розробник</w:t>
             </w:r>
           </w:p>
         </w:tc>
@@ -3615,7 +3635,7 @@
         <w:trPr/>
         <w:tc>
           <w:tcPr>
-            <w:tcW w:w="370" w:type="dxa"/>
+            <w:tcW w:w="412" w:type="dxa"/>
             <w:tcBorders>
               <w:left w:val="single" w:sz="4" w:space="0" w:color="000000"/>
               <w:bottom w:val="single" w:sz="4" w:space="0" w:color="000000"/>
@@ -3628,14 +3648,14 @@
               <w:spacing w:lineRule="auto" w:line="240"/>
               <w:ind w:hanging="0" w:left="0"/>
               <w:rPr>
-                <w:sz w:val="24"/>
-                <w:szCs w:val="24"/>
-              </w:rPr>
-            </w:pPr>
-            <w:r>
-              <w:rPr>
-                <w:sz w:val="24"/>
-                <w:szCs w:val="24"/>
+                <w:sz w:val="28"/>
+                <w:szCs w:val="28"/>
+              </w:rPr>
+            </w:pPr>
+            <w:r>
+              <w:rPr>
+                <w:sz w:val="28"/>
+                <w:szCs w:val="28"/>
               </w:rPr>
               <w:t>5</w:t>
             </w:r>
@@ -3643,7 +3663,7 @@
         </w:tc>
         <w:tc>
           <w:tcPr>
-            <w:tcW w:w="6352" w:type="dxa"/>
+            <w:tcW w:w="5084" w:type="dxa"/>
             <w:tcBorders>
               <w:left w:val="single" w:sz="4" w:space="0" w:color="000000"/>
               <w:bottom w:val="single" w:sz="4" w:space="0" w:color="000000"/>
@@ -3656,22 +3676,22 @@
               <w:spacing w:lineRule="auto" w:line="240"/>
               <w:ind w:hanging="0" w:left="0"/>
               <w:rPr>
-                <w:sz w:val="24"/>
-                <w:szCs w:val="24"/>
-              </w:rPr>
-            </w:pPr>
-            <w:r>
-              <w:rPr>
-                <w:sz w:val="24"/>
-                <w:szCs w:val="24"/>
-              </w:rPr>
-              <w:t>Підвищити кількість читачів до п’ятої частини мешканців області</w:t>
-            </w:r>
-          </w:p>
-        </w:tc>
-        <w:tc>
-          <w:tcPr>
-            <w:tcW w:w="1991" w:type="dxa"/>
+                <w:sz w:val="28"/>
+                <w:szCs w:val="28"/>
+              </w:rPr>
+            </w:pPr>
+            <w:r>
+              <w:rPr>
+                <w:sz w:val="28"/>
+                <w:szCs w:val="28"/>
+              </w:rPr>
+              <w:t>Забезпечити своєчасне поширення новин у Telegram</w:t>
+            </w:r>
+          </w:p>
+        </w:tc>
+        <w:tc>
+          <w:tcPr>
+            <w:tcW w:w="3473" w:type="dxa"/>
             <w:tcBorders>
               <w:left w:val="single" w:sz="4" w:space="0" w:color="000000"/>
               <w:bottom w:val="single" w:sz="4" w:space="0" w:color="000000"/>
@@ -3680,26 +3700,26 @@
           </w:tcPr>
           <w:p>
             <w:pPr>
-              <w:pStyle w:val="user4"/>
-              <w:spacing w:lineRule="auto" w:line="240"/>
-              <w:ind w:hanging="0" w:left="0"/>
-              <w:rPr>
-                <w:sz w:val="24"/>
-                <w:szCs w:val="24"/>
-              </w:rPr>
-            </w:pPr>
-            <w:r>
-              <w:rPr>
-                <w:sz w:val="24"/>
-                <w:szCs w:val="24"/>
-              </w:rPr>
-              <w:t>До кінця року</w:t>
-            </w:r>
-          </w:p>
-        </w:tc>
-        <w:tc>
-          <w:tcPr>
-            <w:tcW w:w="2905" w:type="dxa"/>
+              <w:pStyle w:val="p11"/>
+              <w:spacing w:lineRule="auto" w:line="240"/>
+              <w:ind w:hanging="0" w:left="0"/>
+              <w:rPr>
+                <w:sz w:val="28"/>
+                <w:szCs w:val="28"/>
+              </w:rPr>
+            </w:pPr>
+            <w:r>
+              <w:rPr>
+                <w:sz w:val="28"/>
+                <w:szCs w:val="28"/>
+              </w:rPr>
+              <w:t>Не менше 98% нових статей автоматично публікуються в Telegram протягом 5 хвилин після публікації на сайті</w:t>
+            </w:r>
+          </w:p>
+        </w:tc>
+        <w:tc>
+          <w:tcPr>
+            <w:tcW w:w="2709" w:type="dxa"/>
             <w:tcBorders>
               <w:left w:val="single" w:sz="4" w:space="0" w:color="000000"/>
               <w:bottom w:val="single" w:sz="4" w:space="0" w:color="000000"/>
@@ -3709,20 +3729,20 @@
           </w:tcPr>
           <w:p>
             <w:pPr>
-              <w:pStyle w:val="p11"/>
-              <w:spacing w:lineRule="auto" w:line="240"/>
-              <w:ind w:hanging="0" w:left="0"/>
-              <w:rPr>
-                <w:sz w:val="24"/>
-                <w:szCs w:val="24"/>
-              </w:rPr>
-            </w:pPr>
-            <w:r>
-              <w:rPr>
-                <w:sz w:val="24"/>
-                <w:szCs w:val="24"/>
-              </w:rPr>
-              <w:t>Новини читають в середньому п’ята частина мешканців області</w:t>
+              <w:pStyle w:val="BodyText"/>
+              <w:spacing w:lineRule="auto" w:line="240" w:before="0" w:after="140"/>
+              <w:ind w:hanging="0" w:left="0"/>
+              <w:rPr>
+                <w:sz w:val="28"/>
+                <w:szCs w:val="28"/>
+              </w:rPr>
+            </w:pPr>
+            <w:r>
+              <w:rPr>
+                <w:sz w:val="28"/>
+                <w:szCs w:val="28"/>
+              </w:rPr>
+              <w:t>Backend-розробник</w:t>
             </w:r>
           </w:p>
         </w:tc>
@@ -3730,7 +3750,7 @@
     </w:tbl>
     <w:p>
       <w:pPr>
-        <w:pStyle w:val="Normal"/>
+        <w:pStyle w:val="p11"/>
         <w:rPr/>
       </w:pPr>
       <w:r>

</xml_diff>

<commit_message>
feat: SP1 chapter 4.3 done
</commit_message>
<xml_diff>
--- a/51SP Sertyficazija PZ/1/SP1_KNT-116m_Onyshchenko_15.docx
+++ b/51SP Sertyficazija PZ/1/SP1_KNT-116m_Onyshchenko_15.docx
@@ -6660,7 +6660,11 @@
       </w:pPr>
       <w:r>
         <w:rPr/>
-        <w:t>Існують наступні те</w:t>
+        <w:t xml:space="preserve">У цьому документі використовуються </w:t>
+      </w:r>
+      <w:r>
+        <w:rPr/>
+        <w:t>наступні те</w:t>
       </w:r>
       <w:r>
         <w:rPr/>
@@ -6684,11 +6688,15 @@
         <w:spacing w:lineRule="auto" w:line="360" w:before="0" w:after="0"/>
         <w:ind w:firstLine="850" w:left="0" w:right="0"/>
         <w:jc w:val="both"/>
-        <w:rPr/>
-      </w:pPr>
-      <w:r>
-        <w:rPr/>
-        <w:t>новинна стаття — публікація, що містить інформацію про певну подію.</w:t>
+        <w:rPr>
+          <w:lang w:val="uk-UA"/>
+        </w:rPr>
+      </w:pPr>
+      <w:r>
+        <w:rPr>
+          <w:lang w:val="uk-UA"/>
+        </w:rPr>
+        <w:t>система управління якістю (СУЯ) — система правил і процесів, за допомогою яких компанія контролює та покращує якість своєї роботи.</w:t>
       </w:r>
     </w:p>
     <w:p>
@@ -6704,11 +6712,15 @@
         <w:spacing w:lineRule="auto" w:line="360" w:before="0" w:after="0"/>
         <w:ind w:firstLine="850" w:left="0" w:right="0"/>
         <w:jc w:val="both"/>
-        <w:rPr/>
-      </w:pPr>
-      <w:r>
-        <w:rPr/>
-        <w:t>посилання на новинну статтю — веб-адреса, за якою користувач може перейти до відповідної новинної статті на веб-сайті.</w:t>
+        <w:rPr>
+          <w:lang w:val="uk-UA"/>
+        </w:rPr>
+      </w:pPr>
+      <w:r>
+        <w:rPr>
+          <w:lang w:val="uk-UA"/>
+        </w:rPr>
+        <w:t>зацікавлена сторона — особа або організація, яка впливає на компанію або залежить від її діяльності.</w:t>
       </w:r>
     </w:p>
     <w:p>
@@ -6724,11 +6736,15 @@
         <w:spacing w:lineRule="auto" w:line="360" w:before="0" w:after="0"/>
         <w:ind w:firstLine="850" w:left="0" w:right="0"/>
         <w:jc w:val="both"/>
-        <w:rPr/>
-      </w:pPr>
-      <w:r>
-        <w:rPr/>
-        <w:t>публікація — інформаційний матеріал, розміщений на веб-сайті для ознайомлення користувачів.</w:t>
+        <w:rPr>
+          <w:lang w:val="uk-UA"/>
+        </w:rPr>
+      </w:pPr>
+      <w:r>
+        <w:rPr>
+          <w:lang w:val="uk-UA"/>
+        </w:rPr>
+        <w:t>процес — послідовність дій, спрямованих на отримання певного результату.</w:t>
       </w:r>
     </w:p>
     <w:p>
@@ -6744,11 +6760,15 @@
         <w:spacing w:lineRule="auto" w:line="360" w:before="0" w:after="0"/>
         <w:ind w:firstLine="850" w:left="0" w:right="0"/>
         <w:jc w:val="both"/>
-        <w:rPr/>
-      </w:pPr>
-      <w:r>
-        <w:rPr/>
-        <w:t xml:space="preserve">подія — факт або випадок, що відбувається в певному місці та часі й може становити інтерес для громадськості. </w:t>
+        <w:rPr>
+          <w:lang w:val="uk-UA"/>
+        </w:rPr>
+      </w:pPr>
+      <w:r>
+        <w:rPr>
+          <w:lang w:val="uk-UA"/>
+        </w:rPr>
+        <w:t>документована інформація — інформація, яку компанія зберігає та використовує у своїй роботі.</w:t>
       </w:r>
     </w:p>
     <w:p>
@@ -6764,17 +6784,15 @@
         <w:spacing w:lineRule="auto" w:line="360" w:before="0" w:after="0"/>
         <w:ind w:firstLine="850" w:left="0" w:right="0"/>
         <w:jc w:val="both"/>
-        <w:rPr/>
-      </w:pPr>
-      <w:r>
-        <w:rPr/>
-        <w:t>веб-сайт — сукупність веб-сторінок компанії, вмістом яких керують за допомогою CMS</w:t>
-      </w:r>
-      <w:r>
-        <w:rPr>
-          <w:lang w:val="en-US"/>
-        </w:rPr>
-        <w:t>.</w:t>
+        <w:rPr>
+          <w:lang w:val="uk-UA"/>
+        </w:rPr>
+      </w:pPr>
+      <w:r>
+        <w:rPr>
+          <w:lang w:val="uk-UA"/>
+        </w:rPr>
+        <w:t>моніторинг — регулярне спостереження та перевірка стану певного процесу.</w:t>
       </w:r>
     </w:p>
     <w:p>
@@ -6798,7 +6816,7 @@
         <w:rPr>
           <w:lang w:val="uk-UA"/>
         </w:rPr>
-        <w:t>компанія — організація, що здійснює збір та поширення новинних статей про події Запорізької області.</w:t>
+        <w:t>ризик — можливість виникнення проблеми, яка може негативно вплинути на роботу компанії.</w:t>
       </w:r>
     </w:p>
     <w:p>
@@ -6822,7 +6840,7 @@
         <w:rPr>
           <w:lang w:val="uk-UA"/>
         </w:rPr>
-        <w:t>організація — група людей, які об’єдналися для спільної діяльності та досягнення певної мети.</w:t>
+        <w:t>новинна стаття — публікація, що містить інформацію про певну подію.</w:t>
       </w:r>
     </w:p>
     <w:p>
@@ -6846,7 +6864,7 @@
         <w:rPr>
           <w:lang w:val="uk-UA"/>
         </w:rPr>
-        <w:t>CMS (система керування контентом) — програмне забезпечення для керування вмістом веб-сайту.</w:t>
+        <w:t>новинний матеріал — текст або інший матеріал, що розповідає про певну подію чи новину.</w:t>
       </w:r>
     </w:p>
     <w:p>
@@ -6870,7 +6888,7 @@
         <w:rPr>
           <w:lang w:val="uk-UA"/>
         </w:rPr>
-        <w:t>рекламодавець — особа, яка оплачує розміщення реклами на веб-сайті з метою просування своєї діяльності.</w:t>
+        <w:t>посилання на новинну статтю — вебадреса, за якою користувач може перейти до відповідної статті на вебсайті.</w:t>
       </w:r>
     </w:p>
     <w:p>
@@ -6894,7 +6912,7 @@
         <w:rPr>
           <w:lang w:val="uk-UA"/>
         </w:rPr>
-        <w:t>Copyscape — програмне забезпечення для перевірки оригінальності текстів шляхом пошуку збігів з матеріалами, опублікованими в інтернеті.</w:t>
+        <w:t>публікація — інформаційний матеріал, розміщений на вебсайті для ознайомлення користувачів.</w:t>
       </w:r>
     </w:p>
     <w:p>
@@ -6918,7 +6936,151 @@
         <w:rPr>
           <w:lang w:val="uk-UA"/>
         </w:rPr>
-        <w:t>новинний матеріал — текст або публікація, що висвітлює певну подію.</w:t>
+        <w:t>подія — факт або випадок, що відбувається в певному місці та часі й може становити інтерес для громадськості.</w:t>
+      </w:r>
+    </w:p>
+    <w:p>
+      <w:pPr>
+        <w:pStyle w:val="P1"/>
+        <w:widowControl/>
+        <w:numPr>
+          <w:ilvl w:val="0"/>
+          <w:numId w:val="4"/>
+        </w:numPr>
+        <w:suppressAutoHyphens w:val="true"/>
+        <w:bidi w:val="0"/>
+        <w:spacing w:lineRule="auto" w:line="360" w:before="0" w:after="0"/>
+        <w:ind w:firstLine="850" w:left="0" w:right="0"/>
+        <w:jc w:val="both"/>
+        <w:rPr>
+          <w:lang w:val="uk-UA"/>
+        </w:rPr>
+      </w:pPr>
+      <w:r>
+        <w:rPr>
+          <w:lang w:val="uk-UA"/>
+        </w:rPr>
+        <w:t>вебсайт — сукупність вебсторінок компанії, вмістом яких керують за допомогою CMS.</w:t>
+      </w:r>
+    </w:p>
+    <w:p>
+      <w:pPr>
+        <w:pStyle w:val="P1"/>
+        <w:widowControl/>
+        <w:numPr>
+          <w:ilvl w:val="0"/>
+          <w:numId w:val="4"/>
+        </w:numPr>
+        <w:suppressAutoHyphens w:val="true"/>
+        <w:bidi w:val="0"/>
+        <w:spacing w:lineRule="auto" w:line="360" w:before="0" w:after="0"/>
+        <w:ind w:firstLine="850" w:left="0" w:right="0"/>
+        <w:jc w:val="both"/>
+        <w:rPr>
+          <w:lang w:val="uk-UA"/>
+        </w:rPr>
+      </w:pPr>
+      <w:r>
+        <w:rPr>
+          <w:lang w:val="uk-UA"/>
+        </w:rPr>
+        <w:t>компанія — організація, що збирає, перевіряє, готує та поширює новини про події Запорізької області.</w:t>
+      </w:r>
+    </w:p>
+    <w:p>
+      <w:pPr>
+        <w:pStyle w:val="P1"/>
+        <w:widowControl/>
+        <w:numPr>
+          <w:ilvl w:val="0"/>
+          <w:numId w:val="4"/>
+        </w:numPr>
+        <w:suppressAutoHyphens w:val="true"/>
+        <w:bidi w:val="0"/>
+        <w:spacing w:lineRule="auto" w:line="360" w:before="0" w:after="0"/>
+        <w:ind w:firstLine="850" w:left="0" w:right="0"/>
+        <w:jc w:val="both"/>
+        <w:rPr>
+          <w:lang w:val="uk-UA"/>
+        </w:rPr>
+      </w:pPr>
+      <w:r>
+        <w:rPr>
+          <w:lang w:val="uk-UA"/>
+        </w:rPr>
+        <w:t>організація — група людей, які працюють разом для досягнення спільної мети.</w:t>
+      </w:r>
+    </w:p>
+    <w:p>
+      <w:pPr>
+        <w:pStyle w:val="P1"/>
+        <w:widowControl/>
+        <w:numPr>
+          <w:ilvl w:val="0"/>
+          <w:numId w:val="4"/>
+        </w:numPr>
+        <w:suppressAutoHyphens w:val="true"/>
+        <w:bidi w:val="0"/>
+        <w:spacing w:lineRule="auto" w:line="360" w:before="0" w:after="0"/>
+        <w:ind w:firstLine="850" w:left="0" w:right="0"/>
+        <w:jc w:val="both"/>
+        <w:rPr>
+          <w:lang w:val="uk-UA"/>
+        </w:rPr>
+      </w:pPr>
+      <w:r>
+        <w:rPr>
+          <w:lang w:val="uk-UA"/>
+        </w:rPr>
+        <w:t>CMS (система керування контентом) — програмне забезпечення для створення, редагування та публікації матеріалів на вебсайті.</w:t>
+      </w:r>
+    </w:p>
+    <w:p>
+      <w:pPr>
+        <w:pStyle w:val="P1"/>
+        <w:widowControl/>
+        <w:numPr>
+          <w:ilvl w:val="0"/>
+          <w:numId w:val="4"/>
+        </w:numPr>
+        <w:suppressAutoHyphens w:val="true"/>
+        <w:bidi w:val="0"/>
+        <w:spacing w:lineRule="auto" w:line="360" w:before="0" w:after="0"/>
+        <w:ind w:firstLine="850" w:left="0" w:right="0"/>
+        <w:jc w:val="both"/>
+        <w:rPr>
+          <w:lang w:val="uk-UA"/>
+        </w:rPr>
+      </w:pPr>
+      <w:r>
+        <w:rPr>
+          <w:lang w:val="uk-UA"/>
+        </w:rPr>
+        <w:t>рекламодавець — особа або організація, яка оплачує розміщення реклами на вебсайті для просування своєї діяльності.</w:t>
+      </w:r>
+    </w:p>
+    <w:p>
+      <w:pPr>
+        <w:pStyle w:val="P1"/>
+        <w:widowControl/>
+        <w:numPr>
+          <w:ilvl w:val="0"/>
+          <w:numId w:val="4"/>
+        </w:numPr>
+        <w:suppressAutoHyphens w:val="true"/>
+        <w:bidi w:val="0"/>
+        <w:spacing w:lineRule="auto" w:line="360" w:before="0" w:after="0"/>
+        <w:ind w:firstLine="850" w:left="0" w:right="0"/>
+        <w:jc w:val="both"/>
+        <w:rPr>
+          <w:lang w:val="uk-UA"/>
+        </w:rPr>
+      </w:pPr>
+      <w:r>
+        <w:rPr>
+          <w:lang w:val="uk-UA"/>
+        </w:rPr>
+        <w:t>Copyscape — онлайн-сервіс для пошуку збігів між текстом та іншими матеріалами в інтернеті.</w:t>
       </w:r>
     </w:p>
     <w:p>

</xml_diff>